<commit_message>
feat: inject FELD_* placeholders into template table cells
- Script adds 51 placeholders across all 3 DOCX templates
- Maps: Name, Anschrift, HRB, Arbeitnehmer, Finanzamt, Steuerberater,
  Bankverbindungen, Gerichtsvollzieher, Gesellschafter, etc.
- Add 18 new FELD_* entries to gutachten-mapping.json
- Add computed field handlers for arbeitnehmer_anzahl, steuerberater,
  finanzamt, bankverbindungen, aelteste_forderung, gesellschafter, etc.

Co-Authored-By: Claude Opus 4.6 (1M context) <noreply@anthropic.com>
</commit_message>
<xml_diff>
--- a/gutachtenvorlagen/Gutachten Muster Personengesellschaft.docx
+++ b/gutachtenvorlagen/Gutachten Muster Personengesellschaft.docx
@@ -8618,6 +8618,12 @@
                 <w:rFonts w:cs="Arial"/>
               </w:rPr>
             </w:pPr>
+            <w:r>
+              <w:rPr>
+                <w:rFonts w:cs="Arial"/>
+              </w:rPr>
+              <w:t xml:space="preserve">FELD_Antragsteller_Name</w:t>
+            </w:r>
           </w:p>
         </w:tc>
       </w:tr>
@@ -8649,6 +8655,70 @@
               <w:t>Antragsgrund</w:t>
             </w:r>
             <w:bookmarkEnd w:id="59"/>
+          </w:p>
+          <w:p>
+            <w:pPr>
+              <w:jc w:val="left"/>
+              <w:rPr>
+                <w:b/>
+                <w:highlight w:val="yellow"/>
+              </w:rPr>
+            </w:pPr>
+          </w:p>
+        </w:tc>
+        <w:tc>
+          <w:tcPr>
+            <w:tcW w:w="4814" w:type="dxa"/>
+            <w:tcBorders>
+              <w:top w:val="single" w:sz="4" w:space="0" w:color="auto"/>
+              <w:left w:val="single" w:sz="4" w:space="0" w:color="auto"/>
+              <w:bottom w:val="single" w:sz="4" w:space="0" w:color="auto"/>
+              <w:right w:val="single" w:sz="4" w:space="0" w:color="auto"/>
+            </w:tcBorders>
+          </w:tcPr>
+          <w:p>
+            <w:pPr>
+              <w:rPr>
+                <w:rFonts w:cs="Arial"/>
+              </w:rPr>
+            </w:pPr>
+            <w:r>
+              <w:rPr>
+                <w:rFonts w:cs="Arial"/>
+              </w:rPr>
+              <w:t xml:space="preserve">FELD_Verfahren_Eroeffnungsgrund</w:t>
+            </w:r>
+          </w:p>
+        </w:tc>
+      </w:tr>
+      <w:tr>
+        <w:tc>
+          <w:tcPr>
+            <w:tcW w:w="3431" w:type="dxa"/>
+            <w:tcBorders>
+              <w:top w:val="single" w:sz="4" w:space="0" w:color="auto"/>
+              <w:left w:val="single" w:sz="4" w:space="0" w:color="auto"/>
+              <w:bottom w:val="single" w:sz="4" w:space="0" w:color="auto"/>
+              <w:right w:val="single" w:sz="4" w:space="0" w:color="auto"/>
+            </w:tcBorders>
+          </w:tcPr>
+          <w:p>
+            <w:pPr>
+              <w:jc w:val="left"/>
+              <w:rPr>
+                <w:b/>
+                <w:highlight w:val="yellow"/>
+              </w:rPr>
+            </w:pPr>
+            <w:bookmarkStart w:id="60" w:name="_Toc134620891"/>
+            <w:r>
+              <w:rPr>
+                <w:b/>
+                <w:highlight w:val="yellow"/>
+              </w:rPr>
+              <w:t>Internationaler Bezug</w:t>
+            </w:r>
+            <w:bookmarkEnd w:id="60"/>
           </w:p>
           <w:p>
             <w:pPr>
@@ -8698,15 +8768,15 @@
                 <w:highlight w:val="yellow"/>
               </w:rPr>
             </w:pPr>
-            <w:bookmarkStart w:id="60" w:name="_Toc134620891"/>
+            <w:bookmarkStart w:id="61" w:name="_Toc134620892"/>
             <w:r>
               <w:rPr>
                 <w:b/>
                 <w:highlight w:val="yellow"/>
               </w:rPr>
-              <w:t>Internationaler Bezug</w:t>
-            </w:r>
-            <w:bookmarkEnd w:id="60"/>
+              <w:t>Eigenverwaltung</w:t>
+            </w:r>
+            <w:bookmarkEnd w:id="61"/>
           </w:p>
           <w:p>
             <w:pPr>
@@ -8756,15 +8826,15 @@
                 <w:highlight w:val="yellow"/>
               </w:rPr>
             </w:pPr>
-            <w:bookmarkStart w:id="61" w:name="_Toc134620892"/>
+            <w:bookmarkStart w:id="62" w:name="_Toc134620893"/>
             <w:r>
               <w:rPr>
                 <w:b/>
                 <w:highlight w:val="yellow"/>
               </w:rPr>
-              <w:t>Eigenverwaltung</w:t>
-            </w:r>
-            <w:bookmarkEnd w:id="61"/>
+              <w:t>Geschäftszweig</w:t>
+            </w:r>
+            <w:bookmarkEnd w:id="62"/>
           </w:p>
           <w:p>
             <w:pPr>
@@ -8792,6 +8862,28 @@
                 <w:rFonts w:cs="Arial"/>
               </w:rPr>
             </w:pPr>
+            <w:bookmarkStart w:id="63" w:name="_Toc134620894"/>
+            <w:r>
+              <w:rPr>
+                <w:rFonts w:cs="Arial"/>
+                <w:highlight w:val="yellow"/>
+              </w:rPr>
+              <w:t>[Branche]</w:t>
+            </w:r>
+            <w:bookmarkEnd w:id="63"/>
+            <w:r>
+              <w:rPr>
+                <w:rFonts w:cs="Arial"/>
+                <w:highlight w:val="yellow"/>
+              </w:rPr>
+              <w:t xml:space="preserve"> </w:t>
+            </w:r>
+            <w:r>
+              <w:rPr>
+                <w:rFonts w:cs="Arial"/>
+              </w:rPr>
+              <w:t>https://de.statista.com/statistik/kategorien/</w:t>
+            </w:r>
           </w:p>
         </w:tc>
       </w:tr>
@@ -8814,15 +8906,56 @@
                 <w:highlight w:val="yellow"/>
               </w:rPr>
             </w:pPr>
-            <w:bookmarkStart w:id="62" w:name="_Toc134620893"/>
+            <w:bookmarkStart w:id="64" w:name="_Toc134620895"/>
             <w:r>
               <w:rPr>
                 <w:b/>
                 <w:highlight w:val="yellow"/>
               </w:rPr>
-              <w:t>Geschäftszweig</w:t>
-            </w:r>
-            <w:bookmarkEnd w:id="62"/>
+              <w:t>Unternehmensgegenstand</w:t>
+            </w:r>
+            <w:bookmarkEnd w:id="64"/>
+          </w:p>
+          <w:p>
+            <w:pPr>
+              <w:jc w:val="left"/>
+              <w:rPr>
+                <w:b/>
+                <w:highlight w:val="yellow"/>
+              </w:rPr>
+            </w:pPr>
+            <w:bookmarkStart w:id="65" w:name="_Toc134620896"/>
+            <w:r>
+              <w:rPr>
+                <w:b/>
+                <w:highlight w:val="yellow"/>
+              </w:rPr>
+              <w:t xml:space="preserve">gemäß </w:t>
+            </w:r>
+            <w:r>
+              <w:rPr>
+                <w:b/>
+                <w:highlight w:val="yellow"/>
+              </w:rPr>
+              <w:t xml:space="preserve">Gesellschaftsregister / </w:t>
+            </w:r>
+          </w:p>
+          <w:p>
+            <w:pPr>
+              <w:jc w:val="left"/>
+              <w:rPr>
+                <w:b/>
+                <w:highlight w:val="yellow"/>
+              </w:rPr>
+            </w:pPr>
+            <w:r>
+              <w:rPr>
+                <w:b/>
+                <w:highlight w:val="yellow"/>
+              </w:rPr>
+              <w:t>Handelsregister</w:t>
+            </w:r>
+            <w:bookmarkEnd w:id="65"/>
           </w:p>
           <w:p>
             <w:pPr>
@@ -8850,27 +8983,11 @@
                 <w:rFonts w:cs="Arial"/>
               </w:rPr>
             </w:pPr>
-            <w:bookmarkStart w:id="63" w:name="_Toc134620894"/>
             <w:r>
               <w:rPr>
                 <w:rFonts w:cs="Arial"/>
-                <w:highlight w:val="yellow"/>
-              </w:rPr>
-              <w:t>[Branche]</w:t>
-            </w:r>
-            <w:bookmarkEnd w:id="63"/>
-            <w:r>
-              <w:rPr>
-                <w:rFonts w:cs="Arial"/>
-                <w:highlight w:val="yellow"/>
-              </w:rPr>
-              <w:t xml:space="preserve"> </w:t>
-            </w:r>
-            <w:r>
-              <w:rPr>
-                <w:rFonts w:cs="Arial"/>
-              </w:rPr>
-              <w:t>https://de.statista.com/statistik/kategorien/</w:t>
+              </w:rPr>
+              <w:t xml:space="preserve">FELD_Schuldner_Firma</w:t>
             </w:r>
           </w:p>
         </w:tc>
@@ -8894,56 +9011,15 @@
                 <w:highlight w:val="yellow"/>
               </w:rPr>
             </w:pPr>
-            <w:bookmarkStart w:id="64" w:name="_Toc134620895"/>
+            <w:bookmarkStart w:id="66" w:name="_Toc134620897"/>
             <w:r>
               <w:rPr>
                 <w:b/>
                 <w:highlight w:val="yellow"/>
               </w:rPr>
-              <w:t>Unternehmensgegenstand</w:t>
-            </w:r>
-            <w:bookmarkEnd w:id="64"/>
-          </w:p>
-          <w:p>
-            <w:pPr>
-              <w:jc w:val="left"/>
-              <w:rPr>
-                <w:b/>
-                <w:highlight w:val="yellow"/>
-              </w:rPr>
-            </w:pPr>
-            <w:bookmarkStart w:id="65" w:name="_Toc134620896"/>
-            <w:r>
-              <w:rPr>
-                <w:b/>
-                <w:highlight w:val="yellow"/>
-              </w:rPr>
-              <w:t xml:space="preserve">gemäß </w:t>
-            </w:r>
-            <w:r>
-              <w:rPr>
-                <w:b/>
-                <w:highlight w:val="yellow"/>
-              </w:rPr>
-              <w:t xml:space="preserve">Gesellschaftsregister / </w:t>
-            </w:r>
-          </w:p>
-          <w:p>
-            <w:pPr>
-              <w:jc w:val="left"/>
-              <w:rPr>
-                <w:b/>
-                <w:highlight w:val="yellow"/>
-              </w:rPr>
-            </w:pPr>
-            <w:r>
-              <w:rPr>
-                <w:b/>
-                <w:highlight w:val="yellow"/>
-              </w:rPr>
-              <w:t>Handelsregister</w:t>
-            </w:r>
-            <w:bookmarkEnd w:id="65"/>
+              <w:t>Arbeitnehmer</w:t>
+            </w:r>
+            <w:bookmarkEnd w:id="66"/>
           </w:p>
           <w:p>
             <w:pPr>
@@ -8971,64 +9047,12 @@
                 <w:rFonts w:cs="Arial"/>
               </w:rPr>
             </w:pPr>
-          </w:p>
-        </w:tc>
-      </w:tr>
-      <w:tr>
-        <w:tc>
-          <w:tcPr>
-            <w:tcW w:w="3431" w:type="dxa"/>
-            <w:tcBorders>
-              <w:top w:val="single" w:sz="4" w:space="0" w:color="auto"/>
-              <w:left w:val="single" w:sz="4" w:space="0" w:color="auto"/>
-              <w:bottom w:val="single" w:sz="4" w:space="0" w:color="auto"/>
-              <w:right w:val="single" w:sz="4" w:space="0" w:color="auto"/>
-            </w:tcBorders>
-          </w:tcPr>
-          <w:p>
-            <w:pPr>
-              <w:jc w:val="left"/>
-              <w:rPr>
-                <w:b/>
-                <w:highlight w:val="yellow"/>
-              </w:rPr>
-            </w:pPr>
-            <w:bookmarkStart w:id="66" w:name="_Toc134620897"/>
-            <w:r>
-              <w:rPr>
-                <w:b/>
-                <w:highlight w:val="yellow"/>
-              </w:rPr>
-              <w:t>Arbeitnehmer</w:t>
-            </w:r>
-            <w:bookmarkEnd w:id="66"/>
-          </w:p>
-          <w:p>
-            <w:pPr>
-              <w:jc w:val="left"/>
-              <w:rPr>
-                <w:b/>
-                <w:highlight w:val="yellow"/>
-              </w:rPr>
-            </w:pPr>
-          </w:p>
-        </w:tc>
-        <w:tc>
-          <w:tcPr>
-            <w:tcW w:w="4814" w:type="dxa"/>
-            <w:tcBorders>
-              <w:top w:val="single" w:sz="4" w:space="0" w:color="auto"/>
-              <w:left w:val="single" w:sz="4" w:space="0" w:color="auto"/>
-              <w:bottom w:val="single" w:sz="4" w:space="0" w:color="auto"/>
-              <w:right w:val="single" w:sz="4" w:space="0" w:color="auto"/>
-            </w:tcBorders>
-          </w:tcPr>
-          <w:p>
-            <w:pPr>
+            <w:r>
               <w:rPr>
                 <w:rFonts w:cs="Arial"/>
               </w:rPr>
-            </w:pPr>
+              <w:t xml:space="preserve">FELD_Arbeitnehmer_Anzahl</w:t>
+            </w:r>
           </w:p>
         </w:tc>
       </w:tr>
@@ -9768,6 +9792,12 @@
                 <w:bCs/>
               </w:rPr>
             </w:pPr>
+            <w:r>
+              <w:rPr>
+                <w:bCs/>
+              </w:rPr>
+              <w:t xml:space="preserve">FELD_Finanzamt</w:t>
+            </w:r>
           </w:p>
         </w:tc>
       </w:tr>
@@ -9797,6 +9827,61 @@
                 <w:b/>
               </w:rPr>
             </w:pPr>
+          </w:p>
+        </w:tc>
+        <w:tc>
+          <w:tcPr>
+            <w:tcW w:w="4985" w:type="dxa"/>
+          </w:tcPr>
+          <w:p>
+            <w:pPr>
+              <w:rPr>
+                <w:bCs/>
+              </w:rPr>
+            </w:pPr>
+            <w:r>
+              <w:rPr>
+                <w:bCs/>
+              </w:rPr>
+              <w:t xml:space="preserve">FELD_Steuernummer</w:t>
+            </w:r>
+          </w:p>
+        </w:tc>
+      </w:tr>
+      <w:tr>
+        <w:tc>
+          <w:tcPr>
+            <w:tcW w:w="3260" w:type="dxa"/>
+          </w:tcPr>
+          <w:p>
+            <w:pPr>
+              <w:rPr>
+                <w:b/>
+              </w:rPr>
+            </w:pPr>
+            <w:bookmarkStart w:id="73" w:name="_Toc134620912"/>
+            <w:r>
+              <w:rPr>
+                <w:b/>
+              </w:rPr>
+              <w:t>Wirtschaftsjahr</w:t>
+            </w:r>
+            <w:bookmarkEnd w:id="73"/>
+          </w:p>
+          <w:p>
+            <w:pPr>
+              <w:rPr>
+                <w:b/>
+              </w:rPr>
+            </w:pPr>
+            <w:bookmarkStart w:id="74" w:name="_Toc134620913"/>
+            <w:r>
+              <w:rPr>
+                <w:b/>
+              </w:rPr>
+              <w:t>USt-Versteuerung</w:t>
+            </w:r>
+            <w:bookmarkEnd w:id="74"/>
           </w:p>
         </w:tc>
         <w:tc>
@@ -9823,14 +9908,14 @@
                 <w:b/>
               </w:rPr>
             </w:pPr>
-            <w:bookmarkStart w:id="73" w:name="_Toc134620912"/>
+            <w:bookmarkStart w:id="75" w:name="_Toc134620914"/>
             <w:r>
               <w:rPr>
                 <w:b/>
               </w:rPr>
-              <w:t>Wirtschaftsjahr</w:t>
-            </w:r>
-            <w:bookmarkEnd w:id="73"/>
+              <w:t>Steuerliche Organschaft</w:t>
+            </w:r>
+            <w:bookmarkEnd w:id="75"/>
           </w:p>
           <w:p>
             <w:pPr>
@@ -9838,14 +9923,6 @@
                 <w:b/>
               </w:rPr>
             </w:pPr>
-            <w:bookmarkStart w:id="74" w:name="_Toc134620913"/>
-            <w:r>
-              <w:rPr>
-                <w:b/>
-              </w:rPr>
-              <w:t>USt-Versteuerung</w:t>
-            </w:r>
-            <w:bookmarkEnd w:id="74"/>
           </w:p>
         </w:tc>
         <w:tc>
@@ -9872,14 +9949,14 @@
                 <w:b/>
               </w:rPr>
             </w:pPr>
-            <w:bookmarkStart w:id="75" w:name="_Toc134620914"/>
+            <w:bookmarkStart w:id="76" w:name="_Toc134620915"/>
             <w:r>
               <w:rPr>
                 <w:b/>
               </w:rPr>
-              <w:t>Steuerliche Organschaft</w:t>
-            </w:r>
-            <w:bookmarkEnd w:id="75"/>
+              <w:t>Letzter Jahresabschluss</w:t>
+            </w:r>
+            <w:bookmarkEnd w:id="76"/>
           </w:p>
           <w:p>
             <w:pPr>
@@ -9899,47 +9976,12 @@
                 <w:bCs/>
               </w:rPr>
             </w:pPr>
-          </w:p>
-        </w:tc>
-      </w:tr>
-      <w:tr>
-        <w:tc>
-          <w:tcPr>
-            <w:tcW w:w="3260" w:type="dxa"/>
-          </w:tcPr>
-          <w:p>
-            <w:pPr>
-              <w:rPr>
-                <w:b/>
-              </w:rPr>
-            </w:pPr>
-            <w:bookmarkStart w:id="76" w:name="_Toc134620915"/>
-            <w:r>
-              <w:rPr>
-                <w:b/>
-              </w:rPr>
-              <w:t>Letzter Jahresabschluss</w:t>
-            </w:r>
-            <w:bookmarkEnd w:id="76"/>
-          </w:p>
-          <w:p>
-            <w:pPr>
-              <w:rPr>
-                <w:b/>
-              </w:rPr>
-            </w:pPr>
-          </w:p>
-        </w:tc>
-        <w:tc>
-          <w:tcPr>
-            <w:tcW w:w="4985" w:type="dxa"/>
-          </w:tcPr>
-          <w:p>
-            <w:pPr>
+            <w:r>
               <w:rPr>
                 <w:bCs/>
               </w:rPr>
-            </w:pPr>
+              <w:t xml:space="preserve">FELD_Letzter_Jahresabschluss</w:t>
+            </w:r>
           </w:p>
         </w:tc>
       </w:tr>
@@ -10081,6 +10123,12 @@
                 <w:bCs/>
               </w:rPr>
             </w:pPr>
+            <w:r>
+              <w:rPr>
+                <w:bCs/>
+              </w:rPr>
+              <w:t xml:space="preserve">FELD_SVTraeger</w:t>
+            </w:r>
           </w:p>
         </w:tc>
       </w:tr>
@@ -10124,6 +10172,12 @@
                 <w:bCs/>
               </w:rPr>
             </w:pPr>
+            <w:r>
+              <w:rPr>
+                <w:bCs/>
+              </w:rPr>
+              <w:t xml:space="preserve">FELD_Betriebsnummer</w:t>
+            </w:r>
           </w:p>
         </w:tc>
       </w:tr>
@@ -10226,6 +10280,12 @@
                 <w:bCs/>
               </w:rPr>
             </w:pPr>
+            <w:r>
+              <w:rPr>
+                <w:bCs/>
+              </w:rPr>
+              <w:t xml:space="preserve">FELD_Aelteste_Forderung</w:t>
+            </w:r>
           </w:p>
         </w:tc>
       </w:tr>
@@ -10328,6 +10388,12 @@
                 <w:bCs/>
               </w:rPr>
             </w:pPr>
+            <w:r>
+              <w:rPr>
+                <w:bCs/>
+              </w:rPr>
+              <w:t xml:space="preserve">FELD_Steuerberater</w:t>
+            </w:r>
           </w:p>
         </w:tc>
       </w:tr>
@@ -10383,6 +10449,12 @@
                 <w:bCs/>
               </w:rPr>
             </w:pPr>
+            <w:r>
+              <w:rPr>
+                <w:bCs/>
+              </w:rPr>
+              <w:t xml:space="preserve">FELD_Bankverbindungen</w:t>
+            </w:r>
           </w:p>
         </w:tc>
       </w:tr>
@@ -10438,6 +10510,12 @@
                 <w:bCs/>
               </w:rPr>
             </w:pPr>
+            <w:r>
+              <w:rPr>
+                <w:bCs/>
+              </w:rPr>
+              <w:t xml:space="preserve">FELD_Anderkonto</w:t>
+            </w:r>
           </w:p>
         </w:tc>
       </w:tr>
@@ -10507,6 +10585,12 @@
                 <w:bCs/>
               </w:rPr>
             </w:pPr>
+            <w:r>
+              <w:rPr>
+                <w:bCs/>
+              </w:rPr>
+              <w:t xml:space="preserve">FELD_Gerichtsvollzieher</w:t>
+            </w:r>
           </w:p>
         </w:tc>
       </w:tr>

</xml_diff>

<commit_message>
refactor: rename FELD_* placeholders to KI_* to avoid Kanzleitool collision
The Kanzleimanagement-Tool fills FELD_* placeholders before the DOCX
reaches our pipeline. Using KI_* prefix avoids conflicts.

- Renamed all 76 mapping keys in gutachten-mapping.json
- Updated replaceFieldsInXml to detect KI_ prefix
- Updated all 3 DOCX templates (432 replacements in XML)
- Updated add-table-placeholders.py script
- Added rename-feld-to-ki.py migration script

Co-Authored-By: Claude Opus 4.6 (1M context) <noreply@anthropic.com>
</commit_message>
<xml_diff>
--- a/gutachtenvorlagen/Gutachten Muster Personengesellschaft.docx
+++ b/gutachtenvorlagen/Gutachten Muster Personengesellschaft.docx
@@ -54,10 +54,10 @@
       <w:r>
         <w:t xml:space="preserve">sverfahren über das Vermögen </w:t>
       </w:r>
-      <w:bookmarkStart w:id="1" w:name="FELD_Schuldner_Artikel"/>
+      <w:bookmarkStart w:id="1" w:name="KI_Schuldner_Artikel"/>
       <w:proofErr w:type="spellStart"/>
       <w:r>
-        <w:t>FELD_Schuldner_Artikel</w:t>
+        <w:t>KI_Schuldner_Artikel</w:t>
       </w:r>
       <w:bookmarkEnd w:id="1"/>
       <w:proofErr w:type="spellEnd"/>
@@ -73,13 +73,13 @@
           <w:b/>
         </w:rPr>
       </w:pPr>
-      <w:bookmarkStart w:id="2" w:name="FELD_Akte_Bezeichnung"/>
+      <w:bookmarkStart w:id="2" w:name="KI_Akte_Bezeichnung"/>
       <w:proofErr w:type="spellStart"/>
       <w:r>
         <w:rPr>
           <w:b/>
         </w:rPr>
-        <w:t>FELD_Akte_Bezeichnung</w:t>
+        <w:t>KI_Akte_Bezeichnung</w:t>
       </w:r>
       <w:bookmarkEnd w:id="2"/>
       <w:proofErr w:type="spellEnd"/>
@@ -103,13 +103,13 @@
           <w:b/>
         </w:rPr>
       </w:pPr>
-      <w:bookmarkStart w:id="3" w:name="FELD_Schuldner_Adr"/>
+      <w:bookmarkStart w:id="3" w:name="KI_Schuldner_Adr"/>
       <w:proofErr w:type="spellStart"/>
       <w:r>
         <w:rPr>
           <w:b/>
         </w:rPr>
-        <w:t>FELD_Schuldner_Adr</w:t>
+        <w:t>KI_Schuldner_Adr</w:t>
       </w:r>
       <w:bookmarkEnd w:id="3"/>
       <w:proofErr w:type="spellEnd"/>
@@ -145,10 +145,10 @@
       <w:r>
         <w:t xml:space="preserve">Amtsgericht </w:t>
       </w:r>
-      <w:bookmarkStart w:id="4" w:name="FELD_Gericht_Ort"/>
+      <w:bookmarkStart w:id="4" w:name="KI_Gericht_Ort"/>
       <w:proofErr w:type="spellStart"/>
       <w:r>
-        <w:t>FELD_Gericht_Ort</w:t>
+        <w:t>KI_Gericht_Ort</w:t>
       </w:r>
       <w:bookmarkEnd w:id="4"/>
       <w:proofErr w:type="spellEnd"/>
@@ -169,13 +169,13 @@
         </w:rPr>
         <w:t xml:space="preserve">- </w:t>
       </w:r>
-      <w:bookmarkStart w:id="5" w:name="FELD_Akte_GerichtAZ"/>
+      <w:bookmarkStart w:id="5" w:name="KI_Akte_GerichtAZ"/>
       <w:proofErr w:type="spellStart"/>
       <w:r>
         <w:rPr>
           <w:highlight w:val="yellow"/>
         </w:rPr>
-        <w:t>FELD_Akte_GerichtAZ</w:t>
+        <w:t>KI_Akte_GerichtAZ</w:t>
       </w:r>
       <w:bookmarkEnd w:id="5"/>
       <w:proofErr w:type="spellEnd"/>
@@ -247,7 +247,7 @@
         <w:tab/>
         <w:t xml:space="preserve">RA </w:t>
       </w:r>
-      <w:bookmarkStart w:id="6" w:name="FELD_Verwalter_Name"/>
+      <w:bookmarkStart w:id="6" w:name="KI_Verwalter_Name"/>
       <w:proofErr w:type="spellStart"/>
       <w:r>
         <w:rPr>
@@ -256,7 +256,7 @@
           <w:color w:val="000000"/>
           <w:lang w:eastAsia="de-DE"/>
         </w:rPr>
-        <w:t>FELD_Verwalter_Name</w:t>
+        <w:t>KI_Verwalter_Name</w:t>
       </w:r>
       <w:bookmarkEnd w:id="6"/>
       <w:proofErr w:type="spellEnd"/>
@@ -398,7 +398,7 @@
         </w:rPr>
         <w:tab/>
       </w:r>
-      <w:bookmarkStart w:id="7" w:name="FELD_Verwalter_Adr"/>
+      <w:bookmarkStart w:id="7" w:name="KI_Verwalter_Adr"/>
       <w:proofErr w:type="spellStart"/>
       <w:r>
         <w:rPr>
@@ -406,7 +406,7 @@
           <w:color w:val="000000"/>
           <w:lang w:eastAsia="de-DE"/>
         </w:rPr>
-        <w:t>FELD_Verwalter_Adr</w:t>
+        <w:t>KI_Verwalter_Adr</w:t>
       </w:r>
       <w:bookmarkEnd w:id="7"/>
       <w:proofErr w:type="spellEnd"/>
@@ -536,14 +536,14 @@
         </w:rPr>
         <w:t xml:space="preserve">Amtsgericht </w:t>
       </w:r>
-      <w:bookmarkStart w:id="8" w:name="FELD_Gericht_Ort_002"/>
+      <w:bookmarkStart w:id="8" w:name="KI_Gericht_Ort_002"/>
       <w:proofErr w:type="spellStart"/>
       <w:r>
         <w:rPr>
           <w:rFonts w:eastAsia="Times New Roman" w:cs="Arial"/>
           <w:lang w:eastAsia="de-DE"/>
         </w:rPr>
-        <w:t>FELD_Gericht_Ort</w:t>
+        <w:t>KI_Gericht_Ort</w:t>
       </w:r>
       <w:bookmarkEnd w:id="8"/>
       <w:proofErr w:type="spellEnd"/>
@@ -599,7 +599,7 @@
         </w:rPr>
         <w:tab/>
       </w:r>
-      <w:bookmarkStart w:id="9" w:name="FELD_Akte_GerichtAZ_002"/>
+      <w:bookmarkStart w:id="9" w:name="KI_Akte_GerichtAZ_002"/>
       <w:proofErr w:type="spellStart"/>
       <w:r>
         <w:rPr>
@@ -607,7 +607,7 @@
           <w:b/>
           <w:lang w:eastAsia="de-DE"/>
         </w:rPr>
-        <w:t>FELD_Akte_GerichtAZ</w:t>
+        <w:t>KI_Akte_GerichtAZ</w:t>
       </w:r>
       <w:bookmarkEnd w:id="9"/>
       <w:proofErr w:type="spellEnd"/>
@@ -7074,10 +7074,10 @@
       <w:r>
         <w:t xml:space="preserve">Das Amtsgericht </w:t>
       </w:r>
-      <w:bookmarkStart w:id="16" w:name="FELD_Gericht_Ort_003"/>
+      <w:bookmarkStart w:id="16" w:name="KI_Gericht_Ort_003"/>
       <w:proofErr w:type="spellStart"/>
       <w:r>
-        <w:t>FELD_Gericht_Ort</w:t>
+        <w:t>KI_Gericht_Ort</w:t>
       </w:r>
       <w:bookmarkEnd w:id="16"/>
       <w:proofErr w:type="spellEnd"/>
@@ -7087,20 +7087,20 @@
       <w:r>
         <w:t xml:space="preserve"> </w:t>
       </w:r>
-      <w:bookmarkStart w:id="17" w:name="FELD_Verwalter_den_die"/>
+      <w:bookmarkStart w:id="17" w:name="KI_Verwalter_den_die"/>
       <w:proofErr w:type="spellStart"/>
       <w:r>
-        <w:t>FELD_Verwalter_den_die</w:t>
+        <w:t>KI_Verwalter_den_die</w:t>
       </w:r>
       <w:bookmarkEnd w:id="17"/>
       <w:proofErr w:type="spellEnd"/>
       <w:r>
         <w:t xml:space="preserve"> </w:t>
       </w:r>
-      <w:bookmarkStart w:id="18" w:name="FELD_Verwalter_Unterzeichner"/>
+      <w:bookmarkStart w:id="18" w:name="KI_Verwalter_Unterzeichner"/>
       <w:proofErr w:type="spellStart"/>
       <w:r>
-        <w:t>FELD_Verwalter_Unterzeichner</w:t>
+        <w:t>KI_Verwalter_Unterzeichner</w:t>
       </w:r>
       <w:bookmarkEnd w:id="18"/>
       <w:proofErr w:type="spellEnd"/>
@@ -7110,13 +7110,13 @@
       <w:r>
         <w:t xml:space="preserve">mit Beschluss vom </w:t>
       </w:r>
-      <w:bookmarkStart w:id="19" w:name="FELD_Akte_BeschlussDat"/>
+      <w:bookmarkStart w:id="19" w:name="KI_Akte_BeschlussDat"/>
       <w:proofErr w:type="spellStart"/>
       <w:r>
         <w:rPr>
           <w:highlight w:val="yellow"/>
         </w:rPr>
-        <w:t>FELD_Akte_BeschlussDat</w:t>
+        <w:t>KI_Akte_BeschlussDat</w:t>
       </w:r>
       <w:bookmarkEnd w:id="19"/>
       <w:proofErr w:type="spellEnd"/>
@@ -7138,10 +7138,10 @@
       <w:r>
         <w:t xml:space="preserve">sverfahren über das Vermögen </w:t>
       </w:r>
-      <w:bookmarkStart w:id="20" w:name="FELD_Schuldner_Artikel_002"/>
+      <w:bookmarkStart w:id="20" w:name="KI_Schuldner_Artikel_002"/>
       <w:proofErr w:type="spellStart"/>
       <w:r>
-        <w:t>FELD_Schuldner_Artikel</w:t>
+        <w:t>KI_Schuldner_Artikel</w:t>
       </w:r>
       <w:bookmarkEnd w:id="20"/>
       <w:proofErr w:type="spellEnd"/>
@@ -7161,13 +7161,13 @@
           <w:b/>
         </w:rPr>
       </w:pPr>
-      <w:bookmarkStart w:id="21" w:name="FELD_Akte_Bezeichnung_002"/>
+      <w:bookmarkStart w:id="21" w:name="KI_Akte_Bezeichnung_002"/>
       <w:proofErr w:type="spellStart"/>
       <w:r>
         <w:rPr>
           <w:b/>
         </w:rPr>
-        <w:t>FELD_Akte_Bezeichnung</w:t>
+        <w:t>KI_Akte_Bezeichnung</w:t>
       </w:r>
       <w:bookmarkEnd w:id="21"/>
       <w:proofErr w:type="spellEnd"/>
@@ -7258,20 +7258,20 @@
       <w:r>
         <w:t xml:space="preserve"> </w:t>
       </w:r>
-      <w:bookmarkStart w:id="22" w:name="FELD_Verwalter_der_die"/>
+      <w:bookmarkStart w:id="22" w:name="KI_Verwalter_der_die"/>
       <w:proofErr w:type="spellStart"/>
       <w:r>
-        <w:t>FELD_Verwalter_der_die</w:t>
+        <w:t>KI_Verwalter_der_die</w:t>
       </w:r>
       <w:bookmarkEnd w:id="22"/>
       <w:proofErr w:type="spellEnd"/>
       <w:r>
         <w:t xml:space="preserve"> </w:t>
       </w:r>
-      <w:bookmarkStart w:id="23" w:name="FELD_Verwalter_Unterzeichner_002"/>
+      <w:bookmarkStart w:id="23" w:name="KI_Verwalter_Unterzeichner_002"/>
       <w:proofErr w:type="spellStart"/>
       <w:r>
-        <w:t>FELD_Verwalter_Unterzeichner</w:t>
+        <w:t>KI_Verwalter_Unterzeichner</w:t>
       </w:r>
       <w:bookmarkEnd w:id="23"/>
       <w:proofErr w:type="spellEnd"/>
@@ -7397,20 +7397,20 @@
       <w:r>
         <w:t xml:space="preserve"> </w:t>
       </w:r>
-      <w:bookmarkStart w:id="28" w:name="FELD_Verwalter_dem_der"/>
+      <w:bookmarkStart w:id="28" w:name="KI_Verwalter_dem_der"/>
       <w:proofErr w:type="spellStart"/>
       <w:r>
-        <w:t>FELD_Verwalter_dem_der</w:t>
+        <w:t>KI_Verwalter_dem_der</w:t>
       </w:r>
       <w:bookmarkEnd w:id="28"/>
       <w:proofErr w:type="spellEnd"/>
       <w:r>
         <w:t xml:space="preserve"> </w:t>
       </w:r>
-      <w:bookmarkStart w:id="29" w:name="FELD_Verwalter_Unterzeichner_003"/>
+      <w:bookmarkStart w:id="29" w:name="KI_Verwalter_Unterzeichner_003"/>
       <w:proofErr w:type="spellStart"/>
       <w:r>
-        <w:t>FELD_Verwalter_Unterzeichner</w:t>
+        <w:t>KI_Verwalter_Unterzeichner</w:t>
       </w:r>
       <w:bookmarkEnd w:id="29"/>
       <w:proofErr w:type="spellEnd"/>
@@ -7454,20 +7454,20 @@
       <w:r>
         <w:t xml:space="preserve"> </w:t>
       </w:r>
-      <w:bookmarkStart w:id="30" w:name="FELD_Verwalter_dem_der_002"/>
+      <w:bookmarkStart w:id="30" w:name="KI_Verwalter_dem_der_002"/>
       <w:proofErr w:type="spellStart"/>
       <w:r>
-        <w:t>FELD_Verwalter_dem_der</w:t>
+        <w:t>KI_Verwalter_dem_der</w:t>
       </w:r>
       <w:bookmarkEnd w:id="30"/>
       <w:proofErr w:type="spellEnd"/>
       <w:r>
         <w:t xml:space="preserve"> </w:t>
       </w:r>
-      <w:bookmarkStart w:id="31" w:name="FELD_Verwalter_Unterzeichner_011"/>
+      <w:bookmarkStart w:id="31" w:name="KI_Verwalter_Unterzeichner_011"/>
       <w:proofErr w:type="spellStart"/>
       <w:r>
-        <w:t>FELD_Verwalter_Unterzeichner</w:t>
+        <w:t>KI_Verwalter_Unterzeichner</w:t>
       </w:r>
       <w:bookmarkEnd w:id="31"/>
       <w:proofErr w:type="spellEnd"/>
@@ -7532,13 +7532,13 @@
       <w:pPr>
         <w:ind w:left="720"/>
       </w:pPr>
-      <w:bookmarkStart w:id="32" w:name="FELD_Verwalter_Der_Die_Groß"/>
+      <w:bookmarkStart w:id="32" w:name="KI_Verwalter_Der_Die_Groß"/>
       <w:proofErr w:type="spellStart"/>
       <w:r>
         <w:rPr>
           <w:highlight w:val="yellow"/>
         </w:rPr>
-        <w:t>FELD_Verwalter_Der_Die_Groß</w:t>
+        <w:t>KI_Verwalter_Der_Die_Groß</w:t>
       </w:r>
       <w:bookmarkEnd w:id="32"/>
       <w:proofErr w:type="spellEnd"/>
@@ -7548,13 +7548,13 @@
         </w:rPr>
         <w:t xml:space="preserve"> </w:t>
       </w:r>
-      <w:bookmarkStart w:id="33" w:name="FELD_Verwalter_Unterzeichner_005"/>
+      <w:bookmarkStart w:id="33" w:name="KI_Verwalter_Unterzeichner_005"/>
       <w:proofErr w:type="spellStart"/>
       <w:r>
         <w:rPr>
           <w:highlight w:val="yellow"/>
         </w:rPr>
-        <w:t>FELD_Verwalter_Unterzeichner</w:t>
+        <w:t>KI_Verwalter_Unterzeichner</w:t>
       </w:r>
       <w:bookmarkEnd w:id="33"/>
       <w:proofErr w:type="spellEnd"/>
@@ -7617,20 +7617,20 @@
       <w:r>
         <w:t xml:space="preserve"> </w:t>
       </w:r>
-      <w:bookmarkStart w:id="35" w:name="FELD_Verwalter_den_die_002"/>
+      <w:bookmarkStart w:id="35" w:name="KI_Verwalter_den_die_002"/>
       <w:proofErr w:type="spellStart"/>
       <w:r>
-        <w:t>FELD_Verwalter_den_die</w:t>
+        <w:t>KI_Verwalter_den_die</w:t>
       </w:r>
       <w:bookmarkEnd w:id="35"/>
       <w:proofErr w:type="spellEnd"/>
       <w:r>
         <w:t xml:space="preserve"> </w:t>
       </w:r>
-      <w:bookmarkStart w:id="36" w:name="FELD_Verwalter_Unterzeichner_006"/>
+      <w:bookmarkStart w:id="36" w:name="KI_Verwalter_Unterzeichner_006"/>
       <w:proofErr w:type="spellStart"/>
       <w:r>
-        <w:t>FELD_Verwalter_Unterzeichner</w:t>
+        <w:t>KI_Verwalter_Unterzeichner</w:t>
       </w:r>
       <w:bookmarkEnd w:id="36"/>
       <w:proofErr w:type="spellEnd"/>
@@ -7903,13 +7903,13 @@
         </w:rPr>
         <w:t xml:space="preserve">i </w:t>
       </w:r>
-      <w:bookmarkStart w:id="42" w:name="FELD_Verwalter_des_der_002"/>
+      <w:bookmarkStart w:id="42" w:name="KI_Verwalter_des_der_002"/>
       <w:proofErr w:type="spellStart"/>
       <w:r>
         <w:rPr>
           <w:highlight w:val="yellow"/>
         </w:rPr>
-        <w:t>FELD_Verwalter_des_</w:t>
+        <w:t>KI_Verwalter_des_</w:t>
       </w:r>
       <w:proofErr w:type="gramStart"/>
       <w:r>
@@ -7926,7 +7926,7 @@
         </w:rPr>
         <w:t xml:space="preserve">  </w:t>
       </w:r>
-      <w:bookmarkStart w:id="43" w:name="FELD_Verwalter_Unterzeichner_Genitiv_002"/>
+      <w:bookmarkStart w:id="43" w:name="KI_Verwalter_Unterzeichner_Genitiv_002"/>
       <w:proofErr w:type="spellStart"/>
       <w:r>
         <w:rPr>
@@ -8622,7 +8622,7 @@
               <w:rPr>
                 <w:rFonts w:cs="Arial"/>
               </w:rPr>
-              <w:t xml:space="preserve">FELD_Antragsteller_Name</w:t>
+              <w:t xml:space="preserve">KI_Antragsteller_Name</w:t>
             </w:r>
           </w:p>
         </w:tc>
@@ -8686,7 +8686,7 @@
               <w:rPr>
                 <w:rFonts w:cs="Arial"/>
               </w:rPr>
-              <w:t xml:space="preserve">FELD_Verfahren_Eroeffnungsgrund</w:t>
+              <w:t xml:space="preserve">KI_Verfahren_Eroeffnungsgrund</w:t>
             </w:r>
           </w:p>
         </w:tc>
@@ -8987,7 +8987,7 @@
               <w:rPr>
                 <w:rFonts w:cs="Arial"/>
               </w:rPr>
-              <w:t xml:space="preserve">FELD_Schuldner_Firma</w:t>
+              <w:t xml:space="preserve">KI_Schuldner_Firma</w:t>
             </w:r>
           </w:p>
         </w:tc>
@@ -9051,7 +9051,7 @@
               <w:rPr>
                 <w:rFonts w:cs="Arial"/>
               </w:rPr>
-              <w:t xml:space="preserve">FELD_Arbeitnehmer_Anzahl</w:t>
+              <w:t xml:space="preserve">KI_Arbeitnehmer_Anzahl</w:t>
             </w:r>
           </w:p>
         </w:tc>
@@ -9796,7 +9796,7 @@
               <w:rPr>
                 <w:bCs/>
               </w:rPr>
-              <w:t xml:space="preserve">FELD_Finanzamt</w:t>
+              <w:t xml:space="preserve">KI_Finanzamt</w:t>
             </w:r>
           </w:p>
         </w:tc>
@@ -9843,7 +9843,7 @@
               <w:rPr>
                 <w:bCs/>
               </w:rPr>
-              <w:t xml:space="preserve">FELD_Steuernummer</w:t>
+              <w:t xml:space="preserve">KI_Steuernummer</w:t>
             </w:r>
           </w:p>
         </w:tc>
@@ -9980,7 +9980,7 @@
               <w:rPr>
                 <w:bCs/>
               </w:rPr>
-              <w:t xml:space="preserve">FELD_Letzter_Jahresabschluss</w:t>
+              <w:t xml:space="preserve">KI_Letzter_Jahresabschluss</w:t>
             </w:r>
           </w:p>
         </w:tc>
@@ -10127,7 +10127,7 @@
               <w:rPr>
                 <w:bCs/>
               </w:rPr>
-              <w:t xml:space="preserve">FELD_SVTraeger</w:t>
+              <w:t xml:space="preserve">KI_SVTraeger</w:t>
             </w:r>
           </w:p>
         </w:tc>
@@ -10176,7 +10176,7 @@
               <w:rPr>
                 <w:bCs/>
               </w:rPr>
-              <w:t xml:space="preserve">FELD_Betriebsnummer</w:t>
+              <w:t xml:space="preserve">KI_Betriebsnummer</w:t>
             </w:r>
           </w:p>
         </w:tc>
@@ -10284,7 +10284,7 @@
               <w:rPr>
                 <w:bCs/>
               </w:rPr>
-              <w:t xml:space="preserve">FELD_Aelteste_Forderung</w:t>
+              <w:t xml:space="preserve">KI_Aelteste_Forderung</w:t>
             </w:r>
           </w:p>
         </w:tc>
@@ -10392,7 +10392,7 @@
               <w:rPr>
                 <w:bCs/>
               </w:rPr>
-              <w:t xml:space="preserve">FELD_Steuerberater</w:t>
+              <w:t xml:space="preserve">KI_Steuerberater</w:t>
             </w:r>
           </w:p>
         </w:tc>
@@ -10453,7 +10453,7 @@
               <w:rPr>
                 <w:bCs/>
               </w:rPr>
-              <w:t xml:space="preserve">FELD_Bankverbindungen</w:t>
+              <w:t xml:space="preserve">KI_Bankverbindungen</w:t>
             </w:r>
           </w:p>
         </w:tc>
@@ -10514,7 +10514,7 @@
               <w:rPr>
                 <w:bCs/>
               </w:rPr>
-              <w:t xml:space="preserve">FELD_Anderkonto</w:t>
+              <w:t xml:space="preserve">KI_Anderkonto</w:t>
             </w:r>
           </w:p>
         </w:tc>
@@ -10589,7 +10589,7 @@
               <w:rPr>
                 <w:bCs/>
               </w:rPr>
-              <w:t xml:space="preserve">FELD_Gerichtsvollzieher</w:t>
+              <w:t xml:space="preserve">KI_Gerichtsvollzieher</w:t>
             </w:r>
           </w:p>
         </w:tc>
@@ -10674,30 +10674,30 @@
       <w:r>
         <w:t xml:space="preserve"> </w:t>
       </w:r>
-      <w:bookmarkStart w:id="93" w:name="FELD_Verwalter_den_die_003"/>
+      <w:bookmarkStart w:id="93" w:name="KI_Verwalter_den_die_003"/>
       <w:proofErr w:type="spellStart"/>
       <w:r>
-        <w:t>FELD_Verwalter_den_die</w:t>
+        <w:t>KI_Verwalter_den_die</w:t>
       </w:r>
       <w:bookmarkEnd w:id="93"/>
       <w:proofErr w:type="spellEnd"/>
       <w:r>
         <w:t xml:space="preserve"> </w:t>
       </w:r>
-      <w:bookmarkStart w:id="94" w:name="FELD_Verwalter_Unterzeichner_007"/>
+      <w:bookmarkStart w:id="94" w:name="KI_Verwalter_Unterzeichner_007"/>
       <w:proofErr w:type="spellStart"/>
       <w:r>
-        <w:t>FELD_Verwalter_Unterzeichner</w:t>
+        <w:t>KI_Verwalter_Unterzeichner</w:t>
       </w:r>
       <w:bookmarkEnd w:id="94"/>
       <w:proofErr w:type="spellEnd"/>
       <w:r>
         <w:t xml:space="preserve"> </w:t>
       </w:r>
-      <w:bookmarkStart w:id="95" w:name="FELD_Verwalter_zum_zur"/>
+      <w:bookmarkStart w:id="95" w:name="KI_Verwalter_zum_zur"/>
       <w:proofErr w:type="spellStart"/>
       <w:r>
-        <w:t>FELD_Verwalter_zum_zur</w:t>
+        <w:t>KI_Verwalter_zum_zur</w:t>
       </w:r>
       <w:bookmarkEnd w:id="95"/>
       <w:proofErr w:type="spellEnd"/>
@@ -10713,13 +10713,13 @@
         </w:rPr>
         <w:t xml:space="preserve">und mit Beschluss vom </w:t>
       </w:r>
-      <w:bookmarkStart w:id="96" w:name="FELD_Akte_VorlVerfahrDat"/>
+      <w:bookmarkStart w:id="96" w:name="KI_Akte_VorlVerfahrDat"/>
       <w:proofErr w:type="spellStart"/>
       <w:r>
         <w:rPr>
           <w:highlight w:val="yellow"/>
         </w:rPr>
-        <w:t>FELD_Akte_VorlVerfahrDat</w:t>
+        <w:t>KI_Akte_VorlVerfahrDat</w:t>
       </w:r>
       <w:bookmarkEnd w:id="96"/>
       <w:proofErr w:type="spellEnd"/>
@@ -11242,20 +11242,20 @@
       <w:r>
         <w:t xml:space="preserve"> </w:t>
       </w:r>
-      <w:bookmarkStart w:id="104" w:name="FELD_Verwalter_Der_Die_Groß_002"/>
+      <w:bookmarkStart w:id="104" w:name="KI_Verwalter_Der_Die_Groß_002"/>
       <w:proofErr w:type="spellStart"/>
       <w:r>
-        <w:t>FELD_Verwalter_Der_Die_Groß</w:t>
+        <w:t>KI_Verwalter_Der_Die_Groß</w:t>
       </w:r>
       <w:bookmarkEnd w:id="104"/>
       <w:proofErr w:type="spellEnd"/>
       <w:r>
         <w:t xml:space="preserve"> </w:t>
       </w:r>
-      <w:bookmarkStart w:id="105" w:name="FELD_Verwalter_Unterzeichner_008"/>
+      <w:bookmarkStart w:id="105" w:name="KI_Verwalter_Unterzeichner_008"/>
       <w:proofErr w:type="spellStart"/>
       <w:r>
-        <w:t>FELD_Verwalter_Unterzeichner</w:t>
+        <w:t>KI_Verwalter_Unterzeichner</w:t>
       </w:r>
       <w:bookmarkEnd w:id="105"/>
       <w:proofErr w:type="spellEnd"/>
@@ -11268,10 +11268,10 @@
       <w:r>
         <w:t xml:space="preserve"> </w:t>
       </w:r>
-      <w:bookmarkStart w:id="106" w:name="FELD_Verwalter_zum_zur_002"/>
+      <w:bookmarkStart w:id="106" w:name="KI_Verwalter_zum_zur_002"/>
       <w:proofErr w:type="spellStart"/>
       <w:r>
-        <w:t>FELD_Verwalter_zum_zur</w:t>
+        <w:t>KI_Verwalter_zum_zur</w:t>
       </w:r>
       <w:bookmarkEnd w:id="106"/>
       <w:proofErr w:type="spellEnd"/>
@@ -11376,20 +11376,20 @@
       <w:r>
         <w:t xml:space="preserve"> </w:t>
       </w:r>
-      <w:bookmarkStart w:id="109" w:name="FELD_Verwalter_der_die_002"/>
+      <w:bookmarkStart w:id="109" w:name="KI_Verwalter_der_die_002"/>
       <w:proofErr w:type="spellStart"/>
       <w:r>
-        <w:t>FELD_Verwalter_der_die</w:t>
+        <w:t>KI_Verwalter_der_die</w:t>
       </w:r>
       <w:bookmarkEnd w:id="109"/>
       <w:proofErr w:type="spellEnd"/>
       <w:r>
         <w:t xml:space="preserve"> </w:t>
       </w:r>
-      <w:bookmarkStart w:id="110" w:name="FELD_Verwalter_Unterzeichner_009"/>
+      <w:bookmarkStart w:id="110" w:name="KI_Verwalter_Unterzeichner_009"/>
       <w:proofErr w:type="spellStart"/>
       <w:r>
-        <w:t>FELD_Verwalter_Unterzeichner</w:t>
+        <w:t>KI_Verwalter_Unterzeichner</w:t>
       </w:r>
       <w:bookmarkEnd w:id="110"/>
       <w:proofErr w:type="spellEnd"/>
@@ -11847,7 +11847,7 @@
         </w:rPr>
         <w:t xml:space="preserve"> </w:t>
       </w:r>
-      <w:bookmarkStart w:id="124" w:name="FELD_Verwalter_Der_Die_Groß_003"/>
+      <w:bookmarkStart w:id="124" w:name="KI_Verwalter_Der_Die_Groß_003"/>
       <w:proofErr w:type="spellStart"/>
       <w:r>
         <w:rPr>
@@ -11855,7 +11855,7 @@
           <w:color w:val="000000"/>
           <w:lang w:eastAsia="de-DE"/>
         </w:rPr>
-        <w:t>FELD_Verwalter_Der_Die_Groß</w:t>
+        <w:t>KI_Verwalter_Der_Die_Groß</w:t>
       </w:r>
       <w:bookmarkEnd w:id="124"/>
       <w:proofErr w:type="spellEnd"/>
@@ -11867,7 +11867,7 @@
         </w:rPr>
         <w:t xml:space="preserve"> </w:t>
       </w:r>
-      <w:bookmarkStart w:id="125" w:name="FELD_Verwalter_Unterzeichner_010"/>
+      <w:bookmarkStart w:id="125" w:name="KI_Verwalter_Unterzeichner_010"/>
       <w:proofErr w:type="spellStart"/>
       <w:r>
         <w:rPr>
@@ -11875,7 +11875,7 @@
           <w:color w:val="000000"/>
           <w:lang w:eastAsia="de-DE"/>
         </w:rPr>
-        <w:t>FELD_Verwalter_Unterzeichner</w:t>
+        <w:t>KI_Verwalter_Unterzeichner</w:t>
       </w:r>
       <w:bookmarkEnd w:id="125"/>
       <w:proofErr w:type="spellEnd"/>
@@ -12302,7 +12302,7 @@
           <w:lang w:eastAsia="de-DE"/>
         </w:rPr>
       </w:pPr>
-      <w:bookmarkStart w:id="146" w:name="FELD_Schuldner_Der_Die_Groß"/>
+      <w:bookmarkStart w:id="146" w:name="KI_Schuldner_Der_Die_Groß"/>
       <w:bookmarkStart w:id="147" w:name="_Hlk77953401"/>
       <w:proofErr w:type="spellStart"/>
       <w:r>
@@ -12311,7 +12311,7 @@
           <w:color w:val="000000"/>
           <w:lang w:eastAsia="de-DE"/>
         </w:rPr>
-        <w:t>FELD_Schuldner_Der_Die_Groß</w:t>
+        <w:t>KI_Schuldner_Der_Die_Groß</w:t>
       </w:r>
       <w:bookmarkEnd w:id="146"/>
       <w:proofErr w:type="spellEnd"/>
@@ -12323,7 +12323,7 @@
         </w:rPr>
         <w:t xml:space="preserve"> </w:t>
       </w:r>
-      <w:bookmarkStart w:id="148" w:name="FELD_Schuldner_Schuldnerin"/>
+      <w:bookmarkStart w:id="148" w:name="KI_Schuldner_Schuldnerin"/>
       <w:proofErr w:type="spellStart"/>
       <w:r>
         <w:rPr>
@@ -12331,7 +12331,7 @@
           <w:color w:val="000000"/>
           <w:lang w:eastAsia="de-DE"/>
         </w:rPr>
-        <w:t>FELD_Schuldner_Schuldnerin</w:t>
+        <w:t>KI_Schuldner_Schuldnerin</w:t>
       </w:r>
       <w:bookmarkEnd w:id="148"/>
       <w:proofErr w:type="spellEnd"/>
@@ -12367,7 +12367,7 @@
         </w:rPr>
         <w:t xml:space="preserve"> </w:t>
       </w:r>
-      <w:bookmarkStart w:id="149" w:name="FELD_Verwalter_Der_Die_Groß_004"/>
+      <w:bookmarkStart w:id="149" w:name="KI_Verwalter_Der_Die_Groß_004"/>
       <w:proofErr w:type="spellStart"/>
       <w:r>
         <w:rPr>
@@ -12375,7 +12375,7 @@
           <w:color w:val="000000"/>
           <w:lang w:eastAsia="de-DE"/>
         </w:rPr>
-        <w:t>FELD_Verwalter_Der_Die_Groß</w:t>
+        <w:t>KI_Verwalter_Der_Die_Groß</w:t>
       </w:r>
       <w:bookmarkEnd w:id="149"/>
       <w:proofErr w:type="spellEnd"/>
@@ -12387,7 +12387,7 @@
         </w:rPr>
         <w:t xml:space="preserve"> </w:t>
       </w:r>
-      <w:bookmarkStart w:id="150" w:name="FELD_Verwalter_Unterzeichner_012"/>
+      <w:bookmarkStart w:id="150" w:name="KI_Verwalter_Unterzeichner_012"/>
       <w:proofErr w:type="spellStart"/>
       <w:r>
         <w:rPr>
@@ -12395,7 +12395,7 @@
           <w:color w:val="000000"/>
           <w:lang w:eastAsia="de-DE"/>
         </w:rPr>
-        <w:t>FELD_Verwalter_Unterzeichner</w:t>
+        <w:t>KI_Verwalter_Unterzeichner</w:t>
       </w:r>
       <w:bookmarkEnd w:id="150"/>
       <w:proofErr w:type="spellEnd"/>
@@ -13535,13 +13535,13 @@
         </w:rPr>
         <w:t xml:space="preserve"> </w:t>
       </w:r>
-      <w:bookmarkStart w:id="171" w:name="FELD_Verwalter_der_die_003"/>
+      <w:bookmarkStart w:id="171" w:name="KI_Verwalter_der_die_003"/>
       <w:proofErr w:type="spellStart"/>
       <w:r>
         <w:rPr>
           <w:lang w:eastAsia="de-DE"/>
         </w:rPr>
-        <w:t>FELD_Verwalter_der_die</w:t>
+        <w:t>KI_Verwalter_der_die</w:t>
       </w:r>
       <w:bookmarkEnd w:id="171"/>
       <w:proofErr w:type="spellEnd"/>
@@ -13551,13 +13551,13 @@
         </w:rPr>
         <w:t xml:space="preserve"> </w:t>
       </w:r>
-      <w:bookmarkStart w:id="172" w:name="FELD_Verwalter_Unterzeichner_013"/>
+      <w:bookmarkStart w:id="172" w:name="KI_Verwalter_Unterzeichner_013"/>
       <w:proofErr w:type="spellStart"/>
       <w:r>
         <w:rPr>
           <w:lang w:eastAsia="de-DE"/>
         </w:rPr>
-        <w:t>FELD_Verwalter_Unterzeichner</w:t>
+        <w:t>KI_Verwalter_Unterzeichner</w:t>
       </w:r>
       <w:bookmarkEnd w:id="172"/>
       <w:proofErr w:type="spellEnd"/>
@@ -13579,13 +13579,13 @@
         </w:rPr>
         <w:t xml:space="preserve"> </w:t>
       </w:r>
-      <w:bookmarkStart w:id="173" w:name="FELD_Verwalter_der_die_004"/>
+      <w:bookmarkStart w:id="173" w:name="KI_Verwalter_der_die_004"/>
       <w:proofErr w:type="spellStart"/>
       <w:r>
         <w:rPr>
           <w:lang w:eastAsia="de-DE"/>
         </w:rPr>
-        <w:t>FELD_Verwalter_der_die</w:t>
+        <w:t>KI_Verwalter_der_die</w:t>
       </w:r>
       <w:bookmarkEnd w:id="173"/>
       <w:proofErr w:type="spellEnd"/>
@@ -13595,13 +13595,13 @@
         </w:rPr>
         <w:t xml:space="preserve"> </w:t>
       </w:r>
-      <w:bookmarkStart w:id="174" w:name="FELD_Verwalter_Unterzeichner_014"/>
+      <w:bookmarkStart w:id="174" w:name="KI_Verwalter_Unterzeichner_014"/>
       <w:proofErr w:type="spellStart"/>
       <w:r>
         <w:rPr>
           <w:lang w:eastAsia="de-DE"/>
         </w:rPr>
-        <w:t>FELD_Verwalter_Unterzeichner</w:t>
+        <w:t>KI_Verwalter_Unterzeichner</w:t>
       </w:r>
       <w:bookmarkEnd w:id="174"/>
       <w:proofErr w:type="spellEnd"/>
@@ -13804,7 +13804,7 @@
           <w:lang w:eastAsia="de-DE"/>
         </w:rPr>
       </w:pPr>
-      <w:bookmarkStart w:id="178" w:name="FELD_Verwalter_Der_Die_Groß_005"/>
+      <w:bookmarkStart w:id="178" w:name="KI_Verwalter_Der_Die_Groß_005"/>
       <w:proofErr w:type="spellStart"/>
       <w:r>
         <w:rPr>
@@ -13812,7 +13812,7 @@
           <w:color w:val="000000"/>
           <w:lang w:eastAsia="de-DE"/>
         </w:rPr>
-        <w:t>FELD_Verwalter_Der_Die_Groß</w:t>
+        <w:t>KI_Verwalter_Der_Die_Groß</w:t>
       </w:r>
       <w:bookmarkEnd w:id="178"/>
       <w:proofErr w:type="spellEnd"/>
@@ -13824,7 +13824,7 @@
         </w:rPr>
         <w:t xml:space="preserve"> </w:t>
       </w:r>
-      <w:bookmarkStart w:id="179" w:name="FELD_Verwalter_Unterzeichner_015"/>
+      <w:bookmarkStart w:id="179" w:name="KI_Verwalter_Unterzeichner_015"/>
       <w:proofErr w:type="spellStart"/>
       <w:r>
         <w:rPr>
@@ -13832,7 +13832,7 @@
           <w:color w:val="000000"/>
           <w:lang w:eastAsia="de-DE"/>
         </w:rPr>
-        <w:t>FELD_Verwalter_Unterzeichner</w:t>
+        <w:t>KI_Verwalter_Unterzeichner</w:t>
       </w:r>
       <w:bookmarkEnd w:id="179"/>
       <w:proofErr w:type="spellEnd"/>
@@ -14212,20 +14212,20 @@
       <w:r>
         <w:t xml:space="preserve"> </w:t>
       </w:r>
-      <w:bookmarkStart w:id="190" w:name="FELD_Verwalter_der_die_005"/>
+      <w:bookmarkStart w:id="190" w:name="KI_Verwalter_der_die_005"/>
       <w:proofErr w:type="spellStart"/>
       <w:r>
-        <w:t>FELD_Verwalter_der_die</w:t>
+        <w:t>KI_Verwalter_der_die</w:t>
       </w:r>
       <w:bookmarkEnd w:id="190"/>
       <w:proofErr w:type="spellEnd"/>
       <w:r>
         <w:t xml:space="preserve"> </w:t>
       </w:r>
-      <w:bookmarkStart w:id="191" w:name="FELD_Verwalter_Unterzeichner_016"/>
+      <w:bookmarkStart w:id="191" w:name="KI_Verwalter_Unterzeichner_016"/>
       <w:proofErr w:type="spellStart"/>
       <w:r>
-        <w:t>FELD_Verwalter_Unterzeichner</w:t>
+        <w:t>KI_Verwalter_Unterzeichner</w:t>
       </w:r>
       <w:bookmarkEnd w:id="191"/>
       <w:proofErr w:type="spellEnd"/>
@@ -14283,20 +14283,20 @@
       <w:r>
         <w:t xml:space="preserve"> </w:t>
       </w:r>
-      <w:bookmarkStart w:id="193" w:name="FELD_Verwalter_der_die_006"/>
+      <w:bookmarkStart w:id="193" w:name="KI_Verwalter_der_die_006"/>
       <w:proofErr w:type="spellStart"/>
       <w:r>
-        <w:t>FELD_Verwalter_der_die</w:t>
+        <w:t>KI_Verwalter_der_die</w:t>
       </w:r>
       <w:bookmarkEnd w:id="193"/>
       <w:proofErr w:type="spellEnd"/>
       <w:r>
         <w:t xml:space="preserve"> </w:t>
       </w:r>
-      <w:bookmarkStart w:id="194" w:name="FELD_Verwalter_Unterzeichner_017"/>
+      <w:bookmarkStart w:id="194" w:name="KI_Verwalter_Unterzeichner_017"/>
       <w:proofErr w:type="spellStart"/>
       <w:r>
-        <w:t>FELD_Verwalter_Unterzeichner</w:t>
+        <w:t>KI_Verwalter_Unterzeichner</w:t>
       </w:r>
       <w:bookmarkEnd w:id="194"/>
       <w:proofErr w:type="spellEnd"/>
@@ -15291,13 +15291,13 @@
         </w:rPr>
         <w:t xml:space="preserve">Der Unterzeichner hat bei der </w:t>
       </w:r>
-      <w:bookmarkStart w:id="210" w:name="FELD_Anderkonto_Bank"/>
+      <w:bookmarkStart w:id="210" w:name="KI_Anderkonto_Bank"/>
       <w:proofErr w:type="spellStart"/>
       <w:r>
         <w:rPr>
           <w:rFonts w:cs="Arial"/>
         </w:rPr>
-        <w:t>FELD_Anderkonto_Bank</w:t>
+        <w:t>KI_Anderkonto_Bank</w:t>
       </w:r>
       <w:bookmarkEnd w:id="210"/>
       <w:proofErr w:type="spellEnd"/>
@@ -15307,12 +15307,12 @@
         </w:rPr>
         <w:t xml:space="preserve"> ein Insolvenz-Sonderkonto mit der IBAN: </w:t>
       </w:r>
-      <w:bookmarkStart w:id="211" w:name="FELD_ANDERKONTO_IBAN"/>
+      <w:bookmarkStart w:id="211" w:name="KI_ANDERKONTO_IBAN"/>
       <w:r>
         <w:rPr>
           <w:rFonts w:cs="Arial"/>
         </w:rPr>
-        <w:t>FELD_ANDERKONTO_IBAN</w:t>
+        <w:t>KI_ANDERKONTO_IBAN</w:t>
       </w:r>
       <w:bookmarkEnd w:id="211"/>
       <w:r>
@@ -16783,20 +16783,20 @@
       <w:r>
         <w:t xml:space="preserve"> </w:t>
       </w:r>
-      <w:bookmarkStart w:id="237" w:name="FELD_Verwalter_des_der_003"/>
+      <w:bookmarkStart w:id="237" w:name="KI_Verwalter_des_der_003"/>
       <w:proofErr w:type="spellStart"/>
       <w:r>
-        <w:t>FELD_Verwalter_des_der</w:t>
+        <w:t>KI_Verwalter_des_der</w:t>
       </w:r>
       <w:bookmarkEnd w:id="237"/>
       <w:proofErr w:type="spellEnd"/>
       <w:r>
         <w:t xml:space="preserve"> </w:t>
       </w:r>
-      <w:bookmarkStart w:id="238" w:name="FELD_Verwalter_Unterzeichner_Genitiv_003"/>
+      <w:bookmarkStart w:id="238" w:name="KI_Verwalter_Unterzeichner_Genitiv_003"/>
       <w:proofErr w:type="spellStart"/>
       <w:r>
-        <w:t>FELD_Verwalter_Unterzeichner_Genitiv</w:t>
+        <w:t>KI_Verwalter_Unterzeichner_Genitiv</w:t>
       </w:r>
       <w:bookmarkEnd w:id="238"/>
       <w:proofErr w:type="spellEnd"/>
@@ -16873,13 +16873,13 @@
         </w:rPr>
         <w:t xml:space="preserve"> </w:t>
       </w:r>
-      <w:bookmarkStart w:id="239" w:name="FELD_Verwalter_der_die_007"/>
+      <w:bookmarkStart w:id="239" w:name="KI_Verwalter_der_die_007"/>
       <w:proofErr w:type="spellStart"/>
       <w:r>
         <w:rPr>
           <w:highlight w:val="yellow"/>
         </w:rPr>
-        <w:t>FELD_Verwalter_der_die</w:t>
+        <w:t>KI_Verwalter_der_die</w:t>
       </w:r>
       <w:bookmarkEnd w:id="239"/>
       <w:proofErr w:type="spellEnd"/>
@@ -16889,13 +16889,13 @@
         </w:rPr>
         <w:t xml:space="preserve"> </w:t>
       </w:r>
-      <w:bookmarkStart w:id="240" w:name="FELD_Verwalter_Unterzeichner_018"/>
+      <w:bookmarkStart w:id="240" w:name="KI_Verwalter_Unterzeichner_018"/>
       <w:proofErr w:type="spellStart"/>
       <w:r>
         <w:rPr>
           <w:highlight w:val="yellow"/>
         </w:rPr>
-        <w:t>FELD_Verwalter_Unterzeichner</w:t>
+        <w:t>KI_Verwalter_Unterzeichner</w:t>
       </w:r>
       <w:bookmarkEnd w:id="240"/>
       <w:proofErr w:type="spellEnd"/>
@@ -17895,20 +17895,20 @@
       <w:pPr>
         <w:spacing w:line="240" w:lineRule="auto"/>
       </w:pPr>
-      <w:bookmarkStart w:id="259" w:name="FELD_Verwalter_Diktatzeichen"/>
+      <w:bookmarkStart w:id="259" w:name="KI_Verwalter_Diktatzeichen"/>
       <w:proofErr w:type="spellStart"/>
       <w:r>
-        <w:t>FELD_Verwalter_Diktatzeichen</w:t>
+        <w:t>KI_Verwalter_Diktatzeichen</w:t>
       </w:r>
       <w:bookmarkEnd w:id="259"/>
       <w:proofErr w:type="spellEnd"/>
       <w:r>
         <w:t xml:space="preserve"> </w:t>
       </w:r>
-      <w:bookmarkStart w:id="260" w:name="FELD_Verwalter_Name_002"/>
+      <w:bookmarkStart w:id="260" w:name="KI_Verwalter_Name_002"/>
       <w:proofErr w:type="spellStart"/>
       <w:r>
-        <w:t>FELD_Verwalter_Name</w:t>
+        <w:t>KI_Verwalter_Name</w:t>
       </w:r>
       <w:bookmarkEnd w:id="260"/>
       <w:proofErr w:type="spellEnd"/>

</xml_diff>

<commit_message>
fix: semantic cleanup — wrong data, template instructions, signature
Code fixes:
- Arbeitnehmer matcher now requires [[SLOT]] directly before "Arbeitnehmer"
  (prevents count "1" leaking into Lohnrückstände slot)
- New cleanupTemplateInstructions phase using processDocxParagraphs:
  - Removes editorial brackets ([kollektivarbeitsrechtliche...], [nicht nur
    Wiedergabe...], [Das Unternehmen hat...], [falls schon erkennbar...])
  - Removes internal notes (optional: bei zusätzlicher Belastung...)
  - Removes redundant "Er/Sie führte auch die Lohnbuchhaltung"
  - Fixes signature "als Sachverständiger und vorläufiger IV" → just
    "als Sachverständiger" when not vorl. IV (handles Word run-splitting)
  - Fixes "Gutachten und Bericht" → "Gutachten" for Sachverständiger-only

Template fixes:
- Replace dummy "Kreditinstitut x/y" with [Kreditinstitut 1/2]
- Replace dummy "Konto-Nr.: 12345678" with [Kontonummer]

Co-Authored-By: Claude Opus 4.6 (1M context) <noreply@anthropic.com>
</commit_message>
<xml_diff>
--- a/gutachtenvorlagen/Gutachten Muster Personengesellschaft.docx
+++ b/gutachtenvorlagen/Gutachten Muster Personengesellschaft.docx
@@ -12661,7 +12661,7 @@
                 <w:highlight w:val="yellow"/>
                 <w:u w:val="single"/>
               </w:rPr>
-              <w:t>Kreditinstitut x:</w:t>
+              <w:t>[Kreditinstitut 1]</w:t>
             </w:r>
           </w:p>
           <w:p>
@@ -12806,7 +12806,7 @@
                 <w:highlight w:val="yellow"/>
                 <w:u w:val="single"/>
               </w:rPr>
-              <w:t>Kreditinstitut y:</w:t>
+              <w:t>[Kreditinstitut 2]</w:t>
             </w:r>
           </w:p>
           <w:p>

</xml_diff>

<commit_message>
chore: remove TBS branding from Gutachten templates - Replace Professor Schmidt logo with KlareProzesse logo - Clean alt text, table style names, metadata, comments - All 3 templates (juristische/natürliche Person, Personengesellschaft) Co-Authored-By: Claude Haiku 4.5 <noreply@anthropic.com>
</commit_message>
<xml_diff>
--- a/gutachtenvorlagen/Gutachten Muster Personengesellschaft.docx
+++ b/gutachtenvorlagen/Gutachten Muster Personengesellschaft.docx
@@ -473,7 +473,7 @@
             <o:lock v:ext="edit" aspectratio="t"/>
           </v:shapetype>
           <v:shape id="_x0000_i1025" type="#_x0000_t75" style="width:115.5pt;height:79.5pt">
-            <v:imagedata r:id="rId11" o:title="Logo_Schmidt_180x180px" croptop="8033f" cropbottom="11416f"/>
+            <v:imagedata r:id="rId11" o:title="Logo_Aktenanalyse" croptop="8033f" cropbottom="11416f"/>
           </v:shape>
         </w:pict>
       </w:r>
@@ -12560,7 +12560,7 @@
     </w:p>
     <w:tbl>
       <w:tblPr>
-        <w:tblStyle w:val="ProfSchmidtTabelle"/>
+        <w:tblStyle w:val="AktenanalyseTabelle"/>
         <w:tblW w:w="8613" w:type="dxa"/>
         <w:tblInd w:w="596" w:type="dxa"/>
         <w:tblLook w:val="04A0" w:firstRow="1" w:lastRow="0" w:firstColumn="1" w:lastColumn="0" w:noHBand="0" w:noVBand="1"/>
@@ -15682,7 +15682,7 @@
     </w:p>
     <w:tbl>
       <w:tblPr>
-        <w:tblStyle w:val="ProfSchmidtTabelle"/>
+        <w:tblStyle w:val="AktenanalyseTabelle"/>
         <w:tblW w:w="9070" w:type="dxa"/>
         <w:tblInd w:w="596" w:type="dxa"/>
         <w:tblLook w:val="04A0" w:firstRow="1" w:lastRow="0" w:firstColumn="1" w:lastColumn="0" w:noHBand="0" w:noVBand="1"/>
@@ -15951,7 +15951,7 @@
     </w:p>
     <w:tbl>
       <w:tblPr>
-        <w:tblStyle w:val="ProfSchmidtTabelle"/>
+        <w:tblStyle w:val="AktenanalyseTabelle"/>
         <w:tblW w:w="9070" w:type="dxa"/>
         <w:tblInd w:w="596" w:type="dxa"/>
         <w:tblLook w:val="04A0" w:firstRow="1" w:lastRow="0" w:firstColumn="1" w:lastColumn="0" w:noHBand="0" w:noVBand="1"/>
@@ -18231,7 +18231,7 @@
 
 <file path=word/comments.xml><?xml version="1.0" encoding="utf-8"?>
 <w:comments xmlns:wpc="http://schemas.microsoft.com/office/word/2010/wordprocessingCanvas" xmlns:cx="http://schemas.microsoft.com/office/drawing/2014/chartex" xmlns:cx1="http://schemas.microsoft.com/office/drawing/2015/9/8/chartex" xmlns:cx2="http://schemas.microsoft.com/office/drawing/2015/10/21/chartex" xmlns:cx3="http://schemas.microsoft.com/office/drawing/2016/5/9/chartex" xmlns:cx4="http://schemas.microsoft.com/office/drawing/2016/5/10/chartex" xmlns:cx5="http://schemas.microsoft.com/office/drawing/2016/5/11/chartex" xmlns:cx6="http://schemas.microsoft.com/office/drawing/2016/5/12/chartex" xmlns:cx7="http://schemas.microsoft.com/office/drawing/2016/5/13/chartex" xmlns:cx8="http://schemas.microsoft.com/office/drawing/2016/5/14/chartex" xmlns:mc="http://schemas.openxmlformats.org/markup-compatibility/2006" xmlns:aink="http://schemas.microsoft.com/office/drawing/2016/ink" xmlns:am3d="http://schemas.microsoft.com/office/drawing/2017/model3d" xmlns:o="urn:schemas-microsoft-com:office:office" xmlns:r="http://schemas.openxmlformats.org/officeDocument/2006/relationships" xmlns:m="http://schemas.openxmlformats.org/officeDocument/2006/math" xmlns:v="urn:schemas-microsoft-com:vml" xmlns:wp14="http://schemas.microsoft.com/office/word/2010/wordprocessingDrawing" xmlns:wp="http://schemas.openxmlformats.org/drawingml/2006/wordprocessingDrawing" xmlns:w10="urn:schemas-microsoft-com:office:word" xmlns:w="http://schemas.openxmlformats.org/wordprocessingml/2006/main" xmlns:w14="http://schemas.microsoft.com/office/word/2010/wordml" xmlns:w15="http://schemas.microsoft.com/office/word/2012/wordml" xmlns:w16cid="http://schemas.microsoft.com/office/word/2016/wordml/cid" xmlns:w16se="http://schemas.microsoft.com/office/word/2015/wordml/symex" xmlns:wpg="http://schemas.microsoft.com/office/word/2010/wordprocessingGroup" xmlns:wpi="http://schemas.microsoft.com/office/word/2010/wordprocessingInk" xmlns:wne="http://schemas.microsoft.com/office/word/2006/wordml" xmlns:wps="http://schemas.microsoft.com/office/word/2010/wordprocessingShape" mc:Ignorable="w14 w15 w16se w16cid wp14">
-  <w:comment w:id="0" w:author="Anna Kültzer" w:date="2020-11-12T14:02:00Z" w:initials="AB">
+  <w:comment w:id="0" w:author="KlareProzesse" w:date="2020-11-12T14:02:00Z" w:initials="AB">
     <w:p>
       <w:pPr>
         <w:pStyle w:val="Kommentartext"/>
@@ -18247,7 +18247,7 @@
       </w:r>
     </w:p>
   </w:comment>
-  <w:comment w:id="34" w:author="Anna Kültzer" w:date="2020-11-26T09:10:00Z" w:initials="AB">
+  <w:comment w:id="34" w:author="KlareProzesse" w:date="2020-11-26T09:10:00Z" w:initials="AB">
     <w:p>
       <w:pPr>
         <w:pStyle w:val="Kommentartext"/>
@@ -18271,7 +18271,7 @@
       </w:r>
     </w:p>
   </w:comment>
-  <w:comment w:id="52" w:author="Jonathan Henke" w:date="2025-12-29T14:14:00Z" w:initials="JH">
+  <w:comment w:id="52" w:author="KlareProzesse" w:date="2025-12-29T14:14:00Z" w:initials="JH">
     <w:p>
       <w:pPr>
         <w:pStyle w:val="Kommentartext"/>
@@ -18303,7 +18303,7 @@
       </w:r>
     </w:p>
   </w:comment>
-  <w:comment w:id="99" w:author="Alexander Lamberty" w:date="2025-06-18T16:37:00Z" w:initials="AL">
+  <w:comment w:id="99" w:author="KlareProzesse" w:date="2025-06-18T16:37:00Z" w:initials="AL">
     <w:p>
       <w:pPr>
         <w:pStyle w:val="Kommentartext"/>
@@ -18319,7 +18319,7 @@
       </w:r>
     </w:p>
   </w:comment>
-  <w:comment w:id="247" w:author="Jonathan Henke" w:date="2026-01-07T14:06:00Z" w:initials="JH">
+  <w:comment w:id="247" w:author="KlareProzesse" w:date="2026-01-07T14:06:00Z" w:initials="JH">
     <w:p>
       <w:pPr>
         <w:pStyle w:val="Kommentartext"/>
@@ -21292,13 +21292,13 @@
 
 <file path=word/people.xml><?xml version="1.0" encoding="utf-8"?>
 <w15:people xmlns:wpc="http://schemas.microsoft.com/office/word/2010/wordprocessingCanvas" xmlns:cx="http://schemas.microsoft.com/office/drawing/2014/chartex" xmlns:cx1="http://schemas.microsoft.com/office/drawing/2015/9/8/chartex" xmlns:cx2="http://schemas.microsoft.com/office/drawing/2015/10/21/chartex" xmlns:cx3="http://schemas.microsoft.com/office/drawing/2016/5/9/chartex" xmlns:cx4="http://schemas.microsoft.com/office/drawing/2016/5/10/chartex" xmlns:cx5="http://schemas.microsoft.com/office/drawing/2016/5/11/chartex" xmlns:cx6="http://schemas.microsoft.com/office/drawing/2016/5/12/chartex" xmlns:cx7="http://schemas.microsoft.com/office/drawing/2016/5/13/chartex" xmlns:cx8="http://schemas.microsoft.com/office/drawing/2016/5/14/chartex" xmlns:mc="http://schemas.openxmlformats.org/markup-compatibility/2006" xmlns:aink="http://schemas.microsoft.com/office/drawing/2016/ink" xmlns:am3d="http://schemas.microsoft.com/office/drawing/2017/model3d" xmlns:o="urn:schemas-microsoft-com:office:office" xmlns:r="http://schemas.openxmlformats.org/officeDocument/2006/relationships" xmlns:m="http://schemas.openxmlformats.org/officeDocument/2006/math" xmlns:v="urn:schemas-microsoft-com:vml" xmlns:wp14="http://schemas.microsoft.com/office/word/2010/wordprocessingDrawing" xmlns:wp="http://schemas.openxmlformats.org/drawingml/2006/wordprocessingDrawing" xmlns:w10="urn:schemas-microsoft-com:office:word" xmlns:w="http://schemas.openxmlformats.org/wordprocessingml/2006/main" xmlns:w14="http://schemas.microsoft.com/office/word/2010/wordml" xmlns:w15="http://schemas.microsoft.com/office/word/2012/wordml" xmlns:w16cid="http://schemas.microsoft.com/office/word/2016/wordml/cid" xmlns:w16se="http://schemas.microsoft.com/office/word/2015/wordml/symex" xmlns:wpg="http://schemas.microsoft.com/office/word/2010/wordprocessingGroup" xmlns:wpi="http://schemas.microsoft.com/office/word/2010/wordprocessingInk" xmlns:wne="http://schemas.microsoft.com/office/word/2006/wordml" xmlns:wps="http://schemas.microsoft.com/office/word/2010/wordprocessingShape" mc:Ignorable="w14 w15 w16se w16cid wp14">
-  <w15:person w15:author="Anna Kültzer">
+  <w15:person w15:author="KlareProzesse">
     <w15:presenceInfo w15:providerId="AD" w15:userId="S-1-5-21-2412788145-1039972723-247666707-1256"/>
   </w15:person>
-  <w15:person w15:author="Jonathan Henke">
+  <w15:person w15:author="KlareProzesse">
     <w15:presenceInfo w15:providerId="AD" w15:userId="S-1-5-21-2412788145-1039972723-247666707-3201"/>
   </w15:person>
-  <w15:person w15:author="Alexander Lamberty">
+  <w15:person w15:author="KlareProzesse">
     <w15:presenceInfo w15:providerId="AD" w15:userId="S-1-5-21-2412788145-1039972723-247666707-1320"/>
   </w15:person>
 </w15:people>
@@ -22325,8 +22325,8 @@
       <w:lang w:eastAsia="de-DE"/>
     </w:rPr>
   </w:style>
-  <w:style w:type="table" w:customStyle="1" w:styleId="ProfSchmidtTabelle">
-    <w:name w:val="Prof. Schmidt Tabelle"/>
+  <w:style w:type="table" w:customStyle="1" w:styleId="AktenanalyseTabelle">
+    <w:name w:val="Aktenanalyse Tabelle"/>
     <w:basedOn w:val="Gitternetztabelle4Akzent1"/>
     <w:uiPriority w:val="99"/>
     <w:rsid w:val="006A7E12"/>

</xml_diff>

<commit_message>
fix: restore templates with original Briefkopf sidebar Co-Authored-By: Claude Opus 4.6 (1M context) <noreply@anthropic.com>
</commit_message>
<xml_diff>
--- a/gutachtenvorlagen/Gutachten Muster Personengesellschaft.docx
+++ b/gutachtenvorlagen/Gutachten Muster Personengesellschaft.docx
@@ -579,7 +579,7 @@
                                 <w:szCs w:val="13"/>
                                 <w:lang w:eastAsia="de-DE"/>
                               </w:rPr>
-                              <w:t xml:space="preserve">www.tbs-insolvenzverwalter.de</w:t>
+                              <w:t>www.tbs-insolvenzverwalter.de</w:t>
                             </w:r>
                           </w:p>
                           <w:p>
@@ -603,11 +603,14 @@
                                 <w:szCs w:val="13"/>
                                 <w:lang w:eastAsia="de-DE"/>
                               </w:rPr>
-                              <w:t xml:space="preserve">Partnerschaftsregister des</w:t>
+                              <w:t>Partnerschaftsregister des</w:t>
                             </w:r>
                           </w:p>
                           <w:p>
                             <w:pPr>
+                              <w:pBdr>
+                                <w:bottom w:val="single" w:sz="4" w:space="1" w:color="auto"/>
+                              </w:pBdr>
                               <w:autoSpaceDE w:val="0"/>
                               <w:autoSpaceDN w:val="0"/>
                               <w:adjustRightInd w:val="0"/>
@@ -627,8 +630,134 @@
                                 <w:szCs w:val="13"/>
                                 <w:lang w:eastAsia="de-DE"/>
                               </w:rPr>
-                              <w:t xml:space="preserve">Amtsgericht Koblenz – PR 20203</w:t>
+                              <w:t>Amtsgericht Koblenz – PR 20203</w:t>
                             </w:r>
+                          </w:p>
+                          <w:p>
+                            <w:pPr>
+                              <w:pBdr>
+                                <w:bottom w:val="single" w:sz="4" w:space="1" w:color="auto"/>
+                              </w:pBdr>
+                              <w:autoSpaceDE w:val="0"/>
+                              <w:autoSpaceDN w:val="0"/>
+                              <w:adjustRightInd w:val="0"/>
+                              <w:spacing w:line="276" w:lineRule="auto"/>
+                              <w:jc w:val="center"/>
+                              <w:rPr>
+                                <w:rFonts w:eastAsia="Calibri" w:cs="CorporateSPro-Light"/>
+                                <w:sz w:val="13"/>
+                                <w:szCs w:val="13"/>
+                                <w:lang w:eastAsia="de-DE"/>
+                              </w:rPr>
+                            </w:pPr>
+                          </w:p>
+                          <w:p>
+                            <w:pPr>
+                              <w:pBdr>
+                                <w:bottom w:val="single" w:sz="4" w:space="1" w:color="auto"/>
+                              </w:pBdr>
+                              <w:autoSpaceDE w:val="0"/>
+                              <w:autoSpaceDN w:val="0"/>
+                              <w:adjustRightInd w:val="0"/>
+                              <w:spacing w:line="276" w:lineRule="auto"/>
+                              <w:jc w:val="center"/>
+                              <w:rPr>
+                                <w:rFonts w:eastAsia="Calibri" w:cs="CorporateSPro-Light"/>
+                                <w:sz w:val="13"/>
+                                <w:szCs w:val="13"/>
+                                <w:lang w:eastAsia="de-DE"/>
+                              </w:rPr>
+                            </w:pPr>
+                          </w:p>
+                          <w:p>
+                            <w:pPr>
+                              <w:pBdr>
+                                <w:bottom w:val="single" w:sz="4" w:space="1" w:color="auto"/>
+                              </w:pBdr>
+                              <w:autoSpaceDE w:val="0"/>
+                              <w:autoSpaceDN w:val="0"/>
+                              <w:adjustRightInd w:val="0"/>
+                              <w:spacing w:line="276" w:lineRule="auto"/>
+                              <w:jc w:val="center"/>
+                              <w:rPr>
+                                <w:rFonts w:eastAsia="Calibri" w:cs="CorporateSPro-Light"/>
+                                <w:sz w:val="13"/>
+                                <w:szCs w:val="13"/>
+                                <w:lang w:eastAsia="de-DE"/>
+                              </w:rPr>
+                            </w:pPr>
+                          </w:p>
+                          <w:p>
+                            <w:pPr>
+                              <w:pBdr>
+                                <w:bottom w:val="single" w:sz="4" w:space="1" w:color="auto"/>
+                              </w:pBdr>
+                              <w:autoSpaceDE w:val="0"/>
+                              <w:autoSpaceDN w:val="0"/>
+                              <w:adjustRightInd w:val="0"/>
+                              <w:spacing w:line="276" w:lineRule="auto"/>
+                              <w:jc w:val="center"/>
+                              <w:rPr>
+                                <w:rFonts w:eastAsia="Calibri" w:cs="CorporateSPro-Light"/>
+                                <w:sz w:val="13"/>
+                                <w:szCs w:val="13"/>
+                                <w:lang w:eastAsia="de-DE"/>
+                              </w:rPr>
+                            </w:pPr>
+                          </w:p>
+                          <w:p>
+                            <w:pPr>
+                              <w:pBdr>
+                                <w:bottom w:val="single" w:sz="4" w:space="1" w:color="auto"/>
+                              </w:pBdr>
+                              <w:autoSpaceDE w:val="0"/>
+                              <w:autoSpaceDN w:val="0"/>
+                              <w:adjustRightInd w:val="0"/>
+                              <w:spacing w:line="276" w:lineRule="auto"/>
+                              <w:jc w:val="center"/>
+                              <w:rPr>
+                                <w:rFonts w:eastAsia="Calibri" w:cs="CorporateSPro-Light"/>
+                                <w:sz w:val="13"/>
+                                <w:szCs w:val="13"/>
+                                <w:lang w:eastAsia="de-DE"/>
+                              </w:rPr>
+                            </w:pPr>
+                          </w:p>
+                          <w:p>
+                            <w:pPr>
+                              <w:pBdr>
+                                <w:bottom w:val="single" w:sz="4" w:space="1" w:color="auto"/>
+                              </w:pBdr>
+                              <w:autoSpaceDE w:val="0"/>
+                              <w:autoSpaceDN w:val="0"/>
+                              <w:adjustRightInd w:val="0"/>
+                              <w:spacing w:line="276" w:lineRule="auto"/>
+                              <w:jc w:val="center"/>
+                              <w:rPr>
+                                <w:rFonts w:eastAsia="Calibri" w:cs="CorporateSPro-Light"/>
+                                <w:sz w:val="13"/>
+                                <w:szCs w:val="13"/>
+                                <w:lang w:eastAsia="de-DE"/>
+                              </w:rPr>
+                            </w:pPr>
+                          </w:p>
+                          <w:p>
+                            <w:pPr>
+                              <w:pBdr>
+                                <w:bottom w:val="single" w:sz="4" w:space="1" w:color="auto"/>
+                              </w:pBdr>
+                              <w:autoSpaceDE w:val="0"/>
+                              <w:autoSpaceDN w:val="0"/>
+                              <w:adjustRightInd w:val="0"/>
+                              <w:spacing w:line="276" w:lineRule="auto"/>
+                              <w:jc w:val="center"/>
+                              <w:rPr>
+                                <w:rFonts w:eastAsia="Calibri" w:cs="CorporateSPro-Light"/>
+                                <w:sz w:val="13"/>
+                                <w:szCs w:val="13"/>
+                                <w:lang w:eastAsia="de-DE"/>
+                              </w:rPr>
+                            </w:pPr>
                           </w:p>
                           <w:p>
                             <w:pPr>
@@ -644,14 +773,38 @@
                                 <w:lang w:eastAsia="de-DE"/>
                               </w:rPr>
                             </w:pPr>
-                            <w:r>
+                          </w:p>
+                          <w:p>
+                            <w:pPr>
+                              <w:autoSpaceDE w:val="0"/>
+                              <w:autoSpaceDN w:val="0"/>
+                              <w:adjustRightInd w:val="0"/>
+                              <w:jc w:val="left"/>
                               <w:rPr>
-                                <w:rFonts w:eastAsia="Calibri" w:cs="CorporateSPro-Light"/>
+                                <w:rFonts w:eastAsia="Calibri" w:cs="CorporateSPro-Regular"/>
                                 <w:sz w:val="13"/>
                                 <w:szCs w:val="13"/>
                                 <w:lang w:eastAsia="de-DE"/>
                               </w:rPr>
-                              <w:t xml:space="preserve"/>
+                            </w:pPr>
+                            <w:bookmarkStart w:id="0" w:name="_Hlk217368252"/>
+                            <w:bookmarkStart w:id="1" w:name="_Hlk217368253"/>
+                            <w:bookmarkStart w:id="2" w:name="_Hlk217368337"/>
+                            <w:bookmarkStart w:id="3" w:name="_Hlk217368338"/>
+                            <w:bookmarkStart w:id="4" w:name="_Hlk217368401"/>
+                            <w:bookmarkStart w:id="5" w:name="_Hlk217368402"/>
+                            <w:bookmarkStart w:id="6" w:name="_Hlk217368434"/>
+                            <w:bookmarkStart w:id="7" w:name="_Hlk217368435"/>
+                            <w:bookmarkStart w:id="8" w:name="_Hlk217368465"/>
+                            <w:bookmarkStart w:id="9" w:name="_Hlk217368466"/>
+                            <w:r>
+                              <w:rPr>
+                                <w:rFonts w:eastAsia="Calibri" w:cs="CorporateSPro-Regular"/>
+                                <w:sz w:val="13"/>
+                                <w:szCs w:val="13"/>
+                                <w:lang w:eastAsia="de-DE"/>
+                              </w:rPr>
+                              <w:t>PARTNER</w:t>
                             </w:r>
                           </w:p>
                           <w:p>
@@ -659,78 +812,7 @@
                               <w:autoSpaceDE w:val="0"/>
                               <w:autoSpaceDN w:val="0"/>
                               <w:adjustRightInd w:val="0"/>
-                              <w:spacing w:line="276" w:lineRule="auto"/>
-                              <w:jc w:val="left"/>
-                              <w:rPr>
-                                <w:rFonts w:eastAsia="Calibri" w:cs="CorporateSPro-Light"/>
-                                <w:sz w:val="13"/>
-                                <w:szCs w:val="13"/>
-                                <w:lang w:eastAsia="de-DE"/>
-                              </w:rPr>
-                            </w:pPr>
-                            <w:r>
-                              <w:rPr>
-                                <w:rFonts w:eastAsia="Calibri" w:cs="CorporateSPro-Light"/>
-                                <w:sz w:val="13"/>
-                                <w:szCs w:val="13"/>
-                                <w:lang w:eastAsia="de-DE"/>
-                              </w:rPr>
-                              <w:t xml:space="preserve"/>
-                            </w:r>
-                          </w:p>
-                          <w:p>
-                            <w:pPr>
-                              <w:autoSpaceDE w:val="0"/>
-                              <w:autoSpaceDN w:val="0"/>
-                              <w:adjustRightInd w:val="0"/>
-                              <w:spacing w:line="276" w:lineRule="auto"/>
-                              <w:jc w:val="left"/>
-                              <w:rPr>
-                                <w:rFonts w:eastAsia="Calibri" w:cs="CorporateSPro-Light"/>
-                                <w:sz w:val="13"/>
-                                <w:szCs w:val="13"/>
-                                <w:lang w:eastAsia="de-DE"/>
-                              </w:rPr>
-                            </w:pPr>
-                            <w:r>
-                              <w:rPr>
-                                <w:rFonts w:eastAsia="Calibri" w:cs="CorporateSPro-Light"/>
-                                <w:sz w:val="13"/>
-                                <w:szCs w:val="13"/>
-                                <w:lang w:eastAsia="de-DE"/>
-                              </w:rPr>
-                              <w:t xml:space="preserve"/>
-                            </w:r>
-                          </w:p>
-                          <w:p>
-                            <w:pPr>
-                              <w:autoSpaceDE w:val="0"/>
-                              <w:autoSpaceDN w:val="0"/>
-                              <w:adjustRightInd w:val="0"/>
-                              <w:spacing w:line="276" w:lineRule="auto"/>
-                              <w:jc w:val="left"/>
-                              <w:rPr>
-                                <w:rFonts w:eastAsia="Calibri" w:cs="CorporateSPro-Light"/>
-                                <w:sz w:val="13"/>
-                                <w:szCs w:val="13"/>
-                                <w:lang w:eastAsia="de-DE"/>
-                              </w:rPr>
-                            </w:pPr>
-                            <w:r>
-                              <w:rPr>
-                                <w:rFonts w:eastAsia="Calibri" w:cs="CorporateSPro-Light"/>
-                                <w:sz w:val="13"/>
-                                <w:szCs w:val="13"/>
-                                <w:lang w:eastAsia="de-DE"/>
-                              </w:rPr>
-                              <w:t xml:space="preserve">PARTNER</w:t>
-                            </w:r>
-                          </w:p>
-                          <w:p>
-                            <w:pPr>
-                              <w:autoSpaceDE w:val="0"/>
-                              <w:autoSpaceDN w:val="0"/>
-                              <w:adjustRightInd w:val="0"/>
+                              <w:spacing w:line="240" w:lineRule="auto"/>
                               <w:jc w:val="left"/>
                               <w:rPr>
                                 <w:rFonts w:eastAsia="Calibri" w:cs="CorporateSPro-Demi"/>
@@ -748,7 +830,7 @@
                                 <w:szCs w:val="13"/>
                                 <w:lang w:eastAsia="de-DE"/>
                               </w:rPr>
-                              <w:t xml:space="preserve">Ingo Grünewald</w:t>
+                              <w:t>Ingo Grünewald</w:t>
                             </w:r>
                           </w:p>
                           <w:p>
@@ -756,7 +838,7 @@
                               <w:autoSpaceDE w:val="0"/>
                               <w:autoSpaceDN w:val="0"/>
                               <w:adjustRightInd w:val="0"/>
-                              <w:spacing w:line="276" w:lineRule="auto"/>
+                              <w:spacing w:line="240" w:lineRule="auto"/>
                               <w:jc w:val="left"/>
                               <w:rPr>
                                 <w:rFonts w:eastAsia="Calibri" w:cs="CorporateSPro-Light"/>
@@ -772,7 +854,7 @@
                                 <w:szCs w:val="13"/>
                                 <w:lang w:eastAsia="de-DE"/>
                               </w:rPr>
-                              <w:t xml:space="preserve">Fachanwalt für Insolvenz- und Sanierungsrecht</w:t>
+                              <w:t>Fachanwalt für Insolvenz- und Sanierungsrecht</w:t>
                             </w:r>
                           </w:p>
                           <w:p>
@@ -780,7 +862,7 @@
                               <w:autoSpaceDE w:val="0"/>
                               <w:autoSpaceDN w:val="0"/>
                               <w:adjustRightInd w:val="0"/>
-                              <w:spacing w:line="276" w:lineRule="auto"/>
+                              <w:spacing w:line="240" w:lineRule="auto"/>
                               <w:jc w:val="left"/>
                               <w:rPr>
                                 <w:rFonts w:eastAsia="Calibri" w:cs="CorporateSPro-Light"/>
@@ -796,7 +878,7 @@
                                 <w:szCs w:val="13"/>
                                 <w:lang w:eastAsia="de-DE"/>
                               </w:rPr>
-                              <w:t xml:space="preserve">Fachanwalt für Handels- und Gesellschaftsrecht</w:t>
+                              <w:t>Fachanwalt für Handels- und Gesellschaftsrecht</w:t>
                             </w:r>
                           </w:p>
                           <w:p>
@@ -804,7 +886,49 @@
                               <w:autoSpaceDE w:val="0"/>
                               <w:autoSpaceDN w:val="0"/>
                               <w:adjustRightInd w:val="0"/>
-                              <w:spacing w:line="276" w:lineRule="auto"/>
+                              <w:spacing w:line="240" w:lineRule="auto"/>
+                              <w:jc w:val="left"/>
+                              <w:rPr>
+                                <w:rFonts w:eastAsia="Calibri" w:cs="CorporateSPro-Demi"/>
+                                <w:b/>
+                                <w:sz w:val="13"/>
+                                <w:szCs w:val="13"/>
+                                <w:lang w:eastAsia="de-DE"/>
+                              </w:rPr>
+                            </w:pPr>
+                          </w:p>
+                          <w:p>
+                            <w:pPr>
+                              <w:autoSpaceDE w:val="0"/>
+                              <w:autoSpaceDN w:val="0"/>
+                              <w:adjustRightInd w:val="0"/>
+                              <w:spacing w:line="240" w:lineRule="auto"/>
+                              <w:jc w:val="left"/>
+                              <w:rPr>
+                                <w:rFonts w:eastAsia="Calibri" w:cs="CorporateSPro-Demi"/>
+                                <w:b/>
+                                <w:sz w:val="13"/>
+                                <w:szCs w:val="13"/>
+                                <w:lang w:val="en-GB" w:eastAsia="de-DE"/>
+                              </w:rPr>
+                            </w:pPr>
+                            <w:r>
+                              <w:rPr>
+                                <w:rFonts w:eastAsia="Calibri" w:cs="CorporateSPro-Demi"/>
+                                <w:b/>
+                                <w:sz w:val="13"/>
+                                <w:szCs w:val="13"/>
+                                <w:lang w:val="en-GB" w:eastAsia="de-DE"/>
+                              </w:rPr>
+                              <w:t>Dr. Alexander Thomas Lamberty LL.M.</w:t>
+                            </w:r>
+                          </w:p>
+                          <w:p>
+                            <w:pPr>
+                              <w:autoSpaceDE w:val="0"/>
+                              <w:autoSpaceDN w:val="0"/>
+                              <w:adjustRightInd w:val="0"/>
+                              <w:spacing w:line="240" w:lineRule="auto"/>
                               <w:jc w:val="left"/>
                               <w:rPr>
                                 <w:rFonts w:eastAsia="Calibri" w:cs="CorporateSPro-Light"/>
@@ -820,7 +944,7 @@
                                 <w:szCs w:val="13"/>
                                 <w:lang w:eastAsia="de-DE"/>
                               </w:rPr>
-                              <w:t xml:space="preserve"/>
+                              <w:t>Fachanwalt für Insolvenz- und Sanierungsrecht</w:t>
                             </w:r>
                           </w:p>
                           <w:p>
@@ -828,6 +952,23 @@
                               <w:autoSpaceDE w:val="0"/>
                               <w:autoSpaceDN w:val="0"/>
                               <w:adjustRightInd w:val="0"/>
+                              <w:spacing w:line="240" w:lineRule="auto"/>
+                              <w:jc w:val="left"/>
+                              <w:rPr>
+                                <w:rFonts w:eastAsia="Calibri" w:cs="CorporateSPro-Demi"/>
+                                <w:b/>
+                                <w:sz w:val="13"/>
+                                <w:szCs w:val="13"/>
+                                <w:lang w:eastAsia="de-DE"/>
+                              </w:rPr>
+                            </w:pPr>
+                          </w:p>
+                          <w:p>
+                            <w:pPr>
+                              <w:autoSpaceDE w:val="0"/>
+                              <w:autoSpaceDN w:val="0"/>
+                              <w:adjustRightInd w:val="0"/>
+                              <w:spacing w:line="240" w:lineRule="auto"/>
                               <w:jc w:val="left"/>
                               <w:rPr>
                                 <w:rFonts w:eastAsia="Calibri" w:cs="CorporateSPro-Demi"/>
@@ -845,7 +986,7 @@
                                 <w:szCs w:val="13"/>
                                 <w:lang w:eastAsia="de-DE"/>
                               </w:rPr>
-                              <w:t xml:space="preserve">Dr. Alexander Thomas Lamberty LL.M.</w:t>
+                              <w:t>Fatma Kreft</w:t>
                             </w:r>
                           </w:p>
                           <w:p>
@@ -853,7 +994,7 @@
                               <w:autoSpaceDE w:val="0"/>
                               <w:autoSpaceDN w:val="0"/>
                               <w:adjustRightInd w:val="0"/>
-                              <w:spacing w:line="276" w:lineRule="auto"/>
+                              <w:spacing w:line="240" w:lineRule="auto"/>
                               <w:jc w:val="left"/>
                               <w:rPr>
                                 <w:rFonts w:eastAsia="Calibri" w:cs="CorporateSPro-Light"/>
@@ -869,7 +1010,7 @@
                                 <w:szCs w:val="13"/>
                                 <w:lang w:eastAsia="de-DE"/>
                               </w:rPr>
-                              <w:t xml:space="preserve">Fachanwalt für Insolvenz- und Sanierungsrecht</w:t>
+                              <w:t>Fachanwältin für Insolvenz- und Sanierungsrecht</w:t>
                             </w:r>
                           </w:p>
                           <w:p>
@@ -877,7 +1018,7 @@
                               <w:autoSpaceDE w:val="0"/>
                               <w:autoSpaceDN w:val="0"/>
                               <w:adjustRightInd w:val="0"/>
-                              <w:spacing w:line="276" w:lineRule="auto"/>
+                              <w:spacing w:line="240" w:lineRule="auto"/>
                               <w:jc w:val="left"/>
                               <w:rPr>
                                 <w:rFonts w:eastAsia="Calibri" w:cs="CorporateSPro-Light"/>
@@ -893,7 +1034,7 @@
                                 <w:szCs w:val="13"/>
                                 <w:lang w:eastAsia="de-DE"/>
                               </w:rPr>
-                              <w:t xml:space="preserve"/>
+                              <w:t>Fachanwältin für Steuerrecht</w:t>
                             </w:r>
                           </w:p>
                           <w:p>
@@ -901,6 +1042,22 @@
                               <w:autoSpaceDE w:val="0"/>
                               <w:autoSpaceDN w:val="0"/>
                               <w:adjustRightInd w:val="0"/>
+                              <w:spacing w:line="240" w:lineRule="auto"/>
+                              <w:jc w:val="left"/>
+                              <w:rPr>
+                                <w:rFonts w:eastAsia="Calibri" w:cs="CorporateSPro-Light"/>
+                                <w:sz w:val="13"/>
+                                <w:szCs w:val="13"/>
+                                <w:lang w:eastAsia="de-DE"/>
+                              </w:rPr>
+                            </w:pPr>
+                          </w:p>
+                          <w:p>
+                            <w:pPr>
+                              <w:autoSpaceDE w:val="0"/>
+                              <w:autoSpaceDN w:val="0"/>
+                              <w:adjustRightInd w:val="0"/>
+                              <w:spacing w:line="240" w:lineRule="auto"/>
                               <w:jc w:val="left"/>
                               <w:rPr>
                                 <w:rFonts w:eastAsia="Calibri" w:cs="CorporateSPro-Demi"/>
@@ -918,7 +1075,7 @@
                                 <w:szCs w:val="13"/>
                                 <w:lang w:eastAsia="de-DE"/>
                               </w:rPr>
-                              <w:t xml:space="preserve">Fatma Kreft</w:t>
+                              <w:t>Dr. Arne Löser</w:t>
                             </w:r>
                           </w:p>
                           <w:p>
@@ -926,7 +1083,7 @@
                               <w:autoSpaceDE w:val="0"/>
                               <w:autoSpaceDN w:val="0"/>
                               <w:adjustRightInd w:val="0"/>
-                              <w:spacing w:line="276" w:lineRule="auto"/>
+                              <w:spacing w:line="240" w:lineRule="auto"/>
                               <w:jc w:val="left"/>
                               <w:rPr>
                                 <w:rFonts w:eastAsia="Calibri" w:cs="CorporateSPro-Light"/>
@@ -942,7 +1099,7 @@
                                 <w:szCs w:val="13"/>
                                 <w:lang w:eastAsia="de-DE"/>
                               </w:rPr>
-                              <w:t xml:space="preserve">Fachanwältin für Insolvenz- und Sanierungsrecht</w:t>
+                              <w:t>Fachanwalt für Insolvenz- und Sanierungsrecht</w:t>
                             </w:r>
                           </w:p>
                           <w:p>
@@ -950,7 +1107,7 @@
                               <w:autoSpaceDE w:val="0"/>
                               <w:autoSpaceDN w:val="0"/>
                               <w:adjustRightInd w:val="0"/>
-                              <w:spacing w:line="276" w:lineRule="auto"/>
+                              <w:spacing w:line="240" w:lineRule="auto"/>
                               <w:jc w:val="left"/>
                               <w:rPr>
                                 <w:rFonts w:eastAsia="Calibri" w:cs="CorporateSPro-Light"/>
@@ -966,7 +1123,7 @@
                                 <w:szCs w:val="13"/>
                                 <w:lang w:eastAsia="de-DE"/>
                               </w:rPr>
-                              <w:t xml:space="preserve">Fachanwältin für Steuerrecht</w:t>
+                              <w:t>Fachanwalt für Handels- und Gesellschaftsrecht</w:t>
                             </w:r>
                           </w:p>
                           <w:p>
@@ -974,7 +1131,7 @@
                               <w:autoSpaceDE w:val="0"/>
                               <w:autoSpaceDN w:val="0"/>
                               <w:adjustRightInd w:val="0"/>
-                              <w:spacing w:line="276" w:lineRule="auto"/>
+                              <w:spacing w:line="240" w:lineRule="auto"/>
                               <w:jc w:val="left"/>
                               <w:rPr>
                                 <w:rFonts w:eastAsia="Calibri" w:cs="CorporateSPro-Light"/>
@@ -983,21 +1140,13 @@
                                 <w:lang w:eastAsia="de-DE"/>
                               </w:rPr>
                             </w:pPr>
-                            <w:r>
-                              <w:rPr>
-                                <w:rFonts w:eastAsia="Calibri" w:cs="CorporateSPro-Light"/>
-                                <w:sz w:val="13"/>
-                                <w:szCs w:val="13"/>
-                                <w:lang w:eastAsia="de-DE"/>
-                              </w:rPr>
-                              <w:t xml:space="preserve"/>
-                            </w:r>
                           </w:p>
                           <w:p>
                             <w:pPr>
                               <w:autoSpaceDE w:val="0"/>
                               <w:autoSpaceDN w:val="0"/>
                               <w:adjustRightInd w:val="0"/>
+                              <w:spacing w:line="240" w:lineRule="auto"/>
                               <w:jc w:val="left"/>
                               <w:rPr>
                                 <w:rFonts w:eastAsia="Calibri" w:cs="CorporateSPro-Demi"/>
@@ -1015,8 +1164,98 @@
                                 <w:szCs w:val="13"/>
                                 <w:lang w:eastAsia="de-DE"/>
                               </w:rPr>
-                              <w:t xml:space="preserve">Dr. Arne Löser</w:t>
+                              <w:t>Dr. Thomas Thöne</w:t>
                             </w:r>
+                          </w:p>
+                          <w:p>
+                            <w:pPr>
+                              <w:autoSpaceDE w:val="0"/>
+                              <w:autoSpaceDN w:val="0"/>
+                              <w:adjustRightInd w:val="0"/>
+                              <w:spacing w:line="240" w:lineRule="auto"/>
+                              <w:jc w:val="left"/>
+                              <w:rPr>
+                                <w:rFonts w:eastAsia="Calibri" w:cs="CorporateSPro-Light"/>
+                                <w:sz w:val="13"/>
+                                <w:szCs w:val="13"/>
+                                <w:lang w:eastAsia="de-DE"/>
+                              </w:rPr>
+                            </w:pPr>
+                            <w:r>
+                              <w:rPr>
+                                <w:rFonts w:eastAsia="Calibri" w:cs="CorporateSPro-Light"/>
+                                <w:sz w:val="13"/>
+                                <w:szCs w:val="13"/>
+                                <w:lang w:eastAsia="de-DE"/>
+                              </w:rPr>
+                              <w:t>Fachanwalt für Insolvenz- und Sanierungsrecht</w:t>
+                            </w:r>
+                          </w:p>
+                          <w:p>
+                            <w:pPr>
+                              <w:autoSpaceDE w:val="0"/>
+                              <w:autoSpaceDN w:val="0"/>
+                              <w:adjustRightInd w:val="0"/>
+                              <w:spacing w:line="240" w:lineRule="auto"/>
+                              <w:jc w:val="left"/>
+                              <w:rPr>
+                                <w:rFonts w:eastAsia="Calibri" w:cs="CorporateSPro-Light"/>
+                                <w:sz w:val="13"/>
+                                <w:szCs w:val="13"/>
+                                <w:lang w:eastAsia="de-DE"/>
+                              </w:rPr>
+                            </w:pPr>
+                            <w:r>
+                              <w:rPr>
+                                <w:rFonts w:eastAsia="Calibri" w:cs="CorporateSPro-Light"/>
+                                <w:sz w:val="13"/>
+                                <w:szCs w:val="13"/>
+                                <w:lang w:eastAsia="de-DE"/>
+                              </w:rPr>
+                              <w:t>Fachanwalt für Steuerrecht</w:t>
+                            </w:r>
+                          </w:p>
+                          <w:p>
+                            <w:pPr>
+                              <w:autoSpaceDE w:val="0"/>
+                              <w:autoSpaceDN w:val="0"/>
+                              <w:adjustRightInd w:val="0"/>
+                              <w:spacing w:line="240" w:lineRule="auto"/>
+                              <w:jc w:val="left"/>
+                              <w:rPr>
+                                <w:rFonts w:eastAsia="Calibri" w:cs="CorporateSPro-Light"/>
+                                <w:sz w:val="13"/>
+                                <w:szCs w:val="13"/>
+                                <w:lang w:eastAsia="de-DE"/>
+                              </w:rPr>
+                            </w:pPr>
+                            <w:r>
+                              <w:rPr>
+                                <w:rFonts w:eastAsia="Calibri" w:cs="CorporateSPro-Light"/>
+                                <w:sz w:val="13"/>
+                                <w:szCs w:val="13"/>
+                                <w:lang w:eastAsia="de-DE"/>
+                              </w:rPr>
+                              <w:t>Notar in Wiesbaden</w:t>
+                            </w:r>
+                          </w:p>
+                          <w:p>
+                            <w:pPr>
+                              <w:pBdr>
+                                <w:bottom w:val="single" w:sz="4" w:space="1" w:color="auto"/>
+                              </w:pBdr>
+                              <w:autoSpaceDE w:val="0"/>
+                              <w:autoSpaceDN w:val="0"/>
+                              <w:adjustRightInd w:val="0"/>
+                              <w:spacing w:line="276" w:lineRule="auto"/>
+                              <w:jc w:val="left"/>
+                              <w:rPr>
+                                <w:rFonts w:eastAsia="Calibri" w:cs="CorporateSPro-Light"/>
+                                <w:sz w:val="13"/>
+                                <w:szCs w:val="13"/>
+                                <w:lang w:eastAsia="de-DE"/>
+                              </w:rPr>
+                            </w:pPr>
                           </w:p>
                           <w:p>
                             <w:pPr>
@@ -1032,14 +1271,28 @@
                                 <w:lang w:eastAsia="de-DE"/>
                               </w:rPr>
                             </w:pPr>
-                            <w:r>
+                          </w:p>
+                          <w:p>
+                            <w:pPr>
+                              <w:autoSpaceDE w:val="0"/>
+                              <w:autoSpaceDN w:val="0"/>
+                              <w:adjustRightInd w:val="0"/>
+                              <w:jc w:val="left"/>
                               <w:rPr>
-                                <w:rFonts w:eastAsia="Calibri" w:cs="CorporateSPro-Light"/>
+                                <w:rFonts w:eastAsia="Calibri" w:cs="CorporateSPro-Regular"/>
                                 <w:sz w:val="13"/>
                                 <w:szCs w:val="13"/>
                                 <w:lang w:eastAsia="de-DE"/>
                               </w:rPr>
-                              <w:t xml:space="preserve">Fachanwalt für Insolvenz- und Sanierungsrecht</w:t>
+                            </w:pPr>
+                            <w:r>
+                              <w:rPr>
+                                <w:rFonts w:eastAsia="Calibri" w:cs="CorporateSPro-Regular"/>
+                                <w:sz w:val="13"/>
+                                <w:szCs w:val="13"/>
+                                <w:lang w:eastAsia="de-DE"/>
+                              </w:rPr>
+                              <w:t>ANGESTELLTE RECHTSANWÄLTE</w:t>
                             </w:r>
                           </w:p>
                           <w:p>
@@ -1047,54 +1300,7 @@
                               <w:autoSpaceDE w:val="0"/>
                               <w:autoSpaceDN w:val="0"/>
                               <w:adjustRightInd w:val="0"/>
-                              <w:spacing w:line="276" w:lineRule="auto"/>
-                              <w:jc w:val="left"/>
-                              <w:rPr>
-                                <w:rFonts w:eastAsia="Calibri" w:cs="CorporateSPro-Light"/>
-                                <w:sz w:val="13"/>
-                                <w:szCs w:val="13"/>
-                                <w:lang w:eastAsia="de-DE"/>
-                              </w:rPr>
-                            </w:pPr>
-                            <w:r>
-                              <w:rPr>
-                                <w:rFonts w:eastAsia="Calibri" w:cs="CorporateSPro-Light"/>
-                                <w:sz w:val="13"/>
-                                <w:szCs w:val="13"/>
-                                <w:lang w:eastAsia="de-DE"/>
-                              </w:rPr>
-                              <w:t xml:space="preserve">Fachanwalt für Handels- und Gesellschaftsrecht</w:t>
-                            </w:r>
-                          </w:p>
-                          <w:p>
-                            <w:pPr>
-                              <w:autoSpaceDE w:val="0"/>
-                              <w:autoSpaceDN w:val="0"/>
-                              <w:adjustRightInd w:val="0"/>
-                              <w:spacing w:line="276" w:lineRule="auto"/>
-                              <w:jc w:val="left"/>
-                              <w:rPr>
-                                <w:rFonts w:eastAsia="Calibri" w:cs="CorporateSPro-Light"/>
-                                <w:sz w:val="13"/>
-                                <w:szCs w:val="13"/>
-                                <w:lang w:eastAsia="de-DE"/>
-                              </w:rPr>
-                            </w:pPr>
-                            <w:r>
-                              <w:rPr>
-                                <w:rFonts w:eastAsia="Calibri" w:cs="CorporateSPro-Light"/>
-                                <w:sz w:val="13"/>
-                                <w:szCs w:val="13"/>
-                                <w:lang w:eastAsia="de-DE"/>
-                              </w:rPr>
-                              <w:t xml:space="preserve"/>
-                            </w:r>
-                          </w:p>
-                          <w:p>
-                            <w:pPr>
-                              <w:autoSpaceDE w:val="0"/>
-                              <w:autoSpaceDN w:val="0"/>
-                              <w:adjustRightInd w:val="0"/>
+                              <w:spacing w:line="240" w:lineRule="auto"/>
                               <w:jc w:val="left"/>
                               <w:rPr>
                                 <w:rFonts w:eastAsia="Calibri" w:cs="CorporateSPro-Demi"/>
@@ -1112,7 +1318,7 @@
                                 <w:szCs w:val="13"/>
                                 <w:lang w:eastAsia="de-DE"/>
                               </w:rPr>
-                              <w:t xml:space="preserve">Thorsten Lex</w:t>
+                              <w:t>Eva Meyer</w:t>
                             </w:r>
                           </w:p>
                           <w:p>
@@ -1120,7 +1326,31 @@
                               <w:autoSpaceDE w:val="0"/>
                               <w:autoSpaceDN w:val="0"/>
                               <w:adjustRightInd w:val="0"/>
-                              <w:spacing w:line="276" w:lineRule="auto"/>
+                              <w:spacing w:line="240" w:lineRule="auto"/>
+                              <w:jc w:val="left"/>
+                              <w:rPr>
+                                <w:rFonts w:eastAsia="Calibri" w:cs="CorporateSPro-Demi"/>
+                                <w:sz w:val="13"/>
+                                <w:szCs w:val="13"/>
+                                <w:lang w:eastAsia="de-DE"/>
+                              </w:rPr>
+                            </w:pPr>
+                            <w:r>
+                              <w:rPr>
+                                <w:rFonts w:eastAsia="Calibri" w:cs="CorporateSPro-Demi"/>
+                                <w:sz w:val="13"/>
+                                <w:szCs w:val="13"/>
+                                <w:lang w:eastAsia="de-DE"/>
+                              </w:rPr>
+                              <w:t>Fachanwältin für Insolvenz- und Sanierungsrecht</w:t>
+                            </w:r>
+                          </w:p>
+                          <w:p>
+                            <w:pPr>
+                              <w:autoSpaceDE w:val="0"/>
+                              <w:autoSpaceDN w:val="0"/>
+                              <w:adjustRightInd w:val="0"/>
+                              <w:spacing w:line="240" w:lineRule="auto"/>
                               <w:jc w:val="left"/>
                               <w:rPr>
                                 <w:rFonts w:eastAsia="Calibri" w:cs="CorporateSPro-Light"/>
@@ -1129,93 +1359,13 @@
                                 <w:lang w:eastAsia="de-DE"/>
                               </w:rPr>
                             </w:pPr>
-                            <w:r>
-                              <w:rPr>
-                                <w:rFonts w:eastAsia="Calibri" w:cs="CorporateSPro-Light"/>
-                                <w:sz w:val="13"/>
-                                <w:szCs w:val="13"/>
-                                <w:lang w:eastAsia="de-DE"/>
-                              </w:rPr>
-                              <w:t xml:space="preserve">Fachanwalt für Business</w:t>
-                            </w:r>
                           </w:p>
                           <w:p>
                             <w:pPr>
                               <w:autoSpaceDE w:val="0"/>
                               <w:autoSpaceDN w:val="0"/>
                               <w:adjustRightInd w:val="0"/>
-                              <w:spacing w:line="276" w:lineRule="auto"/>
-                              <w:jc w:val="left"/>
-                              <w:rPr>
-                                <w:rFonts w:eastAsia="Calibri" w:cs="CorporateSPro-Light"/>
-                                <w:sz w:val="13"/>
-                                <w:szCs w:val="13"/>
-                                <w:lang w:eastAsia="de-DE"/>
-                              </w:rPr>
-                            </w:pPr>
-                            <w:r>
-                              <w:rPr>
-                                <w:rFonts w:eastAsia="Calibri" w:cs="CorporateSPro-Light"/>
-                                <w:sz w:val="13"/>
-                                <w:szCs w:val="13"/>
-                                <w:lang w:eastAsia="de-DE"/>
-                              </w:rPr>
-                              <w:t xml:space="preserve"/>
-                            </w:r>
-                          </w:p>
-                          <w:p>
-                            <w:pPr>
-                              <w:autoSpaceDE w:val="0"/>
-                              <w:autoSpaceDN w:val="0"/>
-                              <w:adjustRightInd w:val="0"/>
-                              <w:spacing w:line="276" w:lineRule="auto"/>
-                              <w:jc w:val="left"/>
-                              <w:rPr>
-                                <w:rFonts w:eastAsia="Calibri" w:cs="CorporateSPro-Light"/>
-                                <w:sz w:val="13"/>
-                                <w:szCs w:val="13"/>
-                                <w:lang w:eastAsia="de-DE"/>
-                              </w:rPr>
-                            </w:pPr>
-                            <w:r>
-                              <w:rPr>
-                                <w:rFonts w:eastAsia="Calibri" w:cs="CorporateSPro-Light"/>
-                                <w:sz w:val="13"/>
-                                <w:szCs w:val="13"/>
-                                <w:lang w:eastAsia="de-DE"/>
-                              </w:rPr>
-                              <w:t xml:space="preserve"/>
-                            </w:r>
-                          </w:p>
-                          <w:p>
-                            <w:pPr>
-                              <w:autoSpaceDE w:val="0"/>
-                              <w:autoSpaceDN w:val="0"/>
-                              <w:adjustRightInd w:val="0"/>
-                              <w:spacing w:line="276" w:lineRule="auto"/>
-                              <w:jc w:val="left"/>
-                              <w:rPr>
-                                <w:rFonts w:eastAsia="Calibri" w:cs="CorporateSPro-Light"/>
-                                <w:sz w:val="13"/>
-                                <w:szCs w:val="13"/>
-                                <w:lang w:eastAsia="de-DE"/>
-                              </w:rPr>
-                            </w:pPr>
-                            <w:r>
-                              <w:rPr>
-                                <w:rFonts w:eastAsia="Calibri" w:cs="CorporateSPro-Light"/>
-                                <w:sz w:val="13"/>
-                                <w:szCs w:val="13"/>
-                                <w:lang w:eastAsia="de-DE"/>
-                              </w:rPr>
-                              <w:t xml:space="preserve">ANGESTELLTE RECHTSANWÄLTE</w:t>
-                            </w:r>
-                          </w:p>
-                          <w:p>
-                            <w:pPr>
-                              <w:autoSpaceDE w:val="0"/>
-                              <w:autoSpaceDN w:val="0"/>
-                              <w:adjustRightInd w:val="0"/>
+                              <w:spacing w:line="240" w:lineRule="auto"/>
                               <w:jc w:val="left"/>
                               <w:rPr>
                                 <w:rFonts w:eastAsia="Calibri" w:cs="CorporateSPro-Demi"/>
@@ -1233,7 +1383,7 @@
                                 <w:szCs w:val="13"/>
                                 <w:lang w:eastAsia="de-DE"/>
                               </w:rPr>
-                              <w:t xml:space="preserve">Eva Meyer</w:t>
+                              <w:t>Bettina Dax</w:t>
                             </w:r>
                           </w:p>
                           <w:p>
@@ -1241,7 +1391,7 @@
                               <w:autoSpaceDE w:val="0"/>
                               <w:autoSpaceDN w:val="0"/>
                               <w:adjustRightInd w:val="0"/>
-                              <w:spacing w:line="276" w:lineRule="auto"/>
+                              <w:spacing w:line="240" w:lineRule="auto"/>
                               <w:jc w:val="left"/>
                               <w:rPr>
                                 <w:rFonts w:eastAsia="Calibri" w:cs="CorporateSPro-Light"/>
@@ -1257,7 +1407,7 @@
                                 <w:szCs w:val="13"/>
                                 <w:lang w:eastAsia="de-DE"/>
                               </w:rPr>
-                              <w:t xml:space="preserve">Fachanwältin für Insolvenz- und Sanierungsrecht</w:t>
+                              <w:t>Rechtsanwältin</w:t>
                             </w:r>
                           </w:p>
                           <w:p>
@@ -1265,30 +1415,23 @@
                               <w:autoSpaceDE w:val="0"/>
                               <w:autoSpaceDN w:val="0"/>
                               <w:adjustRightInd w:val="0"/>
-                              <w:spacing w:line="276" w:lineRule="auto"/>
+                              <w:spacing w:line="240" w:lineRule="auto"/>
                               <w:jc w:val="left"/>
                               <w:rPr>
-                                <w:rFonts w:eastAsia="Calibri" w:cs="CorporateSPro-Light"/>
+                                <w:rFonts w:eastAsia="Calibri" w:cs="CorporateSPro-Demi"/>
+                                <w:b/>
                                 <w:sz w:val="13"/>
                                 <w:szCs w:val="13"/>
                                 <w:lang w:eastAsia="de-DE"/>
                               </w:rPr>
                             </w:pPr>
-                            <w:r>
-                              <w:rPr>
-                                <w:rFonts w:eastAsia="Calibri" w:cs="CorporateSPro-Light"/>
-                                <w:sz w:val="13"/>
-                                <w:szCs w:val="13"/>
-                                <w:lang w:eastAsia="de-DE"/>
-                              </w:rPr>
-                              <w:t xml:space="preserve"/>
-                            </w:r>
                           </w:p>
                           <w:p>
                             <w:pPr>
                               <w:autoSpaceDE w:val="0"/>
                               <w:autoSpaceDN w:val="0"/>
                               <w:adjustRightInd w:val="0"/>
+                              <w:spacing w:line="240" w:lineRule="auto"/>
                               <w:jc w:val="left"/>
                               <w:rPr>
                                 <w:rFonts w:eastAsia="Calibri" w:cs="CorporateSPro-Demi"/>
@@ -1306,7 +1449,7 @@
                                 <w:szCs w:val="13"/>
                                 <w:lang w:eastAsia="de-DE"/>
                               </w:rPr>
-                              <w:t xml:space="preserve">Bettina Dax</w:t>
+                              <w:t>Cornelia Kriege</w:t>
                             </w:r>
                           </w:p>
                           <w:p>
@@ -1314,7 +1457,7 @@
                               <w:autoSpaceDE w:val="0"/>
                               <w:autoSpaceDN w:val="0"/>
                               <w:adjustRightInd w:val="0"/>
-                              <w:spacing w:line="276" w:lineRule="auto"/>
+                              <w:spacing w:line="240" w:lineRule="auto"/>
                               <w:jc w:val="left"/>
                               <w:rPr>
                                 <w:rFonts w:eastAsia="Calibri" w:cs="CorporateSPro-Light"/>
@@ -1330,7 +1473,7 @@
                                 <w:szCs w:val="13"/>
                                 <w:lang w:eastAsia="de-DE"/>
                               </w:rPr>
-                              <w:t xml:space="preserve">Rechtsanwältin</w:t>
+                              <w:t>Rechtsanwältin</w:t>
                             </w:r>
                           </w:p>
                           <w:p>
@@ -1338,7 +1481,7 @@
                               <w:autoSpaceDE w:val="0"/>
                               <w:autoSpaceDN w:val="0"/>
                               <w:adjustRightInd w:val="0"/>
-                              <w:spacing w:line="276" w:lineRule="auto"/>
+                              <w:spacing w:line="240" w:lineRule="auto"/>
                               <w:jc w:val="left"/>
                               <w:rPr>
                                 <w:rFonts w:eastAsia="Calibri" w:cs="CorporateSPro-Light"/>
@@ -1347,21 +1490,13 @@
                                 <w:lang w:eastAsia="de-DE"/>
                               </w:rPr>
                             </w:pPr>
-                            <w:r>
-                              <w:rPr>
-                                <w:rFonts w:eastAsia="Calibri" w:cs="CorporateSPro-Light"/>
-                                <w:sz w:val="13"/>
-                                <w:szCs w:val="13"/>
-                                <w:lang w:eastAsia="de-DE"/>
-                              </w:rPr>
-                              <w:t xml:space="preserve"/>
-                            </w:r>
                           </w:p>
                           <w:p>
                             <w:pPr>
                               <w:autoSpaceDE w:val="0"/>
                               <w:autoSpaceDN w:val="0"/>
                               <w:adjustRightInd w:val="0"/>
+                              <w:spacing w:line="240" w:lineRule="auto"/>
                               <w:jc w:val="left"/>
                               <w:rPr>
                                 <w:rFonts w:eastAsia="Calibri" w:cs="CorporateSPro-Demi"/>
@@ -1379,8 +1514,50 @@
                                 <w:szCs w:val="13"/>
                                 <w:lang w:eastAsia="de-DE"/>
                               </w:rPr>
-                              <w:t xml:space="preserve">Cornelia Kriege</w:t>
+                              <w:t>Lars Wacker</w:t>
                             </w:r>
+                          </w:p>
+                          <w:p>
+                            <w:pPr>
+                              <w:autoSpaceDE w:val="0"/>
+                              <w:autoSpaceDN w:val="0"/>
+                              <w:adjustRightInd w:val="0"/>
+                              <w:spacing w:line="240" w:lineRule="auto"/>
+                              <w:jc w:val="left"/>
+                              <w:rPr>
+                                <w:rFonts w:eastAsia="Calibri" w:cs="CorporateSPro-Light"/>
+                                <w:sz w:val="13"/>
+                                <w:szCs w:val="13"/>
+                                <w:lang w:eastAsia="de-DE"/>
+                              </w:rPr>
+                            </w:pPr>
+                            <w:r>
+                              <w:rPr>
+                                <w:rFonts w:eastAsia="Calibri" w:cs="CorporateSPro-Light"/>
+                                <w:sz w:val="13"/>
+                                <w:szCs w:val="13"/>
+                                <w:lang w:eastAsia="de-DE"/>
+                              </w:rPr>
+                              <w:t>Rechtsanwalt</w:t>
+                            </w:r>
+                          </w:p>
+                          <w:p>
+                            <w:pPr>
+                              <w:pBdr>
+                                <w:bottom w:val="single" w:sz="4" w:space="1" w:color="auto"/>
+                              </w:pBdr>
+                              <w:autoSpaceDE w:val="0"/>
+                              <w:autoSpaceDN w:val="0"/>
+                              <w:adjustRightInd w:val="0"/>
+                              <w:spacing w:line="276" w:lineRule="auto"/>
+                              <w:jc w:val="left"/>
+                              <w:rPr>
+                                <w:rFonts w:eastAsia="Calibri" w:cs="CorporateSPro-Light"/>
+                                <w:sz w:val="13"/>
+                                <w:szCs w:val="13"/>
+                                <w:lang w:eastAsia="de-DE"/>
+                              </w:rPr>
+                            </w:pPr>
                           </w:p>
                           <w:p>
                             <w:pPr>
@@ -1396,14 +1573,28 @@
                                 <w:lang w:eastAsia="de-DE"/>
                               </w:rPr>
                             </w:pPr>
-                            <w:r>
+                          </w:p>
+                          <w:p>
+                            <w:pPr>
+                              <w:autoSpaceDE w:val="0"/>
+                              <w:autoSpaceDN w:val="0"/>
+                              <w:adjustRightInd w:val="0"/>
+                              <w:jc w:val="left"/>
                               <w:rPr>
-                                <w:rFonts w:eastAsia="Calibri" w:cs="CorporateSPro-Light"/>
+                                <w:rFonts w:eastAsia="Calibri" w:cs="CorporateSPro-Regular"/>
                                 <w:sz w:val="13"/>
                                 <w:szCs w:val="13"/>
                                 <w:lang w:eastAsia="de-DE"/>
                               </w:rPr>
-                              <w:t xml:space="preserve">Rechtsanwältin</w:t>
+                            </w:pPr>
+                            <w:r>
+                              <w:rPr>
+                                <w:rFonts w:eastAsia="Calibri" w:cs="CorporateSPro-Regular"/>
+                                <w:sz w:val="13"/>
+                                <w:szCs w:val="13"/>
+                                <w:lang w:eastAsia="de-DE"/>
+                              </w:rPr>
+                              <w:t>OF COUNSEL</w:t>
                             </w:r>
                           </w:p>
                           <w:p>
@@ -1411,30 +1602,7 @@
                               <w:autoSpaceDE w:val="0"/>
                               <w:autoSpaceDN w:val="0"/>
                               <w:adjustRightInd w:val="0"/>
-                              <w:spacing w:line="276" w:lineRule="auto"/>
-                              <w:jc w:val="left"/>
-                              <w:rPr>
-                                <w:rFonts w:eastAsia="Calibri" w:cs="CorporateSPro-Light"/>
-                                <w:sz w:val="13"/>
-                                <w:szCs w:val="13"/>
-                                <w:lang w:eastAsia="de-DE"/>
-                              </w:rPr>
-                            </w:pPr>
-                            <w:r>
-                              <w:rPr>
-                                <w:rFonts w:eastAsia="Calibri" w:cs="CorporateSPro-Light"/>
-                                <w:sz w:val="13"/>
-                                <w:szCs w:val="13"/>
-                                <w:lang w:eastAsia="de-DE"/>
-                              </w:rPr>
-                              <w:t xml:space="preserve"/>
-                            </w:r>
-                          </w:p>
-                          <w:p>
-                            <w:pPr>
-                              <w:autoSpaceDE w:val="0"/>
-                              <w:autoSpaceDN w:val="0"/>
-                              <w:adjustRightInd w:val="0"/>
+                              <w:spacing w:line="240" w:lineRule="auto"/>
                               <w:jc w:val="left"/>
                               <w:rPr>
                                 <w:rFonts w:eastAsia="Calibri" w:cs="CorporateSPro-Demi"/>
@@ -1452,8 +1620,50 @@
                                 <w:szCs w:val="13"/>
                                 <w:lang w:eastAsia="de-DE"/>
                               </w:rPr>
-                              <w:t xml:space="preserve">Lars Wacker</w:t>
+                              <w:t>Justizrat Prof. Dr. Dr. Thomas B. Schmidt M.A.</w:t>
                             </w:r>
+                          </w:p>
+                          <w:p>
+                            <w:pPr>
+                              <w:autoSpaceDE w:val="0"/>
+                              <w:autoSpaceDN w:val="0"/>
+                              <w:adjustRightInd w:val="0"/>
+                              <w:spacing w:line="240" w:lineRule="auto"/>
+                              <w:jc w:val="left"/>
+                              <w:rPr>
+                                <w:rFonts w:eastAsia="Calibri" w:cs="CorporateSPro-Light"/>
+                                <w:sz w:val="13"/>
+                                <w:szCs w:val="13"/>
+                                <w:lang w:eastAsia="de-DE"/>
+                              </w:rPr>
+                            </w:pPr>
+                            <w:r>
+                              <w:rPr>
+                                <w:rFonts w:eastAsia="Calibri" w:cs="CorporateSPro-Light"/>
+                                <w:sz w:val="13"/>
+                                <w:szCs w:val="13"/>
+                                <w:lang w:eastAsia="de-DE"/>
+                              </w:rPr>
+                              <w:t>Fachanwalt für Insolvenz- und Sanierungsrecht</w:t>
+                            </w:r>
+                          </w:p>
+                          <w:p>
+                            <w:pPr>
+                              <w:pBdr>
+                                <w:bottom w:val="single" w:sz="4" w:space="1" w:color="auto"/>
+                              </w:pBdr>
+                              <w:autoSpaceDE w:val="0"/>
+                              <w:autoSpaceDN w:val="0"/>
+                              <w:adjustRightInd w:val="0"/>
+                              <w:spacing w:line="276" w:lineRule="auto"/>
+                              <w:jc w:val="left"/>
+                              <w:rPr>
+                                <w:rFonts w:eastAsia="Calibri" w:cs="CorporateSPro-Light"/>
+                                <w:sz w:val="13"/>
+                                <w:szCs w:val="13"/>
+                                <w:lang w:eastAsia="de-DE"/>
+                              </w:rPr>
+                            </w:pPr>
                           </w:p>
                           <w:p>
                             <w:pPr>
@@ -1469,87 +1679,6 @@
                                 <w:lang w:eastAsia="de-DE"/>
                               </w:rPr>
                             </w:pPr>
-                            <w:r>
-                              <w:rPr>
-                                <w:rFonts w:eastAsia="Calibri" w:cs="CorporateSPro-Light"/>
-                                <w:sz w:val="13"/>
-                                <w:szCs w:val="13"/>
-                                <w:lang w:eastAsia="de-DE"/>
-                              </w:rPr>
-                              <w:t xml:space="preserve">Rechtsanwalt</w:t>
-                            </w:r>
-                          </w:p>
-                          <w:p>
-                            <w:pPr>
-                              <w:autoSpaceDE w:val="0"/>
-                              <w:autoSpaceDN w:val="0"/>
-                              <w:adjustRightInd w:val="0"/>
-                              <w:spacing w:line="276" w:lineRule="auto"/>
-                              <w:jc w:val="left"/>
-                              <w:rPr>
-                                <w:rFonts w:eastAsia="Calibri" w:cs="CorporateSPro-Light"/>
-                                <w:sz w:val="13"/>
-                                <w:szCs w:val="13"/>
-                                <w:lang w:eastAsia="de-DE"/>
-                              </w:rPr>
-                            </w:pPr>
-                            <w:r>
-                              <w:rPr>
-                                <w:rFonts w:eastAsia="Calibri" w:cs="CorporateSPro-Light"/>
-                                <w:sz w:val="13"/>
-                                <w:szCs w:val="13"/>
-                                <w:lang w:eastAsia="de-DE"/>
-                              </w:rPr>
-                              <w:t xml:space="preserve"/>
-                            </w:r>
-                          </w:p>
-                          <w:p>
-                            <w:pPr>
-                              <w:autoSpaceDE w:val="0"/>
-                              <w:autoSpaceDN w:val="0"/>
-                              <w:adjustRightInd w:val="0"/>
-                              <w:spacing w:line="276" w:lineRule="auto"/>
-                              <w:jc w:val="left"/>
-                              <w:rPr>
-                                <w:rFonts w:eastAsia="Calibri" w:cs="CorporateSPro-Light"/>
-                                <w:sz w:val="13"/>
-                                <w:szCs w:val="13"/>
-                                <w:lang w:eastAsia="de-DE"/>
-                              </w:rPr>
-                            </w:pPr>
-                            <w:r>
-                              <w:rPr>
-                                <w:rFonts w:eastAsia="Calibri" w:cs="CorporateSPro-Light"/>
-                                <w:sz w:val="13"/>
-                                <w:szCs w:val="13"/>
-                                <w:lang w:eastAsia="de-DE"/>
-                              </w:rPr>
-                              <w:t xml:space="preserve"/>
-                            </w:r>
-                          </w:p>
-                          <w:p>
-                            <w:pPr>
-                              <w:autoSpaceDE w:val="0"/>
-                              <w:autoSpaceDN w:val="0"/>
-                              <w:adjustRightInd w:val="0"/>
-                              <w:spacing w:line="276" w:lineRule="auto"/>
-                              <w:jc w:val="left"/>
-                              <w:rPr>
-                                <w:rFonts w:eastAsia="Calibri" w:cs="CorporateSPro-Light"/>
-                                <w:sz w:val="13"/>
-                                <w:szCs w:val="13"/>
-                                <w:lang w:eastAsia="de-DE"/>
-                              </w:rPr>
-                            </w:pPr>
-                            <w:r>
-                              <w:rPr>
-                                <w:rFonts w:eastAsia="Calibri" w:cs="CorporateSPro-Light"/>
-                                <w:sz w:val="13"/>
-                                <w:szCs w:val="13"/>
-                                <w:lang w:eastAsia="de-DE"/>
-                              </w:rPr>
-                              <w:t xml:space="preserve">OF COUNSEL</w:t>
-                            </w:r>
                           </w:p>
                           <w:p>
                             <w:pPr>
@@ -1558,8 +1687,30 @@
                               <w:adjustRightInd w:val="0"/>
                               <w:jc w:val="left"/>
                               <w:rPr>
+                                <w:rFonts w:eastAsia="Calibri" w:cs="CorporateSPro-Regular"/>
+                                <w:sz w:val="13"/>
+                                <w:szCs w:val="13"/>
+                                <w:lang w:eastAsia="de-DE"/>
+                              </w:rPr>
+                            </w:pPr>
+                            <w:r>
+                              <w:rPr>
+                                <w:rFonts w:eastAsia="Calibri" w:cs="CorporateSPro-Regular"/>
+                                <w:sz w:val="13"/>
+                                <w:szCs w:val="13"/>
+                                <w:lang w:eastAsia="de-DE"/>
+                              </w:rPr>
+                              <w:t>STANDORTE</w:t>
+                            </w:r>
+                          </w:p>
+                          <w:p>
+                            <w:pPr>
+                              <w:autoSpaceDE w:val="0"/>
+                              <w:autoSpaceDN w:val="0"/>
+                              <w:adjustRightInd w:val="0"/>
+                              <w:spacing w:line="240" w:lineRule="auto"/>
+                              <w:rPr>
                                 <w:rFonts w:eastAsia="Calibri" w:cs="CorporateSPro-Demi"/>
-                                <w:b/>
                                 <w:sz w:val="13"/>
                                 <w:szCs w:val="13"/>
                                 <w:lang w:eastAsia="de-DE"/>
@@ -1568,12 +1719,30 @@
                             <w:r>
                               <w:rPr>
                                 <w:rFonts w:eastAsia="Calibri" w:cs="CorporateSPro-Demi"/>
-                                <w:b/>
                                 <w:sz w:val="13"/>
                                 <w:szCs w:val="13"/>
                                 <w:lang w:eastAsia="de-DE"/>
                               </w:rPr>
-                              <w:t xml:space="preserve">Justizrat Prof. Dr. Dr. Thomas B. Schmidt M.A.</w:t>
+                              <w:t>Trier</w:t>
+                            </w:r>
+                            <w:r>
+                              <w:rPr>
+                                <w:rFonts w:eastAsia="Calibri" w:cs="CorporateSPro-Demi"/>
+                                <w:sz w:val="13"/>
+                                <w:szCs w:val="13"/>
+                                <w:lang w:eastAsia="de-DE"/>
+                              </w:rPr>
+                              <w:tab/>
+                            </w:r>
+                            <w:r>
+                              <w:rPr>
+                                <w:rFonts w:eastAsia="Calibri" w:cs="CorporateSPro-Demi"/>
+                                <w:sz w:val="13"/>
+                                <w:szCs w:val="13"/>
+                                <w:lang w:eastAsia="de-DE"/>
+                              </w:rPr>
+                              <w:tab/>
+                              <w:t>Bad Kreuznach</w:t>
                             </w:r>
                           </w:p>
                           <w:p>
@@ -1581,10 +1750,9 @@
                               <w:autoSpaceDE w:val="0"/>
                               <w:autoSpaceDN w:val="0"/>
                               <w:adjustRightInd w:val="0"/>
-                              <w:spacing w:line="276" w:lineRule="auto"/>
-                              <w:jc w:val="left"/>
+                              <w:spacing w:line="240" w:lineRule="auto"/>
                               <w:rPr>
-                                <w:rFonts w:eastAsia="Calibri" w:cs="CorporateSPro-Light"/>
+                                <w:rFonts w:eastAsia="Calibri" w:cs="CorporateSPro-Demi"/>
                                 <w:sz w:val="13"/>
                                 <w:szCs w:val="13"/>
                                 <w:lang w:eastAsia="de-DE"/>
@@ -1592,12 +1760,22 @@
                             </w:pPr>
                             <w:r>
                               <w:rPr>
-                                <w:rFonts w:eastAsia="Calibri" w:cs="CorporateSPro-Light"/>
+                                <w:rFonts w:eastAsia="Calibri" w:cs="CorporateSPro-Demi"/>
                                 <w:sz w:val="13"/>
                                 <w:szCs w:val="13"/>
                                 <w:lang w:eastAsia="de-DE"/>
                               </w:rPr>
-                              <w:t xml:space="preserve">Fachanwalt für Insolvenz- und Sanierungsrecht</w:t>
+                              <w:t>Frankfurt am Main</w:t>
+                            </w:r>
+                            <w:r>
+                              <w:rPr>
+                                <w:rFonts w:eastAsia="Calibri" w:cs="CorporateSPro-Demi"/>
+                                <w:sz w:val="13"/>
+                                <w:szCs w:val="13"/>
+                                <w:lang w:eastAsia="de-DE"/>
+                              </w:rPr>
+                              <w:tab/>
+                              <w:t>Zell/Mosel</w:t>
                             </w:r>
                           </w:p>
                           <w:p>
@@ -1605,10 +1783,9 @@
                               <w:autoSpaceDE w:val="0"/>
                               <w:autoSpaceDN w:val="0"/>
                               <w:adjustRightInd w:val="0"/>
-                              <w:spacing w:line="276" w:lineRule="auto"/>
-                              <w:jc w:val="left"/>
+                              <w:spacing w:line="240" w:lineRule="auto"/>
                               <w:rPr>
-                                <w:rFonts w:eastAsia="Calibri" w:cs="CorporateSPro-Light"/>
+                                <w:rFonts w:eastAsia="Calibri" w:cs="CorporateSPro-Demi"/>
                                 <w:sz w:val="13"/>
                                 <w:szCs w:val="13"/>
                                 <w:lang w:eastAsia="de-DE"/>
@@ -1616,12 +1793,22 @@
                             </w:pPr>
                             <w:r>
                               <w:rPr>
-                                <w:rFonts w:eastAsia="Calibri" w:cs="CorporateSPro-Light"/>
+                                <w:rFonts w:eastAsia="Calibri" w:cs="CorporateSPro-Demi"/>
                                 <w:sz w:val="13"/>
                                 <w:szCs w:val="13"/>
                                 <w:lang w:eastAsia="de-DE"/>
                               </w:rPr>
-                              <w:t xml:space="preserve"/>
+                              <w:t>Idar-Oberstein</w:t>
+                            </w:r>
+                            <w:r>
+                              <w:rPr>
+                                <w:rFonts w:eastAsia="Calibri" w:cs="CorporateSPro-Demi"/>
+                                <w:sz w:val="13"/>
+                                <w:szCs w:val="13"/>
+                                <w:lang w:eastAsia="de-DE"/>
+                              </w:rPr>
+                              <w:tab/>
+                              <w:t>Koblenz</w:t>
                             </w:r>
                           </w:p>
                           <w:p>
@@ -1629,10 +1816,9 @@
                               <w:autoSpaceDE w:val="0"/>
                               <w:autoSpaceDN w:val="0"/>
                               <w:adjustRightInd w:val="0"/>
-                              <w:spacing w:line="276" w:lineRule="auto"/>
-                              <w:jc w:val="left"/>
+                              <w:spacing w:line="240" w:lineRule="auto"/>
                               <w:rPr>
-                                <w:rFonts w:eastAsia="Calibri" w:cs="CorporateSPro-Light"/>
+                                <w:rFonts w:eastAsia="Calibri" w:cs="CorporateSPro-Demi"/>
                                 <w:sz w:val="13"/>
                                 <w:szCs w:val="13"/>
                                 <w:lang w:eastAsia="de-DE"/>
@@ -1640,12 +1826,31 @@
                             </w:pPr>
                             <w:r>
                               <w:rPr>
-                                <w:rFonts w:eastAsia="Calibri" w:cs="CorporateSPro-Light"/>
+                                <w:rFonts w:eastAsia="Calibri" w:cs="CorporateSPro-Demi"/>
                                 <w:sz w:val="13"/>
                                 <w:szCs w:val="13"/>
                                 <w:lang w:eastAsia="de-DE"/>
                               </w:rPr>
-                              <w:t xml:space="preserve"/>
+                              <w:t>Langgöns</w:t>
+                            </w:r>
+                            <w:r>
+                              <w:rPr>
+                                <w:rFonts w:eastAsia="Calibri" w:cs="CorporateSPro-Demi"/>
+                                <w:sz w:val="13"/>
+                                <w:szCs w:val="13"/>
+                                <w:lang w:eastAsia="de-DE"/>
+                              </w:rPr>
+                              <w:tab/>
+                            </w:r>
+                            <w:r>
+                              <w:rPr>
+                                <w:rFonts w:eastAsia="Calibri" w:cs="CorporateSPro-Demi"/>
+                                <w:sz w:val="13"/>
+                                <w:szCs w:val="13"/>
+                                <w:lang w:eastAsia="de-DE"/>
+                              </w:rPr>
+                              <w:tab/>
+                              <w:t>Limburg/Lahn</w:t>
                             </w:r>
                           </w:p>
                           <w:p>
@@ -1653,144 +1858,52 @@
                               <w:autoSpaceDE w:val="0"/>
                               <w:autoSpaceDN w:val="0"/>
                               <w:adjustRightInd w:val="0"/>
-                              <w:spacing w:line="276" w:lineRule="auto"/>
-                              <w:jc w:val="left"/>
+                              <w:spacing w:line="240" w:lineRule="auto"/>
                               <w:rPr>
-                                <w:rFonts w:eastAsia="Calibri" w:cs="CorporateSPro-Light"/>
-                                <w:sz w:val="13"/>
-                                <w:szCs w:val="13"/>
+                                <w:rFonts w:eastAsia="Calibri" w:cs="CorporateSPro-Demi"/>
+                                <w:sz w:val="9"/>
+                                <w:szCs w:val="9"/>
                                 <w:lang w:eastAsia="de-DE"/>
                               </w:rPr>
                             </w:pPr>
                             <w:r>
                               <w:rPr>
-                                <w:rFonts w:eastAsia="Calibri" w:cs="CorporateSPro-Light"/>
+                                <w:rFonts w:eastAsia="Calibri" w:cs="CorporateSPro-Demi"/>
                                 <w:sz w:val="13"/>
                                 <w:szCs w:val="13"/>
                                 <w:lang w:eastAsia="de-DE"/>
                               </w:rPr>
-                              <w:t xml:space="preserve">STANDORTE</w:t>
+                              <w:t>Mainz</w:t>
                             </w:r>
-                          </w:p>
-                          <w:p>
-                            <w:pPr>
-                              <w:autoSpaceDE w:val="0"/>
-                              <w:autoSpaceDN w:val="0"/>
-                              <w:adjustRightInd w:val="0"/>
-                              <w:spacing w:line="276" w:lineRule="auto"/>
-                              <w:jc w:val="left"/>
+                            <w:r>
                               <w:rPr>
-                                <w:rFonts w:eastAsia="Calibri" w:cs="CorporateSPro-Light"/>
+                                <w:rFonts w:eastAsia="Calibri" w:cs="CorporateSPro-Demi"/>
                                 <w:sz w:val="13"/>
                                 <w:szCs w:val="13"/>
                                 <w:lang w:eastAsia="de-DE"/>
                               </w:rPr>
-                            </w:pPr>
+                              <w:tab/>
+                            </w:r>
                             <w:r>
                               <w:rPr>
-                                <w:rFonts w:eastAsia="Calibri" w:cs="CorporateSPro-Light"/>
+                                <w:rFonts w:eastAsia="Calibri" w:cs="CorporateSPro-Demi"/>
                                 <w:sz w:val="13"/>
                                 <w:szCs w:val="13"/>
                                 <w:lang w:eastAsia="de-DE"/>
                               </w:rPr>
-                              <w:t xml:space="preserve">Trier		Zell/Mosel</w:t>
+                              <w:tab/>
+                              <w:t>Wiesbaden</w:t>
                             </w:r>
-                          </w:p>
-                          <w:p>
-                            <w:pPr>
-                              <w:autoSpaceDE w:val="0"/>
-                              <w:autoSpaceDN w:val="0"/>
-                              <w:adjustRightInd w:val="0"/>
-                              <w:spacing w:line="276" w:lineRule="auto"/>
-                              <w:jc w:val="left"/>
-                              <w:rPr>
-                                <w:rFonts w:eastAsia="Calibri" w:cs="CorporateSPro-Light"/>
-                                <w:sz w:val="13"/>
-                                <w:szCs w:val="13"/>
-                                <w:lang w:eastAsia="de-DE"/>
-                              </w:rPr>
-                            </w:pPr>
-                            <w:r>
-                              <w:rPr>
-                                <w:rFonts w:eastAsia="Calibri" w:cs="CorporateSPro-Light"/>
-                                <w:sz w:val="13"/>
-                                <w:szCs w:val="13"/>
-                                <w:lang w:eastAsia="de-DE"/>
-                              </w:rPr>
-                              <w:t xml:space="preserve">Wiesbaden		Koblenz</w:t>
-                            </w:r>
-                          </w:p>
-                          <w:p>
-                            <w:pPr>
-                              <w:autoSpaceDE w:val="0"/>
-                              <w:autoSpaceDN w:val="0"/>
-                              <w:adjustRightInd w:val="0"/>
-                              <w:spacing w:line="276" w:lineRule="auto"/>
-                              <w:jc w:val="left"/>
-                              <w:rPr>
-                                <w:rFonts w:eastAsia="Calibri" w:cs="CorporateSPro-Light"/>
-                                <w:sz w:val="13"/>
-                                <w:szCs w:val="13"/>
-                                <w:lang w:eastAsia="de-DE"/>
-                              </w:rPr>
-                            </w:pPr>
-                            <w:r>
-                              <w:rPr>
-                                <w:rFonts w:eastAsia="Calibri" w:cs="CorporateSPro-Light"/>
-                                <w:sz w:val="13"/>
-                                <w:szCs w:val="13"/>
-                                <w:lang w:eastAsia="de-DE"/>
-                              </w:rPr>
-                              <w:t xml:space="preserve">Bad Kreuznach		Frankfurt am Main</w:t>
-                            </w:r>
-                          </w:p>
-                          <w:p>
-                            <w:pPr>
-                              <w:autoSpaceDE w:val="0"/>
-                              <w:autoSpaceDN w:val="0"/>
-                              <w:adjustRightInd w:val="0"/>
-                              <w:spacing w:line="276" w:lineRule="auto"/>
-                              <w:jc w:val="left"/>
-                              <w:rPr>
-                                <w:rFonts w:eastAsia="Calibri" w:cs="CorporateSPro-Light"/>
-                                <w:sz w:val="13"/>
-                                <w:szCs w:val="13"/>
-                                <w:lang w:eastAsia="de-DE"/>
-                              </w:rPr>
-                            </w:pPr>
-                            <w:r>
-                              <w:rPr>
-                                <w:rFonts w:eastAsia="Calibri" w:cs="CorporateSPro-Light"/>
-                                <w:sz w:val="13"/>
-                                <w:szCs w:val="13"/>
-                                <w:lang w:eastAsia="de-DE"/>
-                              </w:rPr>
-                              <w:t xml:space="preserve">Idar-Oberstein		Langgöns</w:t>
-                            </w:r>
-                          </w:p>
-                          <w:p>
-                            <w:pPr>
-                              <w:autoSpaceDE w:val="0"/>
-                              <w:autoSpaceDN w:val="0"/>
-                              <w:adjustRightInd w:val="0"/>
-                              <w:spacing w:line="276" w:lineRule="auto"/>
-                              <w:jc w:val="left"/>
-                              <w:rPr>
-                                <w:rFonts w:eastAsia="Calibri" w:cs="CorporateSPro-Light"/>
-                                <w:sz w:val="13"/>
-                                <w:szCs w:val="13"/>
-                                <w:lang w:eastAsia="de-DE"/>
-                              </w:rPr>
-                            </w:pPr>
-                            <w:r>
-                              <w:rPr>
-                                <w:rFonts w:eastAsia="Calibri" w:cs="CorporateSPro-Light"/>
-                                <w:sz w:val="13"/>
-                                <w:szCs w:val="13"/>
-                                <w:lang w:eastAsia="de-DE"/>
-                              </w:rPr>
-                              <w:t xml:space="preserve">Limburg/Lahn		Mainz</w:t>
-                            </w:r>
+                            <w:bookmarkEnd w:id="0"/>
+                            <w:bookmarkEnd w:id="1"/>
+                            <w:bookmarkEnd w:id="2"/>
+                            <w:bookmarkEnd w:id="3"/>
+                            <w:bookmarkEnd w:id="4"/>
+                            <w:bookmarkEnd w:id="5"/>
+                            <w:bookmarkEnd w:id="6"/>
+                            <w:bookmarkEnd w:id="7"/>
+                            <w:bookmarkEnd w:id="8"/>
+                            <w:bookmarkEnd w:id="9"/>
                           </w:p>
                         </w:txbxContent>
                       </wps:txbx>
@@ -1843,7 +1956,7 @@
                           <w:szCs w:val="13"/>
                           <w:lang w:eastAsia="de-DE"/>
                         </w:rPr>
-                        <w:t xml:space="preserve">www.tbs-insolvenzverwalter.de</w:t>
+                        <w:t>www.tbs-insolvenzverwalter.de</w:t>
                       </w:r>
                     </w:p>
                     <w:p>
@@ -1867,11 +1980,14 @@
                           <w:szCs w:val="13"/>
                           <w:lang w:eastAsia="de-DE"/>
                         </w:rPr>
-                        <w:t xml:space="preserve">Partnerschaftsregister des</w:t>
+                        <w:t>Partnerschaftsregister des</w:t>
                       </w:r>
                     </w:p>
                     <w:p>
                       <w:pPr>
+                        <w:pBdr>
+                          <w:bottom w:val="single" w:sz="4" w:space="1" w:color="auto"/>
+                        </w:pBdr>
                         <w:autoSpaceDE w:val="0"/>
                         <w:autoSpaceDN w:val="0"/>
                         <w:adjustRightInd w:val="0"/>
@@ -1891,8 +2007,134 @@
                           <w:szCs w:val="13"/>
                           <w:lang w:eastAsia="de-DE"/>
                         </w:rPr>
-                        <w:t xml:space="preserve">Amtsgericht Koblenz – PR 20203</w:t>
+                        <w:t>Amtsgericht Koblenz – PR 20203</w:t>
                       </w:r>
+                    </w:p>
+                    <w:p>
+                      <w:pPr>
+                        <w:pBdr>
+                          <w:bottom w:val="single" w:sz="4" w:space="1" w:color="auto"/>
+                        </w:pBdr>
+                        <w:autoSpaceDE w:val="0"/>
+                        <w:autoSpaceDN w:val="0"/>
+                        <w:adjustRightInd w:val="0"/>
+                        <w:spacing w:line="276" w:lineRule="auto"/>
+                        <w:jc w:val="center"/>
+                        <w:rPr>
+                          <w:rFonts w:eastAsia="Calibri" w:cs="CorporateSPro-Light"/>
+                          <w:sz w:val="13"/>
+                          <w:szCs w:val="13"/>
+                          <w:lang w:eastAsia="de-DE"/>
+                        </w:rPr>
+                      </w:pPr>
+                    </w:p>
+                    <w:p>
+                      <w:pPr>
+                        <w:pBdr>
+                          <w:bottom w:val="single" w:sz="4" w:space="1" w:color="auto"/>
+                        </w:pBdr>
+                        <w:autoSpaceDE w:val="0"/>
+                        <w:autoSpaceDN w:val="0"/>
+                        <w:adjustRightInd w:val="0"/>
+                        <w:spacing w:line="276" w:lineRule="auto"/>
+                        <w:jc w:val="center"/>
+                        <w:rPr>
+                          <w:rFonts w:eastAsia="Calibri" w:cs="CorporateSPro-Light"/>
+                          <w:sz w:val="13"/>
+                          <w:szCs w:val="13"/>
+                          <w:lang w:eastAsia="de-DE"/>
+                        </w:rPr>
+                      </w:pPr>
+                    </w:p>
+                    <w:p>
+                      <w:pPr>
+                        <w:pBdr>
+                          <w:bottom w:val="single" w:sz="4" w:space="1" w:color="auto"/>
+                        </w:pBdr>
+                        <w:autoSpaceDE w:val="0"/>
+                        <w:autoSpaceDN w:val="0"/>
+                        <w:adjustRightInd w:val="0"/>
+                        <w:spacing w:line="276" w:lineRule="auto"/>
+                        <w:jc w:val="center"/>
+                        <w:rPr>
+                          <w:rFonts w:eastAsia="Calibri" w:cs="CorporateSPro-Light"/>
+                          <w:sz w:val="13"/>
+                          <w:szCs w:val="13"/>
+                          <w:lang w:eastAsia="de-DE"/>
+                        </w:rPr>
+                      </w:pPr>
+                    </w:p>
+                    <w:p>
+                      <w:pPr>
+                        <w:pBdr>
+                          <w:bottom w:val="single" w:sz="4" w:space="1" w:color="auto"/>
+                        </w:pBdr>
+                        <w:autoSpaceDE w:val="0"/>
+                        <w:autoSpaceDN w:val="0"/>
+                        <w:adjustRightInd w:val="0"/>
+                        <w:spacing w:line="276" w:lineRule="auto"/>
+                        <w:jc w:val="center"/>
+                        <w:rPr>
+                          <w:rFonts w:eastAsia="Calibri" w:cs="CorporateSPro-Light"/>
+                          <w:sz w:val="13"/>
+                          <w:szCs w:val="13"/>
+                          <w:lang w:eastAsia="de-DE"/>
+                        </w:rPr>
+                      </w:pPr>
+                    </w:p>
+                    <w:p>
+                      <w:pPr>
+                        <w:pBdr>
+                          <w:bottom w:val="single" w:sz="4" w:space="1" w:color="auto"/>
+                        </w:pBdr>
+                        <w:autoSpaceDE w:val="0"/>
+                        <w:autoSpaceDN w:val="0"/>
+                        <w:adjustRightInd w:val="0"/>
+                        <w:spacing w:line="276" w:lineRule="auto"/>
+                        <w:jc w:val="center"/>
+                        <w:rPr>
+                          <w:rFonts w:eastAsia="Calibri" w:cs="CorporateSPro-Light"/>
+                          <w:sz w:val="13"/>
+                          <w:szCs w:val="13"/>
+                          <w:lang w:eastAsia="de-DE"/>
+                        </w:rPr>
+                      </w:pPr>
+                    </w:p>
+                    <w:p>
+                      <w:pPr>
+                        <w:pBdr>
+                          <w:bottom w:val="single" w:sz="4" w:space="1" w:color="auto"/>
+                        </w:pBdr>
+                        <w:autoSpaceDE w:val="0"/>
+                        <w:autoSpaceDN w:val="0"/>
+                        <w:adjustRightInd w:val="0"/>
+                        <w:spacing w:line="276" w:lineRule="auto"/>
+                        <w:jc w:val="center"/>
+                        <w:rPr>
+                          <w:rFonts w:eastAsia="Calibri" w:cs="CorporateSPro-Light"/>
+                          <w:sz w:val="13"/>
+                          <w:szCs w:val="13"/>
+                          <w:lang w:eastAsia="de-DE"/>
+                        </w:rPr>
+                      </w:pPr>
+                    </w:p>
+                    <w:p>
+                      <w:pPr>
+                        <w:pBdr>
+                          <w:bottom w:val="single" w:sz="4" w:space="1" w:color="auto"/>
+                        </w:pBdr>
+                        <w:autoSpaceDE w:val="0"/>
+                        <w:autoSpaceDN w:val="0"/>
+                        <w:adjustRightInd w:val="0"/>
+                        <w:spacing w:line="276" w:lineRule="auto"/>
+                        <w:jc w:val="center"/>
+                        <w:rPr>
+                          <w:rFonts w:eastAsia="Calibri" w:cs="CorporateSPro-Light"/>
+                          <w:sz w:val="13"/>
+                          <w:szCs w:val="13"/>
+                          <w:lang w:eastAsia="de-DE"/>
+                        </w:rPr>
+                      </w:pPr>
                     </w:p>
                     <w:p>
                       <w:pPr>
@@ -1908,14 +2150,38 @@
                           <w:lang w:eastAsia="de-DE"/>
                         </w:rPr>
                       </w:pPr>
-                      <w:r>
+                    </w:p>
+                    <w:p>
+                      <w:pPr>
+                        <w:autoSpaceDE w:val="0"/>
+                        <w:autoSpaceDN w:val="0"/>
+                        <w:adjustRightInd w:val="0"/>
+                        <w:jc w:val="left"/>
                         <w:rPr>
-                          <w:rFonts w:eastAsia="Calibri" w:cs="CorporateSPro-Light"/>
+                          <w:rFonts w:eastAsia="Calibri" w:cs="CorporateSPro-Regular"/>
                           <w:sz w:val="13"/>
                           <w:szCs w:val="13"/>
                           <w:lang w:eastAsia="de-DE"/>
                         </w:rPr>
-                        <w:t xml:space="preserve"/>
+                      </w:pPr>
+                      <w:bookmarkStart w:id="10" w:name="_Hlk217368252"/>
+                      <w:bookmarkStart w:id="11" w:name="_Hlk217368253"/>
+                      <w:bookmarkStart w:id="12" w:name="_Hlk217368337"/>
+                      <w:bookmarkStart w:id="13" w:name="_Hlk217368338"/>
+                      <w:bookmarkStart w:id="14" w:name="_Hlk217368401"/>
+                      <w:bookmarkStart w:id="15" w:name="_Hlk217368402"/>
+                      <w:bookmarkStart w:id="16" w:name="_Hlk217368434"/>
+                      <w:bookmarkStart w:id="17" w:name="_Hlk217368435"/>
+                      <w:bookmarkStart w:id="18" w:name="_Hlk217368465"/>
+                      <w:bookmarkStart w:id="19" w:name="_Hlk217368466"/>
+                      <w:r>
+                        <w:rPr>
+                          <w:rFonts w:eastAsia="Calibri" w:cs="CorporateSPro-Regular"/>
+                          <w:sz w:val="13"/>
+                          <w:szCs w:val="13"/>
+                          <w:lang w:eastAsia="de-DE"/>
+                        </w:rPr>
+                        <w:t>PARTNER</w:t>
                       </w:r>
                     </w:p>
                     <w:p>
@@ -1923,78 +2189,7 @@
                         <w:autoSpaceDE w:val="0"/>
                         <w:autoSpaceDN w:val="0"/>
                         <w:adjustRightInd w:val="0"/>
-                        <w:spacing w:line="276" w:lineRule="auto"/>
-                        <w:jc w:val="left"/>
-                        <w:rPr>
-                          <w:rFonts w:eastAsia="Calibri" w:cs="CorporateSPro-Light"/>
-                          <w:sz w:val="13"/>
-                          <w:szCs w:val="13"/>
-                          <w:lang w:eastAsia="de-DE"/>
-                        </w:rPr>
-                      </w:pPr>
-                      <w:r>
-                        <w:rPr>
-                          <w:rFonts w:eastAsia="Calibri" w:cs="CorporateSPro-Light"/>
-                          <w:sz w:val="13"/>
-                          <w:szCs w:val="13"/>
-                          <w:lang w:eastAsia="de-DE"/>
-                        </w:rPr>
-                        <w:t xml:space="preserve"/>
-                      </w:r>
-                    </w:p>
-                    <w:p>
-                      <w:pPr>
-                        <w:autoSpaceDE w:val="0"/>
-                        <w:autoSpaceDN w:val="0"/>
-                        <w:adjustRightInd w:val="0"/>
-                        <w:spacing w:line="276" w:lineRule="auto"/>
-                        <w:jc w:val="left"/>
-                        <w:rPr>
-                          <w:rFonts w:eastAsia="Calibri" w:cs="CorporateSPro-Light"/>
-                          <w:sz w:val="13"/>
-                          <w:szCs w:val="13"/>
-                          <w:lang w:eastAsia="de-DE"/>
-                        </w:rPr>
-                      </w:pPr>
-                      <w:r>
-                        <w:rPr>
-                          <w:rFonts w:eastAsia="Calibri" w:cs="CorporateSPro-Light"/>
-                          <w:sz w:val="13"/>
-                          <w:szCs w:val="13"/>
-                          <w:lang w:eastAsia="de-DE"/>
-                        </w:rPr>
-                        <w:t xml:space="preserve"/>
-                      </w:r>
-                    </w:p>
-                    <w:p>
-                      <w:pPr>
-                        <w:autoSpaceDE w:val="0"/>
-                        <w:autoSpaceDN w:val="0"/>
-                        <w:adjustRightInd w:val="0"/>
-                        <w:spacing w:line="276" w:lineRule="auto"/>
-                        <w:jc w:val="left"/>
-                        <w:rPr>
-                          <w:rFonts w:eastAsia="Calibri" w:cs="CorporateSPro-Light"/>
-                          <w:sz w:val="13"/>
-                          <w:szCs w:val="13"/>
-                          <w:lang w:eastAsia="de-DE"/>
-                        </w:rPr>
-                      </w:pPr>
-                      <w:r>
-                        <w:rPr>
-                          <w:rFonts w:eastAsia="Calibri" w:cs="CorporateSPro-Light"/>
-                          <w:sz w:val="13"/>
-                          <w:szCs w:val="13"/>
-                          <w:lang w:eastAsia="de-DE"/>
-                        </w:rPr>
-                        <w:t xml:space="preserve">PARTNER</w:t>
-                      </w:r>
-                    </w:p>
-                    <w:p>
-                      <w:pPr>
-                        <w:autoSpaceDE w:val="0"/>
-                        <w:autoSpaceDN w:val="0"/>
-                        <w:adjustRightInd w:val="0"/>
+                        <w:spacing w:line="240" w:lineRule="auto"/>
                         <w:jc w:val="left"/>
                         <w:rPr>
                           <w:rFonts w:eastAsia="Calibri" w:cs="CorporateSPro-Demi"/>
@@ -2012,7 +2207,7 @@
                           <w:szCs w:val="13"/>
                           <w:lang w:eastAsia="de-DE"/>
                         </w:rPr>
-                        <w:t xml:space="preserve">Ingo Grünewald</w:t>
+                        <w:t>Ingo Grünewald</w:t>
                       </w:r>
                     </w:p>
                     <w:p>
@@ -2020,7 +2215,7 @@
                         <w:autoSpaceDE w:val="0"/>
                         <w:autoSpaceDN w:val="0"/>
                         <w:adjustRightInd w:val="0"/>
-                        <w:spacing w:line="276" w:lineRule="auto"/>
+                        <w:spacing w:line="240" w:lineRule="auto"/>
                         <w:jc w:val="left"/>
                         <w:rPr>
                           <w:rFonts w:eastAsia="Calibri" w:cs="CorporateSPro-Light"/>
@@ -2036,7 +2231,7 @@
                           <w:szCs w:val="13"/>
                           <w:lang w:eastAsia="de-DE"/>
                         </w:rPr>
-                        <w:t xml:space="preserve">Fachanwalt für Insolvenz- und Sanierungsrecht</w:t>
+                        <w:t>Fachanwalt für Insolvenz- und Sanierungsrecht</w:t>
                       </w:r>
                     </w:p>
                     <w:p>
@@ -2044,7 +2239,7 @@
                         <w:autoSpaceDE w:val="0"/>
                         <w:autoSpaceDN w:val="0"/>
                         <w:adjustRightInd w:val="0"/>
-                        <w:spacing w:line="276" w:lineRule="auto"/>
+                        <w:spacing w:line="240" w:lineRule="auto"/>
                         <w:jc w:val="left"/>
                         <w:rPr>
                           <w:rFonts w:eastAsia="Calibri" w:cs="CorporateSPro-Light"/>
@@ -2060,7 +2255,7 @@
                           <w:szCs w:val="13"/>
                           <w:lang w:eastAsia="de-DE"/>
                         </w:rPr>
-                        <w:t xml:space="preserve">Fachanwalt für Handels- und Gesellschaftsrecht</w:t>
+                        <w:t>Fachanwalt für Handels- und Gesellschaftsrecht</w:t>
                       </w:r>
                     </w:p>
                     <w:p>
@@ -2068,7 +2263,49 @@
                         <w:autoSpaceDE w:val="0"/>
                         <w:autoSpaceDN w:val="0"/>
                         <w:adjustRightInd w:val="0"/>
-                        <w:spacing w:line="276" w:lineRule="auto"/>
+                        <w:spacing w:line="240" w:lineRule="auto"/>
+                        <w:jc w:val="left"/>
+                        <w:rPr>
+                          <w:rFonts w:eastAsia="Calibri" w:cs="CorporateSPro-Demi"/>
+                          <w:b/>
+                          <w:sz w:val="13"/>
+                          <w:szCs w:val="13"/>
+                          <w:lang w:eastAsia="de-DE"/>
+                        </w:rPr>
+                      </w:pPr>
+                    </w:p>
+                    <w:p>
+                      <w:pPr>
+                        <w:autoSpaceDE w:val="0"/>
+                        <w:autoSpaceDN w:val="0"/>
+                        <w:adjustRightInd w:val="0"/>
+                        <w:spacing w:line="240" w:lineRule="auto"/>
+                        <w:jc w:val="left"/>
+                        <w:rPr>
+                          <w:rFonts w:eastAsia="Calibri" w:cs="CorporateSPro-Demi"/>
+                          <w:b/>
+                          <w:sz w:val="13"/>
+                          <w:szCs w:val="13"/>
+                          <w:lang w:val="en-GB" w:eastAsia="de-DE"/>
+                        </w:rPr>
+                      </w:pPr>
+                      <w:r>
+                        <w:rPr>
+                          <w:rFonts w:eastAsia="Calibri" w:cs="CorporateSPro-Demi"/>
+                          <w:b/>
+                          <w:sz w:val="13"/>
+                          <w:szCs w:val="13"/>
+                          <w:lang w:val="en-GB" w:eastAsia="de-DE"/>
+                        </w:rPr>
+                        <w:t>Dr. Alexander Thomas Lamberty LL.M.</w:t>
+                      </w:r>
+                    </w:p>
+                    <w:p>
+                      <w:pPr>
+                        <w:autoSpaceDE w:val="0"/>
+                        <w:autoSpaceDN w:val="0"/>
+                        <w:adjustRightInd w:val="0"/>
+                        <w:spacing w:line="240" w:lineRule="auto"/>
                         <w:jc w:val="left"/>
                         <w:rPr>
                           <w:rFonts w:eastAsia="Calibri" w:cs="CorporateSPro-Light"/>
@@ -2084,7 +2321,7 @@
                           <w:szCs w:val="13"/>
                           <w:lang w:eastAsia="de-DE"/>
                         </w:rPr>
-                        <w:t xml:space="preserve"/>
+                        <w:t>Fachanwalt für Insolvenz- und Sanierungsrecht</w:t>
                       </w:r>
                     </w:p>
                     <w:p>
@@ -2092,6 +2329,23 @@
                         <w:autoSpaceDE w:val="0"/>
                         <w:autoSpaceDN w:val="0"/>
                         <w:adjustRightInd w:val="0"/>
+                        <w:spacing w:line="240" w:lineRule="auto"/>
+                        <w:jc w:val="left"/>
+                        <w:rPr>
+                          <w:rFonts w:eastAsia="Calibri" w:cs="CorporateSPro-Demi"/>
+                          <w:b/>
+                          <w:sz w:val="13"/>
+                          <w:szCs w:val="13"/>
+                          <w:lang w:eastAsia="de-DE"/>
+                        </w:rPr>
+                      </w:pPr>
+                    </w:p>
+                    <w:p>
+                      <w:pPr>
+                        <w:autoSpaceDE w:val="0"/>
+                        <w:autoSpaceDN w:val="0"/>
+                        <w:adjustRightInd w:val="0"/>
+                        <w:spacing w:line="240" w:lineRule="auto"/>
                         <w:jc w:val="left"/>
                         <w:rPr>
                           <w:rFonts w:eastAsia="Calibri" w:cs="CorporateSPro-Demi"/>
@@ -2109,7 +2363,7 @@
                           <w:szCs w:val="13"/>
                           <w:lang w:eastAsia="de-DE"/>
                         </w:rPr>
-                        <w:t xml:space="preserve">Dr. Alexander Thomas Lamberty LL.M.</w:t>
+                        <w:t>Fatma Kreft</w:t>
                       </w:r>
                     </w:p>
                     <w:p>
@@ -2117,7 +2371,7 @@
                         <w:autoSpaceDE w:val="0"/>
                         <w:autoSpaceDN w:val="0"/>
                         <w:adjustRightInd w:val="0"/>
-                        <w:spacing w:line="276" w:lineRule="auto"/>
+                        <w:spacing w:line="240" w:lineRule="auto"/>
                         <w:jc w:val="left"/>
                         <w:rPr>
                           <w:rFonts w:eastAsia="Calibri" w:cs="CorporateSPro-Light"/>
@@ -2133,7 +2387,7 @@
                           <w:szCs w:val="13"/>
                           <w:lang w:eastAsia="de-DE"/>
                         </w:rPr>
-                        <w:t xml:space="preserve">Fachanwalt für Insolvenz- und Sanierungsrecht</w:t>
+                        <w:t>Fachanwältin für Insolvenz- und Sanierungsrecht</w:t>
                       </w:r>
                     </w:p>
                     <w:p>
@@ -2141,7 +2395,7 @@
                         <w:autoSpaceDE w:val="0"/>
                         <w:autoSpaceDN w:val="0"/>
                         <w:adjustRightInd w:val="0"/>
-                        <w:spacing w:line="276" w:lineRule="auto"/>
+                        <w:spacing w:line="240" w:lineRule="auto"/>
                         <w:jc w:val="left"/>
                         <w:rPr>
                           <w:rFonts w:eastAsia="Calibri" w:cs="CorporateSPro-Light"/>
@@ -2157,7 +2411,7 @@
                           <w:szCs w:val="13"/>
                           <w:lang w:eastAsia="de-DE"/>
                         </w:rPr>
-                        <w:t xml:space="preserve"/>
+                        <w:t>Fachanwältin für Steuerrecht</w:t>
                       </w:r>
                     </w:p>
                     <w:p>
@@ -2165,6 +2419,22 @@
                         <w:autoSpaceDE w:val="0"/>
                         <w:autoSpaceDN w:val="0"/>
                         <w:adjustRightInd w:val="0"/>
+                        <w:spacing w:line="240" w:lineRule="auto"/>
+                        <w:jc w:val="left"/>
+                        <w:rPr>
+                          <w:rFonts w:eastAsia="Calibri" w:cs="CorporateSPro-Light"/>
+                          <w:sz w:val="13"/>
+                          <w:szCs w:val="13"/>
+                          <w:lang w:eastAsia="de-DE"/>
+                        </w:rPr>
+                      </w:pPr>
+                    </w:p>
+                    <w:p>
+                      <w:pPr>
+                        <w:autoSpaceDE w:val="0"/>
+                        <w:autoSpaceDN w:val="0"/>
+                        <w:adjustRightInd w:val="0"/>
+                        <w:spacing w:line="240" w:lineRule="auto"/>
                         <w:jc w:val="left"/>
                         <w:rPr>
                           <w:rFonts w:eastAsia="Calibri" w:cs="CorporateSPro-Demi"/>
@@ -2182,7 +2452,7 @@
                           <w:szCs w:val="13"/>
                           <w:lang w:eastAsia="de-DE"/>
                         </w:rPr>
-                        <w:t xml:space="preserve">Fatma Kreft</w:t>
+                        <w:t>Dr. Arne Löser</w:t>
                       </w:r>
                     </w:p>
                     <w:p>
@@ -2190,7 +2460,7 @@
                         <w:autoSpaceDE w:val="0"/>
                         <w:autoSpaceDN w:val="0"/>
                         <w:adjustRightInd w:val="0"/>
-                        <w:spacing w:line="276" w:lineRule="auto"/>
+                        <w:spacing w:line="240" w:lineRule="auto"/>
                         <w:jc w:val="left"/>
                         <w:rPr>
                           <w:rFonts w:eastAsia="Calibri" w:cs="CorporateSPro-Light"/>
@@ -2206,7 +2476,7 @@
                           <w:szCs w:val="13"/>
                           <w:lang w:eastAsia="de-DE"/>
                         </w:rPr>
-                        <w:t xml:space="preserve">Fachanwältin für Insolvenz- und Sanierungsrecht</w:t>
+                        <w:t>Fachanwalt für Insolvenz- und Sanierungsrecht</w:t>
                       </w:r>
                     </w:p>
                     <w:p>
@@ -2214,7 +2484,7 @@
                         <w:autoSpaceDE w:val="0"/>
                         <w:autoSpaceDN w:val="0"/>
                         <w:adjustRightInd w:val="0"/>
-                        <w:spacing w:line="276" w:lineRule="auto"/>
+                        <w:spacing w:line="240" w:lineRule="auto"/>
                         <w:jc w:val="left"/>
                         <w:rPr>
                           <w:rFonts w:eastAsia="Calibri" w:cs="CorporateSPro-Light"/>
@@ -2230,7 +2500,7 @@
                           <w:szCs w:val="13"/>
                           <w:lang w:eastAsia="de-DE"/>
                         </w:rPr>
-                        <w:t xml:space="preserve">Fachanwältin für Steuerrecht</w:t>
+                        <w:t>Fachanwalt für Handels- und Gesellschaftsrecht</w:t>
                       </w:r>
                     </w:p>
                     <w:p>
@@ -2238,7 +2508,7 @@
                         <w:autoSpaceDE w:val="0"/>
                         <w:autoSpaceDN w:val="0"/>
                         <w:adjustRightInd w:val="0"/>
-                        <w:spacing w:line="276" w:lineRule="auto"/>
+                        <w:spacing w:line="240" w:lineRule="auto"/>
                         <w:jc w:val="left"/>
                         <w:rPr>
                           <w:rFonts w:eastAsia="Calibri" w:cs="CorporateSPro-Light"/>
@@ -2247,21 +2517,13 @@
                           <w:lang w:eastAsia="de-DE"/>
                         </w:rPr>
                       </w:pPr>
-                      <w:r>
-                        <w:rPr>
-                          <w:rFonts w:eastAsia="Calibri" w:cs="CorporateSPro-Light"/>
-                          <w:sz w:val="13"/>
-                          <w:szCs w:val="13"/>
-                          <w:lang w:eastAsia="de-DE"/>
-                        </w:rPr>
-                        <w:t xml:space="preserve"/>
-                      </w:r>
                     </w:p>
                     <w:p>
                       <w:pPr>
                         <w:autoSpaceDE w:val="0"/>
                         <w:autoSpaceDN w:val="0"/>
                         <w:adjustRightInd w:val="0"/>
+                        <w:spacing w:line="240" w:lineRule="auto"/>
                         <w:jc w:val="left"/>
                         <w:rPr>
                           <w:rFonts w:eastAsia="Calibri" w:cs="CorporateSPro-Demi"/>
@@ -2279,8 +2541,98 @@
                           <w:szCs w:val="13"/>
                           <w:lang w:eastAsia="de-DE"/>
                         </w:rPr>
-                        <w:t xml:space="preserve">Dr. Arne Löser</w:t>
+                        <w:t>Dr. Thomas Thöne</w:t>
                       </w:r>
+                    </w:p>
+                    <w:p>
+                      <w:pPr>
+                        <w:autoSpaceDE w:val="0"/>
+                        <w:autoSpaceDN w:val="0"/>
+                        <w:adjustRightInd w:val="0"/>
+                        <w:spacing w:line="240" w:lineRule="auto"/>
+                        <w:jc w:val="left"/>
+                        <w:rPr>
+                          <w:rFonts w:eastAsia="Calibri" w:cs="CorporateSPro-Light"/>
+                          <w:sz w:val="13"/>
+                          <w:szCs w:val="13"/>
+                          <w:lang w:eastAsia="de-DE"/>
+                        </w:rPr>
+                      </w:pPr>
+                      <w:r>
+                        <w:rPr>
+                          <w:rFonts w:eastAsia="Calibri" w:cs="CorporateSPro-Light"/>
+                          <w:sz w:val="13"/>
+                          <w:szCs w:val="13"/>
+                          <w:lang w:eastAsia="de-DE"/>
+                        </w:rPr>
+                        <w:t>Fachanwalt für Insolvenz- und Sanierungsrecht</w:t>
+                      </w:r>
+                    </w:p>
+                    <w:p>
+                      <w:pPr>
+                        <w:autoSpaceDE w:val="0"/>
+                        <w:autoSpaceDN w:val="0"/>
+                        <w:adjustRightInd w:val="0"/>
+                        <w:spacing w:line="240" w:lineRule="auto"/>
+                        <w:jc w:val="left"/>
+                        <w:rPr>
+                          <w:rFonts w:eastAsia="Calibri" w:cs="CorporateSPro-Light"/>
+                          <w:sz w:val="13"/>
+                          <w:szCs w:val="13"/>
+                          <w:lang w:eastAsia="de-DE"/>
+                        </w:rPr>
+                      </w:pPr>
+                      <w:r>
+                        <w:rPr>
+                          <w:rFonts w:eastAsia="Calibri" w:cs="CorporateSPro-Light"/>
+                          <w:sz w:val="13"/>
+                          <w:szCs w:val="13"/>
+                          <w:lang w:eastAsia="de-DE"/>
+                        </w:rPr>
+                        <w:t>Fachanwalt für Steuerrecht</w:t>
+                      </w:r>
+                    </w:p>
+                    <w:p>
+                      <w:pPr>
+                        <w:autoSpaceDE w:val="0"/>
+                        <w:autoSpaceDN w:val="0"/>
+                        <w:adjustRightInd w:val="0"/>
+                        <w:spacing w:line="240" w:lineRule="auto"/>
+                        <w:jc w:val="left"/>
+                        <w:rPr>
+                          <w:rFonts w:eastAsia="Calibri" w:cs="CorporateSPro-Light"/>
+                          <w:sz w:val="13"/>
+                          <w:szCs w:val="13"/>
+                          <w:lang w:eastAsia="de-DE"/>
+                        </w:rPr>
+                      </w:pPr>
+                      <w:r>
+                        <w:rPr>
+                          <w:rFonts w:eastAsia="Calibri" w:cs="CorporateSPro-Light"/>
+                          <w:sz w:val="13"/>
+                          <w:szCs w:val="13"/>
+                          <w:lang w:eastAsia="de-DE"/>
+                        </w:rPr>
+                        <w:t>Notar in Wiesbaden</w:t>
+                      </w:r>
+                    </w:p>
+                    <w:p>
+                      <w:pPr>
+                        <w:pBdr>
+                          <w:bottom w:val="single" w:sz="4" w:space="1" w:color="auto"/>
+                        </w:pBdr>
+                        <w:autoSpaceDE w:val="0"/>
+                        <w:autoSpaceDN w:val="0"/>
+                        <w:adjustRightInd w:val="0"/>
+                        <w:spacing w:line="276" w:lineRule="auto"/>
+                        <w:jc w:val="left"/>
+                        <w:rPr>
+                          <w:rFonts w:eastAsia="Calibri" w:cs="CorporateSPro-Light"/>
+                          <w:sz w:val="13"/>
+                          <w:szCs w:val="13"/>
+                          <w:lang w:eastAsia="de-DE"/>
+                        </w:rPr>
+                      </w:pPr>
                     </w:p>
                     <w:p>
                       <w:pPr>
@@ -2296,14 +2648,28 @@
                           <w:lang w:eastAsia="de-DE"/>
                         </w:rPr>
                       </w:pPr>
-                      <w:r>
+                    </w:p>
+                    <w:p>
+                      <w:pPr>
+                        <w:autoSpaceDE w:val="0"/>
+                        <w:autoSpaceDN w:val="0"/>
+                        <w:adjustRightInd w:val="0"/>
+                        <w:jc w:val="left"/>
                         <w:rPr>
-                          <w:rFonts w:eastAsia="Calibri" w:cs="CorporateSPro-Light"/>
+                          <w:rFonts w:eastAsia="Calibri" w:cs="CorporateSPro-Regular"/>
                           <w:sz w:val="13"/>
                           <w:szCs w:val="13"/>
                           <w:lang w:eastAsia="de-DE"/>
                         </w:rPr>
-                        <w:t xml:space="preserve">Fachanwalt für Insolvenz- und Sanierungsrecht</w:t>
+                      </w:pPr>
+                      <w:r>
+                        <w:rPr>
+                          <w:rFonts w:eastAsia="Calibri" w:cs="CorporateSPro-Regular"/>
+                          <w:sz w:val="13"/>
+                          <w:szCs w:val="13"/>
+                          <w:lang w:eastAsia="de-DE"/>
+                        </w:rPr>
+                        <w:t>ANGESTELLTE RECHTSANWÄLTE</w:t>
                       </w:r>
                     </w:p>
                     <w:p>
@@ -2311,54 +2677,7 @@
                         <w:autoSpaceDE w:val="0"/>
                         <w:autoSpaceDN w:val="0"/>
                         <w:adjustRightInd w:val="0"/>
-                        <w:spacing w:line="276" w:lineRule="auto"/>
-                        <w:jc w:val="left"/>
-                        <w:rPr>
-                          <w:rFonts w:eastAsia="Calibri" w:cs="CorporateSPro-Light"/>
-                          <w:sz w:val="13"/>
-                          <w:szCs w:val="13"/>
-                          <w:lang w:eastAsia="de-DE"/>
-                        </w:rPr>
-                      </w:pPr>
-                      <w:r>
-                        <w:rPr>
-                          <w:rFonts w:eastAsia="Calibri" w:cs="CorporateSPro-Light"/>
-                          <w:sz w:val="13"/>
-                          <w:szCs w:val="13"/>
-                          <w:lang w:eastAsia="de-DE"/>
-                        </w:rPr>
-                        <w:t xml:space="preserve">Fachanwalt für Handels- und Gesellschaftsrecht</w:t>
-                      </w:r>
-                    </w:p>
-                    <w:p>
-                      <w:pPr>
-                        <w:autoSpaceDE w:val="0"/>
-                        <w:autoSpaceDN w:val="0"/>
-                        <w:adjustRightInd w:val="0"/>
-                        <w:spacing w:line="276" w:lineRule="auto"/>
-                        <w:jc w:val="left"/>
-                        <w:rPr>
-                          <w:rFonts w:eastAsia="Calibri" w:cs="CorporateSPro-Light"/>
-                          <w:sz w:val="13"/>
-                          <w:szCs w:val="13"/>
-                          <w:lang w:eastAsia="de-DE"/>
-                        </w:rPr>
-                      </w:pPr>
-                      <w:r>
-                        <w:rPr>
-                          <w:rFonts w:eastAsia="Calibri" w:cs="CorporateSPro-Light"/>
-                          <w:sz w:val="13"/>
-                          <w:szCs w:val="13"/>
-                          <w:lang w:eastAsia="de-DE"/>
-                        </w:rPr>
-                        <w:t xml:space="preserve"/>
-                      </w:r>
-                    </w:p>
-                    <w:p>
-                      <w:pPr>
-                        <w:autoSpaceDE w:val="0"/>
-                        <w:autoSpaceDN w:val="0"/>
-                        <w:adjustRightInd w:val="0"/>
+                        <w:spacing w:line="240" w:lineRule="auto"/>
                         <w:jc w:val="left"/>
                         <w:rPr>
                           <w:rFonts w:eastAsia="Calibri" w:cs="CorporateSPro-Demi"/>
@@ -2376,7 +2695,7 @@
                           <w:szCs w:val="13"/>
                           <w:lang w:eastAsia="de-DE"/>
                         </w:rPr>
-                        <w:t xml:space="preserve">Thorsten Lex</w:t>
+                        <w:t>Eva Meyer</w:t>
                       </w:r>
                     </w:p>
                     <w:p>
@@ -2384,7 +2703,31 @@
                         <w:autoSpaceDE w:val="0"/>
                         <w:autoSpaceDN w:val="0"/>
                         <w:adjustRightInd w:val="0"/>
-                        <w:spacing w:line="276" w:lineRule="auto"/>
+                        <w:spacing w:line="240" w:lineRule="auto"/>
+                        <w:jc w:val="left"/>
+                        <w:rPr>
+                          <w:rFonts w:eastAsia="Calibri" w:cs="CorporateSPro-Demi"/>
+                          <w:sz w:val="13"/>
+                          <w:szCs w:val="13"/>
+                          <w:lang w:eastAsia="de-DE"/>
+                        </w:rPr>
+                      </w:pPr>
+                      <w:r>
+                        <w:rPr>
+                          <w:rFonts w:eastAsia="Calibri" w:cs="CorporateSPro-Demi"/>
+                          <w:sz w:val="13"/>
+                          <w:szCs w:val="13"/>
+                          <w:lang w:eastAsia="de-DE"/>
+                        </w:rPr>
+                        <w:t>Fachanwältin für Insolvenz- und Sanierungsrecht</w:t>
+                      </w:r>
+                    </w:p>
+                    <w:p>
+                      <w:pPr>
+                        <w:autoSpaceDE w:val="0"/>
+                        <w:autoSpaceDN w:val="0"/>
+                        <w:adjustRightInd w:val="0"/>
+                        <w:spacing w:line="240" w:lineRule="auto"/>
                         <w:jc w:val="left"/>
                         <w:rPr>
                           <w:rFonts w:eastAsia="Calibri" w:cs="CorporateSPro-Light"/>
@@ -2393,93 +2736,13 @@
                           <w:lang w:eastAsia="de-DE"/>
                         </w:rPr>
                       </w:pPr>
-                      <w:r>
-                        <w:rPr>
-                          <w:rFonts w:eastAsia="Calibri" w:cs="CorporateSPro-Light"/>
-                          <w:sz w:val="13"/>
-                          <w:szCs w:val="13"/>
-                          <w:lang w:eastAsia="de-DE"/>
-                        </w:rPr>
-                        <w:t xml:space="preserve">Fachanwalt für Business</w:t>
-                      </w:r>
                     </w:p>
                     <w:p>
                       <w:pPr>
                         <w:autoSpaceDE w:val="0"/>
                         <w:autoSpaceDN w:val="0"/>
                         <w:adjustRightInd w:val="0"/>
-                        <w:spacing w:line="276" w:lineRule="auto"/>
-                        <w:jc w:val="left"/>
-                        <w:rPr>
-                          <w:rFonts w:eastAsia="Calibri" w:cs="CorporateSPro-Light"/>
-                          <w:sz w:val="13"/>
-                          <w:szCs w:val="13"/>
-                          <w:lang w:eastAsia="de-DE"/>
-                        </w:rPr>
-                      </w:pPr>
-                      <w:r>
-                        <w:rPr>
-                          <w:rFonts w:eastAsia="Calibri" w:cs="CorporateSPro-Light"/>
-                          <w:sz w:val="13"/>
-                          <w:szCs w:val="13"/>
-                          <w:lang w:eastAsia="de-DE"/>
-                        </w:rPr>
-                        <w:t xml:space="preserve"/>
-                      </w:r>
-                    </w:p>
-                    <w:p>
-                      <w:pPr>
-                        <w:autoSpaceDE w:val="0"/>
-                        <w:autoSpaceDN w:val="0"/>
-                        <w:adjustRightInd w:val="0"/>
-                        <w:spacing w:line="276" w:lineRule="auto"/>
-                        <w:jc w:val="left"/>
-                        <w:rPr>
-                          <w:rFonts w:eastAsia="Calibri" w:cs="CorporateSPro-Light"/>
-                          <w:sz w:val="13"/>
-                          <w:szCs w:val="13"/>
-                          <w:lang w:eastAsia="de-DE"/>
-                        </w:rPr>
-                      </w:pPr>
-                      <w:r>
-                        <w:rPr>
-                          <w:rFonts w:eastAsia="Calibri" w:cs="CorporateSPro-Light"/>
-                          <w:sz w:val="13"/>
-                          <w:szCs w:val="13"/>
-                          <w:lang w:eastAsia="de-DE"/>
-                        </w:rPr>
-                        <w:t xml:space="preserve"/>
-                      </w:r>
-                    </w:p>
-                    <w:p>
-                      <w:pPr>
-                        <w:autoSpaceDE w:val="0"/>
-                        <w:autoSpaceDN w:val="0"/>
-                        <w:adjustRightInd w:val="0"/>
-                        <w:spacing w:line="276" w:lineRule="auto"/>
-                        <w:jc w:val="left"/>
-                        <w:rPr>
-                          <w:rFonts w:eastAsia="Calibri" w:cs="CorporateSPro-Light"/>
-                          <w:sz w:val="13"/>
-                          <w:szCs w:val="13"/>
-                          <w:lang w:eastAsia="de-DE"/>
-                        </w:rPr>
-                      </w:pPr>
-                      <w:r>
-                        <w:rPr>
-                          <w:rFonts w:eastAsia="Calibri" w:cs="CorporateSPro-Light"/>
-                          <w:sz w:val="13"/>
-                          <w:szCs w:val="13"/>
-                          <w:lang w:eastAsia="de-DE"/>
-                        </w:rPr>
-                        <w:t xml:space="preserve">ANGESTELLTE RECHTSANWÄLTE</w:t>
-                      </w:r>
-                    </w:p>
-                    <w:p>
-                      <w:pPr>
-                        <w:autoSpaceDE w:val="0"/>
-                        <w:autoSpaceDN w:val="0"/>
-                        <w:adjustRightInd w:val="0"/>
+                        <w:spacing w:line="240" w:lineRule="auto"/>
                         <w:jc w:val="left"/>
                         <w:rPr>
                           <w:rFonts w:eastAsia="Calibri" w:cs="CorporateSPro-Demi"/>
@@ -2497,7 +2760,7 @@
                           <w:szCs w:val="13"/>
                           <w:lang w:eastAsia="de-DE"/>
                         </w:rPr>
-                        <w:t xml:space="preserve">Eva Meyer</w:t>
+                        <w:t>Bettina Dax</w:t>
                       </w:r>
                     </w:p>
                     <w:p>
@@ -2505,7 +2768,7 @@
                         <w:autoSpaceDE w:val="0"/>
                         <w:autoSpaceDN w:val="0"/>
                         <w:adjustRightInd w:val="0"/>
-                        <w:spacing w:line="276" w:lineRule="auto"/>
+                        <w:spacing w:line="240" w:lineRule="auto"/>
                         <w:jc w:val="left"/>
                         <w:rPr>
                           <w:rFonts w:eastAsia="Calibri" w:cs="CorporateSPro-Light"/>
@@ -2521,7 +2784,7 @@
                           <w:szCs w:val="13"/>
                           <w:lang w:eastAsia="de-DE"/>
                         </w:rPr>
-                        <w:t xml:space="preserve">Fachanwältin für Insolvenz- und Sanierungsrecht</w:t>
+                        <w:t>Rechtsanwältin</w:t>
                       </w:r>
                     </w:p>
                     <w:p>
@@ -2529,30 +2792,23 @@
                         <w:autoSpaceDE w:val="0"/>
                         <w:autoSpaceDN w:val="0"/>
                         <w:adjustRightInd w:val="0"/>
-                        <w:spacing w:line="276" w:lineRule="auto"/>
+                        <w:spacing w:line="240" w:lineRule="auto"/>
                         <w:jc w:val="left"/>
                         <w:rPr>
-                          <w:rFonts w:eastAsia="Calibri" w:cs="CorporateSPro-Light"/>
+                          <w:rFonts w:eastAsia="Calibri" w:cs="CorporateSPro-Demi"/>
+                          <w:b/>
                           <w:sz w:val="13"/>
                           <w:szCs w:val="13"/>
                           <w:lang w:eastAsia="de-DE"/>
                         </w:rPr>
                       </w:pPr>
-                      <w:r>
-                        <w:rPr>
-                          <w:rFonts w:eastAsia="Calibri" w:cs="CorporateSPro-Light"/>
-                          <w:sz w:val="13"/>
-                          <w:szCs w:val="13"/>
-                          <w:lang w:eastAsia="de-DE"/>
-                        </w:rPr>
-                        <w:t xml:space="preserve"/>
-                      </w:r>
                     </w:p>
                     <w:p>
                       <w:pPr>
                         <w:autoSpaceDE w:val="0"/>
                         <w:autoSpaceDN w:val="0"/>
                         <w:adjustRightInd w:val="0"/>
+                        <w:spacing w:line="240" w:lineRule="auto"/>
                         <w:jc w:val="left"/>
                         <w:rPr>
                           <w:rFonts w:eastAsia="Calibri" w:cs="CorporateSPro-Demi"/>
@@ -2570,7 +2826,7 @@
                           <w:szCs w:val="13"/>
                           <w:lang w:eastAsia="de-DE"/>
                         </w:rPr>
-                        <w:t xml:space="preserve">Bettina Dax</w:t>
+                        <w:t>Cornelia Kriege</w:t>
                       </w:r>
                     </w:p>
                     <w:p>
@@ -2578,7 +2834,7 @@
                         <w:autoSpaceDE w:val="0"/>
                         <w:autoSpaceDN w:val="0"/>
                         <w:adjustRightInd w:val="0"/>
-                        <w:spacing w:line="276" w:lineRule="auto"/>
+                        <w:spacing w:line="240" w:lineRule="auto"/>
                         <w:jc w:val="left"/>
                         <w:rPr>
                           <w:rFonts w:eastAsia="Calibri" w:cs="CorporateSPro-Light"/>
@@ -2594,7 +2850,7 @@
                           <w:szCs w:val="13"/>
                           <w:lang w:eastAsia="de-DE"/>
                         </w:rPr>
-                        <w:t xml:space="preserve">Rechtsanwältin</w:t>
+                        <w:t>Rechtsanwältin</w:t>
                       </w:r>
                     </w:p>
                     <w:p>
@@ -2602,7 +2858,7 @@
                         <w:autoSpaceDE w:val="0"/>
                         <w:autoSpaceDN w:val="0"/>
                         <w:adjustRightInd w:val="0"/>
-                        <w:spacing w:line="276" w:lineRule="auto"/>
+                        <w:spacing w:line="240" w:lineRule="auto"/>
                         <w:jc w:val="left"/>
                         <w:rPr>
                           <w:rFonts w:eastAsia="Calibri" w:cs="CorporateSPro-Light"/>
@@ -2611,21 +2867,13 @@
                           <w:lang w:eastAsia="de-DE"/>
                         </w:rPr>
                       </w:pPr>
-                      <w:r>
-                        <w:rPr>
-                          <w:rFonts w:eastAsia="Calibri" w:cs="CorporateSPro-Light"/>
-                          <w:sz w:val="13"/>
-                          <w:szCs w:val="13"/>
-                          <w:lang w:eastAsia="de-DE"/>
-                        </w:rPr>
-                        <w:t xml:space="preserve"/>
-                      </w:r>
                     </w:p>
                     <w:p>
                       <w:pPr>
                         <w:autoSpaceDE w:val="0"/>
                         <w:autoSpaceDN w:val="0"/>
                         <w:adjustRightInd w:val="0"/>
+                        <w:spacing w:line="240" w:lineRule="auto"/>
                         <w:jc w:val="left"/>
                         <w:rPr>
                           <w:rFonts w:eastAsia="Calibri" w:cs="CorporateSPro-Demi"/>
@@ -2643,8 +2891,50 @@
                           <w:szCs w:val="13"/>
                           <w:lang w:eastAsia="de-DE"/>
                         </w:rPr>
-                        <w:t xml:space="preserve">Cornelia Kriege</w:t>
+                        <w:t>Lars Wacker</w:t>
                       </w:r>
+                    </w:p>
+                    <w:p>
+                      <w:pPr>
+                        <w:autoSpaceDE w:val="0"/>
+                        <w:autoSpaceDN w:val="0"/>
+                        <w:adjustRightInd w:val="0"/>
+                        <w:spacing w:line="240" w:lineRule="auto"/>
+                        <w:jc w:val="left"/>
+                        <w:rPr>
+                          <w:rFonts w:eastAsia="Calibri" w:cs="CorporateSPro-Light"/>
+                          <w:sz w:val="13"/>
+                          <w:szCs w:val="13"/>
+                          <w:lang w:eastAsia="de-DE"/>
+                        </w:rPr>
+                      </w:pPr>
+                      <w:r>
+                        <w:rPr>
+                          <w:rFonts w:eastAsia="Calibri" w:cs="CorporateSPro-Light"/>
+                          <w:sz w:val="13"/>
+                          <w:szCs w:val="13"/>
+                          <w:lang w:eastAsia="de-DE"/>
+                        </w:rPr>
+                        <w:t>Rechtsanwalt</w:t>
+                      </w:r>
+                    </w:p>
+                    <w:p>
+                      <w:pPr>
+                        <w:pBdr>
+                          <w:bottom w:val="single" w:sz="4" w:space="1" w:color="auto"/>
+                        </w:pBdr>
+                        <w:autoSpaceDE w:val="0"/>
+                        <w:autoSpaceDN w:val="0"/>
+                        <w:adjustRightInd w:val="0"/>
+                        <w:spacing w:line="276" w:lineRule="auto"/>
+                        <w:jc w:val="left"/>
+                        <w:rPr>
+                          <w:rFonts w:eastAsia="Calibri" w:cs="CorporateSPro-Light"/>
+                          <w:sz w:val="13"/>
+                          <w:szCs w:val="13"/>
+                          <w:lang w:eastAsia="de-DE"/>
+                        </w:rPr>
+                      </w:pPr>
                     </w:p>
                     <w:p>
                       <w:pPr>
@@ -2660,14 +2950,28 @@
                           <w:lang w:eastAsia="de-DE"/>
                         </w:rPr>
                       </w:pPr>
-                      <w:r>
+                    </w:p>
+                    <w:p>
+                      <w:pPr>
+                        <w:autoSpaceDE w:val="0"/>
+                        <w:autoSpaceDN w:val="0"/>
+                        <w:adjustRightInd w:val="0"/>
+                        <w:jc w:val="left"/>
                         <w:rPr>
-                          <w:rFonts w:eastAsia="Calibri" w:cs="CorporateSPro-Light"/>
+                          <w:rFonts w:eastAsia="Calibri" w:cs="CorporateSPro-Regular"/>
                           <w:sz w:val="13"/>
                           <w:szCs w:val="13"/>
                           <w:lang w:eastAsia="de-DE"/>
                         </w:rPr>
-                        <w:t xml:space="preserve">Rechtsanwältin</w:t>
+                      </w:pPr>
+                      <w:r>
+                        <w:rPr>
+                          <w:rFonts w:eastAsia="Calibri" w:cs="CorporateSPro-Regular"/>
+                          <w:sz w:val="13"/>
+                          <w:szCs w:val="13"/>
+                          <w:lang w:eastAsia="de-DE"/>
+                        </w:rPr>
+                        <w:t>OF COUNSEL</w:t>
                       </w:r>
                     </w:p>
                     <w:p>
@@ -2675,30 +2979,7 @@
                         <w:autoSpaceDE w:val="0"/>
                         <w:autoSpaceDN w:val="0"/>
                         <w:adjustRightInd w:val="0"/>
-                        <w:spacing w:line="276" w:lineRule="auto"/>
-                        <w:jc w:val="left"/>
-                        <w:rPr>
-                          <w:rFonts w:eastAsia="Calibri" w:cs="CorporateSPro-Light"/>
-                          <w:sz w:val="13"/>
-                          <w:szCs w:val="13"/>
-                          <w:lang w:eastAsia="de-DE"/>
-                        </w:rPr>
-                      </w:pPr>
-                      <w:r>
-                        <w:rPr>
-                          <w:rFonts w:eastAsia="Calibri" w:cs="CorporateSPro-Light"/>
-                          <w:sz w:val="13"/>
-                          <w:szCs w:val="13"/>
-                          <w:lang w:eastAsia="de-DE"/>
-                        </w:rPr>
-                        <w:t xml:space="preserve"/>
-                      </w:r>
-                    </w:p>
-                    <w:p>
-                      <w:pPr>
-                        <w:autoSpaceDE w:val="0"/>
-                        <w:autoSpaceDN w:val="0"/>
-                        <w:adjustRightInd w:val="0"/>
+                        <w:spacing w:line="240" w:lineRule="auto"/>
                         <w:jc w:val="left"/>
                         <w:rPr>
                           <w:rFonts w:eastAsia="Calibri" w:cs="CorporateSPro-Demi"/>
@@ -2716,8 +2997,50 @@
                           <w:szCs w:val="13"/>
                           <w:lang w:eastAsia="de-DE"/>
                         </w:rPr>
-                        <w:t xml:space="preserve">Lars Wacker</w:t>
+                        <w:t>Justizrat Prof. Dr. Dr. Thomas B. Schmidt M.A.</w:t>
                       </w:r>
+                    </w:p>
+                    <w:p>
+                      <w:pPr>
+                        <w:autoSpaceDE w:val="0"/>
+                        <w:autoSpaceDN w:val="0"/>
+                        <w:adjustRightInd w:val="0"/>
+                        <w:spacing w:line="240" w:lineRule="auto"/>
+                        <w:jc w:val="left"/>
+                        <w:rPr>
+                          <w:rFonts w:eastAsia="Calibri" w:cs="CorporateSPro-Light"/>
+                          <w:sz w:val="13"/>
+                          <w:szCs w:val="13"/>
+                          <w:lang w:eastAsia="de-DE"/>
+                        </w:rPr>
+                      </w:pPr>
+                      <w:r>
+                        <w:rPr>
+                          <w:rFonts w:eastAsia="Calibri" w:cs="CorporateSPro-Light"/>
+                          <w:sz w:val="13"/>
+                          <w:szCs w:val="13"/>
+                          <w:lang w:eastAsia="de-DE"/>
+                        </w:rPr>
+                        <w:t>Fachanwalt für Insolvenz- und Sanierungsrecht</w:t>
+                      </w:r>
+                    </w:p>
+                    <w:p>
+                      <w:pPr>
+                        <w:pBdr>
+                          <w:bottom w:val="single" w:sz="4" w:space="1" w:color="auto"/>
+                        </w:pBdr>
+                        <w:autoSpaceDE w:val="0"/>
+                        <w:autoSpaceDN w:val="0"/>
+                        <w:adjustRightInd w:val="0"/>
+                        <w:spacing w:line="276" w:lineRule="auto"/>
+                        <w:jc w:val="left"/>
+                        <w:rPr>
+                          <w:rFonts w:eastAsia="Calibri" w:cs="CorporateSPro-Light"/>
+                          <w:sz w:val="13"/>
+                          <w:szCs w:val="13"/>
+                          <w:lang w:eastAsia="de-DE"/>
+                        </w:rPr>
+                      </w:pPr>
                     </w:p>
                     <w:p>
                       <w:pPr>
@@ -2733,87 +3056,6 @@
                           <w:lang w:eastAsia="de-DE"/>
                         </w:rPr>
                       </w:pPr>
-                      <w:r>
-                        <w:rPr>
-                          <w:rFonts w:eastAsia="Calibri" w:cs="CorporateSPro-Light"/>
-                          <w:sz w:val="13"/>
-                          <w:szCs w:val="13"/>
-                          <w:lang w:eastAsia="de-DE"/>
-                        </w:rPr>
-                        <w:t xml:space="preserve">Rechtsanwalt</w:t>
-                      </w:r>
-                    </w:p>
-                    <w:p>
-                      <w:pPr>
-                        <w:autoSpaceDE w:val="0"/>
-                        <w:autoSpaceDN w:val="0"/>
-                        <w:adjustRightInd w:val="0"/>
-                        <w:spacing w:line="276" w:lineRule="auto"/>
-                        <w:jc w:val="left"/>
-                        <w:rPr>
-                          <w:rFonts w:eastAsia="Calibri" w:cs="CorporateSPro-Light"/>
-                          <w:sz w:val="13"/>
-                          <w:szCs w:val="13"/>
-                          <w:lang w:eastAsia="de-DE"/>
-                        </w:rPr>
-                      </w:pPr>
-                      <w:r>
-                        <w:rPr>
-                          <w:rFonts w:eastAsia="Calibri" w:cs="CorporateSPro-Light"/>
-                          <w:sz w:val="13"/>
-                          <w:szCs w:val="13"/>
-                          <w:lang w:eastAsia="de-DE"/>
-                        </w:rPr>
-                        <w:t xml:space="preserve"/>
-                      </w:r>
-                    </w:p>
-                    <w:p>
-                      <w:pPr>
-                        <w:autoSpaceDE w:val="0"/>
-                        <w:autoSpaceDN w:val="0"/>
-                        <w:adjustRightInd w:val="0"/>
-                        <w:spacing w:line="276" w:lineRule="auto"/>
-                        <w:jc w:val="left"/>
-                        <w:rPr>
-                          <w:rFonts w:eastAsia="Calibri" w:cs="CorporateSPro-Light"/>
-                          <w:sz w:val="13"/>
-                          <w:szCs w:val="13"/>
-                          <w:lang w:eastAsia="de-DE"/>
-                        </w:rPr>
-                      </w:pPr>
-                      <w:r>
-                        <w:rPr>
-                          <w:rFonts w:eastAsia="Calibri" w:cs="CorporateSPro-Light"/>
-                          <w:sz w:val="13"/>
-                          <w:szCs w:val="13"/>
-                          <w:lang w:eastAsia="de-DE"/>
-                        </w:rPr>
-                        <w:t xml:space="preserve"/>
-                      </w:r>
-                    </w:p>
-                    <w:p>
-                      <w:pPr>
-                        <w:autoSpaceDE w:val="0"/>
-                        <w:autoSpaceDN w:val="0"/>
-                        <w:adjustRightInd w:val="0"/>
-                        <w:spacing w:line="276" w:lineRule="auto"/>
-                        <w:jc w:val="left"/>
-                        <w:rPr>
-                          <w:rFonts w:eastAsia="Calibri" w:cs="CorporateSPro-Light"/>
-                          <w:sz w:val="13"/>
-                          <w:szCs w:val="13"/>
-                          <w:lang w:eastAsia="de-DE"/>
-                        </w:rPr>
-                      </w:pPr>
-                      <w:r>
-                        <w:rPr>
-                          <w:rFonts w:eastAsia="Calibri" w:cs="CorporateSPro-Light"/>
-                          <w:sz w:val="13"/>
-                          <w:szCs w:val="13"/>
-                          <w:lang w:eastAsia="de-DE"/>
-                        </w:rPr>
-                        <w:t xml:space="preserve">OF COUNSEL</w:t>
-                      </w:r>
                     </w:p>
                     <w:p>
                       <w:pPr>
@@ -2822,8 +3064,30 @@
                         <w:adjustRightInd w:val="0"/>
                         <w:jc w:val="left"/>
                         <w:rPr>
+                          <w:rFonts w:eastAsia="Calibri" w:cs="CorporateSPro-Regular"/>
+                          <w:sz w:val="13"/>
+                          <w:szCs w:val="13"/>
+                          <w:lang w:eastAsia="de-DE"/>
+                        </w:rPr>
+                      </w:pPr>
+                      <w:r>
+                        <w:rPr>
+                          <w:rFonts w:eastAsia="Calibri" w:cs="CorporateSPro-Regular"/>
+                          <w:sz w:val="13"/>
+                          <w:szCs w:val="13"/>
+                          <w:lang w:eastAsia="de-DE"/>
+                        </w:rPr>
+                        <w:t>STANDORTE</w:t>
+                      </w:r>
+                    </w:p>
+                    <w:p>
+                      <w:pPr>
+                        <w:autoSpaceDE w:val="0"/>
+                        <w:autoSpaceDN w:val="0"/>
+                        <w:adjustRightInd w:val="0"/>
+                        <w:spacing w:line="240" w:lineRule="auto"/>
+                        <w:rPr>
                           <w:rFonts w:eastAsia="Calibri" w:cs="CorporateSPro-Demi"/>
-                          <w:b/>
                           <w:sz w:val="13"/>
                           <w:szCs w:val="13"/>
                           <w:lang w:eastAsia="de-DE"/>
@@ -2832,12 +3096,30 @@
                       <w:r>
                         <w:rPr>
                           <w:rFonts w:eastAsia="Calibri" w:cs="CorporateSPro-Demi"/>
-                          <w:b/>
                           <w:sz w:val="13"/>
                           <w:szCs w:val="13"/>
                           <w:lang w:eastAsia="de-DE"/>
                         </w:rPr>
-                        <w:t xml:space="preserve">Justizrat Prof. Dr. Dr. Thomas B. Schmidt M.A.</w:t>
+                        <w:t>Trier</w:t>
+                      </w:r>
+                      <w:r>
+                        <w:rPr>
+                          <w:rFonts w:eastAsia="Calibri" w:cs="CorporateSPro-Demi"/>
+                          <w:sz w:val="13"/>
+                          <w:szCs w:val="13"/>
+                          <w:lang w:eastAsia="de-DE"/>
+                        </w:rPr>
+                        <w:tab/>
+                      </w:r>
+                      <w:r>
+                        <w:rPr>
+                          <w:rFonts w:eastAsia="Calibri" w:cs="CorporateSPro-Demi"/>
+                          <w:sz w:val="13"/>
+                          <w:szCs w:val="13"/>
+                          <w:lang w:eastAsia="de-DE"/>
+                        </w:rPr>
+                        <w:tab/>
+                        <w:t>Bad Kreuznach</w:t>
                       </w:r>
                     </w:p>
                     <w:p>
@@ -2845,10 +3127,9 @@
                         <w:autoSpaceDE w:val="0"/>
                         <w:autoSpaceDN w:val="0"/>
                         <w:adjustRightInd w:val="0"/>
-                        <w:spacing w:line="276" w:lineRule="auto"/>
-                        <w:jc w:val="left"/>
+                        <w:spacing w:line="240" w:lineRule="auto"/>
                         <w:rPr>
-                          <w:rFonts w:eastAsia="Calibri" w:cs="CorporateSPro-Light"/>
+                          <w:rFonts w:eastAsia="Calibri" w:cs="CorporateSPro-Demi"/>
                           <w:sz w:val="13"/>
                           <w:szCs w:val="13"/>
                           <w:lang w:eastAsia="de-DE"/>
@@ -2856,12 +3137,22 @@
                       </w:pPr>
                       <w:r>
                         <w:rPr>
-                          <w:rFonts w:eastAsia="Calibri" w:cs="CorporateSPro-Light"/>
+                          <w:rFonts w:eastAsia="Calibri" w:cs="CorporateSPro-Demi"/>
                           <w:sz w:val="13"/>
                           <w:szCs w:val="13"/>
                           <w:lang w:eastAsia="de-DE"/>
                         </w:rPr>
-                        <w:t xml:space="preserve">Fachanwalt für Insolvenz- und Sanierungsrecht</w:t>
+                        <w:t>Frankfurt am Main</w:t>
+                      </w:r>
+                      <w:r>
+                        <w:rPr>
+                          <w:rFonts w:eastAsia="Calibri" w:cs="CorporateSPro-Demi"/>
+                          <w:sz w:val="13"/>
+                          <w:szCs w:val="13"/>
+                          <w:lang w:eastAsia="de-DE"/>
+                        </w:rPr>
+                        <w:tab/>
+                        <w:t>Zell/Mosel</w:t>
                       </w:r>
                     </w:p>
                     <w:p>
@@ -2869,10 +3160,9 @@
                         <w:autoSpaceDE w:val="0"/>
                         <w:autoSpaceDN w:val="0"/>
                         <w:adjustRightInd w:val="0"/>
-                        <w:spacing w:line="276" w:lineRule="auto"/>
-                        <w:jc w:val="left"/>
+                        <w:spacing w:line="240" w:lineRule="auto"/>
                         <w:rPr>
-                          <w:rFonts w:eastAsia="Calibri" w:cs="CorporateSPro-Light"/>
+                          <w:rFonts w:eastAsia="Calibri" w:cs="CorporateSPro-Demi"/>
                           <w:sz w:val="13"/>
                           <w:szCs w:val="13"/>
                           <w:lang w:eastAsia="de-DE"/>
@@ -2880,12 +3170,22 @@
                       </w:pPr>
                       <w:r>
                         <w:rPr>
-                          <w:rFonts w:eastAsia="Calibri" w:cs="CorporateSPro-Light"/>
+                          <w:rFonts w:eastAsia="Calibri" w:cs="CorporateSPro-Demi"/>
                           <w:sz w:val="13"/>
                           <w:szCs w:val="13"/>
                           <w:lang w:eastAsia="de-DE"/>
                         </w:rPr>
-                        <w:t xml:space="preserve"/>
+                        <w:t>Idar-Oberstein</w:t>
+                      </w:r>
+                      <w:r>
+                        <w:rPr>
+                          <w:rFonts w:eastAsia="Calibri" w:cs="CorporateSPro-Demi"/>
+                          <w:sz w:val="13"/>
+                          <w:szCs w:val="13"/>
+                          <w:lang w:eastAsia="de-DE"/>
+                        </w:rPr>
+                        <w:tab/>
+                        <w:t>Koblenz</w:t>
                       </w:r>
                     </w:p>
                     <w:p>
@@ -2893,10 +3193,9 @@
                         <w:autoSpaceDE w:val="0"/>
                         <w:autoSpaceDN w:val="0"/>
                         <w:adjustRightInd w:val="0"/>
-                        <w:spacing w:line="276" w:lineRule="auto"/>
-                        <w:jc w:val="left"/>
+                        <w:spacing w:line="240" w:lineRule="auto"/>
                         <w:rPr>
-                          <w:rFonts w:eastAsia="Calibri" w:cs="CorporateSPro-Light"/>
+                          <w:rFonts w:eastAsia="Calibri" w:cs="CorporateSPro-Demi"/>
                           <w:sz w:val="13"/>
                           <w:szCs w:val="13"/>
                           <w:lang w:eastAsia="de-DE"/>
@@ -2904,12 +3203,31 @@
                       </w:pPr>
                       <w:r>
                         <w:rPr>
-                          <w:rFonts w:eastAsia="Calibri" w:cs="CorporateSPro-Light"/>
+                          <w:rFonts w:eastAsia="Calibri" w:cs="CorporateSPro-Demi"/>
                           <w:sz w:val="13"/>
                           <w:szCs w:val="13"/>
                           <w:lang w:eastAsia="de-DE"/>
                         </w:rPr>
-                        <w:t xml:space="preserve"/>
+                        <w:t>Langgöns</w:t>
+                      </w:r>
+                      <w:r>
+                        <w:rPr>
+                          <w:rFonts w:eastAsia="Calibri" w:cs="CorporateSPro-Demi"/>
+                          <w:sz w:val="13"/>
+                          <w:szCs w:val="13"/>
+                          <w:lang w:eastAsia="de-DE"/>
+                        </w:rPr>
+                        <w:tab/>
+                      </w:r>
+                      <w:r>
+                        <w:rPr>
+                          <w:rFonts w:eastAsia="Calibri" w:cs="CorporateSPro-Demi"/>
+                          <w:sz w:val="13"/>
+                          <w:szCs w:val="13"/>
+                          <w:lang w:eastAsia="de-DE"/>
+                        </w:rPr>
+                        <w:tab/>
+                        <w:t>Limburg/Lahn</w:t>
                       </w:r>
                     </w:p>
                     <w:p>
@@ -2917,144 +3235,52 @@
                         <w:autoSpaceDE w:val="0"/>
                         <w:autoSpaceDN w:val="0"/>
                         <w:adjustRightInd w:val="0"/>
-                        <w:spacing w:line="276" w:lineRule="auto"/>
-                        <w:jc w:val="left"/>
+                        <w:spacing w:line="240" w:lineRule="auto"/>
                         <w:rPr>
-                          <w:rFonts w:eastAsia="Calibri" w:cs="CorporateSPro-Light"/>
-                          <w:sz w:val="13"/>
-                          <w:szCs w:val="13"/>
+                          <w:rFonts w:eastAsia="Calibri" w:cs="CorporateSPro-Demi"/>
+                          <w:sz w:val="9"/>
+                          <w:szCs w:val="9"/>
                           <w:lang w:eastAsia="de-DE"/>
                         </w:rPr>
                       </w:pPr>
                       <w:r>
                         <w:rPr>
-                          <w:rFonts w:eastAsia="Calibri" w:cs="CorporateSPro-Light"/>
+                          <w:rFonts w:eastAsia="Calibri" w:cs="CorporateSPro-Demi"/>
                           <w:sz w:val="13"/>
                           <w:szCs w:val="13"/>
                           <w:lang w:eastAsia="de-DE"/>
                         </w:rPr>
-                        <w:t xml:space="preserve">STANDORTE</w:t>
+                        <w:t>Mainz</w:t>
                       </w:r>
-                    </w:p>
-                    <w:p>
-                      <w:pPr>
-                        <w:autoSpaceDE w:val="0"/>
-                        <w:autoSpaceDN w:val="0"/>
-                        <w:adjustRightInd w:val="0"/>
-                        <w:spacing w:line="276" w:lineRule="auto"/>
-                        <w:jc w:val="left"/>
+                      <w:r>
                         <w:rPr>
-                          <w:rFonts w:eastAsia="Calibri" w:cs="CorporateSPro-Light"/>
+                          <w:rFonts w:eastAsia="Calibri" w:cs="CorporateSPro-Demi"/>
                           <w:sz w:val="13"/>
                           <w:szCs w:val="13"/>
                           <w:lang w:eastAsia="de-DE"/>
                         </w:rPr>
-                      </w:pPr>
+                        <w:tab/>
+                      </w:r>
                       <w:r>
                         <w:rPr>
-                          <w:rFonts w:eastAsia="Calibri" w:cs="CorporateSPro-Light"/>
+                          <w:rFonts w:eastAsia="Calibri" w:cs="CorporateSPro-Demi"/>
                           <w:sz w:val="13"/>
                           <w:szCs w:val="13"/>
                           <w:lang w:eastAsia="de-DE"/>
                         </w:rPr>
-                        <w:t xml:space="preserve">Trier		Zell/Mosel</w:t>
+                        <w:tab/>
+                        <w:t>Wiesbaden</w:t>
                       </w:r>
-                    </w:p>
-                    <w:p>
-                      <w:pPr>
-                        <w:autoSpaceDE w:val="0"/>
-                        <w:autoSpaceDN w:val="0"/>
-                        <w:adjustRightInd w:val="0"/>
-                        <w:spacing w:line="276" w:lineRule="auto"/>
-                        <w:jc w:val="left"/>
-                        <w:rPr>
-                          <w:rFonts w:eastAsia="Calibri" w:cs="CorporateSPro-Light"/>
-                          <w:sz w:val="13"/>
-                          <w:szCs w:val="13"/>
-                          <w:lang w:eastAsia="de-DE"/>
-                        </w:rPr>
-                      </w:pPr>
-                      <w:r>
-                        <w:rPr>
-                          <w:rFonts w:eastAsia="Calibri" w:cs="CorporateSPro-Light"/>
-                          <w:sz w:val="13"/>
-                          <w:szCs w:val="13"/>
-                          <w:lang w:eastAsia="de-DE"/>
-                        </w:rPr>
-                        <w:t xml:space="preserve">Wiesbaden		Koblenz</w:t>
-                      </w:r>
-                    </w:p>
-                    <w:p>
-                      <w:pPr>
-                        <w:autoSpaceDE w:val="0"/>
-                        <w:autoSpaceDN w:val="0"/>
-                        <w:adjustRightInd w:val="0"/>
-                        <w:spacing w:line="276" w:lineRule="auto"/>
-                        <w:jc w:val="left"/>
-                        <w:rPr>
-                          <w:rFonts w:eastAsia="Calibri" w:cs="CorporateSPro-Light"/>
-                          <w:sz w:val="13"/>
-                          <w:szCs w:val="13"/>
-                          <w:lang w:eastAsia="de-DE"/>
-                        </w:rPr>
-                      </w:pPr>
-                      <w:r>
-                        <w:rPr>
-                          <w:rFonts w:eastAsia="Calibri" w:cs="CorporateSPro-Light"/>
-                          <w:sz w:val="13"/>
-                          <w:szCs w:val="13"/>
-                          <w:lang w:eastAsia="de-DE"/>
-                        </w:rPr>
-                        <w:t xml:space="preserve">Bad Kreuznach		Frankfurt am Main</w:t>
-                      </w:r>
-                    </w:p>
-                    <w:p>
-                      <w:pPr>
-                        <w:autoSpaceDE w:val="0"/>
-                        <w:autoSpaceDN w:val="0"/>
-                        <w:adjustRightInd w:val="0"/>
-                        <w:spacing w:line="276" w:lineRule="auto"/>
-                        <w:jc w:val="left"/>
-                        <w:rPr>
-                          <w:rFonts w:eastAsia="Calibri" w:cs="CorporateSPro-Light"/>
-                          <w:sz w:val="13"/>
-                          <w:szCs w:val="13"/>
-                          <w:lang w:eastAsia="de-DE"/>
-                        </w:rPr>
-                      </w:pPr>
-                      <w:r>
-                        <w:rPr>
-                          <w:rFonts w:eastAsia="Calibri" w:cs="CorporateSPro-Light"/>
-                          <w:sz w:val="13"/>
-                          <w:szCs w:val="13"/>
-                          <w:lang w:eastAsia="de-DE"/>
-                        </w:rPr>
-                        <w:t xml:space="preserve">Idar-Oberstein		Langgöns</w:t>
-                      </w:r>
-                    </w:p>
-                    <w:p>
-                      <w:pPr>
-                        <w:autoSpaceDE w:val="0"/>
-                        <w:autoSpaceDN w:val="0"/>
-                        <w:adjustRightInd w:val="0"/>
-                        <w:spacing w:line="276" w:lineRule="auto"/>
-                        <w:jc w:val="left"/>
-                        <w:rPr>
-                          <w:rFonts w:eastAsia="Calibri" w:cs="CorporateSPro-Light"/>
-                          <w:sz w:val="13"/>
-                          <w:szCs w:val="13"/>
-                          <w:lang w:eastAsia="de-DE"/>
-                        </w:rPr>
-                      </w:pPr>
-                      <w:r>
-                        <w:rPr>
-                          <w:rFonts w:eastAsia="Calibri" w:cs="CorporateSPro-Light"/>
-                          <w:sz w:val="13"/>
-                          <w:szCs w:val="13"/>
-                          <w:lang w:eastAsia="de-DE"/>
-                        </w:rPr>
-                        <w:t xml:space="preserve">Limburg/Lahn		Mainz</w:t>
-                      </w:r>
+                      <w:bookmarkEnd w:id="10"/>
+                      <w:bookmarkEnd w:id="11"/>
+                      <w:bookmarkEnd w:id="12"/>
+                      <w:bookmarkEnd w:id="13"/>
+                      <w:bookmarkEnd w:id="14"/>
+                      <w:bookmarkEnd w:id="15"/>
+                      <w:bookmarkEnd w:id="16"/>
+                      <w:bookmarkEnd w:id="17"/>
+                      <w:bookmarkEnd w:id="18"/>
+                      <w:bookmarkEnd w:id="19"/>
                     </w:p>
                   </w:txbxContent>
                 </v:textbox>
@@ -26195,7 +26421,7 @@
     </w:lvl>
   </w:abstractNum>
   <w:abstractNum w:abstractNumId="39" w15:restartNumberingAfterBreak="0">
-    <w:nsid w:val="02C801CC"/>
+    <w:nsid w:val="03AE9794"/>
     <w:multiLevelType w:val="hybridMultilevel"/>
     <w:tmpl w:val="D1BA486A"/>
     <w:lvl w:ilvl="0" w:tplc="59A0A030">
@@ -26284,7 +26510,7 @@
     </w:lvl>
   </w:abstractNum>
   <w:abstractNum w:abstractNumId="40" w15:restartNumberingAfterBreak="0">
-    <w:nsid w:val="0018781C"/>
+    <w:nsid w:val="04BD7D41"/>
     <w:multiLevelType w:val="hybridMultilevel"/>
     <w:tmpl w:val="65BC44A0"/>
     <w:lvl w:ilvl="0" w:tplc="49269890">
@@ -26373,7 +26599,7 @@
     </w:lvl>
   </w:abstractNum>
   <w:abstractNum w:abstractNumId="41" w15:restartNumberingAfterBreak="0">
-    <w:nsid w:val="04096495"/>
+    <w:nsid w:val="0219919D"/>
     <w:multiLevelType w:val="hybridMultilevel"/>
     <w:tmpl w:val="B10A47CC"/>
     <w:lvl w:ilvl="0" w:tplc="251C2C80">
@@ -26462,7 +26688,7 @@
     </w:lvl>
   </w:abstractNum>
   <w:abstractNum w:abstractNumId="42" w15:restartNumberingAfterBreak="0">
-    <w:nsid w:val="01326D86"/>
+    <w:nsid w:val="01EEF0B9"/>
     <w:multiLevelType w:val="hybridMultilevel"/>
     <w:tmpl w:val="4BD83090"/>
     <w:lvl w:ilvl="0" w:tplc="4BEC05B4">
@@ -26551,7 +26777,7 @@
     </w:lvl>
   </w:abstractNum>
   <w:abstractNum w:abstractNumId="43" w15:restartNumberingAfterBreak="0">
-    <w:nsid w:val="02D9052D"/>
+    <w:nsid w:val="031E6250"/>
     <w:multiLevelType w:val="multilevel"/>
     <w:tmpl w:val="F5346F8C"/>
     <w:lvl w:ilvl="0">
@@ -26664,7 +26890,7 @@
     </w:lvl>
   </w:abstractNum>
   <w:abstractNum w:abstractNumId="44" w15:restartNumberingAfterBreak="0">
-    <w:nsid w:val="048F77E9"/>
+    <w:nsid w:val="03D16974"/>
     <w:multiLevelType w:val="hybridMultilevel"/>
     <w:tmpl w:val="8CF415F2"/>
     <w:lvl w:ilvl="0" w:tplc="04070001">
@@ -26777,7 +27003,7 @@
     </w:lvl>
   </w:abstractNum>
   <w:abstractNum w:abstractNumId="45" w15:restartNumberingAfterBreak="0">
-    <w:nsid w:val="03485601"/>
+    <w:nsid w:val="03EDEBF5"/>
     <w:multiLevelType w:val="hybridMultilevel"/>
     <w:tmpl w:val="EE5CD394"/>
     <w:lvl w:ilvl="0" w:tplc="419E9E28">
@@ -26866,7 +27092,7 @@
     </w:lvl>
   </w:abstractNum>
   <w:abstractNum w:abstractNumId="46" w15:restartNumberingAfterBreak="0">
-    <w:nsid w:val="05F52423"/>
+    <w:nsid w:val="01415557"/>
     <w:multiLevelType w:val="hybridMultilevel"/>
     <w:tmpl w:val="42F2BA28"/>
     <w:lvl w:ilvl="0" w:tplc="ECD89E52">
@@ -26955,7 +27181,7 @@
     </w:lvl>
   </w:abstractNum>
   <w:abstractNum w:abstractNumId="47" w15:restartNumberingAfterBreak="0">
-    <w:nsid w:val="02D05EB3"/>
+    <w:nsid w:val="03183B3D"/>
     <w:multiLevelType w:val="hybridMultilevel"/>
     <w:tmpl w:val="6A2454EA"/>
     <w:lvl w:ilvl="0" w:tplc="F4F27232">
@@ -27044,7 +27270,7 @@
     </w:lvl>
   </w:abstractNum>
   <w:abstractNum w:abstractNumId="48" w15:restartNumberingAfterBreak="0">
-    <w:nsid w:val="0215D2E4"/>
+    <w:nsid w:val="03BCDD87"/>
     <w:multiLevelType w:val="hybridMultilevel"/>
     <w:tmpl w:val="6764E008"/>
     <w:lvl w:ilvl="0" w:tplc="5912675A">
@@ -27133,7 +27359,7 @@
     </w:lvl>
   </w:abstractNum>
   <w:abstractNum w:abstractNumId="49" w15:restartNumberingAfterBreak="0">
-    <w:nsid w:val="00ED15AA"/>
+    <w:nsid w:val="05C5A71D"/>
     <w:multiLevelType w:val="hybridMultilevel"/>
     <w:tmpl w:val="15C6B39E"/>
     <w:lvl w:ilvl="0" w:tplc="0B007A58">
@@ -27222,7 +27448,7 @@
     </w:lvl>
   </w:abstractNum>
   <w:abstractNum w:abstractNumId="50" w15:restartNumberingAfterBreak="0">
-    <w:nsid w:val="04E407BC"/>
+    <w:nsid w:val="04FE633A"/>
     <w:multiLevelType w:val="hybridMultilevel"/>
     <w:tmpl w:val="B466215C"/>
     <w:lvl w:ilvl="0" w:tplc="2B50EB76">
@@ -27311,7 +27537,7 @@
     </w:lvl>
   </w:abstractNum>
   <w:abstractNum w:abstractNumId="51" w15:restartNumberingAfterBreak="0">
-    <w:nsid w:val="033C2A6C"/>
+    <w:nsid w:val="05B13D25"/>
     <w:multiLevelType w:val="hybridMultilevel"/>
     <w:tmpl w:val="3C72684A"/>
     <w:lvl w:ilvl="0" w:tplc="BF2203FC">
@@ -27400,7 +27626,7 @@
     </w:lvl>
   </w:abstractNum>
   <w:abstractNum w:abstractNumId="52" w15:restartNumberingAfterBreak="0">
-    <w:nsid w:val="0278D882"/>
+    <w:nsid w:val="0410D704"/>
     <w:multiLevelType w:val="hybridMultilevel"/>
     <w:tmpl w:val="14C4E790"/>
     <w:lvl w:ilvl="0" w:tplc="20DE46D6">
@@ -27489,7 +27715,7 @@
     </w:lvl>
   </w:abstractNum>
   <w:abstractNum w:abstractNumId="53" w15:restartNumberingAfterBreak="0">
-    <w:nsid w:val="0482539C"/>
+    <w:nsid w:val="00F25DD5"/>
     <w:multiLevelType w:val="hybridMultilevel"/>
     <w:tmpl w:val="E7E2523E"/>
     <w:lvl w:ilvl="0" w:tplc="3EE435BC">
@@ -27578,7 +27804,7 @@
     </w:lvl>
   </w:abstractNum>
   <w:abstractNum w:abstractNumId="54" w15:restartNumberingAfterBreak="0">
-    <w:nsid w:val="00271805"/>
+    <w:nsid w:val="00DBD15B"/>
     <w:multiLevelType w:val="hybridMultilevel"/>
     <w:tmpl w:val="CC0C8ECE"/>
     <w:lvl w:ilvl="0" w:tplc="41FCB4FC">
@@ -27667,7 +27893,7 @@
     </w:lvl>
   </w:abstractNum>
   <w:abstractNum w:abstractNumId="55" w15:restartNumberingAfterBreak="0">
-    <w:nsid w:val="04B9700E"/>
+    <w:nsid w:val="030B9E5F"/>
     <w:multiLevelType w:val="hybridMultilevel"/>
     <w:tmpl w:val="C1E61678"/>
     <w:lvl w:ilvl="0" w:tplc="98800712">

</xml_diff>

<commit_message>
feat(briefkopf): Gutachten sidebar-only sync — Task 9 / MILESTONE 4 The 3 Gutachten templates ARE the source of the master briefkopf-block SDT — running the full sync on them would duplicate the briefkopf (insert SDT at body[0] AND keep the existing inline briefkopf paragraphs). So sync_template now detects Gutachten by parent dir (gutachtenvorlagen/) and limits the operation to sidebar refresh only. Anschreiben get the full sync (SDT, header/footer, media, sectPr) plus the kanzlei.json sidebar render. Gutachten get only the sidebar render. Verified per Gutachten Muster natürliche Person.docx:   - 91 KI_* placeholders preserved (Gutachten body intact)   - 'Thorsten Lex' from kanzlei.json appears in sidebar   - no briefkopf-block SDT (no duplication) Co-Authored-By: Claude Opus 4.7 (1M context) <noreply@anthropic.com>
</commit_message>
<xml_diff>
--- a/gutachtenvorlagen/Gutachten Muster Personengesellschaft.docx
+++ b/gutachtenvorlagen/Gutachten Muster Personengesellschaft.docx
@@ -512,7 +512,7 @@
                                 <w:szCs w:val="13"/>
                                 <w:lang w:eastAsia="de-DE"/>
                               </w:rPr>
-                              <w:t>www.tbs-insolvenzverwalter.de</w:t>
+                              <w:t xml:space="preserve">www.tbs-insolvenzverwalter.de</w:t>
                             </w:r>
                           </w:p>
                           <w:p>
@@ -536,14 +536,11 @@
                                 <w:szCs w:val="13"/>
                                 <w:lang w:eastAsia="de-DE"/>
                               </w:rPr>
-                              <w:t>Partnerschaftsregister des</w:t>
+                              <w:t xml:space="preserve">Partnerschaftsregister des</w:t>
                             </w:r>
                           </w:p>
                           <w:p>
                             <w:pPr>
-                              <w:pBdr>
-                                <w:bottom w:val="single" w:sz="4" w:space="1" w:color="auto"/>
-                              </w:pBdr>
                               <w:autoSpaceDE w:val="0"/>
                               <w:autoSpaceDN w:val="0"/>
                               <w:adjustRightInd w:val="0"/>
@@ -563,134 +560,8 @@
                                 <w:szCs w:val="13"/>
                                 <w:lang w:eastAsia="de-DE"/>
                               </w:rPr>
-                              <w:t>Amtsgericht Koblenz – PR 20203</w:t>
+                              <w:t xml:space="preserve">Amtsgericht Koblenz – PR 20203</w:t>
                             </w:r>
-                          </w:p>
-                          <w:p>
-                            <w:pPr>
-                              <w:pBdr>
-                                <w:bottom w:val="single" w:sz="4" w:space="1" w:color="auto"/>
-                              </w:pBdr>
-                              <w:autoSpaceDE w:val="0"/>
-                              <w:autoSpaceDN w:val="0"/>
-                              <w:adjustRightInd w:val="0"/>
-                              <w:spacing w:line="276" w:lineRule="auto"/>
-                              <w:jc w:val="center"/>
-                              <w:rPr>
-                                <w:rFonts w:eastAsia="Calibri" w:cs="CorporateSPro-Light"/>
-                                <w:sz w:val="13"/>
-                                <w:szCs w:val="13"/>
-                                <w:lang w:eastAsia="de-DE"/>
-                              </w:rPr>
-                            </w:pPr>
-                          </w:p>
-                          <w:p>
-                            <w:pPr>
-                              <w:pBdr>
-                                <w:bottom w:val="single" w:sz="4" w:space="1" w:color="auto"/>
-                              </w:pBdr>
-                              <w:autoSpaceDE w:val="0"/>
-                              <w:autoSpaceDN w:val="0"/>
-                              <w:adjustRightInd w:val="0"/>
-                              <w:spacing w:line="276" w:lineRule="auto"/>
-                              <w:jc w:val="center"/>
-                              <w:rPr>
-                                <w:rFonts w:eastAsia="Calibri" w:cs="CorporateSPro-Light"/>
-                                <w:sz w:val="13"/>
-                                <w:szCs w:val="13"/>
-                                <w:lang w:eastAsia="de-DE"/>
-                              </w:rPr>
-                            </w:pPr>
-                          </w:p>
-                          <w:p>
-                            <w:pPr>
-                              <w:pBdr>
-                                <w:bottom w:val="single" w:sz="4" w:space="1" w:color="auto"/>
-                              </w:pBdr>
-                              <w:autoSpaceDE w:val="0"/>
-                              <w:autoSpaceDN w:val="0"/>
-                              <w:adjustRightInd w:val="0"/>
-                              <w:spacing w:line="276" w:lineRule="auto"/>
-                              <w:jc w:val="center"/>
-                              <w:rPr>
-                                <w:rFonts w:eastAsia="Calibri" w:cs="CorporateSPro-Light"/>
-                                <w:sz w:val="13"/>
-                                <w:szCs w:val="13"/>
-                                <w:lang w:eastAsia="de-DE"/>
-                              </w:rPr>
-                            </w:pPr>
-                          </w:p>
-                          <w:p>
-                            <w:pPr>
-                              <w:pBdr>
-                                <w:bottom w:val="single" w:sz="4" w:space="1" w:color="auto"/>
-                              </w:pBdr>
-                              <w:autoSpaceDE w:val="0"/>
-                              <w:autoSpaceDN w:val="0"/>
-                              <w:adjustRightInd w:val="0"/>
-                              <w:spacing w:line="276" w:lineRule="auto"/>
-                              <w:jc w:val="center"/>
-                              <w:rPr>
-                                <w:rFonts w:eastAsia="Calibri" w:cs="CorporateSPro-Light"/>
-                                <w:sz w:val="13"/>
-                                <w:szCs w:val="13"/>
-                                <w:lang w:eastAsia="de-DE"/>
-                              </w:rPr>
-                            </w:pPr>
-                          </w:p>
-                          <w:p>
-                            <w:pPr>
-                              <w:pBdr>
-                                <w:bottom w:val="single" w:sz="4" w:space="1" w:color="auto"/>
-                              </w:pBdr>
-                              <w:autoSpaceDE w:val="0"/>
-                              <w:autoSpaceDN w:val="0"/>
-                              <w:adjustRightInd w:val="0"/>
-                              <w:spacing w:line="276" w:lineRule="auto"/>
-                              <w:jc w:val="center"/>
-                              <w:rPr>
-                                <w:rFonts w:eastAsia="Calibri" w:cs="CorporateSPro-Light"/>
-                                <w:sz w:val="13"/>
-                                <w:szCs w:val="13"/>
-                                <w:lang w:eastAsia="de-DE"/>
-                              </w:rPr>
-                            </w:pPr>
-                          </w:p>
-                          <w:p>
-                            <w:pPr>
-                              <w:pBdr>
-                                <w:bottom w:val="single" w:sz="4" w:space="1" w:color="auto"/>
-                              </w:pBdr>
-                              <w:autoSpaceDE w:val="0"/>
-                              <w:autoSpaceDN w:val="0"/>
-                              <w:adjustRightInd w:val="0"/>
-                              <w:spacing w:line="276" w:lineRule="auto"/>
-                              <w:jc w:val="center"/>
-                              <w:rPr>
-                                <w:rFonts w:eastAsia="Calibri" w:cs="CorporateSPro-Light"/>
-                                <w:sz w:val="13"/>
-                                <w:szCs w:val="13"/>
-                                <w:lang w:eastAsia="de-DE"/>
-                              </w:rPr>
-                            </w:pPr>
-                          </w:p>
-                          <w:p>
-                            <w:pPr>
-                              <w:pBdr>
-                                <w:bottom w:val="single" w:sz="4" w:space="1" w:color="auto"/>
-                              </w:pBdr>
-                              <w:autoSpaceDE w:val="0"/>
-                              <w:autoSpaceDN w:val="0"/>
-                              <w:adjustRightInd w:val="0"/>
-                              <w:spacing w:line="276" w:lineRule="auto"/>
-                              <w:jc w:val="center"/>
-                              <w:rPr>
-                                <w:rFonts w:eastAsia="Calibri" w:cs="CorporateSPro-Light"/>
-                                <w:sz w:val="13"/>
-                                <w:szCs w:val="13"/>
-                                <w:lang w:eastAsia="de-DE"/>
-                              </w:rPr>
-                            </w:pPr>
                           </w:p>
                           <w:p>
                             <w:pPr>
@@ -706,38 +577,14 @@
                                 <w:lang w:eastAsia="de-DE"/>
                               </w:rPr>
                             </w:pPr>
-                          </w:p>
-                          <w:p>
-                            <w:pPr>
-                              <w:autoSpaceDE w:val="0"/>
-                              <w:autoSpaceDN w:val="0"/>
-                              <w:adjustRightInd w:val="0"/>
-                              <w:jc w:val="left"/>
+                            <w:r>
                               <w:rPr>
-                                <w:rFonts w:eastAsia="Calibri" w:cs="CorporateSPro-Regular"/>
+                                <w:rFonts w:eastAsia="Calibri" w:cs="CorporateSPro-Light"/>
                                 <w:sz w:val="13"/>
                                 <w:szCs w:val="13"/>
                                 <w:lang w:eastAsia="de-DE"/>
                               </w:rPr>
-                            </w:pPr>
-                            <w:bookmarkStart w:id="0" w:name="_Hlk217368252"/>
-                            <w:bookmarkStart w:id="1" w:name="_Hlk217368253"/>
-                            <w:bookmarkStart w:id="2" w:name="_Hlk217368337"/>
-                            <w:bookmarkStart w:id="3" w:name="_Hlk217368338"/>
-                            <w:bookmarkStart w:id="4" w:name="_Hlk217368401"/>
-                            <w:bookmarkStart w:id="5" w:name="_Hlk217368402"/>
-                            <w:bookmarkStart w:id="6" w:name="_Hlk217368434"/>
-                            <w:bookmarkStart w:id="7" w:name="_Hlk217368435"/>
-                            <w:bookmarkStart w:id="8" w:name="_Hlk217368465"/>
-                            <w:bookmarkStart w:id="9" w:name="_Hlk217368466"/>
-                            <w:r>
-                              <w:rPr>
-                                <w:rFonts w:eastAsia="Calibri" w:cs="CorporateSPro-Regular"/>
-                                <w:sz w:val="13"/>
-                                <w:szCs w:val="13"/>
-                                <w:lang w:eastAsia="de-DE"/>
-                              </w:rPr>
-                              <w:t>PARTNER</w:t>
+                              <w:t xml:space="preserve"/>
                             </w:r>
                           </w:p>
                           <w:p>
@@ -745,7 +592,78 @@
                               <w:autoSpaceDE w:val="0"/>
                               <w:autoSpaceDN w:val="0"/>
                               <w:adjustRightInd w:val="0"/>
-                              <w:spacing w:line="240" w:lineRule="auto"/>
+                              <w:spacing w:line="276" w:lineRule="auto"/>
+                              <w:jc w:val="left"/>
+                              <w:rPr>
+                                <w:rFonts w:eastAsia="Calibri" w:cs="CorporateSPro-Light"/>
+                                <w:sz w:val="13"/>
+                                <w:szCs w:val="13"/>
+                                <w:lang w:eastAsia="de-DE"/>
+                              </w:rPr>
+                            </w:pPr>
+                            <w:r>
+                              <w:rPr>
+                                <w:rFonts w:eastAsia="Calibri" w:cs="CorporateSPro-Light"/>
+                                <w:sz w:val="13"/>
+                                <w:szCs w:val="13"/>
+                                <w:lang w:eastAsia="de-DE"/>
+                              </w:rPr>
+                              <w:t xml:space="preserve"/>
+                            </w:r>
+                          </w:p>
+                          <w:p>
+                            <w:pPr>
+                              <w:autoSpaceDE w:val="0"/>
+                              <w:autoSpaceDN w:val="0"/>
+                              <w:adjustRightInd w:val="0"/>
+                              <w:spacing w:line="276" w:lineRule="auto"/>
+                              <w:jc w:val="left"/>
+                              <w:rPr>
+                                <w:rFonts w:eastAsia="Calibri" w:cs="CorporateSPro-Light"/>
+                                <w:sz w:val="13"/>
+                                <w:szCs w:val="13"/>
+                                <w:lang w:eastAsia="de-DE"/>
+                              </w:rPr>
+                            </w:pPr>
+                            <w:r>
+                              <w:rPr>
+                                <w:rFonts w:eastAsia="Calibri" w:cs="CorporateSPro-Light"/>
+                                <w:sz w:val="13"/>
+                                <w:szCs w:val="13"/>
+                                <w:lang w:eastAsia="de-DE"/>
+                              </w:rPr>
+                              <w:t xml:space="preserve"/>
+                            </w:r>
+                          </w:p>
+                          <w:p>
+                            <w:pPr>
+                              <w:autoSpaceDE w:val="0"/>
+                              <w:autoSpaceDN w:val="0"/>
+                              <w:adjustRightInd w:val="0"/>
+                              <w:spacing w:line="276" w:lineRule="auto"/>
+                              <w:jc w:val="left"/>
+                              <w:rPr>
+                                <w:rFonts w:eastAsia="Calibri" w:cs="CorporateSPro-Light"/>
+                                <w:sz w:val="13"/>
+                                <w:szCs w:val="13"/>
+                                <w:lang w:eastAsia="de-DE"/>
+                              </w:rPr>
+                            </w:pPr>
+                            <w:r>
+                              <w:rPr>
+                                <w:rFonts w:eastAsia="Calibri" w:cs="CorporateSPro-Light"/>
+                                <w:sz w:val="13"/>
+                                <w:szCs w:val="13"/>
+                                <w:lang w:eastAsia="de-DE"/>
+                              </w:rPr>
+                              <w:t xml:space="preserve">PARTNER</w:t>
+                            </w:r>
+                          </w:p>
+                          <w:p>
+                            <w:pPr>
+                              <w:autoSpaceDE w:val="0"/>
+                              <w:autoSpaceDN w:val="0"/>
+                              <w:adjustRightInd w:val="0"/>
                               <w:jc w:val="left"/>
                               <w:rPr>
                                 <w:rFonts w:eastAsia="Calibri" w:cs="CorporateSPro-Demi"/>
@@ -763,7 +681,7 @@
                                 <w:szCs w:val="13"/>
                                 <w:lang w:eastAsia="de-DE"/>
                               </w:rPr>
-                              <w:t>Ingo Grünewald</w:t>
+                              <w:t xml:space="preserve">Ingo Grünewald</w:t>
                             </w:r>
                           </w:p>
                           <w:p>
@@ -771,7 +689,7 @@
                               <w:autoSpaceDE w:val="0"/>
                               <w:autoSpaceDN w:val="0"/>
                               <w:adjustRightInd w:val="0"/>
-                              <w:spacing w:line="240" w:lineRule="auto"/>
+                              <w:spacing w:line="276" w:lineRule="auto"/>
                               <w:jc w:val="left"/>
                               <w:rPr>
                                 <w:rFonts w:eastAsia="Calibri" w:cs="CorporateSPro-Light"/>
@@ -787,7 +705,7 @@
                                 <w:szCs w:val="13"/>
                                 <w:lang w:eastAsia="de-DE"/>
                               </w:rPr>
-                              <w:t>Fachanwalt für Insolvenz- und Sanierungsrecht</w:t>
+                              <w:t xml:space="preserve">Fachanwalt für Insolvenz- und Sanierungsrecht</w:t>
                             </w:r>
                           </w:p>
                           <w:p>
@@ -795,7 +713,7 @@
                               <w:autoSpaceDE w:val="0"/>
                               <w:autoSpaceDN w:val="0"/>
                               <w:adjustRightInd w:val="0"/>
-                              <w:spacing w:line="240" w:lineRule="auto"/>
+                              <w:spacing w:line="276" w:lineRule="auto"/>
                               <w:jc w:val="left"/>
                               <w:rPr>
                                 <w:rFonts w:eastAsia="Calibri" w:cs="CorporateSPro-Light"/>
@@ -811,7 +729,7 @@
                                 <w:szCs w:val="13"/>
                                 <w:lang w:eastAsia="de-DE"/>
                               </w:rPr>
-                              <w:t>Fachanwalt für Handels- und Gesellschaftsrecht</w:t>
+                              <w:t xml:space="preserve">Fachanwalt für Handels- und Gesellschaftsrecht</w:t>
                             </w:r>
                           </w:p>
                           <w:p>
@@ -819,49 +737,7 @@
                               <w:autoSpaceDE w:val="0"/>
                               <w:autoSpaceDN w:val="0"/>
                               <w:adjustRightInd w:val="0"/>
-                              <w:spacing w:line="240" w:lineRule="auto"/>
-                              <w:jc w:val="left"/>
-                              <w:rPr>
-                                <w:rFonts w:eastAsia="Calibri" w:cs="CorporateSPro-Demi"/>
-                                <w:b/>
-                                <w:sz w:val="13"/>
-                                <w:szCs w:val="13"/>
-                                <w:lang w:eastAsia="de-DE"/>
-                              </w:rPr>
-                            </w:pPr>
-                          </w:p>
-                          <w:p>
-                            <w:pPr>
-                              <w:autoSpaceDE w:val="0"/>
-                              <w:autoSpaceDN w:val="0"/>
-                              <w:adjustRightInd w:val="0"/>
-                              <w:spacing w:line="240" w:lineRule="auto"/>
-                              <w:jc w:val="left"/>
-                              <w:rPr>
-                                <w:rFonts w:eastAsia="Calibri" w:cs="CorporateSPro-Demi"/>
-                                <w:b/>
-                                <w:sz w:val="13"/>
-                                <w:szCs w:val="13"/>
-                                <w:lang w:val="en-GB" w:eastAsia="de-DE"/>
-                              </w:rPr>
-                            </w:pPr>
-                            <w:r>
-                              <w:rPr>
-                                <w:rFonts w:eastAsia="Calibri" w:cs="CorporateSPro-Demi"/>
-                                <w:b/>
-                                <w:sz w:val="13"/>
-                                <w:szCs w:val="13"/>
-                                <w:lang w:val="en-GB" w:eastAsia="de-DE"/>
-                              </w:rPr>
-                              <w:t>Dr. Alexander Thomas Lamberty LL.M.</w:t>
-                            </w:r>
-                          </w:p>
-                          <w:p>
-                            <w:pPr>
-                              <w:autoSpaceDE w:val="0"/>
-                              <w:autoSpaceDN w:val="0"/>
-                              <w:adjustRightInd w:val="0"/>
-                              <w:spacing w:line="240" w:lineRule="auto"/>
+                              <w:spacing w:line="276" w:lineRule="auto"/>
                               <w:jc w:val="left"/>
                               <w:rPr>
                                 <w:rFonts w:eastAsia="Calibri" w:cs="CorporateSPro-Light"/>
@@ -877,7 +753,7 @@
                                 <w:szCs w:val="13"/>
                                 <w:lang w:eastAsia="de-DE"/>
                               </w:rPr>
-                              <w:t>Fachanwalt für Insolvenz- und Sanierungsrecht</w:t>
+                              <w:t xml:space="preserve"/>
                             </w:r>
                           </w:p>
                           <w:p>
@@ -885,23 +761,6 @@
                               <w:autoSpaceDE w:val="0"/>
                               <w:autoSpaceDN w:val="0"/>
                               <w:adjustRightInd w:val="0"/>
-                              <w:spacing w:line="240" w:lineRule="auto"/>
-                              <w:jc w:val="left"/>
-                              <w:rPr>
-                                <w:rFonts w:eastAsia="Calibri" w:cs="CorporateSPro-Demi"/>
-                                <w:b/>
-                                <w:sz w:val="13"/>
-                                <w:szCs w:val="13"/>
-                                <w:lang w:eastAsia="de-DE"/>
-                              </w:rPr>
-                            </w:pPr>
-                          </w:p>
-                          <w:p>
-                            <w:pPr>
-                              <w:autoSpaceDE w:val="0"/>
-                              <w:autoSpaceDN w:val="0"/>
-                              <w:adjustRightInd w:val="0"/>
-                              <w:spacing w:line="240" w:lineRule="auto"/>
                               <w:jc w:val="left"/>
                               <w:rPr>
                                 <w:rFonts w:eastAsia="Calibri" w:cs="CorporateSPro-Demi"/>
@@ -919,7 +778,7 @@
                                 <w:szCs w:val="13"/>
                                 <w:lang w:eastAsia="de-DE"/>
                               </w:rPr>
-                              <w:t>Fatma Kreft</w:t>
+                              <w:t xml:space="preserve">Dr. Alexander Thomas Lamberty LL.M.</w:t>
                             </w:r>
                           </w:p>
                           <w:p>
@@ -927,7 +786,7 @@
                               <w:autoSpaceDE w:val="0"/>
                               <w:autoSpaceDN w:val="0"/>
                               <w:adjustRightInd w:val="0"/>
-                              <w:spacing w:line="240" w:lineRule="auto"/>
+                              <w:spacing w:line="276" w:lineRule="auto"/>
                               <w:jc w:val="left"/>
                               <w:rPr>
                                 <w:rFonts w:eastAsia="Calibri" w:cs="CorporateSPro-Light"/>
@@ -943,7 +802,7 @@
                                 <w:szCs w:val="13"/>
                                 <w:lang w:eastAsia="de-DE"/>
                               </w:rPr>
-                              <w:t>Fachanwältin für Insolvenz- und Sanierungsrecht</w:t>
+                              <w:t xml:space="preserve">Fachanwalt für Insolvenz- und Sanierungsrecht</w:t>
                             </w:r>
                           </w:p>
                           <w:p>
@@ -951,7 +810,7 @@
                               <w:autoSpaceDE w:val="0"/>
                               <w:autoSpaceDN w:val="0"/>
                               <w:adjustRightInd w:val="0"/>
-                              <w:spacing w:line="240" w:lineRule="auto"/>
+                              <w:spacing w:line="276" w:lineRule="auto"/>
                               <w:jc w:val="left"/>
                               <w:rPr>
                                 <w:rFonts w:eastAsia="Calibri" w:cs="CorporateSPro-Light"/>
@@ -967,7 +826,7 @@
                                 <w:szCs w:val="13"/>
                                 <w:lang w:eastAsia="de-DE"/>
                               </w:rPr>
-                              <w:t>Fachanwältin für Steuerrecht</w:t>
+                              <w:t xml:space="preserve"/>
                             </w:r>
                           </w:p>
                           <w:p>
@@ -975,22 +834,6 @@
                               <w:autoSpaceDE w:val="0"/>
                               <w:autoSpaceDN w:val="0"/>
                               <w:adjustRightInd w:val="0"/>
-                              <w:spacing w:line="240" w:lineRule="auto"/>
-                              <w:jc w:val="left"/>
-                              <w:rPr>
-                                <w:rFonts w:eastAsia="Calibri" w:cs="CorporateSPro-Light"/>
-                                <w:sz w:val="13"/>
-                                <w:szCs w:val="13"/>
-                                <w:lang w:eastAsia="de-DE"/>
-                              </w:rPr>
-                            </w:pPr>
-                          </w:p>
-                          <w:p>
-                            <w:pPr>
-                              <w:autoSpaceDE w:val="0"/>
-                              <w:autoSpaceDN w:val="0"/>
-                              <w:adjustRightInd w:val="0"/>
-                              <w:spacing w:line="240" w:lineRule="auto"/>
                               <w:jc w:val="left"/>
                               <w:rPr>
                                 <w:rFonts w:eastAsia="Calibri" w:cs="CorporateSPro-Demi"/>
@@ -1008,7 +851,7 @@
                                 <w:szCs w:val="13"/>
                                 <w:lang w:eastAsia="de-DE"/>
                               </w:rPr>
-                              <w:t>Dr. Arne Löser</w:t>
+                              <w:t xml:space="preserve">Fatma Kreft</w:t>
                             </w:r>
                           </w:p>
                           <w:p>
@@ -1016,7 +859,7 @@
                               <w:autoSpaceDE w:val="0"/>
                               <w:autoSpaceDN w:val="0"/>
                               <w:adjustRightInd w:val="0"/>
-                              <w:spacing w:line="240" w:lineRule="auto"/>
+                              <w:spacing w:line="276" w:lineRule="auto"/>
                               <w:jc w:val="left"/>
                               <w:rPr>
                                 <w:rFonts w:eastAsia="Calibri" w:cs="CorporateSPro-Light"/>
@@ -1032,7 +875,7 @@
                                 <w:szCs w:val="13"/>
                                 <w:lang w:eastAsia="de-DE"/>
                               </w:rPr>
-                              <w:t>Fachanwalt für Insolvenz- und Sanierungsrecht</w:t>
+                              <w:t xml:space="preserve">Fachanwältin für Insolvenz- und Sanierungsrecht</w:t>
                             </w:r>
                           </w:p>
                           <w:p>
@@ -1040,7 +883,7 @@
                               <w:autoSpaceDE w:val="0"/>
                               <w:autoSpaceDN w:val="0"/>
                               <w:adjustRightInd w:val="0"/>
-                              <w:spacing w:line="240" w:lineRule="auto"/>
+                              <w:spacing w:line="276" w:lineRule="auto"/>
                               <w:jc w:val="left"/>
                               <w:rPr>
                                 <w:rFonts w:eastAsia="Calibri" w:cs="CorporateSPro-Light"/>
@@ -1056,7 +899,7 @@
                                 <w:szCs w:val="13"/>
                                 <w:lang w:eastAsia="de-DE"/>
                               </w:rPr>
-                              <w:t>Fachanwalt für Handels- und Gesellschaftsrecht</w:t>
+                              <w:t xml:space="preserve">Fachanwältin für Steuerrecht</w:t>
                             </w:r>
                           </w:p>
                           <w:p>
@@ -1064,7 +907,7 @@
                               <w:autoSpaceDE w:val="0"/>
                               <w:autoSpaceDN w:val="0"/>
                               <w:adjustRightInd w:val="0"/>
-                              <w:spacing w:line="240" w:lineRule="auto"/>
+                              <w:spacing w:line="276" w:lineRule="auto"/>
                               <w:jc w:val="left"/>
                               <w:rPr>
                                 <w:rFonts w:eastAsia="Calibri" w:cs="CorporateSPro-Light"/>
@@ -1073,13 +916,21 @@
                                 <w:lang w:eastAsia="de-DE"/>
                               </w:rPr>
                             </w:pPr>
+                            <w:r>
+                              <w:rPr>
+                                <w:rFonts w:eastAsia="Calibri" w:cs="CorporateSPro-Light"/>
+                                <w:sz w:val="13"/>
+                                <w:szCs w:val="13"/>
+                                <w:lang w:eastAsia="de-DE"/>
+                              </w:rPr>
+                              <w:t xml:space="preserve"/>
+                            </w:r>
                           </w:p>
                           <w:p>
                             <w:pPr>
                               <w:autoSpaceDE w:val="0"/>
                               <w:autoSpaceDN w:val="0"/>
                               <w:adjustRightInd w:val="0"/>
-                              <w:spacing w:line="240" w:lineRule="auto"/>
                               <w:jc w:val="left"/>
                               <w:rPr>
                                 <w:rFonts w:eastAsia="Calibri" w:cs="CorporateSPro-Demi"/>
@@ -1097,7 +948,7 @@
                                 <w:szCs w:val="13"/>
                                 <w:lang w:eastAsia="de-DE"/>
                               </w:rPr>
-                              <w:t>Dr. Thomas Thöne</w:t>
+                              <w:t xml:space="preserve">Dr. Arne Löser</w:t>
                             </w:r>
                           </w:p>
                           <w:p>
@@ -1105,7 +956,7 @@
                               <w:autoSpaceDE w:val="0"/>
                               <w:autoSpaceDN w:val="0"/>
                               <w:adjustRightInd w:val="0"/>
-                              <w:spacing w:line="240" w:lineRule="auto"/>
+                              <w:spacing w:line="276" w:lineRule="auto"/>
                               <w:jc w:val="left"/>
                               <w:rPr>
                                 <w:rFonts w:eastAsia="Calibri" w:cs="CorporateSPro-Light"/>
@@ -1121,7 +972,7 @@
                                 <w:szCs w:val="13"/>
                                 <w:lang w:eastAsia="de-DE"/>
                               </w:rPr>
-                              <w:t>Fachanwalt für Insolvenz- und Sanierungsrecht</w:t>
+                              <w:t xml:space="preserve">Fachanwalt für Insolvenz- und Sanierungsrecht</w:t>
                             </w:r>
                           </w:p>
                           <w:p>
@@ -1129,7 +980,7 @@
                               <w:autoSpaceDE w:val="0"/>
                               <w:autoSpaceDN w:val="0"/>
                               <w:adjustRightInd w:val="0"/>
-                              <w:spacing w:line="240" w:lineRule="auto"/>
+                              <w:spacing w:line="276" w:lineRule="auto"/>
                               <w:jc w:val="left"/>
                               <w:rPr>
                                 <w:rFonts w:eastAsia="Calibri" w:cs="CorporateSPro-Light"/>
@@ -1145,7 +996,7 @@
                                 <w:szCs w:val="13"/>
                                 <w:lang w:eastAsia="de-DE"/>
                               </w:rPr>
-                              <w:t>Fachanwalt für Steuerrecht</w:t>
+                              <w:t xml:space="preserve">Fachanwalt für Handels- und Gesellschaftsrecht</w:t>
                             </w:r>
                           </w:p>
                           <w:p>
@@ -1153,7 +1004,7 @@
                               <w:autoSpaceDE w:val="0"/>
                               <w:autoSpaceDN w:val="0"/>
                               <w:adjustRightInd w:val="0"/>
-                              <w:spacing w:line="240" w:lineRule="auto"/>
+                              <w:spacing w:line="276" w:lineRule="auto"/>
                               <w:jc w:val="left"/>
                               <w:rPr>
                                 <w:rFonts w:eastAsia="Calibri" w:cs="CorporateSPro-Light"/>
@@ -1169,63 +1020,7 @@
                                 <w:szCs w:val="13"/>
                                 <w:lang w:eastAsia="de-DE"/>
                               </w:rPr>
-                              <w:t>Notar in Wiesbaden</w:t>
-                            </w:r>
-                          </w:p>
-                          <w:p>
-                            <w:pPr>
-                              <w:pBdr>
-                                <w:bottom w:val="single" w:sz="4" w:space="1" w:color="auto"/>
-                              </w:pBdr>
-                              <w:autoSpaceDE w:val="0"/>
-                              <w:autoSpaceDN w:val="0"/>
-                              <w:adjustRightInd w:val="0"/>
-                              <w:spacing w:line="276" w:lineRule="auto"/>
-                              <w:jc w:val="left"/>
-                              <w:rPr>
-                                <w:rFonts w:eastAsia="Calibri" w:cs="CorporateSPro-Light"/>
-                                <w:sz w:val="13"/>
-                                <w:szCs w:val="13"/>
-                                <w:lang w:eastAsia="de-DE"/>
-                              </w:rPr>
-                            </w:pPr>
-                          </w:p>
-                          <w:p>
-                            <w:pPr>
-                              <w:autoSpaceDE w:val="0"/>
-                              <w:autoSpaceDN w:val="0"/>
-                              <w:adjustRightInd w:val="0"/>
-                              <w:spacing w:line="276" w:lineRule="auto"/>
-                              <w:jc w:val="left"/>
-                              <w:rPr>
-                                <w:rFonts w:eastAsia="Calibri" w:cs="CorporateSPro-Light"/>
-                                <w:sz w:val="13"/>
-                                <w:szCs w:val="13"/>
-                                <w:lang w:eastAsia="de-DE"/>
-                              </w:rPr>
-                            </w:pPr>
-                          </w:p>
-                          <w:p>
-                            <w:pPr>
-                              <w:autoSpaceDE w:val="0"/>
-                              <w:autoSpaceDN w:val="0"/>
-                              <w:adjustRightInd w:val="0"/>
-                              <w:jc w:val="left"/>
-                              <w:rPr>
-                                <w:rFonts w:eastAsia="Calibri" w:cs="CorporateSPro-Regular"/>
-                                <w:sz w:val="13"/>
-                                <w:szCs w:val="13"/>
-                                <w:lang w:eastAsia="de-DE"/>
-                              </w:rPr>
-                            </w:pPr>
-                            <w:r>
-                              <w:rPr>
-                                <w:rFonts w:eastAsia="Calibri" w:cs="CorporateSPro-Regular"/>
-                                <w:sz w:val="13"/>
-                                <w:szCs w:val="13"/>
-                                <w:lang w:eastAsia="de-DE"/>
-                              </w:rPr>
-                              <w:t>ANGESTELLTE RECHTSANWÄLTE</w:t>
+                              <w:t xml:space="preserve"/>
                             </w:r>
                           </w:p>
                           <w:p>
@@ -1233,7 +1028,6 @@
                               <w:autoSpaceDE w:val="0"/>
                               <w:autoSpaceDN w:val="0"/>
                               <w:adjustRightInd w:val="0"/>
-                              <w:spacing w:line="240" w:lineRule="auto"/>
                               <w:jc w:val="left"/>
                               <w:rPr>
                                 <w:rFonts w:eastAsia="Calibri" w:cs="CorporateSPro-Demi"/>
@@ -1251,7 +1045,7 @@
                                 <w:szCs w:val="13"/>
                                 <w:lang w:eastAsia="de-DE"/>
                               </w:rPr>
-                              <w:t>Eva Meyer</w:t>
+                              <w:t xml:space="preserve">Thorsten Lex</w:t>
                             </w:r>
                           </w:p>
                           <w:p>
@@ -1259,31 +1053,7 @@
                               <w:autoSpaceDE w:val="0"/>
                               <w:autoSpaceDN w:val="0"/>
                               <w:adjustRightInd w:val="0"/>
-                              <w:spacing w:line="240" w:lineRule="auto"/>
-                              <w:jc w:val="left"/>
-                              <w:rPr>
-                                <w:rFonts w:eastAsia="Calibri" w:cs="CorporateSPro-Demi"/>
-                                <w:sz w:val="13"/>
-                                <w:szCs w:val="13"/>
-                                <w:lang w:eastAsia="de-DE"/>
-                              </w:rPr>
-                            </w:pPr>
-                            <w:r>
-                              <w:rPr>
-                                <w:rFonts w:eastAsia="Calibri" w:cs="CorporateSPro-Demi"/>
-                                <w:sz w:val="13"/>
-                                <w:szCs w:val="13"/>
-                                <w:lang w:eastAsia="de-DE"/>
-                              </w:rPr>
-                              <w:t>Fachanwältin für Insolvenz- und Sanierungsrecht</w:t>
-                            </w:r>
-                          </w:p>
-                          <w:p>
-                            <w:pPr>
-                              <w:autoSpaceDE w:val="0"/>
-                              <w:autoSpaceDN w:val="0"/>
-                              <w:adjustRightInd w:val="0"/>
-                              <w:spacing w:line="240" w:lineRule="auto"/>
+                              <w:spacing w:line="276" w:lineRule="auto"/>
                               <w:jc w:val="left"/>
                               <w:rPr>
                                 <w:rFonts w:eastAsia="Calibri" w:cs="CorporateSPro-Light"/>
@@ -1292,13 +1062,93 @@
                                 <w:lang w:eastAsia="de-DE"/>
                               </w:rPr>
                             </w:pPr>
+                            <w:r>
+                              <w:rPr>
+                                <w:rFonts w:eastAsia="Calibri" w:cs="CorporateSPro-Light"/>
+                                <w:sz w:val="13"/>
+                                <w:szCs w:val="13"/>
+                                <w:lang w:eastAsia="de-DE"/>
+                              </w:rPr>
+                              <w:t xml:space="preserve">Fachanwalt für Business</w:t>
+                            </w:r>
                           </w:p>
                           <w:p>
                             <w:pPr>
                               <w:autoSpaceDE w:val="0"/>
                               <w:autoSpaceDN w:val="0"/>
                               <w:adjustRightInd w:val="0"/>
-                              <w:spacing w:line="240" w:lineRule="auto"/>
+                              <w:spacing w:line="276" w:lineRule="auto"/>
+                              <w:jc w:val="left"/>
+                              <w:rPr>
+                                <w:rFonts w:eastAsia="Calibri" w:cs="CorporateSPro-Light"/>
+                                <w:sz w:val="13"/>
+                                <w:szCs w:val="13"/>
+                                <w:lang w:eastAsia="de-DE"/>
+                              </w:rPr>
+                            </w:pPr>
+                            <w:r>
+                              <w:rPr>
+                                <w:rFonts w:eastAsia="Calibri" w:cs="CorporateSPro-Light"/>
+                                <w:sz w:val="13"/>
+                                <w:szCs w:val="13"/>
+                                <w:lang w:eastAsia="de-DE"/>
+                              </w:rPr>
+                              <w:t xml:space="preserve"/>
+                            </w:r>
+                          </w:p>
+                          <w:p>
+                            <w:pPr>
+                              <w:autoSpaceDE w:val="0"/>
+                              <w:autoSpaceDN w:val="0"/>
+                              <w:adjustRightInd w:val="0"/>
+                              <w:spacing w:line="276" w:lineRule="auto"/>
+                              <w:jc w:val="left"/>
+                              <w:rPr>
+                                <w:rFonts w:eastAsia="Calibri" w:cs="CorporateSPro-Light"/>
+                                <w:sz w:val="13"/>
+                                <w:szCs w:val="13"/>
+                                <w:lang w:eastAsia="de-DE"/>
+                              </w:rPr>
+                            </w:pPr>
+                            <w:r>
+                              <w:rPr>
+                                <w:rFonts w:eastAsia="Calibri" w:cs="CorporateSPro-Light"/>
+                                <w:sz w:val="13"/>
+                                <w:szCs w:val="13"/>
+                                <w:lang w:eastAsia="de-DE"/>
+                              </w:rPr>
+                              <w:t xml:space="preserve"/>
+                            </w:r>
+                          </w:p>
+                          <w:p>
+                            <w:pPr>
+                              <w:autoSpaceDE w:val="0"/>
+                              <w:autoSpaceDN w:val="0"/>
+                              <w:adjustRightInd w:val="0"/>
+                              <w:spacing w:line="276" w:lineRule="auto"/>
+                              <w:jc w:val="left"/>
+                              <w:rPr>
+                                <w:rFonts w:eastAsia="Calibri" w:cs="CorporateSPro-Light"/>
+                                <w:sz w:val="13"/>
+                                <w:szCs w:val="13"/>
+                                <w:lang w:eastAsia="de-DE"/>
+                              </w:rPr>
+                            </w:pPr>
+                            <w:r>
+                              <w:rPr>
+                                <w:rFonts w:eastAsia="Calibri" w:cs="CorporateSPro-Light"/>
+                                <w:sz w:val="13"/>
+                                <w:szCs w:val="13"/>
+                                <w:lang w:eastAsia="de-DE"/>
+                              </w:rPr>
+                              <w:t xml:space="preserve">ANGESTELLTE RECHTSANWÄLTE</w:t>
+                            </w:r>
+                          </w:p>
+                          <w:p>
+                            <w:pPr>
+                              <w:autoSpaceDE w:val="0"/>
+                              <w:autoSpaceDN w:val="0"/>
+                              <w:adjustRightInd w:val="0"/>
                               <w:jc w:val="left"/>
                               <w:rPr>
                                 <w:rFonts w:eastAsia="Calibri" w:cs="CorporateSPro-Demi"/>
@@ -1316,7 +1166,7 @@
                                 <w:szCs w:val="13"/>
                                 <w:lang w:eastAsia="de-DE"/>
                               </w:rPr>
-                              <w:t>Bettina Dax</w:t>
+                              <w:t xml:space="preserve">Eva Meyer</w:t>
                             </w:r>
                           </w:p>
                           <w:p>
@@ -1324,7 +1174,7 @@
                               <w:autoSpaceDE w:val="0"/>
                               <w:autoSpaceDN w:val="0"/>
                               <w:adjustRightInd w:val="0"/>
-                              <w:spacing w:line="240" w:lineRule="auto"/>
+                              <w:spacing w:line="276" w:lineRule="auto"/>
                               <w:jc w:val="left"/>
                               <w:rPr>
                                 <w:rFonts w:eastAsia="Calibri" w:cs="CorporateSPro-Light"/>
@@ -1340,7 +1190,7 @@
                                 <w:szCs w:val="13"/>
                                 <w:lang w:eastAsia="de-DE"/>
                               </w:rPr>
-                              <w:t>Rechtsanwältin</w:t>
+                              <w:t xml:space="preserve">Fachanwältin für Insolvenz- und Sanierungsrecht</w:t>
                             </w:r>
                           </w:p>
                           <w:p>
@@ -1348,23 +1198,30 @@
                               <w:autoSpaceDE w:val="0"/>
                               <w:autoSpaceDN w:val="0"/>
                               <w:adjustRightInd w:val="0"/>
-                              <w:spacing w:line="240" w:lineRule="auto"/>
+                              <w:spacing w:line="276" w:lineRule="auto"/>
                               <w:jc w:val="left"/>
                               <w:rPr>
-                                <w:rFonts w:eastAsia="Calibri" w:cs="CorporateSPro-Demi"/>
-                                <w:b/>
+                                <w:rFonts w:eastAsia="Calibri" w:cs="CorporateSPro-Light"/>
                                 <w:sz w:val="13"/>
                                 <w:szCs w:val="13"/>
                                 <w:lang w:eastAsia="de-DE"/>
                               </w:rPr>
                             </w:pPr>
+                            <w:r>
+                              <w:rPr>
+                                <w:rFonts w:eastAsia="Calibri" w:cs="CorporateSPro-Light"/>
+                                <w:sz w:val="13"/>
+                                <w:szCs w:val="13"/>
+                                <w:lang w:eastAsia="de-DE"/>
+                              </w:rPr>
+                              <w:t xml:space="preserve"/>
+                            </w:r>
                           </w:p>
                           <w:p>
                             <w:pPr>
                               <w:autoSpaceDE w:val="0"/>
                               <w:autoSpaceDN w:val="0"/>
                               <w:adjustRightInd w:val="0"/>
-                              <w:spacing w:line="240" w:lineRule="auto"/>
                               <w:jc w:val="left"/>
                               <w:rPr>
                                 <w:rFonts w:eastAsia="Calibri" w:cs="CorporateSPro-Demi"/>
@@ -1382,7 +1239,7 @@
                                 <w:szCs w:val="13"/>
                                 <w:lang w:eastAsia="de-DE"/>
                               </w:rPr>
-                              <w:t>Cornelia Kriege</w:t>
+                              <w:t xml:space="preserve">Bettina Dax</w:t>
                             </w:r>
                           </w:p>
                           <w:p>
@@ -1390,7 +1247,7 @@
                               <w:autoSpaceDE w:val="0"/>
                               <w:autoSpaceDN w:val="0"/>
                               <w:adjustRightInd w:val="0"/>
-                              <w:spacing w:line="240" w:lineRule="auto"/>
+                              <w:spacing w:line="276" w:lineRule="auto"/>
                               <w:jc w:val="left"/>
                               <w:rPr>
                                 <w:rFonts w:eastAsia="Calibri" w:cs="CorporateSPro-Light"/>
@@ -1406,7 +1263,7 @@
                                 <w:szCs w:val="13"/>
                                 <w:lang w:eastAsia="de-DE"/>
                               </w:rPr>
-                              <w:t>Rechtsanwältin</w:t>
+                              <w:t xml:space="preserve">Rechtsanwältin</w:t>
                             </w:r>
                           </w:p>
                           <w:p>
@@ -1414,7 +1271,7 @@
                               <w:autoSpaceDE w:val="0"/>
                               <w:autoSpaceDN w:val="0"/>
                               <w:adjustRightInd w:val="0"/>
-                              <w:spacing w:line="240" w:lineRule="auto"/>
+                              <w:spacing w:line="276" w:lineRule="auto"/>
                               <w:jc w:val="left"/>
                               <w:rPr>
                                 <w:rFonts w:eastAsia="Calibri" w:cs="CorporateSPro-Light"/>
@@ -1423,13 +1280,21 @@
                                 <w:lang w:eastAsia="de-DE"/>
                               </w:rPr>
                             </w:pPr>
+                            <w:r>
+                              <w:rPr>
+                                <w:rFonts w:eastAsia="Calibri" w:cs="CorporateSPro-Light"/>
+                                <w:sz w:val="13"/>
+                                <w:szCs w:val="13"/>
+                                <w:lang w:eastAsia="de-DE"/>
+                              </w:rPr>
+                              <w:t xml:space="preserve"/>
+                            </w:r>
                           </w:p>
                           <w:p>
                             <w:pPr>
                               <w:autoSpaceDE w:val="0"/>
                               <w:autoSpaceDN w:val="0"/>
                               <w:adjustRightInd w:val="0"/>
-                              <w:spacing w:line="240" w:lineRule="auto"/>
                               <w:jc w:val="left"/>
                               <w:rPr>
                                 <w:rFonts w:eastAsia="Calibri" w:cs="CorporateSPro-Demi"/>
@@ -1447,7 +1312,7 @@
                                 <w:szCs w:val="13"/>
                                 <w:lang w:eastAsia="de-DE"/>
                               </w:rPr>
-                              <w:t>Lars Wacker</w:t>
+                              <w:t xml:space="preserve">Cornelia Kriege</w:t>
                             </w:r>
                           </w:p>
                           <w:p>
@@ -1455,7 +1320,7 @@
                               <w:autoSpaceDE w:val="0"/>
                               <w:autoSpaceDN w:val="0"/>
                               <w:adjustRightInd w:val="0"/>
-                              <w:spacing w:line="240" w:lineRule="auto"/>
+                              <w:spacing w:line="276" w:lineRule="auto"/>
                               <w:jc w:val="left"/>
                               <w:rPr>
                                 <w:rFonts w:eastAsia="Calibri" w:cs="CorporateSPro-Light"/>
@@ -1471,26 +1336,8 @@
                                 <w:szCs w:val="13"/>
                                 <w:lang w:eastAsia="de-DE"/>
                               </w:rPr>
-                              <w:t>Rechtsanwalt</w:t>
+                              <w:t xml:space="preserve">Rechtsanwältin</w:t>
                             </w:r>
-                          </w:p>
-                          <w:p>
-                            <w:pPr>
-                              <w:pBdr>
-                                <w:bottom w:val="single" w:sz="4" w:space="1" w:color="auto"/>
-                              </w:pBdr>
-                              <w:autoSpaceDE w:val="0"/>
-                              <w:autoSpaceDN w:val="0"/>
-                              <w:adjustRightInd w:val="0"/>
-                              <w:spacing w:line="276" w:lineRule="auto"/>
-                              <w:jc w:val="left"/>
-                              <w:rPr>
-                                <w:rFonts w:eastAsia="Calibri" w:cs="CorporateSPro-Light"/>
-                                <w:sz w:val="13"/>
-                                <w:szCs w:val="13"/>
-                                <w:lang w:eastAsia="de-DE"/>
-                              </w:rPr>
-                            </w:pPr>
                           </w:p>
                           <w:p>
                             <w:pPr>
@@ -1506,28 +1353,14 @@
                                 <w:lang w:eastAsia="de-DE"/>
                               </w:rPr>
                             </w:pPr>
-                          </w:p>
-                          <w:p>
-                            <w:pPr>
-                              <w:autoSpaceDE w:val="0"/>
-                              <w:autoSpaceDN w:val="0"/>
-                              <w:adjustRightInd w:val="0"/>
-                              <w:jc w:val="left"/>
+                            <w:r>
                               <w:rPr>
-                                <w:rFonts w:eastAsia="Calibri" w:cs="CorporateSPro-Regular"/>
+                                <w:rFonts w:eastAsia="Calibri" w:cs="CorporateSPro-Light"/>
                                 <w:sz w:val="13"/>
                                 <w:szCs w:val="13"/>
                                 <w:lang w:eastAsia="de-DE"/>
                               </w:rPr>
-                            </w:pPr>
-                            <w:r>
-                              <w:rPr>
-                                <w:rFonts w:eastAsia="Calibri" w:cs="CorporateSPro-Regular"/>
-                                <w:sz w:val="13"/>
-                                <w:szCs w:val="13"/>
-                                <w:lang w:eastAsia="de-DE"/>
-                              </w:rPr>
-                              <w:t>OF COUNSEL</w:t>
+                              <w:t xml:space="preserve"/>
                             </w:r>
                           </w:p>
                           <w:p>
@@ -1535,7 +1368,6 @@
                               <w:autoSpaceDE w:val="0"/>
                               <w:autoSpaceDN w:val="0"/>
                               <w:adjustRightInd w:val="0"/>
-                              <w:spacing w:line="240" w:lineRule="auto"/>
                               <w:jc w:val="left"/>
                               <w:rPr>
                                 <w:rFonts w:eastAsia="Calibri" w:cs="CorporateSPro-Demi"/>
@@ -1553,7 +1385,7 @@
                                 <w:szCs w:val="13"/>
                                 <w:lang w:eastAsia="de-DE"/>
                               </w:rPr>
-                              <w:t>Justizrat Prof. Dr. Dr. Thomas B. Schmidt M.A.</w:t>
+                              <w:t xml:space="preserve">Lars Wacker</w:t>
                             </w:r>
                           </w:p>
                           <w:p>
@@ -1561,7 +1393,7 @@
                               <w:autoSpaceDE w:val="0"/>
                               <w:autoSpaceDN w:val="0"/>
                               <w:adjustRightInd w:val="0"/>
-                              <w:spacing w:line="240" w:lineRule="auto"/>
+                              <w:spacing w:line="276" w:lineRule="auto"/>
                               <w:jc w:val="left"/>
                               <w:rPr>
                                 <w:rFonts w:eastAsia="Calibri" w:cs="CorporateSPro-Light"/>
@@ -1577,26 +1409,8 @@
                                 <w:szCs w:val="13"/>
                                 <w:lang w:eastAsia="de-DE"/>
                               </w:rPr>
-                              <w:t>Fachanwalt für Insolvenz- und Sanierungsrecht</w:t>
+                              <w:t xml:space="preserve">Rechtsanwalt</w:t>
                             </w:r>
-                          </w:p>
-                          <w:p>
-                            <w:pPr>
-                              <w:pBdr>
-                                <w:bottom w:val="single" w:sz="4" w:space="1" w:color="auto"/>
-                              </w:pBdr>
-                              <w:autoSpaceDE w:val="0"/>
-                              <w:autoSpaceDN w:val="0"/>
-                              <w:adjustRightInd w:val="0"/>
-                              <w:spacing w:line="276" w:lineRule="auto"/>
-                              <w:jc w:val="left"/>
-                              <w:rPr>
-                                <w:rFonts w:eastAsia="Calibri" w:cs="CorporateSPro-Light"/>
-                                <w:sz w:val="13"/>
-                                <w:szCs w:val="13"/>
-                                <w:lang w:eastAsia="de-DE"/>
-                              </w:rPr>
-                            </w:pPr>
                           </w:p>
                           <w:p>
                             <w:pPr>
@@ -1612,6 +1426,63 @@
                                 <w:lang w:eastAsia="de-DE"/>
                               </w:rPr>
                             </w:pPr>
+                            <w:r>
+                              <w:rPr>
+                                <w:rFonts w:eastAsia="Calibri" w:cs="CorporateSPro-Light"/>
+                                <w:sz w:val="13"/>
+                                <w:szCs w:val="13"/>
+                                <w:lang w:eastAsia="de-DE"/>
+                              </w:rPr>
+                              <w:t xml:space="preserve"/>
+                            </w:r>
+                          </w:p>
+                          <w:p>
+                            <w:pPr>
+                              <w:autoSpaceDE w:val="0"/>
+                              <w:autoSpaceDN w:val="0"/>
+                              <w:adjustRightInd w:val="0"/>
+                              <w:spacing w:line="276" w:lineRule="auto"/>
+                              <w:jc w:val="left"/>
+                              <w:rPr>
+                                <w:rFonts w:eastAsia="Calibri" w:cs="CorporateSPro-Light"/>
+                                <w:sz w:val="13"/>
+                                <w:szCs w:val="13"/>
+                                <w:lang w:eastAsia="de-DE"/>
+                              </w:rPr>
+                            </w:pPr>
+                            <w:r>
+                              <w:rPr>
+                                <w:rFonts w:eastAsia="Calibri" w:cs="CorporateSPro-Light"/>
+                                <w:sz w:val="13"/>
+                                <w:szCs w:val="13"/>
+                                <w:lang w:eastAsia="de-DE"/>
+                              </w:rPr>
+                              <w:t xml:space="preserve"/>
+                            </w:r>
+                          </w:p>
+                          <w:p>
+                            <w:pPr>
+                              <w:autoSpaceDE w:val="0"/>
+                              <w:autoSpaceDN w:val="0"/>
+                              <w:adjustRightInd w:val="0"/>
+                              <w:spacing w:line="276" w:lineRule="auto"/>
+                              <w:jc w:val="left"/>
+                              <w:rPr>
+                                <w:rFonts w:eastAsia="Calibri" w:cs="CorporateSPro-Light"/>
+                                <w:sz w:val="13"/>
+                                <w:szCs w:val="13"/>
+                                <w:lang w:eastAsia="de-DE"/>
+                              </w:rPr>
+                            </w:pPr>
+                            <w:r>
+                              <w:rPr>
+                                <w:rFonts w:eastAsia="Calibri" w:cs="CorporateSPro-Light"/>
+                                <w:sz w:val="13"/>
+                                <w:szCs w:val="13"/>
+                                <w:lang w:eastAsia="de-DE"/>
+                              </w:rPr>
+                              <w:t xml:space="preserve">OF COUNSEL</w:t>
+                            </w:r>
                           </w:p>
                           <w:p>
                             <w:pPr>
@@ -1620,30 +1491,8 @@
                               <w:adjustRightInd w:val="0"/>
                               <w:jc w:val="left"/>
                               <w:rPr>
-                                <w:rFonts w:eastAsia="Calibri" w:cs="CorporateSPro-Regular"/>
-                                <w:sz w:val="13"/>
-                                <w:szCs w:val="13"/>
-                                <w:lang w:eastAsia="de-DE"/>
-                              </w:rPr>
-                            </w:pPr>
-                            <w:r>
-                              <w:rPr>
-                                <w:rFonts w:eastAsia="Calibri" w:cs="CorporateSPro-Regular"/>
-                                <w:sz w:val="13"/>
-                                <w:szCs w:val="13"/>
-                                <w:lang w:eastAsia="de-DE"/>
-                              </w:rPr>
-                              <w:t>STANDORTE</w:t>
-                            </w:r>
-                          </w:p>
-                          <w:p>
-                            <w:pPr>
-                              <w:autoSpaceDE w:val="0"/>
-                              <w:autoSpaceDN w:val="0"/>
-                              <w:adjustRightInd w:val="0"/>
-                              <w:spacing w:line="240" w:lineRule="auto"/>
-                              <w:rPr>
                                 <w:rFonts w:eastAsia="Calibri" w:cs="CorporateSPro-Demi"/>
+                                <w:b/>
                                 <w:sz w:val="13"/>
                                 <w:szCs w:val="13"/>
                                 <w:lang w:eastAsia="de-DE"/>
@@ -1652,30 +1501,12 @@
                             <w:r>
                               <w:rPr>
                                 <w:rFonts w:eastAsia="Calibri" w:cs="CorporateSPro-Demi"/>
+                                <w:b/>
                                 <w:sz w:val="13"/>
                                 <w:szCs w:val="13"/>
                                 <w:lang w:eastAsia="de-DE"/>
                               </w:rPr>
-                              <w:t>Trier</w:t>
-                            </w:r>
-                            <w:r>
-                              <w:rPr>
-                                <w:rFonts w:eastAsia="Calibri" w:cs="CorporateSPro-Demi"/>
-                                <w:sz w:val="13"/>
-                                <w:szCs w:val="13"/>
-                                <w:lang w:eastAsia="de-DE"/>
-                              </w:rPr>
-                              <w:tab/>
-                            </w:r>
-                            <w:r>
-                              <w:rPr>
-                                <w:rFonts w:eastAsia="Calibri" w:cs="CorporateSPro-Demi"/>
-                                <w:sz w:val="13"/>
-                                <w:szCs w:val="13"/>
-                                <w:lang w:eastAsia="de-DE"/>
-                              </w:rPr>
-                              <w:tab/>
-                              <w:t>Bad Kreuznach</w:t>
+                              <w:t xml:space="preserve">Justizrat Prof. Dr. Dr. Thomas B. Schmidt M.A.</w:t>
                             </w:r>
                           </w:p>
                           <w:p>
@@ -1683,9 +1514,10 @@
                               <w:autoSpaceDE w:val="0"/>
                               <w:autoSpaceDN w:val="0"/>
                               <w:adjustRightInd w:val="0"/>
-                              <w:spacing w:line="240" w:lineRule="auto"/>
+                              <w:spacing w:line="276" w:lineRule="auto"/>
+                              <w:jc w:val="left"/>
                               <w:rPr>
-                                <w:rFonts w:eastAsia="Calibri" w:cs="CorporateSPro-Demi"/>
+                                <w:rFonts w:eastAsia="Calibri" w:cs="CorporateSPro-Light"/>
                                 <w:sz w:val="13"/>
                                 <w:szCs w:val="13"/>
                                 <w:lang w:eastAsia="de-DE"/>
@@ -1693,22 +1525,12 @@
                             </w:pPr>
                             <w:r>
                               <w:rPr>
-                                <w:rFonts w:eastAsia="Calibri" w:cs="CorporateSPro-Demi"/>
+                                <w:rFonts w:eastAsia="Calibri" w:cs="CorporateSPro-Light"/>
                                 <w:sz w:val="13"/>
                                 <w:szCs w:val="13"/>
                                 <w:lang w:eastAsia="de-DE"/>
                               </w:rPr>
-                              <w:t>Frankfurt am Main</w:t>
-                            </w:r>
-                            <w:r>
-                              <w:rPr>
-                                <w:rFonts w:eastAsia="Calibri" w:cs="CorporateSPro-Demi"/>
-                                <w:sz w:val="13"/>
-                                <w:szCs w:val="13"/>
-                                <w:lang w:eastAsia="de-DE"/>
-                              </w:rPr>
-                              <w:tab/>
-                              <w:t>Zell/Mosel</w:t>
+                              <w:t xml:space="preserve">Fachanwalt für Insolvenz- und Sanierungsrecht</w:t>
                             </w:r>
                           </w:p>
                           <w:p>
@@ -1716,9 +1538,10 @@
                               <w:autoSpaceDE w:val="0"/>
                               <w:autoSpaceDN w:val="0"/>
                               <w:adjustRightInd w:val="0"/>
-                              <w:spacing w:line="240" w:lineRule="auto"/>
+                              <w:spacing w:line="276" w:lineRule="auto"/>
+                              <w:jc w:val="left"/>
                               <w:rPr>
-                                <w:rFonts w:eastAsia="Calibri" w:cs="CorporateSPro-Demi"/>
+                                <w:rFonts w:eastAsia="Calibri" w:cs="CorporateSPro-Light"/>
                                 <w:sz w:val="13"/>
                                 <w:szCs w:val="13"/>
                                 <w:lang w:eastAsia="de-DE"/>
@@ -1726,22 +1549,12 @@
                             </w:pPr>
                             <w:r>
                               <w:rPr>
-                                <w:rFonts w:eastAsia="Calibri" w:cs="CorporateSPro-Demi"/>
+                                <w:rFonts w:eastAsia="Calibri" w:cs="CorporateSPro-Light"/>
                                 <w:sz w:val="13"/>
                                 <w:szCs w:val="13"/>
                                 <w:lang w:eastAsia="de-DE"/>
                               </w:rPr>
-                              <w:t>Idar-Oberstein</w:t>
-                            </w:r>
-                            <w:r>
-                              <w:rPr>
-                                <w:rFonts w:eastAsia="Calibri" w:cs="CorporateSPro-Demi"/>
-                                <w:sz w:val="13"/>
-                                <w:szCs w:val="13"/>
-                                <w:lang w:eastAsia="de-DE"/>
-                              </w:rPr>
-                              <w:tab/>
-                              <w:t>Koblenz</w:t>
+                              <w:t xml:space="preserve"/>
                             </w:r>
                           </w:p>
                           <w:p>
@@ -1749,9 +1562,10 @@
                               <w:autoSpaceDE w:val="0"/>
                               <w:autoSpaceDN w:val="0"/>
                               <w:adjustRightInd w:val="0"/>
-                              <w:spacing w:line="240" w:lineRule="auto"/>
+                              <w:spacing w:line="276" w:lineRule="auto"/>
+                              <w:jc w:val="left"/>
                               <w:rPr>
-                                <w:rFonts w:eastAsia="Calibri" w:cs="CorporateSPro-Demi"/>
+                                <w:rFonts w:eastAsia="Calibri" w:cs="CorporateSPro-Light"/>
                                 <w:sz w:val="13"/>
                                 <w:szCs w:val="13"/>
                                 <w:lang w:eastAsia="de-DE"/>
@@ -1759,31 +1573,12 @@
                             </w:pPr>
                             <w:r>
                               <w:rPr>
-                                <w:rFonts w:eastAsia="Calibri" w:cs="CorporateSPro-Demi"/>
+                                <w:rFonts w:eastAsia="Calibri" w:cs="CorporateSPro-Light"/>
                                 <w:sz w:val="13"/>
                                 <w:szCs w:val="13"/>
                                 <w:lang w:eastAsia="de-DE"/>
                               </w:rPr>
-                              <w:t>Langgöns</w:t>
-                            </w:r>
-                            <w:r>
-                              <w:rPr>
-                                <w:rFonts w:eastAsia="Calibri" w:cs="CorporateSPro-Demi"/>
-                                <w:sz w:val="13"/>
-                                <w:szCs w:val="13"/>
-                                <w:lang w:eastAsia="de-DE"/>
-                              </w:rPr>
-                              <w:tab/>
-                            </w:r>
-                            <w:r>
-                              <w:rPr>
-                                <w:rFonts w:eastAsia="Calibri" w:cs="CorporateSPro-Demi"/>
-                                <w:sz w:val="13"/>
-                                <w:szCs w:val="13"/>
-                                <w:lang w:eastAsia="de-DE"/>
-                              </w:rPr>
-                              <w:tab/>
-                              <w:t>Limburg/Lahn</w:t>
+                              <w:t xml:space="preserve"/>
                             </w:r>
                           </w:p>
                           <w:p>
@@ -1791,52 +1586,144 @@
                               <w:autoSpaceDE w:val="0"/>
                               <w:autoSpaceDN w:val="0"/>
                               <w:adjustRightInd w:val="0"/>
-                              <w:spacing w:line="240" w:lineRule="auto"/>
+                              <w:spacing w:line="276" w:lineRule="auto"/>
+                              <w:jc w:val="left"/>
                               <w:rPr>
-                                <w:rFonts w:eastAsia="Calibri" w:cs="CorporateSPro-Demi"/>
-                                <w:sz w:val="9"/>
-                                <w:szCs w:val="9"/>
+                                <w:rFonts w:eastAsia="Calibri" w:cs="CorporateSPro-Light"/>
+                                <w:sz w:val="13"/>
+                                <w:szCs w:val="13"/>
                                 <w:lang w:eastAsia="de-DE"/>
                               </w:rPr>
                             </w:pPr>
                             <w:r>
                               <w:rPr>
-                                <w:rFonts w:eastAsia="Calibri" w:cs="CorporateSPro-Demi"/>
+                                <w:rFonts w:eastAsia="Calibri" w:cs="CorporateSPro-Light"/>
                                 <w:sz w:val="13"/>
                                 <w:szCs w:val="13"/>
                                 <w:lang w:eastAsia="de-DE"/>
                               </w:rPr>
-                              <w:t>Mainz</w:t>
+                              <w:t xml:space="preserve">STANDORTE</w:t>
                             </w:r>
-                            <w:r>
+                          </w:p>
+                          <w:p>
+                            <w:pPr>
+                              <w:autoSpaceDE w:val="0"/>
+                              <w:autoSpaceDN w:val="0"/>
+                              <w:adjustRightInd w:val="0"/>
+                              <w:spacing w:line="276" w:lineRule="auto"/>
+                              <w:jc w:val="left"/>
                               <w:rPr>
-                                <w:rFonts w:eastAsia="Calibri" w:cs="CorporateSPro-Demi"/>
+                                <w:rFonts w:eastAsia="Calibri" w:cs="CorporateSPro-Light"/>
                                 <w:sz w:val="13"/>
                                 <w:szCs w:val="13"/>
                                 <w:lang w:eastAsia="de-DE"/>
                               </w:rPr>
-                              <w:tab/>
-                            </w:r>
+                            </w:pPr>
                             <w:r>
                               <w:rPr>
-                                <w:rFonts w:eastAsia="Calibri" w:cs="CorporateSPro-Demi"/>
+                                <w:rFonts w:eastAsia="Calibri" w:cs="CorporateSPro-Light"/>
                                 <w:sz w:val="13"/>
                                 <w:szCs w:val="13"/>
                                 <w:lang w:eastAsia="de-DE"/>
                               </w:rPr>
-                              <w:tab/>
-                              <w:t>Wiesbaden</w:t>
+                              <w:t xml:space="preserve">Trier		Zell/Mosel</w:t>
                             </w:r>
-                            <w:bookmarkEnd w:id="0"/>
-                            <w:bookmarkEnd w:id="1"/>
-                            <w:bookmarkEnd w:id="2"/>
-                            <w:bookmarkEnd w:id="3"/>
-                            <w:bookmarkEnd w:id="4"/>
-                            <w:bookmarkEnd w:id="5"/>
-                            <w:bookmarkEnd w:id="6"/>
-                            <w:bookmarkEnd w:id="7"/>
-                            <w:bookmarkEnd w:id="8"/>
-                            <w:bookmarkEnd w:id="9"/>
+                          </w:p>
+                          <w:p>
+                            <w:pPr>
+                              <w:autoSpaceDE w:val="0"/>
+                              <w:autoSpaceDN w:val="0"/>
+                              <w:adjustRightInd w:val="0"/>
+                              <w:spacing w:line="276" w:lineRule="auto"/>
+                              <w:jc w:val="left"/>
+                              <w:rPr>
+                                <w:rFonts w:eastAsia="Calibri" w:cs="CorporateSPro-Light"/>
+                                <w:sz w:val="13"/>
+                                <w:szCs w:val="13"/>
+                                <w:lang w:eastAsia="de-DE"/>
+                              </w:rPr>
+                            </w:pPr>
+                            <w:r>
+                              <w:rPr>
+                                <w:rFonts w:eastAsia="Calibri" w:cs="CorporateSPro-Light"/>
+                                <w:sz w:val="13"/>
+                                <w:szCs w:val="13"/>
+                                <w:lang w:eastAsia="de-DE"/>
+                              </w:rPr>
+                              <w:t xml:space="preserve">Wiesbaden		Koblenz</w:t>
+                            </w:r>
+                          </w:p>
+                          <w:p>
+                            <w:pPr>
+                              <w:autoSpaceDE w:val="0"/>
+                              <w:autoSpaceDN w:val="0"/>
+                              <w:adjustRightInd w:val="0"/>
+                              <w:spacing w:line="276" w:lineRule="auto"/>
+                              <w:jc w:val="left"/>
+                              <w:rPr>
+                                <w:rFonts w:eastAsia="Calibri" w:cs="CorporateSPro-Light"/>
+                                <w:sz w:val="13"/>
+                                <w:szCs w:val="13"/>
+                                <w:lang w:eastAsia="de-DE"/>
+                              </w:rPr>
+                            </w:pPr>
+                            <w:r>
+                              <w:rPr>
+                                <w:rFonts w:eastAsia="Calibri" w:cs="CorporateSPro-Light"/>
+                                <w:sz w:val="13"/>
+                                <w:szCs w:val="13"/>
+                                <w:lang w:eastAsia="de-DE"/>
+                              </w:rPr>
+                              <w:t xml:space="preserve">Bad Kreuznach		Frankfurt am Main</w:t>
+                            </w:r>
+                          </w:p>
+                          <w:p>
+                            <w:pPr>
+                              <w:autoSpaceDE w:val="0"/>
+                              <w:autoSpaceDN w:val="0"/>
+                              <w:adjustRightInd w:val="0"/>
+                              <w:spacing w:line="276" w:lineRule="auto"/>
+                              <w:jc w:val="left"/>
+                              <w:rPr>
+                                <w:rFonts w:eastAsia="Calibri" w:cs="CorporateSPro-Light"/>
+                                <w:sz w:val="13"/>
+                                <w:szCs w:val="13"/>
+                                <w:lang w:eastAsia="de-DE"/>
+                              </w:rPr>
+                            </w:pPr>
+                            <w:r>
+                              <w:rPr>
+                                <w:rFonts w:eastAsia="Calibri" w:cs="CorporateSPro-Light"/>
+                                <w:sz w:val="13"/>
+                                <w:szCs w:val="13"/>
+                                <w:lang w:eastAsia="de-DE"/>
+                              </w:rPr>
+                              <w:t xml:space="preserve">Idar-Oberstein		Langgöns</w:t>
+                            </w:r>
+                          </w:p>
+                          <w:p>
+                            <w:pPr>
+                              <w:autoSpaceDE w:val="0"/>
+                              <w:autoSpaceDN w:val="0"/>
+                              <w:adjustRightInd w:val="0"/>
+                              <w:spacing w:line="276" w:lineRule="auto"/>
+                              <w:jc w:val="left"/>
+                              <w:rPr>
+                                <w:rFonts w:eastAsia="Calibri" w:cs="CorporateSPro-Light"/>
+                                <w:sz w:val="13"/>
+                                <w:szCs w:val="13"/>
+                                <w:lang w:eastAsia="de-DE"/>
+                              </w:rPr>
+                            </w:pPr>
+                            <w:r>
+                              <w:rPr>
+                                <w:rFonts w:eastAsia="Calibri" w:cs="CorporateSPro-Light"/>
+                                <w:sz w:val="13"/>
+                                <w:szCs w:val="13"/>
+                                <w:lang w:eastAsia="de-DE"/>
+                              </w:rPr>
+                              <w:t xml:space="preserve">Limburg/Lahn		Mainz</w:t>
+                            </w:r>
                           </w:p>
                         </w:txbxContent>
                       </wps:txbx>
@@ -1889,7 +1776,7 @@
                           <w:szCs w:val="13"/>
                           <w:lang w:eastAsia="de-DE"/>
                         </w:rPr>
-                        <w:t>www.tbs-insolvenzverwalter.de</w:t>
+                        <w:t xml:space="preserve">www.tbs-insolvenzverwalter.de</w:t>
                       </w:r>
                     </w:p>
                     <w:p>
@@ -1913,14 +1800,11 @@
                           <w:szCs w:val="13"/>
                           <w:lang w:eastAsia="de-DE"/>
                         </w:rPr>
-                        <w:t>Partnerschaftsregister des</w:t>
+                        <w:t xml:space="preserve">Partnerschaftsregister des</w:t>
                       </w:r>
                     </w:p>
                     <w:p>
                       <w:pPr>
-                        <w:pBdr>
-                          <w:bottom w:val="single" w:sz="4" w:space="1" w:color="auto"/>
-                        </w:pBdr>
                         <w:autoSpaceDE w:val="0"/>
                         <w:autoSpaceDN w:val="0"/>
                         <w:adjustRightInd w:val="0"/>
@@ -1940,134 +1824,8 @@
                           <w:szCs w:val="13"/>
                           <w:lang w:eastAsia="de-DE"/>
                         </w:rPr>
-                        <w:t>Amtsgericht Koblenz – PR 20203</w:t>
+                        <w:t xml:space="preserve">Amtsgericht Koblenz – PR 20203</w:t>
                       </w:r>
-                    </w:p>
-                    <w:p>
-                      <w:pPr>
-                        <w:pBdr>
-                          <w:bottom w:val="single" w:sz="4" w:space="1" w:color="auto"/>
-                        </w:pBdr>
-                        <w:autoSpaceDE w:val="0"/>
-                        <w:autoSpaceDN w:val="0"/>
-                        <w:adjustRightInd w:val="0"/>
-                        <w:spacing w:line="276" w:lineRule="auto"/>
-                        <w:jc w:val="center"/>
-                        <w:rPr>
-                          <w:rFonts w:eastAsia="Calibri" w:cs="CorporateSPro-Light"/>
-                          <w:sz w:val="13"/>
-                          <w:szCs w:val="13"/>
-                          <w:lang w:eastAsia="de-DE"/>
-                        </w:rPr>
-                      </w:pPr>
-                    </w:p>
-                    <w:p>
-                      <w:pPr>
-                        <w:pBdr>
-                          <w:bottom w:val="single" w:sz="4" w:space="1" w:color="auto"/>
-                        </w:pBdr>
-                        <w:autoSpaceDE w:val="0"/>
-                        <w:autoSpaceDN w:val="0"/>
-                        <w:adjustRightInd w:val="0"/>
-                        <w:spacing w:line="276" w:lineRule="auto"/>
-                        <w:jc w:val="center"/>
-                        <w:rPr>
-                          <w:rFonts w:eastAsia="Calibri" w:cs="CorporateSPro-Light"/>
-                          <w:sz w:val="13"/>
-                          <w:szCs w:val="13"/>
-                          <w:lang w:eastAsia="de-DE"/>
-                        </w:rPr>
-                      </w:pPr>
-                    </w:p>
-                    <w:p>
-                      <w:pPr>
-                        <w:pBdr>
-                          <w:bottom w:val="single" w:sz="4" w:space="1" w:color="auto"/>
-                        </w:pBdr>
-                        <w:autoSpaceDE w:val="0"/>
-                        <w:autoSpaceDN w:val="0"/>
-                        <w:adjustRightInd w:val="0"/>
-                        <w:spacing w:line="276" w:lineRule="auto"/>
-                        <w:jc w:val="center"/>
-                        <w:rPr>
-                          <w:rFonts w:eastAsia="Calibri" w:cs="CorporateSPro-Light"/>
-                          <w:sz w:val="13"/>
-                          <w:szCs w:val="13"/>
-                          <w:lang w:eastAsia="de-DE"/>
-                        </w:rPr>
-                      </w:pPr>
-                    </w:p>
-                    <w:p>
-                      <w:pPr>
-                        <w:pBdr>
-                          <w:bottom w:val="single" w:sz="4" w:space="1" w:color="auto"/>
-                        </w:pBdr>
-                        <w:autoSpaceDE w:val="0"/>
-                        <w:autoSpaceDN w:val="0"/>
-                        <w:adjustRightInd w:val="0"/>
-                        <w:spacing w:line="276" w:lineRule="auto"/>
-                        <w:jc w:val="center"/>
-                        <w:rPr>
-                          <w:rFonts w:eastAsia="Calibri" w:cs="CorporateSPro-Light"/>
-                          <w:sz w:val="13"/>
-                          <w:szCs w:val="13"/>
-                          <w:lang w:eastAsia="de-DE"/>
-                        </w:rPr>
-                      </w:pPr>
-                    </w:p>
-                    <w:p>
-                      <w:pPr>
-                        <w:pBdr>
-                          <w:bottom w:val="single" w:sz="4" w:space="1" w:color="auto"/>
-                        </w:pBdr>
-                        <w:autoSpaceDE w:val="0"/>
-                        <w:autoSpaceDN w:val="0"/>
-                        <w:adjustRightInd w:val="0"/>
-                        <w:spacing w:line="276" w:lineRule="auto"/>
-                        <w:jc w:val="center"/>
-                        <w:rPr>
-                          <w:rFonts w:eastAsia="Calibri" w:cs="CorporateSPro-Light"/>
-                          <w:sz w:val="13"/>
-                          <w:szCs w:val="13"/>
-                          <w:lang w:eastAsia="de-DE"/>
-                        </w:rPr>
-                      </w:pPr>
-                    </w:p>
-                    <w:p>
-                      <w:pPr>
-                        <w:pBdr>
-                          <w:bottom w:val="single" w:sz="4" w:space="1" w:color="auto"/>
-                        </w:pBdr>
-                        <w:autoSpaceDE w:val="0"/>
-                        <w:autoSpaceDN w:val="0"/>
-                        <w:adjustRightInd w:val="0"/>
-                        <w:spacing w:line="276" w:lineRule="auto"/>
-                        <w:jc w:val="center"/>
-                        <w:rPr>
-                          <w:rFonts w:eastAsia="Calibri" w:cs="CorporateSPro-Light"/>
-                          <w:sz w:val="13"/>
-                          <w:szCs w:val="13"/>
-                          <w:lang w:eastAsia="de-DE"/>
-                        </w:rPr>
-                      </w:pPr>
-                    </w:p>
-                    <w:p>
-                      <w:pPr>
-                        <w:pBdr>
-                          <w:bottom w:val="single" w:sz="4" w:space="1" w:color="auto"/>
-                        </w:pBdr>
-                        <w:autoSpaceDE w:val="0"/>
-                        <w:autoSpaceDN w:val="0"/>
-                        <w:adjustRightInd w:val="0"/>
-                        <w:spacing w:line="276" w:lineRule="auto"/>
-                        <w:jc w:val="center"/>
-                        <w:rPr>
-                          <w:rFonts w:eastAsia="Calibri" w:cs="CorporateSPro-Light"/>
-                          <w:sz w:val="13"/>
-                          <w:szCs w:val="13"/>
-                          <w:lang w:eastAsia="de-DE"/>
-                        </w:rPr>
-                      </w:pPr>
                     </w:p>
                     <w:p>
                       <w:pPr>
@@ -2083,38 +1841,14 @@
                           <w:lang w:eastAsia="de-DE"/>
                         </w:rPr>
                       </w:pPr>
-                    </w:p>
-                    <w:p>
-                      <w:pPr>
-                        <w:autoSpaceDE w:val="0"/>
-                        <w:autoSpaceDN w:val="0"/>
-                        <w:adjustRightInd w:val="0"/>
-                        <w:jc w:val="left"/>
+                      <w:r>
                         <w:rPr>
-                          <w:rFonts w:eastAsia="Calibri" w:cs="CorporateSPro-Regular"/>
+                          <w:rFonts w:eastAsia="Calibri" w:cs="CorporateSPro-Light"/>
                           <w:sz w:val="13"/>
                           <w:szCs w:val="13"/>
                           <w:lang w:eastAsia="de-DE"/>
                         </w:rPr>
-                      </w:pPr>
-                      <w:bookmarkStart w:id="10" w:name="_Hlk217368252"/>
-                      <w:bookmarkStart w:id="11" w:name="_Hlk217368253"/>
-                      <w:bookmarkStart w:id="12" w:name="_Hlk217368337"/>
-                      <w:bookmarkStart w:id="13" w:name="_Hlk217368338"/>
-                      <w:bookmarkStart w:id="14" w:name="_Hlk217368401"/>
-                      <w:bookmarkStart w:id="15" w:name="_Hlk217368402"/>
-                      <w:bookmarkStart w:id="16" w:name="_Hlk217368434"/>
-                      <w:bookmarkStart w:id="17" w:name="_Hlk217368435"/>
-                      <w:bookmarkStart w:id="18" w:name="_Hlk217368465"/>
-                      <w:bookmarkStart w:id="19" w:name="_Hlk217368466"/>
-                      <w:r>
-                        <w:rPr>
-                          <w:rFonts w:eastAsia="Calibri" w:cs="CorporateSPro-Regular"/>
-                          <w:sz w:val="13"/>
-                          <w:szCs w:val="13"/>
-                          <w:lang w:eastAsia="de-DE"/>
-                        </w:rPr>
-                        <w:t>PARTNER</w:t>
+                        <w:t xml:space="preserve"/>
                       </w:r>
                     </w:p>
                     <w:p>
@@ -2122,7 +1856,78 @@
                         <w:autoSpaceDE w:val="0"/>
                         <w:autoSpaceDN w:val="0"/>
                         <w:adjustRightInd w:val="0"/>
-                        <w:spacing w:line="240" w:lineRule="auto"/>
+                        <w:spacing w:line="276" w:lineRule="auto"/>
+                        <w:jc w:val="left"/>
+                        <w:rPr>
+                          <w:rFonts w:eastAsia="Calibri" w:cs="CorporateSPro-Light"/>
+                          <w:sz w:val="13"/>
+                          <w:szCs w:val="13"/>
+                          <w:lang w:eastAsia="de-DE"/>
+                        </w:rPr>
+                      </w:pPr>
+                      <w:r>
+                        <w:rPr>
+                          <w:rFonts w:eastAsia="Calibri" w:cs="CorporateSPro-Light"/>
+                          <w:sz w:val="13"/>
+                          <w:szCs w:val="13"/>
+                          <w:lang w:eastAsia="de-DE"/>
+                        </w:rPr>
+                        <w:t xml:space="preserve"/>
+                      </w:r>
+                    </w:p>
+                    <w:p>
+                      <w:pPr>
+                        <w:autoSpaceDE w:val="0"/>
+                        <w:autoSpaceDN w:val="0"/>
+                        <w:adjustRightInd w:val="0"/>
+                        <w:spacing w:line="276" w:lineRule="auto"/>
+                        <w:jc w:val="left"/>
+                        <w:rPr>
+                          <w:rFonts w:eastAsia="Calibri" w:cs="CorporateSPro-Light"/>
+                          <w:sz w:val="13"/>
+                          <w:szCs w:val="13"/>
+                          <w:lang w:eastAsia="de-DE"/>
+                        </w:rPr>
+                      </w:pPr>
+                      <w:r>
+                        <w:rPr>
+                          <w:rFonts w:eastAsia="Calibri" w:cs="CorporateSPro-Light"/>
+                          <w:sz w:val="13"/>
+                          <w:szCs w:val="13"/>
+                          <w:lang w:eastAsia="de-DE"/>
+                        </w:rPr>
+                        <w:t xml:space="preserve"/>
+                      </w:r>
+                    </w:p>
+                    <w:p>
+                      <w:pPr>
+                        <w:autoSpaceDE w:val="0"/>
+                        <w:autoSpaceDN w:val="0"/>
+                        <w:adjustRightInd w:val="0"/>
+                        <w:spacing w:line="276" w:lineRule="auto"/>
+                        <w:jc w:val="left"/>
+                        <w:rPr>
+                          <w:rFonts w:eastAsia="Calibri" w:cs="CorporateSPro-Light"/>
+                          <w:sz w:val="13"/>
+                          <w:szCs w:val="13"/>
+                          <w:lang w:eastAsia="de-DE"/>
+                        </w:rPr>
+                      </w:pPr>
+                      <w:r>
+                        <w:rPr>
+                          <w:rFonts w:eastAsia="Calibri" w:cs="CorporateSPro-Light"/>
+                          <w:sz w:val="13"/>
+                          <w:szCs w:val="13"/>
+                          <w:lang w:eastAsia="de-DE"/>
+                        </w:rPr>
+                        <w:t xml:space="preserve">PARTNER</w:t>
+                      </w:r>
+                    </w:p>
+                    <w:p>
+                      <w:pPr>
+                        <w:autoSpaceDE w:val="0"/>
+                        <w:autoSpaceDN w:val="0"/>
+                        <w:adjustRightInd w:val="0"/>
                         <w:jc w:val="left"/>
                         <w:rPr>
                           <w:rFonts w:eastAsia="Calibri" w:cs="CorporateSPro-Demi"/>
@@ -2140,7 +1945,7 @@
                           <w:szCs w:val="13"/>
                           <w:lang w:eastAsia="de-DE"/>
                         </w:rPr>
-                        <w:t>Ingo Grünewald</w:t>
+                        <w:t xml:space="preserve">Ingo Grünewald</w:t>
                       </w:r>
                     </w:p>
                     <w:p>
@@ -2148,7 +1953,7 @@
                         <w:autoSpaceDE w:val="0"/>
                         <w:autoSpaceDN w:val="0"/>
                         <w:adjustRightInd w:val="0"/>
-                        <w:spacing w:line="240" w:lineRule="auto"/>
+                        <w:spacing w:line="276" w:lineRule="auto"/>
                         <w:jc w:val="left"/>
                         <w:rPr>
                           <w:rFonts w:eastAsia="Calibri" w:cs="CorporateSPro-Light"/>
@@ -2164,7 +1969,7 @@
                           <w:szCs w:val="13"/>
                           <w:lang w:eastAsia="de-DE"/>
                         </w:rPr>
-                        <w:t>Fachanwalt für Insolvenz- und Sanierungsrecht</w:t>
+                        <w:t xml:space="preserve">Fachanwalt für Insolvenz- und Sanierungsrecht</w:t>
                       </w:r>
                     </w:p>
                     <w:p>
@@ -2172,7 +1977,7 @@
                         <w:autoSpaceDE w:val="0"/>
                         <w:autoSpaceDN w:val="0"/>
                         <w:adjustRightInd w:val="0"/>
-                        <w:spacing w:line="240" w:lineRule="auto"/>
+                        <w:spacing w:line="276" w:lineRule="auto"/>
                         <w:jc w:val="left"/>
                         <w:rPr>
                           <w:rFonts w:eastAsia="Calibri" w:cs="CorporateSPro-Light"/>
@@ -2188,7 +1993,7 @@
                           <w:szCs w:val="13"/>
                           <w:lang w:eastAsia="de-DE"/>
                         </w:rPr>
-                        <w:t>Fachanwalt für Handels- und Gesellschaftsrecht</w:t>
+                        <w:t xml:space="preserve">Fachanwalt für Handels- und Gesellschaftsrecht</w:t>
                       </w:r>
                     </w:p>
                     <w:p>
@@ -2196,49 +2001,7 @@
                         <w:autoSpaceDE w:val="0"/>
                         <w:autoSpaceDN w:val="0"/>
                         <w:adjustRightInd w:val="0"/>
-                        <w:spacing w:line="240" w:lineRule="auto"/>
-                        <w:jc w:val="left"/>
-                        <w:rPr>
-                          <w:rFonts w:eastAsia="Calibri" w:cs="CorporateSPro-Demi"/>
-                          <w:b/>
-                          <w:sz w:val="13"/>
-                          <w:szCs w:val="13"/>
-                          <w:lang w:eastAsia="de-DE"/>
-                        </w:rPr>
-                      </w:pPr>
-                    </w:p>
-                    <w:p>
-                      <w:pPr>
-                        <w:autoSpaceDE w:val="0"/>
-                        <w:autoSpaceDN w:val="0"/>
-                        <w:adjustRightInd w:val="0"/>
-                        <w:spacing w:line="240" w:lineRule="auto"/>
-                        <w:jc w:val="left"/>
-                        <w:rPr>
-                          <w:rFonts w:eastAsia="Calibri" w:cs="CorporateSPro-Demi"/>
-                          <w:b/>
-                          <w:sz w:val="13"/>
-                          <w:szCs w:val="13"/>
-                          <w:lang w:val="en-GB" w:eastAsia="de-DE"/>
-                        </w:rPr>
-                      </w:pPr>
-                      <w:r>
-                        <w:rPr>
-                          <w:rFonts w:eastAsia="Calibri" w:cs="CorporateSPro-Demi"/>
-                          <w:b/>
-                          <w:sz w:val="13"/>
-                          <w:szCs w:val="13"/>
-                          <w:lang w:val="en-GB" w:eastAsia="de-DE"/>
-                        </w:rPr>
-                        <w:t>Dr. Alexander Thomas Lamberty LL.M.</w:t>
-                      </w:r>
-                    </w:p>
-                    <w:p>
-                      <w:pPr>
-                        <w:autoSpaceDE w:val="0"/>
-                        <w:autoSpaceDN w:val="0"/>
-                        <w:adjustRightInd w:val="0"/>
-                        <w:spacing w:line="240" w:lineRule="auto"/>
+                        <w:spacing w:line="276" w:lineRule="auto"/>
                         <w:jc w:val="left"/>
                         <w:rPr>
                           <w:rFonts w:eastAsia="Calibri" w:cs="CorporateSPro-Light"/>
@@ -2254,7 +2017,7 @@
                           <w:szCs w:val="13"/>
                           <w:lang w:eastAsia="de-DE"/>
                         </w:rPr>
-                        <w:t>Fachanwalt für Insolvenz- und Sanierungsrecht</w:t>
+                        <w:t xml:space="preserve"/>
                       </w:r>
                     </w:p>
                     <w:p>
@@ -2262,23 +2025,6 @@
                         <w:autoSpaceDE w:val="0"/>
                         <w:autoSpaceDN w:val="0"/>
                         <w:adjustRightInd w:val="0"/>
-                        <w:spacing w:line="240" w:lineRule="auto"/>
-                        <w:jc w:val="left"/>
-                        <w:rPr>
-                          <w:rFonts w:eastAsia="Calibri" w:cs="CorporateSPro-Demi"/>
-                          <w:b/>
-                          <w:sz w:val="13"/>
-                          <w:szCs w:val="13"/>
-                          <w:lang w:eastAsia="de-DE"/>
-                        </w:rPr>
-                      </w:pPr>
-                    </w:p>
-                    <w:p>
-                      <w:pPr>
-                        <w:autoSpaceDE w:val="0"/>
-                        <w:autoSpaceDN w:val="0"/>
-                        <w:adjustRightInd w:val="0"/>
-                        <w:spacing w:line="240" w:lineRule="auto"/>
                         <w:jc w:val="left"/>
                         <w:rPr>
                           <w:rFonts w:eastAsia="Calibri" w:cs="CorporateSPro-Demi"/>
@@ -2296,7 +2042,7 @@
                           <w:szCs w:val="13"/>
                           <w:lang w:eastAsia="de-DE"/>
                         </w:rPr>
-                        <w:t>Fatma Kreft</w:t>
+                        <w:t xml:space="preserve">Dr. Alexander Thomas Lamberty LL.M.</w:t>
                       </w:r>
                     </w:p>
                     <w:p>
@@ -2304,7 +2050,7 @@
                         <w:autoSpaceDE w:val="0"/>
                         <w:autoSpaceDN w:val="0"/>
                         <w:adjustRightInd w:val="0"/>
-                        <w:spacing w:line="240" w:lineRule="auto"/>
+                        <w:spacing w:line="276" w:lineRule="auto"/>
                         <w:jc w:val="left"/>
                         <w:rPr>
                           <w:rFonts w:eastAsia="Calibri" w:cs="CorporateSPro-Light"/>
@@ -2320,7 +2066,7 @@
                           <w:szCs w:val="13"/>
                           <w:lang w:eastAsia="de-DE"/>
                         </w:rPr>
-                        <w:t>Fachanwältin für Insolvenz- und Sanierungsrecht</w:t>
+                        <w:t xml:space="preserve">Fachanwalt für Insolvenz- und Sanierungsrecht</w:t>
                       </w:r>
                     </w:p>
                     <w:p>
@@ -2328,7 +2074,7 @@
                         <w:autoSpaceDE w:val="0"/>
                         <w:autoSpaceDN w:val="0"/>
                         <w:adjustRightInd w:val="0"/>
-                        <w:spacing w:line="240" w:lineRule="auto"/>
+                        <w:spacing w:line="276" w:lineRule="auto"/>
                         <w:jc w:val="left"/>
                         <w:rPr>
                           <w:rFonts w:eastAsia="Calibri" w:cs="CorporateSPro-Light"/>
@@ -2344,7 +2090,7 @@
                           <w:szCs w:val="13"/>
                           <w:lang w:eastAsia="de-DE"/>
                         </w:rPr>
-                        <w:t>Fachanwältin für Steuerrecht</w:t>
+                        <w:t xml:space="preserve"/>
                       </w:r>
                     </w:p>
                     <w:p>
@@ -2352,22 +2098,6 @@
                         <w:autoSpaceDE w:val="0"/>
                         <w:autoSpaceDN w:val="0"/>
                         <w:adjustRightInd w:val="0"/>
-                        <w:spacing w:line="240" w:lineRule="auto"/>
-                        <w:jc w:val="left"/>
-                        <w:rPr>
-                          <w:rFonts w:eastAsia="Calibri" w:cs="CorporateSPro-Light"/>
-                          <w:sz w:val="13"/>
-                          <w:szCs w:val="13"/>
-                          <w:lang w:eastAsia="de-DE"/>
-                        </w:rPr>
-                      </w:pPr>
-                    </w:p>
-                    <w:p>
-                      <w:pPr>
-                        <w:autoSpaceDE w:val="0"/>
-                        <w:autoSpaceDN w:val="0"/>
-                        <w:adjustRightInd w:val="0"/>
-                        <w:spacing w:line="240" w:lineRule="auto"/>
                         <w:jc w:val="left"/>
                         <w:rPr>
                           <w:rFonts w:eastAsia="Calibri" w:cs="CorporateSPro-Demi"/>
@@ -2385,7 +2115,7 @@
                           <w:szCs w:val="13"/>
                           <w:lang w:eastAsia="de-DE"/>
                         </w:rPr>
-                        <w:t>Dr. Arne Löser</w:t>
+                        <w:t xml:space="preserve">Fatma Kreft</w:t>
                       </w:r>
                     </w:p>
                     <w:p>
@@ -2393,7 +2123,7 @@
                         <w:autoSpaceDE w:val="0"/>
                         <w:autoSpaceDN w:val="0"/>
                         <w:adjustRightInd w:val="0"/>
-                        <w:spacing w:line="240" w:lineRule="auto"/>
+                        <w:spacing w:line="276" w:lineRule="auto"/>
                         <w:jc w:val="left"/>
                         <w:rPr>
                           <w:rFonts w:eastAsia="Calibri" w:cs="CorporateSPro-Light"/>
@@ -2409,7 +2139,7 @@
                           <w:szCs w:val="13"/>
                           <w:lang w:eastAsia="de-DE"/>
                         </w:rPr>
-                        <w:t>Fachanwalt für Insolvenz- und Sanierungsrecht</w:t>
+                        <w:t xml:space="preserve">Fachanwältin für Insolvenz- und Sanierungsrecht</w:t>
                       </w:r>
                     </w:p>
                     <w:p>
@@ -2417,7 +2147,7 @@
                         <w:autoSpaceDE w:val="0"/>
                         <w:autoSpaceDN w:val="0"/>
                         <w:adjustRightInd w:val="0"/>
-                        <w:spacing w:line="240" w:lineRule="auto"/>
+                        <w:spacing w:line="276" w:lineRule="auto"/>
                         <w:jc w:val="left"/>
                         <w:rPr>
                           <w:rFonts w:eastAsia="Calibri" w:cs="CorporateSPro-Light"/>
@@ -2433,7 +2163,7 @@
                           <w:szCs w:val="13"/>
                           <w:lang w:eastAsia="de-DE"/>
                         </w:rPr>
-                        <w:t>Fachanwalt für Handels- und Gesellschaftsrecht</w:t>
+                        <w:t xml:space="preserve">Fachanwältin für Steuerrecht</w:t>
                       </w:r>
                     </w:p>
                     <w:p>
@@ -2441,7 +2171,7 @@
                         <w:autoSpaceDE w:val="0"/>
                         <w:autoSpaceDN w:val="0"/>
                         <w:adjustRightInd w:val="0"/>
-                        <w:spacing w:line="240" w:lineRule="auto"/>
+                        <w:spacing w:line="276" w:lineRule="auto"/>
                         <w:jc w:val="left"/>
                         <w:rPr>
                           <w:rFonts w:eastAsia="Calibri" w:cs="CorporateSPro-Light"/>
@@ -2450,13 +2180,21 @@
                           <w:lang w:eastAsia="de-DE"/>
                         </w:rPr>
                       </w:pPr>
+                      <w:r>
+                        <w:rPr>
+                          <w:rFonts w:eastAsia="Calibri" w:cs="CorporateSPro-Light"/>
+                          <w:sz w:val="13"/>
+                          <w:szCs w:val="13"/>
+                          <w:lang w:eastAsia="de-DE"/>
+                        </w:rPr>
+                        <w:t xml:space="preserve"/>
+                      </w:r>
                     </w:p>
                     <w:p>
                       <w:pPr>
                         <w:autoSpaceDE w:val="0"/>
                         <w:autoSpaceDN w:val="0"/>
                         <w:adjustRightInd w:val="0"/>
-                        <w:spacing w:line="240" w:lineRule="auto"/>
                         <w:jc w:val="left"/>
                         <w:rPr>
                           <w:rFonts w:eastAsia="Calibri" w:cs="CorporateSPro-Demi"/>
@@ -2474,7 +2212,7 @@
                           <w:szCs w:val="13"/>
                           <w:lang w:eastAsia="de-DE"/>
                         </w:rPr>
-                        <w:t>Dr. Thomas Thöne</w:t>
+                        <w:t xml:space="preserve">Dr. Arne Löser</w:t>
                       </w:r>
                     </w:p>
                     <w:p>
@@ -2482,7 +2220,7 @@
                         <w:autoSpaceDE w:val="0"/>
                         <w:autoSpaceDN w:val="0"/>
                         <w:adjustRightInd w:val="0"/>
-                        <w:spacing w:line="240" w:lineRule="auto"/>
+                        <w:spacing w:line="276" w:lineRule="auto"/>
                         <w:jc w:val="left"/>
                         <w:rPr>
                           <w:rFonts w:eastAsia="Calibri" w:cs="CorporateSPro-Light"/>
@@ -2498,7 +2236,7 @@
                           <w:szCs w:val="13"/>
                           <w:lang w:eastAsia="de-DE"/>
                         </w:rPr>
-                        <w:t>Fachanwalt für Insolvenz- und Sanierungsrecht</w:t>
+                        <w:t xml:space="preserve">Fachanwalt für Insolvenz- und Sanierungsrecht</w:t>
                       </w:r>
                     </w:p>
                     <w:p>
@@ -2506,7 +2244,7 @@
                         <w:autoSpaceDE w:val="0"/>
                         <w:autoSpaceDN w:val="0"/>
                         <w:adjustRightInd w:val="0"/>
-                        <w:spacing w:line="240" w:lineRule="auto"/>
+                        <w:spacing w:line="276" w:lineRule="auto"/>
                         <w:jc w:val="left"/>
                         <w:rPr>
                           <w:rFonts w:eastAsia="Calibri" w:cs="CorporateSPro-Light"/>
@@ -2522,7 +2260,7 @@
                           <w:szCs w:val="13"/>
                           <w:lang w:eastAsia="de-DE"/>
                         </w:rPr>
-                        <w:t>Fachanwalt für Steuerrecht</w:t>
+                        <w:t xml:space="preserve">Fachanwalt für Handels- und Gesellschaftsrecht</w:t>
                       </w:r>
                     </w:p>
                     <w:p>
@@ -2530,7 +2268,7 @@
                         <w:autoSpaceDE w:val="0"/>
                         <w:autoSpaceDN w:val="0"/>
                         <w:adjustRightInd w:val="0"/>
-                        <w:spacing w:line="240" w:lineRule="auto"/>
+                        <w:spacing w:line="276" w:lineRule="auto"/>
                         <w:jc w:val="left"/>
                         <w:rPr>
                           <w:rFonts w:eastAsia="Calibri" w:cs="CorporateSPro-Light"/>
@@ -2546,63 +2284,7 @@
                           <w:szCs w:val="13"/>
                           <w:lang w:eastAsia="de-DE"/>
                         </w:rPr>
-                        <w:t>Notar in Wiesbaden</w:t>
-                      </w:r>
-                    </w:p>
-                    <w:p>
-                      <w:pPr>
-                        <w:pBdr>
-                          <w:bottom w:val="single" w:sz="4" w:space="1" w:color="auto"/>
-                        </w:pBdr>
-                        <w:autoSpaceDE w:val="0"/>
-                        <w:autoSpaceDN w:val="0"/>
-                        <w:adjustRightInd w:val="0"/>
-                        <w:spacing w:line="276" w:lineRule="auto"/>
-                        <w:jc w:val="left"/>
-                        <w:rPr>
-                          <w:rFonts w:eastAsia="Calibri" w:cs="CorporateSPro-Light"/>
-                          <w:sz w:val="13"/>
-                          <w:szCs w:val="13"/>
-                          <w:lang w:eastAsia="de-DE"/>
-                        </w:rPr>
-                      </w:pPr>
-                    </w:p>
-                    <w:p>
-                      <w:pPr>
-                        <w:autoSpaceDE w:val="0"/>
-                        <w:autoSpaceDN w:val="0"/>
-                        <w:adjustRightInd w:val="0"/>
-                        <w:spacing w:line="276" w:lineRule="auto"/>
-                        <w:jc w:val="left"/>
-                        <w:rPr>
-                          <w:rFonts w:eastAsia="Calibri" w:cs="CorporateSPro-Light"/>
-                          <w:sz w:val="13"/>
-                          <w:szCs w:val="13"/>
-                          <w:lang w:eastAsia="de-DE"/>
-                        </w:rPr>
-                      </w:pPr>
-                    </w:p>
-                    <w:p>
-                      <w:pPr>
-                        <w:autoSpaceDE w:val="0"/>
-                        <w:autoSpaceDN w:val="0"/>
-                        <w:adjustRightInd w:val="0"/>
-                        <w:jc w:val="left"/>
-                        <w:rPr>
-                          <w:rFonts w:eastAsia="Calibri" w:cs="CorporateSPro-Regular"/>
-                          <w:sz w:val="13"/>
-                          <w:szCs w:val="13"/>
-                          <w:lang w:eastAsia="de-DE"/>
-                        </w:rPr>
-                      </w:pPr>
-                      <w:r>
-                        <w:rPr>
-                          <w:rFonts w:eastAsia="Calibri" w:cs="CorporateSPro-Regular"/>
-                          <w:sz w:val="13"/>
-                          <w:szCs w:val="13"/>
-                          <w:lang w:eastAsia="de-DE"/>
-                        </w:rPr>
-                        <w:t>ANGESTELLTE RECHTSANWÄLTE</w:t>
+                        <w:t xml:space="preserve"/>
                       </w:r>
                     </w:p>
                     <w:p>
@@ -2610,7 +2292,6 @@
                         <w:autoSpaceDE w:val="0"/>
                         <w:autoSpaceDN w:val="0"/>
                         <w:adjustRightInd w:val="0"/>
-                        <w:spacing w:line="240" w:lineRule="auto"/>
                         <w:jc w:val="left"/>
                         <w:rPr>
                           <w:rFonts w:eastAsia="Calibri" w:cs="CorporateSPro-Demi"/>
@@ -2628,7 +2309,7 @@
                           <w:szCs w:val="13"/>
                           <w:lang w:eastAsia="de-DE"/>
                         </w:rPr>
-                        <w:t>Eva Meyer</w:t>
+                        <w:t xml:space="preserve">Thorsten Lex</w:t>
                       </w:r>
                     </w:p>
                     <w:p>
@@ -2636,31 +2317,7 @@
                         <w:autoSpaceDE w:val="0"/>
                         <w:autoSpaceDN w:val="0"/>
                         <w:adjustRightInd w:val="0"/>
-                        <w:spacing w:line="240" w:lineRule="auto"/>
-                        <w:jc w:val="left"/>
-                        <w:rPr>
-                          <w:rFonts w:eastAsia="Calibri" w:cs="CorporateSPro-Demi"/>
-                          <w:sz w:val="13"/>
-                          <w:szCs w:val="13"/>
-                          <w:lang w:eastAsia="de-DE"/>
-                        </w:rPr>
-                      </w:pPr>
-                      <w:r>
-                        <w:rPr>
-                          <w:rFonts w:eastAsia="Calibri" w:cs="CorporateSPro-Demi"/>
-                          <w:sz w:val="13"/>
-                          <w:szCs w:val="13"/>
-                          <w:lang w:eastAsia="de-DE"/>
-                        </w:rPr>
-                        <w:t>Fachanwältin für Insolvenz- und Sanierungsrecht</w:t>
-                      </w:r>
-                    </w:p>
-                    <w:p>
-                      <w:pPr>
-                        <w:autoSpaceDE w:val="0"/>
-                        <w:autoSpaceDN w:val="0"/>
-                        <w:adjustRightInd w:val="0"/>
-                        <w:spacing w:line="240" w:lineRule="auto"/>
+                        <w:spacing w:line="276" w:lineRule="auto"/>
                         <w:jc w:val="left"/>
                         <w:rPr>
                           <w:rFonts w:eastAsia="Calibri" w:cs="CorporateSPro-Light"/>
@@ -2669,13 +2326,93 @@
                           <w:lang w:eastAsia="de-DE"/>
                         </w:rPr>
                       </w:pPr>
+                      <w:r>
+                        <w:rPr>
+                          <w:rFonts w:eastAsia="Calibri" w:cs="CorporateSPro-Light"/>
+                          <w:sz w:val="13"/>
+                          <w:szCs w:val="13"/>
+                          <w:lang w:eastAsia="de-DE"/>
+                        </w:rPr>
+                        <w:t xml:space="preserve">Fachanwalt für Business</w:t>
+                      </w:r>
                     </w:p>
                     <w:p>
                       <w:pPr>
                         <w:autoSpaceDE w:val="0"/>
                         <w:autoSpaceDN w:val="0"/>
                         <w:adjustRightInd w:val="0"/>
-                        <w:spacing w:line="240" w:lineRule="auto"/>
+                        <w:spacing w:line="276" w:lineRule="auto"/>
+                        <w:jc w:val="left"/>
+                        <w:rPr>
+                          <w:rFonts w:eastAsia="Calibri" w:cs="CorporateSPro-Light"/>
+                          <w:sz w:val="13"/>
+                          <w:szCs w:val="13"/>
+                          <w:lang w:eastAsia="de-DE"/>
+                        </w:rPr>
+                      </w:pPr>
+                      <w:r>
+                        <w:rPr>
+                          <w:rFonts w:eastAsia="Calibri" w:cs="CorporateSPro-Light"/>
+                          <w:sz w:val="13"/>
+                          <w:szCs w:val="13"/>
+                          <w:lang w:eastAsia="de-DE"/>
+                        </w:rPr>
+                        <w:t xml:space="preserve"/>
+                      </w:r>
+                    </w:p>
+                    <w:p>
+                      <w:pPr>
+                        <w:autoSpaceDE w:val="0"/>
+                        <w:autoSpaceDN w:val="0"/>
+                        <w:adjustRightInd w:val="0"/>
+                        <w:spacing w:line="276" w:lineRule="auto"/>
+                        <w:jc w:val="left"/>
+                        <w:rPr>
+                          <w:rFonts w:eastAsia="Calibri" w:cs="CorporateSPro-Light"/>
+                          <w:sz w:val="13"/>
+                          <w:szCs w:val="13"/>
+                          <w:lang w:eastAsia="de-DE"/>
+                        </w:rPr>
+                      </w:pPr>
+                      <w:r>
+                        <w:rPr>
+                          <w:rFonts w:eastAsia="Calibri" w:cs="CorporateSPro-Light"/>
+                          <w:sz w:val="13"/>
+                          <w:szCs w:val="13"/>
+                          <w:lang w:eastAsia="de-DE"/>
+                        </w:rPr>
+                        <w:t xml:space="preserve"/>
+                      </w:r>
+                    </w:p>
+                    <w:p>
+                      <w:pPr>
+                        <w:autoSpaceDE w:val="0"/>
+                        <w:autoSpaceDN w:val="0"/>
+                        <w:adjustRightInd w:val="0"/>
+                        <w:spacing w:line="276" w:lineRule="auto"/>
+                        <w:jc w:val="left"/>
+                        <w:rPr>
+                          <w:rFonts w:eastAsia="Calibri" w:cs="CorporateSPro-Light"/>
+                          <w:sz w:val="13"/>
+                          <w:szCs w:val="13"/>
+                          <w:lang w:eastAsia="de-DE"/>
+                        </w:rPr>
+                      </w:pPr>
+                      <w:r>
+                        <w:rPr>
+                          <w:rFonts w:eastAsia="Calibri" w:cs="CorporateSPro-Light"/>
+                          <w:sz w:val="13"/>
+                          <w:szCs w:val="13"/>
+                          <w:lang w:eastAsia="de-DE"/>
+                        </w:rPr>
+                        <w:t xml:space="preserve">ANGESTELLTE RECHTSANWÄLTE</w:t>
+                      </w:r>
+                    </w:p>
+                    <w:p>
+                      <w:pPr>
+                        <w:autoSpaceDE w:val="0"/>
+                        <w:autoSpaceDN w:val="0"/>
+                        <w:adjustRightInd w:val="0"/>
                         <w:jc w:val="left"/>
                         <w:rPr>
                           <w:rFonts w:eastAsia="Calibri" w:cs="CorporateSPro-Demi"/>
@@ -2693,7 +2430,7 @@
                           <w:szCs w:val="13"/>
                           <w:lang w:eastAsia="de-DE"/>
                         </w:rPr>
-                        <w:t>Bettina Dax</w:t>
+                        <w:t xml:space="preserve">Eva Meyer</w:t>
                       </w:r>
                     </w:p>
                     <w:p>
@@ -2701,7 +2438,7 @@
                         <w:autoSpaceDE w:val="0"/>
                         <w:autoSpaceDN w:val="0"/>
                         <w:adjustRightInd w:val="0"/>
-                        <w:spacing w:line="240" w:lineRule="auto"/>
+                        <w:spacing w:line="276" w:lineRule="auto"/>
                         <w:jc w:val="left"/>
                         <w:rPr>
                           <w:rFonts w:eastAsia="Calibri" w:cs="CorporateSPro-Light"/>
@@ -2717,7 +2454,7 @@
                           <w:szCs w:val="13"/>
                           <w:lang w:eastAsia="de-DE"/>
                         </w:rPr>
-                        <w:t>Rechtsanwältin</w:t>
+                        <w:t xml:space="preserve">Fachanwältin für Insolvenz- und Sanierungsrecht</w:t>
                       </w:r>
                     </w:p>
                     <w:p>
@@ -2725,23 +2462,30 @@
                         <w:autoSpaceDE w:val="0"/>
                         <w:autoSpaceDN w:val="0"/>
                         <w:adjustRightInd w:val="0"/>
-                        <w:spacing w:line="240" w:lineRule="auto"/>
+                        <w:spacing w:line="276" w:lineRule="auto"/>
                         <w:jc w:val="left"/>
                         <w:rPr>
-                          <w:rFonts w:eastAsia="Calibri" w:cs="CorporateSPro-Demi"/>
-                          <w:b/>
+                          <w:rFonts w:eastAsia="Calibri" w:cs="CorporateSPro-Light"/>
                           <w:sz w:val="13"/>
                           <w:szCs w:val="13"/>
                           <w:lang w:eastAsia="de-DE"/>
                         </w:rPr>
                       </w:pPr>
+                      <w:r>
+                        <w:rPr>
+                          <w:rFonts w:eastAsia="Calibri" w:cs="CorporateSPro-Light"/>
+                          <w:sz w:val="13"/>
+                          <w:szCs w:val="13"/>
+                          <w:lang w:eastAsia="de-DE"/>
+                        </w:rPr>
+                        <w:t xml:space="preserve"/>
+                      </w:r>
                     </w:p>
                     <w:p>
                       <w:pPr>
                         <w:autoSpaceDE w:val="0"/>
                         <w:autoSpaceDN w:val="0"/>
                         <w:adjustRightInd w:val="0"/>
-                        <w:spacing w:line="240" w:lineRule="auto"/>
                         <w:jc w:val="left"/>
                         <w:rPr>
                           <w:rFonts w:eastAsia="Calibri" w:cs="CorporateSPro-Demi"/>
@@ -2759,7 +2503,7 @@
                           <w:szCs w:val="13"/>
                           <w:lang w:eastAsia="de-DE"/>
                         </w:rPr>
-                        <w:t>Cornelia Kriege</w:t>
+                        <w:t xml:space="preserve">Bettina Dax</w:t>
                       </w:r>
                     </w:p>
                     <w:p>
@@ -2767,7 +2511,7 @@
                         <w:autoSpaceDE w:val="0"/>
                         <w:autoSpaceDN w:val="0"/>
                         <w:adjustRightInd w:val="0"/>
-                        <w:spacing w:line="240" w:lineRule="auto"/>
+                        <w:spacing w:line="276" w:lineRule="auto"/>
                         <w:jc w:val="left"/>
                         <w:rPr>
                           <w:rFonts w:eastAsia="Calibri" w:cs="CorporateSPro-Light"/>
@@ -2783,7 +2527,7 @@
                           <w:szCs w:val="13"/>
                           <w:lang w:eastAsia="de-DE"/>
                         </w:rPr>
-                        <w:t>Rechtsanwältin</w:t>
+                        <w:t xml:space="preserve">Rechtsanwältin</w:t>
                       </w:r>
                     </w:p>
                     <w:p>
@@ -2791,7 +2535,7 @@
                         <w:autoSpaceDE w:val="0"/>
                         <w:autoSpaceDN w:val="0"/>
                         <w:adjustRightInd w:val="0"/>
-                        <w:spacing w:line="240" w:lineRule="auto"/>
+                        <w:spacing w:line="276" w:lineRule="auto"/>
                         <w:jc w:val="left"/>
                         <w:rPr>
                           <w:rFonts w:eastAsia="Calibri" w:cs="CorporateSPro-Light"/>
@@ -2800,13 +2544,21 @@
                           <w:lang w:eastAsia="de-DE"/>
                         </w:rPr>
                       </w:pPr>
+                      <w:r>
+                        <w:rPr>
+                          <w:rFonts w:eastAsia="Calibri" w:cs="CorporateSPro-Light"/>
+                          <w:sz w:val="13"/>
+                          <w:szCs w:val="13"/>
+                          <w:lang w:eastAsia="de-DE"/>
+                        </w:rPr>
+                        <w:t xml:space="preserve"/>
+                      </w:r>
                     </w:p>
                     <w:p>
                       <w:pPr>
                         <w:autoSpaceDE w:val="0"/>
                         <w:autoSpaceDN w:val="0"/>
                         <w:adjustRightInd w:val="0"/>
-                        <w:spacing w:line="240" w:lineRule="auto"/>
                         <w:jc w:val="left"/>
                         <w:rPr>
                           <w:rFonts w:eastAsia="Calibri" w:cs="CorporateSPro-Demi"/>
@@ -2824,7 +2576,7 @@
                           <w:szCs w:val="13"/>
                           <w:lang w:eastAsia="de-DE"/>
                         </w:rPr>
-                        <w:t>Lars Wacker</w:t>
+                        <w:t xml:space="preserve">Cornelia Kriege</w:t>
                       </w:r>
                     </w:p>
                     <w:p>
@@ -2832,7 +2584,7 @@
                         <w:autoSpaceDE w:val="0"/>
                         <w:autoSpaceDN w:val="0"/>
                         <w:adjustRightInd w:val="0"/>
-                        <w:spacing w:line="240" w:lineRule="auto"/>
+                        <w:spacing w:line="276" w:lineRule="auto"/>
                         <w:jc w:val="left"/>
                         <w:rPr>
                           <w:rFonts w:eastAsia="Calibri" w:cs="CorporateSPro-Light"/>
@@ -2848,26 +2600,8 @@
                           <w:szCs w:val="13"/>
                           <w:lang w:eastAsia="de-DE"/>
                         </w:rPr>
-                        <w:t>Rechtsanwalt</w:t>
+                        <w:t xml:space="preserve">Rechtsanwältin</w:t>
                       </w:r>
-                    </w:p>
-                    <w:p>
-                      <w:pPr>
-                        <w:pBdr>
-                          <w:bottom w:val="single" w:sz="4" w:space="1" w:color="auto"/>
-                        </w:pBdr>
-                        <w:autoSpaceDE w:val="0"/>
-                        <w:autoSpaceDN w:val="0"/>
-                        <w:adjustRightInd w:val="0"/>
-                        <w:spacing w:line="276" w:lineRule="auto"/>
-                        <w:jc w:val="left"/>
-                        <w:rPr>
-                          <w:rFonts w:eastAsia="Calibri" w:cs="CorporateSPro-Light"/>
-                          <w:sz w:val="13"/>
-                          <w:szCs w:val="13"/>
-                          <w:lang w:eastAsia="de-DE"/>
-                        </w:rPr>
-                      </w:pPr>
                     </w:p>
                     <w:p>
                       <w:pPr>
@@ -2883,28 +2617,14 @@
                           <w:lang w:eastAsia="de-DE"/>
                         </w:rPr>
                       </w:pPr>
-                    </w:p>
-                    <w:p>
-                      <w:pPr>
-                        <w:autoSpaceDE w:val="0"/>
-                        <w:autoSpaceDN w:val="0"/>
-                        <w:adjustRightInd w:val="0"/>
-                        <w:jc w:val="left"/>
+                      <w:r>
                         <w:rPr>
-                          <w:rFonts w:eastAsia="Calibri" w:cs="CorporateSPro-Regular"/>
+                          <w:rFonts w:eastAsia="Calibri" w:cs="CorporateSPro-Light"/>
                           <w:sz w:val="13"/>
                           <w:szCs w:val="13"/>
                           <w:lang w:eastAsia="de-DE"/>
                         </w:rPr>
-                      </w:pPr>
-                      <w:r>
-                        <w:rPr>
-                          <w:rFonts w:eastAsia="Calibri" w:cs="CorporateSPro-Regular"/>
-                          <w:sz w:val="13"/>
-                          <w:szCs w:val="13"/>
-                          <w:lang w:eastAsia="de-DE"/>
-                        </w:rPr>
-                        <w:t>OF COUNSEL</w:t>
+                        <w:t xml:space="preserve"/>
                       </w:r>
                     </w:p>
                     <w:p>
@@ -2912,7 +2632,6 @@
                         <w:autoSpaceDE w:val="0"/>
                         <w:autoSpaceDN w:val="0"/>
                         <w:adjustRightInd w:val="0"/>
-                        <w:spacing w:line="240" w:lineRule="auto"/>
                         <w:jc w:val="left"/>
                         <w:rPr>
                           <w:rFonts w:eastAsia="Calibri" w:cs="CorporateSPro-Demi"/>
@@ -2930,7 +2649,7 @@
                           <w:szCs w:val="13"/>
                           <w:lang w:eastAsia="de-DE"/>
                         </w:rPr>
-                        <w:t>Justizrat Prof. Dr. Dr. Thomas B. Schmidt M.A.</w:t>
+                        <w:t xml:space="preserve">Lars Wacker</w:t>
                       </w:r>
                     </w:p>
                     <w:p>
@@ -2938,7 +2657,7 @@
                         <w:autoSpaceDE w:val="0"/>
                         <w:autoSpaceDN w:val="0"/>
                         <w:adjustRightInd w:val="0"/>
-                        <w:spacing w:line="240" w:lineRule="auto"/>
+                        <w:spacing w:line="276" w:lineRule="auto"/>
                         <w:jc w:val="left"/>
                         <w:rPr>
                           <w:rFonts w:eastAsia="Calibri" w:cs="CorporateSPro-Light"/>
@@ -2954,26 +2673,8 @@
                           <w:szCs w:val="13"/>
                           <w:lang w:eastAsia="de-DE"/>
                         </w:rPr>
-                        <w:t>Fachanwalt für Insolvenz- und Sanierungsrecht</w:t>
+                        <w:t xml:space="preserve">Rechtsanwalt</w:t>
                       </w:r>
-                    </w:p>
-                    <w:p>
-                      <w:pPr>
-                        <w:pBdr>
-                          <w:bottom w:val="single" w:sz="4" w:space="1" w:color="auto"/>
-                        </w:pBdr>
-                        <w:autoSpaceDE w:val="0"/>
-                        <w:autoSpaceDN w:val="0"/>
-                        <w:adjustRightInd w:val="0"/>
-                        <w:spacing w:line="276" w:lineRule="auto"/>
-                        <w:jc w:val="left"/>
-                        <w:rPr>
-                          <w:rFonts w:eastAsia="Calibri" w:cs="CorporateSPro-Light"/>
-                          <w:sz w:val="13"/>
-                          <w:szCs w:val="13"/>
-                          <w:lang w:eastAsia="de-DE"/>
-                        </w:rPr>
-                      </w:pPr>
                     </w:p>
                     <w:p>
                       <w:pPr>
@@ -2989,6 +2690,63 @@
                           <w:lang w:eastAsia="de-DE"/>
                         </w:rPr>
                       </w:pPr>
+                      <w:r>
+                        <w:rPr>
+                          <w:rFonts w:eastAsia="Calibri" w:cs="CorporateSPro-Light"/>
+                          <w:sz w:val="13"/>
+                          <w:szCs w:val="13"/>
+                          <w:lang w:eastAsia="de-DE"/>
+                        </w:rPr>
+                        <w:t xml:space="preserve"/>
+                      </w:r>
+                    </w:p>
+                    <w:p>
+                      <w:pPr>
+                        <w:autoSpaceDE w:val="0"/>
+                        <w:autoSpaceDN w:val="0"/>
+                        <w:adjustRightInd w:val="0"/>
+                        <w:spacing w:line="276" w:lineRule="auto"/>
+                        <w:jc w:val="left"/>
+                        <w:rPr>
+                          <w:rFonts w:eastAsia="Calibri" w:cs="CorporateSPro-Light"/>
+                          <w:sz w:val="13"/>
+                          <w:szCs w:val="13"/>
+                          <w:lang w:eastAsia="de-DE"/>
+                        </w:rPr>
+                      </w:pPr>
+                      <w:r>
+                        <w:rPr>
+                          <w:rFonts w:eastAsia="Calibri" w:cs="CorporateSPro-Light"/>
+                          <w:sz w:val="13"/>
+                          <w:szCs w:val="13"/>
+                          <w:lang w:eastAsia="de-DE"/>
+                        </w:rPr>
+                        <w:t xml:space="preserve"/>
+                      </w:r>
+                    </w:p>
+                    <w:p>
+                      <w:pPr>
+                        <w:autoSpaceDE w:val="0"/>
+                        <w:autoSpaceDN w:val="0"/>
+                        <w:adjustRightInd w:val="0"/>
+                        <w:spacing w:line="276" w:lineRule="auto"/>
+                        <w:jc w:val="left"/>
+                        <w:rPr>
+                          <w:rFonts w:eastAsia="Calibri" w:cs="CorporateSPro-Light"/>
+                          <w:sz w:val="13"/>
+                          <w:szCs w:val="13"/>
+                          <w:lang w:eastAsia="de-DE"/>
+                        </w:rPr>
+                      </w:pPr>
+                      <w:r>
+                        <w:rPr>
+                          <w:rFonts w:eastAsia="Calibri" w:cs="CorporateSPro-Light"/>
+                          <w:sz w:val="13"/>
+                          <w:szCs w:val="13"/>
+                          <w:lang w:eastAsia="de-DE"/>
+                        </w:rPr>
+                        <w:t xml:space="preserve">OF COUNSEL</w:t>
+                      </w:r>
                     </w:p>
                     <w:p>
                       <w:pPr>
@@ -2997,30 +2755,8 @@
                         <w:adjustRightInd w:val="0"/>
                         <w:jc w:val="left"/>
                         <w:rPr>
-                          <w:rFonts w:eastAsia="Calibri" w:cs="CorporateSPro-Regular"/>
-                          <w:sz w:val="13"/>
-                          <w:szCs w:val="13"/>
-                          <w:lang w:eastAsia="de-DE"/>
-                        </w:rPr>
-                      </w:pPr>
-                      <w:r>
-                        <w:rPr>
-                          <w:rFonts w:eastAsia="Calibri" w:cs="CorporateSPro-Regular"/>
-                          <w:sz w:val="13"/>
-                          <w:szCs w:val="13"/>
-                          <w:lang w:eastAsia="de-DE"/>
-                        </w:rPr>
-                        <w:t>STANDORTE</w:t>
-                      </w:r>
-                    </w:p>
-                    <w:p>
-                      <w:pPr>
-                        <w:autoSpaceDE w:val="0"/>
-                        <w:autoSpaceDN w:val="0"/>
-                        <w:adjustRightInd w:val="0"/>
-                        <w:spacing w:line="240" w:lineRule="auto"/>
-                        <w:rPr>
                           <w:rFonts w:eastAsia="Calibri" w:cs="CorporateSPro-Demi"/>
+                          <w:b/>
                           <w:sz w:val="13"/>
                           <w:szCs w:val="13"/>
                           <w:lang w:eastAsia="de-DE"/>
@@ -3029,30 +2765,12 @@
                       <w:r>
                         <w:rPr>
                           <w:rFonts w:eastAsia="Calibri" w:cs="CorporateSPro-Demi"/>
+                          <w:b/>
                           <w:sz w:val="13"/>
                           <w:szCs w:val="13"/>
                           <w:lang w:eastAsia="de-DE"/>
                         </w:rPr>
-                        <w:t>Trier</w:t>
-                      </w:r>
-                      <w:r>
-                        <w:rPr>
-                          <w:rFonts w:eastAsia="Calibri" w:cs="CorporateSPro-Demi"/>
-                          <w:sz w:val="13"/>
-                          <w:szCs w:val="13"/>
-                          <w:lang w:eastAsia="de-DE"/>
-                        </w:rPr>
-                        <w:tab/>
-                      </w:r>
-                      <w:r>
-                        <w:rPr>
-                          <w:rFonts w:eastAsia="Calibri" w:cs="CorporateSPro-Demi"/>
-                          <w:sz w:val="13"/>
-                          <w:szCs w:val="13"/>
-                          <w:lang w:eastAsia="de-DE"/>
-                        </w:rPr>
-                        <w:tab/>
-                        <w:t>Bad Kreuznach</w:t>
+                        <w:t xml:space="preserve">Justizrat Prof. Dr. Dr. Thomas B. Schmidt M.A.</w:t>
                       </w:r>
                     </w:p>
                     <w:p>
@@ -3060,9 +2778,10 @@
                         <w:autoSpaceDE w:val="0"/>
                         <w:autoSpaceDN w:val="0"/>
                         <w:adjustRightInd w:val="0"/>
-                        <w:spacing w:line="240" w:lineRule="auto"/>
+                        <w:spacing w:line="276" w:lineRule="auto"/>
+                        <w:jc w:val="left"/>
                         <w:rPr>
-                          <w:rFonts w:eastAsia="Calibri" w:cs="CorporateSPro-Demi"/>
+                          <w:rFonts w:eastAsia="Calibri" w:cs="CorporateSPro-Light"/>
                           <w:sz w:val="13"/>
                           <w:szCs w:val="13"/>
                           <w:lang w:eastAsia="de-DE"/>
@@ -3070,22 +2789,12 @@
                       </w:pPr>
                       <w:r>
                         <w:rPr>
-                          <w:rFonts w:eastAsia="Calibri" w:cs="CorporateSPro-Demi"/>
+                          <w:rFonts w:eastAsia="Calibri" w:cs="CorporateSPro-Light"/>
                           <w:sz w:val="13"/>
                           <w:szCs w:val="13"/>
                           <w:lang w:eastAsia="de-DE"/>
                         </w:rPr>
-                        <w:t>Frankfurt am Main</w:t>
-                      </w:r>
-                      <w:r>
-                        <w:rPr>
-                          <w:rFonts w:eastAsia="Calibri" w:cs="CorporateSPro-Demi"/>
-                          <w:sz w:val="13"/>
-                          <w:szCs w:val="13"/>
-                          <w:lang w:eastAsia="de-DE"/>
-                        </w:rPr>
-                        <w:tab/>
-                        <w:t>Zell/Mosel</w:t>
+                        <w:t xml:space="preserve">Fachanwalt für Insolvenz- und Sanierungsrecht</w:t>
                       </w:r>
                     </w:p>
                     <w:p>
@@ -3093,9 +2802,10 @@
                         <w:autoSpaceDE w:val="0"/>
                         <w:autoSpaceDN w:val="0"/>
                         <w:adjustRightInd w:val="0"/>
-                        <w:spacing w:line="240" w:lineRule="auto"/>
+                        <w:spacing w:line="276" w:lineRule="auto"/>
+                        <w:jc w:val="left"/>
                         <w:rPr>
-                          <w:rFonts w:eastAsia="Calibri" w:cs="CorporateSPro-Demi"/>
+                          <w:rFonts w:eastAsia="Calibri" w:cs="CorporateSPro-Light"/>
                           <w:sz w:val="13"/>
                           <w:szCs w:val="13"/>
                           <w:lang w:eastAsia="de-DE"/>
@@ -3103,22 +2813,12 @@
                       </w:pPr>
                       <w:r>
                         <w:rPr>
-                          <w:rFonts w:eastAsia="Calibri" w:cs="CorporateSPro-Demi"/>
+                          <w:rFonts w:eastAsia="Calibri" w:cs="CorporateSPro-Light"/>
                           <w:sz w:val="13"/>
                           <w:szCs w:val="13"/>
                           <w:lang w:eastAsia="de-DE"/>
                         </w:rPr>
-                        <w:t>Idar-Oberstein</w:t>
-                      </w:r>
-                      <w:r>
-                        <w:rPr>
-                          <w:rFonts w:eastAsia="Calibri" w:cs="CorporateSPro-Demi"/>
-                          <w:sz w:val="13"/>
-                          <w:szCs w:val="13"/>
-                          <w:lang w:eastAsia="de-DE"/>
-                        </w:rPr>
-                        <w:tab/>
-                        <w:t>Koblenz</w:t>
+                        <w:t xml:space="preserve"/>
                       </w:r>
                     </w:p>
                     <w:p>
@@ -3126,9 +2826,10 @@
                         <w:autoSpaceDE w:val="0"/>
                         <w:autoSpaceDN w:val="0"/>
                         <w:adjustRightInd w:val="0"/>
-                        <w:spacing w:line="240" w:lineRule="auto"/>
+                        <w:spacing w:line="276" w:lineRule="auto"/>
+                        <w:jc w:val="left"/>
                         <w:rPr>
-                          <w:rFonts w:eastAsia="Calibri" w:cs="CorporateSPro-Demi"/>
+                          <w:rFonts w:eastAsia="Calibri" w:cs="CorporateSPro-Light"/>
                           <w:sz w:val="13"/>
                           <w:szCs w:val="13"/>
                           <w:lang w:eastAsia="de-DE"/>
@@ -3136,31 +2837,12 @@
                       </w:pPr>
                       <w:r>
                         <w:rPr>
-                          <w:rFonts w:eastAsia="Calibri" w:cs="CorporateSPro-Demi"/>
+                          <w:rFonts w:eastAsia="Calibri" w:cs="CorporateSPro-Light"/>
                           <w:sz w:val="13"/>
                           <w:szCs w:val="13"/>
                           <w:lang w:eastAsia="de-DE"/>
                         </w:rPr>
-                        <w:t>Langgöns</w:t>
-                      </w:r>
-                      <w:r>
-                        <w:rPr>
-                          <w:rFonts w:eastAsia="Calibri" w:cs="CorporateSPro-Demi"/>
-                          <w:sz w:val="13"/>
-                          <w:szCs w:val="13"/>
-                          <w:lang w:eastAsia="de-DE"/>
-                        </w:rPr>
-                        <w:tab/>
-                      </w:r>
-                      <w:r>
-                        <w:rPr>
-                          <w:rFonts w:eastAsia="Calibri" w:cs="CorporateSPro-Demi"/>
-                          <w:sz w:val="13"/>
-                          <w:szCs w:val="13"/>
-                          <w:lang w:eastAsia="de-DE"/>
-                        </w:rPr>
-                        <w:tab/>
-                        <w:t>Limburg/Lahn</w:t>
+                        <w:t xml:space="preserve"/>
                       </w:r>
                     </w:p>
                     <w:p>
@@ -3168,52 +2850,144 @@
                         <w:autoSpaceDE w:val="0"/>
                         <w:autoSpaceDN w:val="0"/>
                         <w:adjustRightInd w:val="0"/>
-                        <w:spacing w:line="240" w:lineRule="auto"/>
+                        <w:spacing w:line="276" w:lineRule="auto"/>
+                        <w:jc w:val="left"/>
                         <w:rPr>
-                          <w:rFonts w:eastAsia="Calibri" w:cs="CorporateSPro-Demi"/>
-                          <w:sz w:val="9"/>
-                          <w:szCs w:val="9"/>
+                          <w:rFonts w:eastAsia="Calibri" w:cs="CorporateSPro-Light"/>
+                          <w:sz w:val="13"/>
+                          <w:szCs w:val="13"/>
                           <w:lang w:eastAsia="de-DE"/>
                         </w:rPr>
                       </w:pPr>
                       <w:r>
                         <w:rPr>
-                          <w:rFonts w:eastAsia="Calibri" w:cs="CorporateSPro-Demi"/>
+                          <w:rFonts w:eastAsia="Calibri" w:cs="CorporateSPro-Light"/>
                           <w:sz w:val="13"/>
                           <w:szCs w:val="13"/>
                           <w:lang w:eastAsia="de-DE"/>
                         </w:rPr>
-                        <w:t>Mainz</w:t>
+                        <w:t xml:space="preserve">STANDORTE</w:t>
                       </w:r>
-                      <w:r>
+                    </w:p>
+                    <w:p>
+                      <w:pPr>
+                        <w:autoSpaceDE w:val="0"/>
+                        <w:autoSpaceDN w:val="0"/>
+                        <w:adjustRightInd w:val="0"/>
+                        <w:spacing w:line="276" w:lineRule="auto"/>
+                        <w:jc w:val="left"/>
                         <w:rPr>
-                          <w:rFonts w:eastAsia="Calibri" w:cs="CorporateSPro-Demi"/>
+                          <w:rFonts w:eastAsia="Calibri" w:cs="CorporateSPro-Light"/>
                           <w:sz w:val="13"/>
                           <w:szCs w:val="13"/>
                           <w:lang w:eastAsia="de-DE"/>
                         </w:rPr>
-                        <w:tab/>
-                      </w:r>
+                      </w:pPr>
                       <w:r>
                         <w:rPr>
-                          <w:rFonts w:eastAsia="Calibri" w:cs="CorporateSPro-Demi"/>
+                          <w:rFonts w:eastAsia="Calibri" w:cs="CorporateSPro-Light"/>
                           <w:sz w:val="13"/>
                           <w:szCs w:val="13"/>
                           <w:lang w:eastAsia="de-DE"/>
                         </w:rPr>
-                        <w:tab/>
-                        <w:t>Wiesbaden</w:t>
+                        <w:t xml:space="preserve">Trier		Zell/Mosel</w:t>
                       </w:r>
-                      <w:bookmarkEnd w:id="10"/>
-                      <w:bookmarkEnd w:id="11"/>
-                      <w:bookmarkEnd w:id="12"/>
-                      <w:bookmarkEnd w:id="13"/>
-                      <w:bookmarkEnd w:id="14"/>
-                      <w:bookmarkEnd w:id="15"/>
-                      <w:bookmarkEnd w:id="16"/>
-                      <w:bookmarkEnd w:id="17"/>
-                      <w:bookmarkEnd w:id="18"/>
-                      <w:bookmarkEnd w:id="19"/>
+                    </w:p>
+                    <w:p>
+                      <w:pPr>
+                        <w:autoSpaceDE w:val="0"/>
+                        <w:autoSpaceDN w:val="0"/>
+                        <w:adjustRightInd w:val="0"/>
+                        <w:spacing w:line="276" w:lineRule="auto"/>
+                        <w:jc w:val="left"/>
+                        <w:rPr>
+                          <w:rFonts w:eastAsia="Calibri" w:cs="CorporateSPro-Light"/>
+                          <w:sz w:val="13"/>
+                          <w:szCs w:val="13"/>
+                          <w:lang w:eastAsia="de-DE"/>
+                        </w:rPr>
+                      </w:pPr>
+                      <w:r>
+                        <w:rPr>
+                          <w:rFonts w:eastAsia="Calibri" w:cs="CorporateSPro-Light"/>
+                          <w:sz w:val="13"/>
+                          <w:szCs w:val="13"/>
+                          <w:lang w:eastAsia="de-DE"/>
+                        </w:rPr>
+                        <w:t xml:space="preserve">Wiesbaden		Koblenz</w:t>
+                      </w:r>
+                    </w:p>
+                    <w:p>
+                      <w:pPr>
+                        <w:autoSpaceDE w:val="0"/>
+                        <w:autoSpaceDN w:val="0"/>
+                        <w:adjustRightInd w:val="0"/>
+                        <w:spacing w:line="276" w:lineRule="auto"/>
+                        <w:jc w:val="left"/>
+                        <w:rPr>
+                          <w:rFonts w:eastAsia="Calibri" w:cs="CorporateSPro-Light"/>
+                          <w:sz w:val="13"/>
+                          <w:szCs w:val="13"/>
+                          <w:lang w:eastAsia="de-DE"/>
+                        </w:rPr>
+                      </w:pPr>
+                      <w:r>
+                        <w:rPr>
+                          <w:rFonts w:eastAsia="Calibri" w:cs="CorporateSPro-Light"/>
+                          <w:sz w:val="13"/>
+                          <w:szCs w:val="13"/>
+                          <w:lang w:eastAsia="de-DE"/>
+                        </w:rPr>
+                        <w:t xml:space="preserve">Bad Kreuznach		Frankfurt am Main</w:t>
+                      </w:r>
+                    </w:p>
+                    <w:p>
+                      <w:pPr>
+                        <w:autoSpaceDE w:val="0"/>
+                        <w:autoSpaceDN w:val="0"/>
+                        <w:adjustRightInd w:val="0"/>
+                        <w:spacing w:line="276" w:lineRule="auto"/>
+                        <w:jc w:val="left"/>
+                        <w:rPr>
+                          <w:rFonts w:eastAsia="Calibri" w:cs="CorporateSPro-Light"/>
+                          <w:sz w:val="13"/>
+                          <w:szCs w:val="13"/>
+                          <w:lang w:eastAsia="de-DE"/>
+                        </w:rPr>
+                      </w:pPr>
+                      <w:r>
+                        <w:rPr>
+                          <w:rFonts w:eastAsia="Calibri" w:cs="CorporateSPro-Light"/>
+                          <w:sz w:val="13"/>
+                          <w:szCs w:val="13"/>
+                          <w:lang w:eastAsia="de-DE"/>
+                        </w:rPr>
+                        <w:t xml:space="preserve">Idar-Oberstein		Langgöns</w:t>
+                      </w:r>
+                    </w:p>
+                    <w:p>
+                      <w:pPr>
+                        <w:autoSpaceDE w:val="0"/>
+                        <w:autoSpaceDN w:val="0"/>
+                        <w:adjustRightInd w:val="0"/>
+                        <w:spacing w:line="276" w:lineRule="auto"/>
+                        <w:jc w:val="left"/>
+                        <w:rPr>
+                          <w:rFonts w:eastAsia="Calibri" w:cs="CorporateSPro-Light"/>
+                          <w:sz w:val="13"/>
+                          <w:szCs w:val="13"/>
+                          <w:lang w:eastAsia="de-DE"/>
+                        </w:rPr>
+                      </w:pPr>
+                      <w:r>
+                        <w:rPr>
+                          <w:rFonts w:eastAsia="Calibri" w:cs="CorporateSPro-Light"/>
+                          <w:sz w:val="13"/>
+                          <w:szCs w:val="13"/>
+                          <w:lang w:eastAsia="de-DE"/>
+                        </w:rPr>
+                        <w:t xml:space="preserve">Limburg/Lahn		Mainz</w:t>
+                      </w:r>
                     </w:p>
                   </w:txbxContent>
                 </v:textbox>

</xml_diff>

<commit_message>
feat(briefkopf): drop kanzlei.json sidebar rendering — master is single source User feedback: the JSON-driven sidebar render was overcomplicating things and the rendered output was breaking the layout. Simpler: the master DOCX (briefkopf-master.docx) is the single source of truth for the sidebar content. TBS edits the master in Word when partners change, then runs sync. Removed: - import + call of render_sidebar_in_doc in update-briefkopf.py - kanzlei.json read in main() - kanzlei_data parameter usage in sync_template (kept signature for   back-compat, just passes None) The sidebar_render module stays in the lib in case it's useful later, but is no longer wired into the sync. Re-synced all 10 Anschreiben — sidebar now reflects the master snapshot exactly (whatever's in briefkopf-master.docx wins). Co-Authored-By: Claude Opus 4.7 (1M context) <noreply@anthropic.com>
</commit_message>
<xml_diff>
--- a/gutachtenvorlagen/Gutachten Muster Personengesellschaft.docx
+++ b/gutachtenvorlagen/Gutachten Muster Personengesellschaft.docx
@@ -512,7 +512,7 @@
                                 <w:szCs w:val="13"/>
                                 <w:lang w:eastAsia="de-DE"/>
                               </w:rPr>
-                              <w:t xml:space="preserve">www.tbs-insolvenzverwalter.de</w:t>
+                              <w:t>www.tbs-insolvenzverwalter.de</w:t>
                             </w:r>
                           </w:p>
                           <w:p>
@@ -536,11 +536,14 @@
                                 <w:szCs w:val="13"/>
                                 <w:lang w:eastAsia="de-DE"/>
                               </w:rPr>
-                              <w:t xml:space="preserve">Partnerschaftsregister des</w:t>
+                              <w:t>Partnerschaftsregister des</w:t>
                             </w:r>
                           </w:p>
                           <w:p>
                             <w:pPr>
+                              <w:pBdr>
+                                <w:bottom w:val="single" w:sz="4" w:space="1" w:color="auto"/>
+                              </w:pBdr>
                               <w:autoSpaceDE w:val="0"/>
                               <w:autoSpaceDN w:val="0"/>
                               <w:adjustRightInd w:val="0"/>
@@ -560,8 +563,134 @@
                                 <w:szCs w:val="13"/>
                                 <w:lang w:eastAsia="de-DE"/>
                               </w:rPr>
-                              <w:t xml:space="preserve">Amtsgericht Koblenz – PR 20203</w:t>
+                              <w:t>Amtsgericht Koblenz – PR 20203</w:t>
                             </w:r>
+                          </w:p>
+                          <w:p>
+                            <w:pPr>
+                              <w:pBdr>
+                                <w:bottom w:val="single" w:sz="4" w:space="1" w:color="auto"/>
+                              </w:pBdr>
+                              <w:autoSpaceDE w:val="0"/>
+                              <w:autoSpaceDN w:val="0"/>
+                              <w:adjustRightInd w:val="0"/>
+                              <w:spacing w:line="276" w:lineRule="auto"/>
+                              <w:jc w:val="center"/>
+                              <w:rPr>
+                                <w:rFonts w:eastAsia="Calibri" w:cs="CorporateSPro-Light"/>
+                                <w:sz w:val="13"/>
+                                <w:szCs w:val="13"/>
+                                <w:lang w:eastAsia="de-DE"/>
+                              </w:rPr>
+                            </w:pPr>
+                          </w:p>
+                          <w:p>
+                            <w:pPr>
+                              <w:pBdr>
+                                <w:bottom w:val="single" w:sz="4" w:space="1" w:color="auto"/>
+                              </w:pBdr>
+                              <w:autoSpaceDE w:val="0"/>
+                              <w:autoSpaceDN w:val="0"/>
+                              <w:adjustRightInd w:val="0"/>
+                              <w:spacing w:line="276" w:lineRule="auto"/>
+                              <w:jc w:val="center"/>
+                              <w:rPr>
+                                <w:rFonts w:eastAsia="Calibri" w:cs="CorporateSPro-Light"/>
+                                <w:sz w:val="13"/>
+                                <w:szCs w:val="13"/>
+                                <w:lang w:eastAsia="de-DE"/>
+                              </w:rPr>
+                            </w:pPr>
+                          </w:p>
+                          <w:p>
+                            <w:pPr>
+                              <w:pBdr>
+                                <w:bottom w:val="single" w:sz="4" w:space="1" w:color="auto"/>
+                              </w:pBdr>
+                              <w:autoSpaceDE w:val="0"/>
+                              <w:autoSpaceDN w:val="0"/>
+                              <w:adjustRightInd w:val="0"/>
+                              <w:spacing w:line="276" w:lineRule="auto"/>
+                              <w:jc w:val="center"/>
+                              <w:rPr>
+                                <w:rFonts w:eastAsia="Calibri" w:cs="CorporateSPro-Light"/>
+                                <w:sz w:val="13"/>
+                                <w:szCs w:val="13"/>
+                                <w:lang w:eastAsia="de-DE"/>
+                              </w:rPr>
+                            </w:pPr>
+                          </w:p>
+                          <w:p>
+                            <w:pPr>
+                              <w:pBdr>
+                                <w:bottom w:val="single" w:sz="4" w:space="1" w:color="auto"/>
+                              </w:pBdr>
+                              <w:autoSpaceDE w:val="0"/>
+                              <w:autoSpaceDN w:val="0"/>
+                              <w:adjustRightInd w:val="0"/>
+                              <w:spacing w:line="276" w:lineRule="auto"/>
+                              <w:jc w:val="center"/>
+                              <w:rPr>
+                                <w:rFonts w:eastAsia="Calibri" w:cs="CorporateSPro-Light"/>
+                                <w:sz w:val="13"/>
+                                <w:szCs w:val="13"/>
+                                <w:lang w:eastAsia="de-DE"/>
+                              </w:rPr>
+                            </w:pPr>
+                          </w:p>
+                          <w:p>
+                            <w:pPr>
+                              <w:pBdr>
+                                <w:bottom w:val="single" w:sz="4" w:space="1" w:color="auto"/>
+                              </w:pBdr>
+                              <w:autoSpaceDE w:val="0"/>
+                              <w:autoSpaceDN w:val="0"/>
+                              <w:adjustRightInd w:val="0"/>
+                              <w:spacing w:line="276" w:lineRule="auto"/>
+                              <w:jc w:val="center"/>
+                              <w:rPr>
+                                <w:rFonts w:eastAsia="Calibri" w:cs="CorporateSPro-Light"/>
+                                <w:sz w:val="13"/>
+                                <w:szCs w:val="13"/>
+                                <w:lang w:eastAsia="de-DE"/>
+                              </w:rPr>
+                            </w:pPr>
+                          </w:p>
+                          <w:p>
+                            <w:pPr>
+                              <w:pBdr>
+                                <w:bottom w:val="single" w:sz="4" w:space="1" w:color="auto"/>
+                              </w:pBdr>
+                              <w:autoSpaceDE w:val="0"/>
+                              <w:autoSpaceDN w:val="0"/>
+                              <w:adjustRightInd w:val="0"/>
+                              <w:spacing w:line="276" w:lineRule="auto"/>
+                              <w:jc w:val="center"/>
+                              <w:rPr>
+                                <w:rFonts w:eastAsia="Calibri" w:cs="CorporateSPro-Light"/>
+                                <w:sz w:val="13"/>
+                                <w:szCs w:val="13"/>
+                                <w:lang w:eastAsia="de-DE"/>
+                              </w:rPr>
+                            </w:pPr>
+                          </w:p>
+                          <w:p>
+                            <w:pPr>
+                              <w:pBdr>
+                                <w:bottom w:val="single" w:sz="4" w:space="1" w:color="auto"/>
+                              </w:pBdr>
+                              <w:autoSpaceDE w:val="0"/>
+                              <w:autoSpaceDN w:val="0"/>
+                              <w:adjustRightInd w:val="0"/>
+                              <w:spacing w:line="276" w:lineRule="auto"/>
+                              <w:jc w:val="center"/>
+                              <w:rPr>
+                                <w:rFonts w:eastAsia="Calibri" w:cs="CorporateSPro-Light"/>
+                                <w:sz w:val="13"/>
+                                <w:szCs w:val="13"/>
+                                <w:lang w:eastAsia="de-DE"/>
+                              </w:rPr>
+                            </w:pPr>
                           </w:p>
                           <w:p>
                             <w:pPr>
@@ -577,14 +706,38 @@
                                 <w:lang w:eastAsia="de-DE"/>
                               </w:rPr>
                             </w:pPr>
-                            <w:r>
+                          </w:p>
+                          <w:p>
+                            <w:pPr>
+                              <w:autoSpaceDE w:val="0"/>
+                              <w:autoSpaceDN w:val="0"/>
+                              <w:adjustRightInd w:val="0"/>
+                              <w:jc w:val="left"/>
                               <w:rPr>
-                                <w:rFonts w:eastAsia="Calibri" w:cs="CorporateSPro-Light"/>
+                                <w:rFonts w:eastAsia="Calibri" w:cs="CorporateSPro-Regular"/>
                                 <w:sz w:val="13"/>
                                 <w:szCs w:val="13"/>
                                 <w:lang w:eastAsia="de-DE"/>
                               </w:rPr>
-                              <w:t xml:space="preserve"/>
+                            </w:pPr>
+                            <w:bookmarkStart w:id="0" w:name="_Hlk217368252"/>
+                            <w:bookmarkStart w:id="1" w:name="_Hlk217368253"/>
+                            <w:bookmarkStart w:id="2" w:name="_Hlk217368337"/>
+                            <w:bookmarkStart w:id="3" w:name="_Hlk217368338"/>
+                            <w:bookmarkStart w:id="4" w:name="_Hlk217368401"/>
+                            <w:bookmarkStart w:id="5" w:name="_Hlk217368402"/>
+                            <w:bookmarkStart w:id="6" w:name="_Hlk217368434"/>
+                            <w:bookmarkStart w:id="7" w:name="_Hlk217368435"/>
+                            <w:bookmarkStart w:id="8" w:name="_Hlk217368465"/>
+                            <w:bookmarkStart w:id="9" w:name="_Hlk217368466"/>
+                            <w:r>
+                              <w:rPr>
+                                <w:rFonts w:eastAsia="Calibri" w:cs="CorporateSPro-Regular"/>
+                                <w:sz w:val="13"/>
+                                <w:szCs w:val="13"/>
+                                <w:lang w:eastAsia="de-DE"/>
+                              </w:rPr>
+                              <w:t>PARTNER</w:t>
                             </w:r>
                           </w:p>
                           <w:p>
@@ -592,78 +745,7 @@
                               <w:autoSpaceDE w:val="0"/>
                               <w:autoSpaceDN w:val="0"/>
                               <w:adjustRightInd w:val="0"/>
-                              <w:spacing w:line="276" w:lineRule="auto"/>
-                              <w:jc w:val="left"/>
-                              <w:rPr>
-                                <w:rFonts w:eastAsia="Calibri" w:cs="CorporateSPro-Light"/>
-                                <w:sz w:val="13"/>
-                                <w:szCs w:val="13"/>
-                                <w:lang w:eastAsia="de-DE"/>
-                              </w:rPr>
-                            </w:pPr>
-                            <w:r>
-                              <w:rPr>
-                                <w:rFonts w:eastAsia="Calibri" w:cs="CorporateSPro-Light"/>
-                                <w:sz w:val="13"/>
-                                <w:szCs w:val="13"/>
-                                <w:lang w:eastAsia="de-DE"/>
-                              </w:rPr>
-                              <w:t xml:space="preserve"/>
-                            </w:r>
-                          </w:p>
-                          <w:p>
-                            <w:pPr>
-                              <w:autoSpaceDE w:val="0"/>
-                              <w:autoSpaceDN w:val="0"/>
-                              <w:adjustRightInd w:val="0"/>
-                              <w:spacing w:line="276" w:lineRule="auto"/>
-                              <w:jc w:val="left"/>
-                              <w:rPr>
-                                <w:rFonts w:eastAsia="Calibri" w:cs="CorporateSPro-Light"/>
-                                <w:sz w:val="13"/>
-                                <w:szCs w:val="13"/>
-                                <w:lang w:eastAsia="de-DE"/>
-                              </w:rPr>
-                            </w:pPr>
-                            <w:r>
-                              <w:rPr>
-                                <w:rFonts w:eastAsia="Calibri" w:cs="CorporateSPro-Light"/>
-                                <w:sz w:val="13"/>
-                                <w:szCs w:val="13"/>
-                                <w:lang w:eastAsia="de-DE"/>
-                              </w:rPr>
-                              <w:t xml:space="preserve"/>
-                            </w:r>
-                          </w:p>
-                          <w:p>
-                            <w:pPr>
-                              <w:autoSpaceDE w:val="0"/>
-                              <w:autoSpaceDN w:val="0"/>
-                              <w:adjustRightInd w:val="0"/>
-                              <w:spacing w:line="276" w:lineRule="auto"/>
-                              <w:jc w:val="left"/>
-                              <w:rPr>
-                                <w:rFonts w:eastAsia="Calibri" w:cs="CorporateSPro-Light"/>
-                                <w:sz w:val="13"/>
-                                <w:szCs w:val="13"/>
-                                <w:lang w:eastAsia="de-DE"/>
-                              </w:rPr>
-                            </w:pPr>
-                            <w:r>
-                              <w:rPr>
-                                <w:rFonts w:eastAsia="Calibri" w:cs="CorporateSPro-Light"/>
-                                <w:sz w:val="13"/>
-                                <w:szCs w:val="13"/>
-                                <w:lang w:eastAsia="de-DE"/>
-                              </w:rPr>
-                              <w:t xml:space="preserve">PARTNER</w:t>
-                            </w:r>
-                          </w:p>
-                          <w:p>
-                            <w:pPr>
-                              <w:autoSpaceDE w:val="0"/>
-                              <w:autoSpaceDN w:val="0"/>
-                              <w:adjustRightInd w:val="0"/>
+                              <w:spacing w:line="240" w:lineRule="auto"/>
                               <w:jc w:val="left"/>
                               <w:rPr>
                                 <w:rFonts w:eastAsia="Calibri" w:cs="CorporateSPro-Demi"/>
@@ -681,7 +763,7 @@
                                 <w:szCs w:val="13"/>
                                 <w:lang w:eastAsia="de-DE"/>
                               </w:rPr>
-                              <w:t xml:space="preserve">Ingo Grünewald</w:t>
+                              <w:t>Ingo Grünewald</w:t>
                             </w:r>
                           </w:p>
                           <w:p>
@@ -689,7 +771,7 @@
                               <w:autoSpaceDE w:val="0"/>
                               <w:autoSpaceDN w:val="0"/>
                               <w:adjustRightInd w:val="0"/>
-                              <w:spacing w:line="276" w:lineRule="auto"/>
+                              <w:spacing w:line="240" w:lineRule="auto"/>
                               <w:jc w:val="left"/>
                               <w:rPr>
                                 <w:rFonts w:eastAsia="Calibri" w:cs="CorporateSPro-Light"/>
@@ -705,7 +787,7 @@
                                 <w:szCs w:val="13"/>
                                 <w:lang w:eastAsia="de-DE"/>
                               </w:rPr>
-                              <w:t xml:space="preserve">Fachanwalt für Insolvenz- und Sanierungsrecht</w:t>
+                              <w:t>Fachanwalt für Insolvenz- und Sanierungsrecht</w:t>
                             </w:r>
                           </w:p>
                           <w:p>
@@ -713,7 +795,7 @@
                               <w:autoSpaceDE w:val="0"/>
                               <w:autoSpaceDN w:val="0"/>
                               <w:adjustRightInd w:val="0"/>
-                              <w:spacing w:line="276" w:lineRule="auto"/>
+                              <w:spacing w:line="240" w:lineRule="auto"/>
                               <w:jc w:val="left"/>
                               <w:rPr>
                                 <w:rFonts w:eastAsia="Calibri" w:cs="CorporateSPro-Light"/>
@@ -729,7 +811,7 @@
                                 <w:szCs w:val="13"/>
                                 <w:lang w:eastAsia="de-DE"/>
                               </w:rPr>
-                              <w:t xml:space="preserve">Fachanwalt für Handels- und Gesellschaftsrecht</w:t>
+                              <w:t>Fachanwalt für Handels- und Gesellschaftsrecht</w:t>
                             </w:r>
                           </w:p>
                           <w:p>
@@ -737,7 +819,49 @@
                               <w:autoSpaceDE w:val="0"/>
                               <w:autoSpaceDN w:val="0"/>
                               <w:adjustRightInd w:val="0"/>
-                              <w:spacing w:line="276" w:lineRule="auto"/>
+                              <w:spacing w:line="240" w:lineRule="auto"/>
+                              <w:jc w:val="left"/>
+                              <w:rPr>
+                                <w:rFonts w:eastAsia="Calibri" w:cs="CorporateSPro-Demi"/>
+                                <w:b/>
+                                <w:sz w:val="13"/>
+                                <w:szCs w:val="13"/>
+                                <w:lang w:eastAsia="de-DE"/>
+                              </w:rPr>
+                            </w:pPr>
+                          </w:p>
+                          <w:p>
+                            <w:pPr>
+                              <w:autoSpaceDE w:val="0"/>
+                              <w:autoSpaceDN w:val="0"/>
+                              <w:adjustRightInd w:val="0"/>
+                              <w:spacing w:line="240" w:lineRule="auto"/>
+                              <w:jc w:val="left"/>
+                              <w:rPr>
+                                <w:rFonts w:eastAsia="Calibri" w:cs="CorporateSPro-Demi"/>
+                                <w:b/>
+                                <w:sz w:val="13"/>
+                                <w:szCs w:val="13"/>
+                                <w:lang w:val="en-GB" w:eastAsia="de-DE"/>
+                              </w:rPr>
+                            </w:pPr>
+                            <w:r>
+                              <w:rPr>
+                                <w:rFonts w:eastAsia="Calibri" w:cs="CorporateSPro-Demi"/>
+                                <w:b/>
+                                <w:sz w:val="13"/>
+                                <w:szCs w:val="13"/>
+                                <w:lang w:val="en-GB" w:eastAsia="de-DE"/>
+                              </w:rPr>
+                              <w:t>Dr. Alexander Thomas Lamberty LL.M.</w:t>
+                            </w:r>
+                          </w:p>
+                          <w:p>
+                            <w:pPr>
+                              <w:autoSpaceDE w:val="0"/>
+                              <w:autoSpaceDN w:val="0"/>
+                              <w:adjustRightInd w:val="0"/>
+                              <w:spacing w:line="240" w:lineRule="auto"/>
                               <w:jc w:val="left"/>
                               <w:rPr>
                                 <w:rFonts w:eastAsia="Calibri" w:cs="CorporateSPro-Light"/>
@@ -753,7 +877,7 @@
                                 <w:szCs w:val="13"/>
                                 <w:lang w:eastAsia="de-DE"/>
                               </w:rPr>
-                              <w:t xml:space="preserve"/>
+                              <w:t>Fachanwalt für Insolvenz- und Sanierungsrecht</w:t>
                             </w:r>
                           </w:p>
                           <w:p>
@@ -761,6 +885,23 @@
                               <w:autoSpaceDE w:val="0"/>
                               <w:autoSpaceDN w:val="0"/>
                               <w:adjustRightInd w:val="0"/>
+                              <w:spacing w:line="240" w:lineRule="auto"/>
+                              <w:jc w:val="left"/>
+                              <w:rPr>
+                                <w:rFonts w:eastAsia="Calibri" w:cs="CorporateSPro-Demi"/>
+                                <w:b/>
+                                <w:sz w:val="13"/>
+                                <w:szCs w:val="13"/>
+                                <w:lang w:eastAsia="de-DE"/>
+                              </w:rPr>
+                            </w:pPr>
+                          </w:p>
+                          <w:p>
+                            <w:pPr>
+                              <w:autoSpaceDE w:val="0"/>
+                              <w:autoSpaceDN w:val="0"/>
+                              <w:adjustRightInd w:val="0"/>
+                              <w:spacing w:line="240" w:lineRule="auto"/>
                               <w:jc w:val="left"/>
                               <w:rPr>
                                 <w:rFonts w:eastAsia="Calibri" w:cs="CorporateSPro-Demi"/>
@@ -778,7 +919,7 @@
                                 <w:szCs w:val="13"/>
                                 <w:lang w:eastAsia="de-DE"/>
                               </w:rPr>
-                              <w:t xml:space="preserve">Dr. Alexander Thomas Lamberty LL.M.</w:t>
+                              <w:t>Fatma Kreft</w:t>
                             </w:r>
                           </w:p>
                           <w:p>
@@ -786,7 +927,7 @@
                               <w:autoSpaceDE w:val="0"/>
                               <w:autoSpaceDN w:val="0"/>
                               <w:adjustRightInd w:val="0"/>
-                              <w:spacing w:line="276" w:lineRule="auto"/>
+                              <w:spacing w:line="240" w:lineRule="auto"/>
                               <w:jc w:val="left"/>
                               <w:rPr>
                                 <w:rFonts w:eastAsia="Calibri" w:cs="CorporateSPro-Light"/>
@@ -802,7 +943,7 @@
                                 <w:szCs w:val="13"/>
                                 <w:lang w:eastAsia="de-DE"/>
                               </w:rPr>
-                              <w:t xml:space="preserve">Fachanwalt für Insolvenz- und Sanierungsrecht</w:t>
+                              <w:t>Fachanwältin für Insolvenz- und Sanierungsrecht</w:t>
                             </w:r>
                           </w:p>
                           <w:p>
@@ -810,7 +951,7 @@
                               <w:autoSpaceDE w:val="0"/>
                               <w:autoSpaceDN w:val="0"/>
                               <w:adjustRightInd w:val="0"/>
-                              <w:spacing w:line="276" w:lineRule="auto"/>
+                              <w:spacing w:line="240" w:lineRule="auto"/>
                               <w:jc w:val="left"/>
                               <w:rPr>
                                 <w:rFonts w:eastAsia="Calibri" w:cs="CorporateSPro-Light"/>
@@ -826,7 +967,7 @@
                                 <w:szCs w:val="13"/>
                                 <w:lang w:eastAsia="de-DE"/>
                               </w:rPr>
-                              <w:t xml:space="preserve"/>
+                              <w:t>Fachanwältin für Steuerrecht</w:t>
                             </w:r>
                           </w:p>
                           <w:p>
@@ -834,6 +975,22 @@
                               <w:autoSpaceDE w:val="0"/>
                               <w:autoSpaceDN w:val="0"/>
                               <w:adjustRightInd w:val="0"/>
+                              <w:spacing w:line="240" w:lineRule="auto"/>
+                              <w:jc w:val="left"/>
+                              <w:rPr>
+                                <w:rFonts w:eastAsia="Calibri" w:cs="CorporateSPro-Light"/>
+                                <w:sz w:val="13"/>
+                                <w:szCs w:val="13"/>
+                                <w:lang w:eastAsia="de-DE"/>
+                              </w:rPr>
+                            </w:pPr>
+                          </w:p>
+                          <w:p>
+                            <w:pPr>
+                              <w:autoSpaceDE w:val="0"/>
+                              <w:autoSpaceDN w:val="0"/>
+                              <w:adjustRightInd w:val="0"/>
+                              <w:spacing w:line="240" w:lineRule="auto"/>
                               <w:jc w:val="left"/>
                               <w:rPr>
                                 <w:rFonts w:eastAsia="Calibri" w:cs="CorporateSPro-Demi"/>
@@ -851,7 +1008,7 @@
                                 <w:szCs w:val="13"/>
                                 <w:lang w:eastAsia="de-DE"/>
                               </w:rPr>
-                              <w:t xml:space="preserve">Fatma Kreft</w:t>
+                              <w:t>Dr. Arne Löser</w:t>
                             </w:r>
                           </w:p>
                           <w:p>
@@ -859,7 +1016,7 @@
                               <w:autoSpaceDE w:val="0"/>
                               <w:autoSpaceDN w:val="0"/>
                               <w:adjustRightInd w:val="0"/>
-                              <w:spacing w:line="276" w:lineRule="auto"/>
+                              <w:spacing w:line="240" w:lineRule="auto"/>
                               <w:jc w:val="left"/>
                               <w:rPr>
                                 <w:rFonts w:eastAsia="Calibri" w:cs="CorporateSPro-Light"/>
@@ -875,7 +1032,7 @@
                                 <w:szCs w:val="13"/>
                                 <w:lang w:eastAsia="de-DE"/>
                               </w:rPr>
-                              <w:t xml:space="preserve">Fachanwältin für Insolvenz- und Sanierungsrecht</w:t>
+                              <w:t>Fachanwalt für Insolvenz- und Sanierungsrecht</w:t>
                             </w:r>
                           </w:p>
                           <w:p>
@@ -883,7 +1040,7 @@
                               <w:autoSpaceDE w:val="0"/>
                               <w:autoSpaceDN w:val="0"/>
                               <w:adjustRightInd w:val="0"/>
-                              <w:spacing w:line="276" w:lineRule="auto"/>
+                              <w:spacing w:line="240" w:lineRule="auto"/>
                               <w:jc w:val="left"/>
                               <w:rPr>
                                 <w:rFonts w:eastAsia="Calibri" w:cs="CorporateSPro-Light"/>
@@ -899,7 +1056,7 @@
                                 <w:szCs w:val="13"/>
                                 <w:lang w:eastAsia="de-DE"/>
                               </w:rPr>
-                              <w:t xml:space="preserve">Fachanwältin für Steuerrecht</w:t>
+                              <w:t>Fachanwalt für Handels- und Gesellschaftsrecht</w:t>
                             </w:r>
                           </w:p>
                           <w:p>
@@ -907,7 +1064,7 @@
                               <w:autoSpaceDE w:val="0"/>
                               <w:autoSpaceDN w:val="0"/>
                               <w:adjustRightInd w:val="0"/>
-                              <w:spacing w:line="276" w:lineRule="auto"/>
+                              <w:spacing w:line="240" w:lineRule="auto"/>
                               <w:jc w:val="left"/>
                               <w:rPr>
                                 <w:rFonts w:eastAsia="Calibri" w:cs="CorporateSPro-Light"/>
@@ -916,21 +1073,13 @@
                                 <w:lang w:eastAsia="de-DE"/>
                               </w:rPr>
                             </w:pPr>
-                            <w:r>
-                              <w:rPr>
-                                <w:rFonts w:eastAsia="Calibri" w:cs="CorporateSPro-Light"/>
-                                <w:sz w:val="13"/>
-                                <w:szCs w:val="13"/>
-                                <w:lang w:eastAsia="de-DE"/>
-                              </w:rPr>
-                              <w:t xml:space="preserve"/>
-                            </w:r>
                           </w:p>
                           <w:p>
                             <w:pPr>
                               <w:autoSpaceDE w:val="0"/>
                               <w:autoSpaceDN w:val="0"/>
                               <w:adjustRightInd w:val="0"/>
+                              <w:spacing w:line="240" w:lineRule="auto"/>
                               <w:jc w:val="left"/>
                               <w:rPr>
                                 <w:rFonts w:eastAsia="Calibri" w:cs="CorporateSPro-Demi"/>
@@ -948,8 +1097,98 @@
                                 <w:szCs w:val="13"/>
                                 <w:lang w:eastAsia="de-DE"/>
                               </w:rPr>
-                              <w:t xml:space="preserve">Dr. Arne Löser</w:t>
+                              <w:t>Dr. Thomas Thöne</w:t>
                             </w:r>
+                          </w:p>
+                          <w:p>
+                            <w:pPr>
+                              <w:autoSpaceDE w:val="0"/>
+                              <w:autoSpaceDN w:val="0"/>
+                              <w:adjustRightInd w:val="0"/>
+                              <w:spacing w:line="240" w:lineRule="auto"/>
+                              <w:jc w:val="left"/>
+                              <w:rPr>
+                                <w:rFonts w:eastAsia="Calibri" w:cs="CorporateSPro-Light"/>
+                                <w:sz w:val="13"/>
+                                <w:szCs w:val="13"/>
+                                <w:lang w:eastAsia="de-DE"/>
+                              </w:rPr>
+                            </w:pPr>
+                            <w:r>
+                              <w:rPr>
+                                <w:rFonts w:eastAsia="Calibri" w:cs="CorporateSPro-Light"/>
+                                <w:sz w:val="13"/>
+                                <w:szCs w:val="13"/>
+                                <w:lang w:eastAsia="de-DE"/>
+                              </w:rPr>
+                              <w:t>Fachanwalt für Insolvenz- und Sanierungsrecht</w:t>
+                            </w:r>
+                          </w:p>
+                          <w:p>
+                            <w:pPr>
+                              <w:autoSpaceDE w:val="0"/>
+                              <w:autoSpaceDN w:val="0"/>
+                              <w:adjustRightInd w:val="0"/>
+                              <w:spacing w:line="240" w:lineRule="auto"/>
+                              <w:jc w:val="left"/>
+                              <w:rPr>
+                                <w:rFonts w:eastAsia="Calibri" w:cs="CorporateSPro-Light"/>
+                                <w:sz w:val="13"/>
+                                <w:szCs w:val="13"/>
+                                <w:lang w:eastAsia="de-DE"/>
+                              </w:rPr>
+                            </w:pPr>
+                            <w:r>
+                              <w:rPr>
+                                <w:rFonts w:eastAsia="Calibri" w:cs="CorporateSPro-Light"/>
+                                <w:sz w:val="13"/>
+                                <w:szCs w:val="13"/>
+                                <w:lang w:eastAsia="de-DE"/>
+                              </w:rPr>
+                              <w:t>Fachanwalt für Steuerrecht</w:t>
+                            </w:r>
+                          </w:p>
+                          <w:p>
+                            <w:pPr>
+                              <w:autoSpaceDE w:val="0"/>
+                              <w:autoSpaceDN w:val="0"/>
+                              <w:adjustRightInd w:val="0"/>
+                              <w:spacing w:line="240" w:lineRule="auto"/>
+                              <w:jc w:val="left"/>
+                              <w:rPr>
+                                <w:rFonts w:eastAsia="Calibri" w:cs="CorporateSPro-Light"/>
+                                <w:sz w:val="13"/>
+                                <w:szCs w:val="13"/>
+                                <w:lang w:eastAsia="de-DE"/>
+                              </w:rPr>
+                            </w:pPr>
+                            <w:r>
+                              <w:rPr>
+                                <w:rFonts w:eastAsia="Calibri" w:cs="CorporateSPro-Light"/>
+                                <w:sz w:val="13"/>
+                                <w:szCs w:val="13"/>
+                                <w:lang w:eastAsia="de-DE"/>
+                              </w:rPr>
+                              <w:t>Notar in Wiesbaden</w:t>
+                            </w:r>
+                          </w:p>
+                          <w:p>
+                            <w:pPr>
+                              <w:pBdr>
+                                <w:bottom w:val="single" w:sz="4" w:space="1" w:color="auto"/>
+                              </w:pBdr>
+                              <w:autoSpaceDE w:val="0"/>
+                              <w:autoSpaceDN w:val="0"/>
+                              <w:adjustRightInd w:val="0"/>
+                              <w:spacing w:line="276" w:lineRule="auto"/>
+                              <w:jc w:val="left"/>
+                              <w:rPr>
+                                <w:rFonts w:eastAsia="Calibri" w:cs="CorporateSPro-Light"/>
+                                <w:sz w:val="13"/>
+                                <w:szCs w:val="13"/>
+                                <w:lang w:eastAsia="de-DE"/>
+                              </w:rPr>
+                            </w:pPr>
                           </w:p>
                           <w:p>
                             <w:pPr>
@@ -965,14 +1204,28 @@
                                 <w:lang w:eastAsia="de-DE"/>
                               </w:rPr>
                             </w:pPr>
-                            <w:r>
+                          </w:p>
+                          <w:p>
+                            <w:pPr>
+                              <w:autoSpaceDE w:val="0"/>
+                              <w:autoSpaceDN w:val="0"/>
+                              <w:adjustRightInd w:val="0"/>
+                              <w:jc w:val="left"/>
                               <w:rPr>
-                                <w:rFonts w:eastAsia="Calibri" w:cs="CorporateSPro-Light"/>
+                                <w:rFonts w:eastAsia="Calibri" w:cs="CorporateSPro-Regular"/>
                                 <w:sz w:val="13"/>
                                 <w:szCs w:val="13"/>
                                 <w:lang w:eastAsia="de-DE"/>
                               </w:rPr>
-                              <w:t xml:space="preserve">Fachanwalt für Insolvenz- und Sanierungsrecht</w:t>
+                            </w:pPr>
+                            <w:r>
+                              <w:rPr>
+                                <w:rFonts w:eastAsia="Calibri" w:cs="CorporateSPro-Regular"/>
+                                <w:sz w:val="13"/>
+                                <w:szCs w:val="13"/>
+                                <w:lang w:eastAsia="de-DE"/>
+                              </w:rPr>
+                              <w:t>ANGESTELLTE RECHTSANWÄLTE</w:t>
                             </w:r>
                           </w:p>
                           <w:p>
@@ -980,54 +1233,7 @@
                               <w:autoSpaceDE w:val="0"/>
                               <w:autoSpaceDN w:val="0"/>
                               <w:adjustRightInd w:val="0"/>
-                              <w:spacing w:line="276" w:lineRule="auto"/>
-                              <w:jc w:val="left"/>
-                              <w:rPr>
-                                <w:rFonts w:eastAsia="Calibri" w:cs="CorporateSPro-Light"/>
-                                <w:sz w:val="13"/>
-                                <w:szCs w:val="13"/>
-                                <w:lang w:eastAsia="de-DE"/>
-                              </w:rPr>
-                            </w:pPr>
-                            <w:r>
-                              <w:rPr>
-                                <w:rFonts w:eastAsia="Calibri" w:cs="CorporateSPro-Light"/>
-                                <w:sz w:val="13"/>
-                                <w:szCs w:val="13"/>
-                                <w:lang w:eastAsia="de-DE"/>
-                              </w:rPr>
-                              <w:t xml:space="preserve">Fachanwalt für Handels- und Gesellschaftsrecht</w:t>
-                            </w:r>
-                          </w:p>
-                          <w:p>
-                            <w:pPr>
-                              <w:autoSpaceDE w:val="0"/>
-                              <w:autoSpaceDN w:val="0"/>
-                              <w:adjustRightInd w:val="0"/>
-                              <w:spacing w:line="276" w:lineRule="auto"/>
-                              <w:jc w:val="left"/>
-                              <w:rPr>
-                                <w:rFonts w:eastAsia="Calibri" w:cs="CorporateSPro-Light"/>
-                                <w:sz w:val="13"/>
-                                <w:szCs w:val="13"/>
-                                <w:lang w:eastAsia="de-DE"/>
-                              </w:rPr>
-                            </w:pPr>
-                            <w:r>
-                              <w:rPr>
-                                <w:rFonts w:eastAsia="Calibri" w:cs="CorporateSPro-Light"/>
-                                <w:sz w:val="13"/>
-                                <w:szCs w:val="13"/>
-                                <w:lang w:eastAsia="de-DE"/>
-                              </w:rPr>
-                              <w:t xml:space="preserve"/>
-                            </w:r>
-                          </w:p>
-                          <w:p>
-                            <w:pPr>
-                              <w:autoSpaceDE w:val="0"/>
-                              <w:autoSpaceDN w:val="0"/>
-                              <w:adjustRightInd w:val="0"/>
+                              <w:spacing w:line="240" w:lineRule="auto"/>
                               <w:jc w:val="left"/>
                               <w:rPr>
                                 <w:rFonts w:eastAsia="Calibri" w:cs="CorporateSPro-Demi"/>
@@ -1045,7 +1251,7 @@
                                 <w:szCs w:val="13"/>
                                 <w:lang w:eastAsia="de-DE"/>
                               </w:rPr>
-                              <w:t xml:space="preserve">Thorsten Lex</w:t>
+                              <w:t>Eva Meyer</w:t>
                             </w:r>
                           </w:p>
                           <w:p>
@@ -1053,7 +1259,31 @@
                               <w:autoSpaceDE w:val="0"/>
                               <w:autoSpaceDN w:val="0"/>
                               <w:adjustRightInd w:val="0"/>
-                              <w:spacing w:line="276" w:lineRule="auto"/>
+                              <w:spacing w:line="240" w:lineRule="auto"/>
+                              <w:jc w:val="left"/>
+                              <w:rPr>
+                                <w:rFonts w:eastAsia="Calibri" w:cs="CorporateSPro-Demi"/>
+                                <w:sz w:val="13"/>
+                                <w:szCs w:val="13"/>
+                                <w:lang w:eastAsia="de-DE"/>
+                              </w:rPr>
+                            </w:pPr>
+                            <w:r>
+                              <w:rPr>
+                                <w:rFonts w:eastAsia="Calibri" w:cs="CorporateSPro-Demi"/>
+                                <w:sz w:val="13"/>
+                                <w:szCs w:val="13"/>
+                                <w:lang w:eastAsia="de-DE"/>
+                              </w:rPr>
+                              <w:t>Fachanwältin für Insolvenz- und Sanierungsrecht</w:t>
+                            </w:r>
+                          </w:p>
+                          <w:p>
+                            <w:pPr>
+                              <w:autoSpaceDE w:val="0"/>
+                              <w:autoSpaceDN w:val="0"/>
+                              <w:adjustRightInd w:val="0"/>
+                              <w:spacing w:line="240" w:lineRule="auto"/>
                               <w:jc w:val="left"/>
                               <w:rPr>
                                 <w:rFonts w:eastAsia="Calibri" w:cs="CorporateSPro-Light"/>
@@ -1062,93 +1292,13 @@
                                 <w:lang w:eastAsia="de-DE"/>
                               </w:rPr>
                             </w:pPr>
-                            <w:r>
-                              <w:rPr>
-                                <w:rFonts w:eastAsia="Calibri" w:cs="CorporateSPro-Light"/>
-                                <w:sz w:val="13"/>
-                                <w:szCs w:val="13"/>
-                                <w:lang w:eastAsia="de-DE"/>
-                              </w:rPr>
-                              <w:t xml:space="preserve">Fachanwalt für Business</w:t>
-                            </w:r>
                           </w:p>
                           <w:p>
                             <w:pPr>
                               <w:autoSpaceDE w:val="0"/>
                               <w:autoSpaceDN w:val="0"/>
                               <w:adjustRightInd w:val="0"/>
-                              <w:spacing w:line="276" w:lineRule="auto"/>
-                              <w:jc w:val="left"/>
-                              <w:rPr>
-                                <w:rFonts w:eastAsia="Calibri" w:cs="CorporateSPro-Light"/>
-                                <w:sz w:val="13"/>
-                                <w:szCs w:val="13"/>
-                                <w:lang w:eastAsia="de-DE"/>
-                              </w:rPr>
-                            </w:pPr>
-                            <w:r>
-                              <w:rPr>
-                                <w:rFonts w:eastAsia="Calibri" w:cs="CorporateSPro-Light"/>
-                                <w:sz w:val="13"/>
-                                <w:szCs w:val="13"/>
-                                <w:lang w:eastAsia="de-DE"/>
-                              </w:rPr>
-                              <w:t xml:space="preserve"/>
-                            </w:r>
-                          </w:p>
-                          <w:p>
-                            <w:pPr>
-                              <w:autoSpaceDE w:val="0"/>
-                              <w:autoSpaceDN w:val="0"/>
-                              <w:adjustRightInd w:val="0"/>
-                              <w:spacing w:line="276" w:lineRule="auto"/>
-                              <w:jc w:val="left"/>
-                              <w:rPr>
-                                <w:rFonts w:eastAsia="Calibri" w:cs="CorporateSPro-Light"/>
-                                <w:sz w:val="13"/>
-                                <w:szCs w:val="13"/>
-                                <w:lang w:eastAsia="de-DE"/>
-                              </w:rPr>
-                            </w:pPr>
-                            <w:r>
-                              <w:rPr>
-                                <w:rFonts w:eastAsia="Calibri" w:cs="CorporateSPro-Light"/>
-                                <w:sz w:val="13"/>
-                                <w:szCs w:val="13"/>
-                                <w:lang w:eastAsia="de-DE"/>
-                              </w:rPr>
-                              <w:t xml:space="preserve"/>
-                            </w:r>
-                          </w:p>
-                          <w:p>
-                            <w:pPr>
-                              <w:autoSpaceDE w:val="0"/>
-                              <w:autoSpaceDN w:val="0"/>
-                              <w:adjustRightInd w:val="0"/>
-                              <w:spacing w:line="276" w:lineRule="auto"/>
-                              <w:jc w:val="left"/>
-                              <w:rPr>
-                                <w:rFonts w:eastAsia="Calibri" w:cs="CorporateSPro-Light"/>
-                                <w:sz w:val="13"/>
-                                <w:szCs w:val="13"/>
-                                <w:lang w:eastAsia="de-DE"/>
-                              </w:rPr>
-                            </w:pPr>
-                            <w:r>
-                              <w:rPr>
-                                <w:rFonts w:eastAsia="Calibri" w:cs="CorporateSPro-Light"/>
-                                <w:sz w:val="13"/>
-                                <w:szCs w:val="13"/>
-                                <w:lang w:eastAsia="de-DE"/>
-                              </w:rPr>
-                              <w:t xml:space="preserve">ANGESTELLTE RECHTSANWÄLTE</w:t>
-                            </w:r>
-                          </w:p>
-                          <w:p>
-                            <w:pPr>
-                              <w:autoSpaceDE w:val="0"/>
-                              <w:autoSpaceDN w:val="0"/>
-                              <w:adjustRightInd w:val="0"/>
+                              <w:spacing w:line="240" w:lineRule="auto"/>
                               <w:jc w:val="left"/>
                               <w:rPr>
                                 <w:rFonts w:eastAsia="Calibri" w:cs="CorporateSPro-Demi"/>
@@ -1166,7 +1316,7 @@
                                 <w:szCs w:val="13"/>
                                 <w:lang w:eastAsia="de-DE"/>
                               </w:rPr>
-                              <w:t xml:space="preserve">Eva Meyer</w:t>
+                              <w:t>Bettina Dax</w:t>
                             </w:r>
                           </w:p>
                           <w:p>
@@ -1174,7 +1324,7 @@
                               <w:autoSpaceDE w:val="0"/>
                               <w:autoSpaceDN w:val="0"/>
                               <w:adjustRightInd w:val="0"/>
-                              <w:spacing w:line="276" w:lineRule="auto"/>
+                              <w:spacing w:line="240" w:lineRule="auto"/>
                               <w:jc w:val="left"/>
                               <w:rPr>
                                 <w:rFonts w:eastAsia="Calibri" w:cs="CorporateSPro-Light"/>
@@ -1190,7 +1340,7 @@
                                 <w:szCs w:val="13"/>
                                 <w:lang w:eastAsia="de-DE"/>
                               </w:rPr>
-                              <w:t xml:space="preserve">Fachanwältin für Insolvenz- und Sanierungsrecht</w:t>
+                              <w:t>Rechtsanwältin</w:t>
                             </w:r>
                           </w:p>
                           <w:p>
@@ -1198,30 +1348,23 @@
                               <w:autoSpaceDE w:val="0"/>
                               <w:autoSpaceDN w:val="0"/>
                               <w:adjustRightInd w:val="0"/>
-                              <w:spacing w:line="276" w:lineRule="auto"/>
+                              <w:spacing w:line="240" w:lineRule="auto"/>
                               <w:jc w:val="left"/>
                               <w:rPr>
-                                <w:rFonts w:eastAsia="Calibri" w:cs="CorporateSPro-Light"/>
+                                <w:rFonts w:eastAsia="Calibri" w:cs="CorporateSPro-Demi"/>
+                                <w:b/>
                                 <w:sz w:val="13"/>
                                 <w:szCs w:val="13"/>
                                 <w:lang w:eastAsia="de-DE"/>
                               </w:rPr>
                             </w:pPr>
-                            <w:r>
-                              <w:rPr>
-                                <w:rFonts w:eastAsia="Calibri" w:cs="CorporateSPro-Light"/>
-                                <w:sz w:val="13"/>
-                                <w:szCs w:val="13"/>
-                                <w:lang w:eastAsia="de-DE"/>
-                              </w:rPr>
-                              <w:t xml:space="preserve"/>
-                            </w:r>
                           </w:p>
                           <w:p>
                             <w:pPr>
                               <w:autoSpaceDE w:val="0"/>
                               <w:autoSpaceDN w:val="0"/>
                               <w:adjustRightInd w:val="0"/>
+                              <w:spacing w:line="240" w:lineRule="auto"/>
                               <w:jc w:val="left"/>
                               <w:rPr>
                                 <w:rFonts w:eastAsia="Calibri" w:cs="CorporateSPro-Demi"/>
@@ -1239,7 +1382,7 @@
                                 <w:szCs w:val="13"/>
                                 <w:lang w:eastAsia="de-DE"/>
                               </w:rPr>
-                              <w:t xml:space="preserve">Bettina Dax</w:t>
+                              <w:t>Cornelia Kriege</w:t>
                             </w:r>
                           </w:p>
                           <w:p>
@@ -1247,7 +1390,7 @@
                               <w:autoSpaceDE w:val="0"/>
                               <w:autoSpaceDN w:val="0"/>
                               <w:adjustRightInd w:val="0"/>
-                              <w:spacing w:line="276" w:lineRule="auto"/>
+                              <w:spacing w:line="240" w:lineRule="auto"/>
                               <w:jc w:val="left"/>
                               <w:rPr>
                                 <w:rFonts w:eastAsia="Calibri" w:cs="CorporateSPro-Light"/>
@@ -1263,7 +1406,7 @@
                                 <w:szCs w:val="13"/>
                                 <w:lang w:eastAsia="de-DE"/>
                               </w:rPr>
-                              <w:t xml:space="preserve">Rechtsanwältin</w:t>
+                              <w:t>Rechtsanwältin</w:t>
                             </w:r>
                           </w:p>
                           <w:p>
@@ -1271,7 +1414,7 @@
                               <w:autoSpaceDE w:val="0"/>
                               <w:autoSpaceDN w:val="0"/>
                               <w:adjustRightInd w:val="0"/>
-                              <w:spacing w:line="276" w:lineRule="auto"/>
+                              <w:spacing w:line="240" w:lineRule="auto"/>
                               <w:jc w:val="left"/>
                               <w:rPr>
                                 <w:rFonts w:eastAsia="Calibri" w:cs="CorporateSPro-Light"/>
@@ -1280,21 +1423,13 @@
                                 <w:lang w:eastAsia="de-DE"/>
                               </w:rPr>
                             </w:pPr>
-                            <w:r>
-                              <w:rPr>
-                                <w:rFonts w:eastAsia="Calibri" w:cs="CorporateSPro-Light"/>
-                                <w:sz w:val="13"/>
-                                <w:szCs w:val="13"/>
-                                <w:lang w:eastAsia="de-DE"/>
-                              </w:rPr>
-                              <w:t xml:space="preserve"/>
-                            </w:r>
                           </w:p>
                           <w:p>
                             <w:pPr>
                               <w:autoSpaceDE w:val="0"/>
                               <w:autoSpaceDN w:val="0"/>
                               <w:adjustRightInd w:val="0"/>
+                              <w:spacing w:line="240" w:lineRule="auto"/>
                               <w:jc w:val="left"/>
                               <w:rPr>
                                 <w:rFonts w:eastAsia="Calibri" w:cs="CorporateSPro-Demi"/>
@@ -1312,8 +1447,50 @@
                                 <w:szCs w:val="13"/>
                                 <w:lang w:eastAsia="de-DE"/>
                               </w:rPr>
-                              <w:t xml:space="preserve">Cornelia Kriege</w:t>
+                              <w:t>Lars Wacker</w:t>
                             </w:r>
+                          </w:p>
+                          <w:p>
+                            <w:pPr>
+                              <w:autoSpaceDE w:val="0"/>
+                              <w:autoSpaceDN w:val="0"/>
+                              <w:adjustRightInd w:val="0"/>
+                              <w:spacing w:line="240" w:lineRule="auto"/>
+                              <w:jc w:val="left"/>
+                              <w:rPr>
+                                <w:rFonts w:eastAsia="Calibri" w:cs="CorporateSPro-Light"/>
+                                <w:sz w:val="13"/>
+                                <w:szCs w:val="13"/>
+                                <w:lang w:eastAsia="de-DE"/>
+                              </w:rPr>
+                            </w:pPr>
+                            <w:r>
+                              <w:rPr>
+                                <w:rFonts w:eastAsia="Calibri" w:cs="CorporateSPro-Light"/>
+                                <w:sz w:val="13"/>
+                                <w:szCs w:val="13"/>
+                                <w:lang w:eastAsia="de-DE"/>
+                              </w:rPr>
+                              <w:t>Rechtsanwalt</w:t>
+                            </w:r>
+                          </w:p>
+                          <w:p>
+                            <w:pPr>
+                              <w:pBdr>
+                                <w:bottom w:val="single" w:sz="4" w:space="1" w:color="auto"/>
+                              </w:pBdr>
+                              <w:autoSpaceDE w:val="0"/>
+                              <w:autoSpaceDN w:val="0"/>
+                              <w:adjustRightInd w:val="0"/>
+                              <w:spacing w:line="276" w:lineRule="auto"/>
+                              <w:jc w:val="left"/>
+                              <w:rPr>
+                                <w:rFonts w:eastAsia="Calibri" w:cs="CorporateSPro-Light"/>
+                                <w:sz w:val="13"/>
+                                <w:szCs w:val="13"/>
+                                <w:lang w:eastAsia="de-DE"/>
+                              </w:rPr>
+                            </w:pPr>
                           </w:p>
                           <w:p>
                             <w:pPr>
@@ -1329,14 +1506,28 @@
                                 <w:lang w:eastAsia="de-DE"/>
                               </w:rPr>
                             </w:pPr>
-                            <w:r>
+                          </w:p>
+                          <w:p>
+                            <w:pPr>
+                              <w:autoSpaceDE w:val="0"/>
+                              <w:autoSpaceDN w:val="0"/>
+                              <w:adjustRightInd w:val="0"/>
+                              <w:jc w:val="left"/>
                               <w:rPr>
-                                <w:rFonts w:eastAsia="Calibri" w:cs="CorporateSPro-Light"/>
+                                <w:rFonts w:eastAsia="Calibri" w:cs="CorporateSPro-Regular"/>
                                 <w:sz w:val="13"/>
                                 <w:szCs w:val="13"/>
                                 <w:lang w:eastAsia="de-DE"/>
                               </w:rPr>
-                              <w:t xml:space="preserve">Rechtsanwältin</w:t>
+                            </w:pPr>
+                            <w:r>
+                              <w:rPr>
+                                <w:rFonts w:eastAsia="Calibri" w:cs="CorporateSPro-Regular"/>
+                                <w:sz w:val="13"/>
+                                <w:szCs w:val="13"/>
+                                <w:lang w:eastAsia="de-DE"/>
+                              </w:rPr>
+                              <w:t>OF COUNSEL</w:t>
                             </w:r>
                           </w:p>
                           <w:p>
@@ -1344,30 +1535,7 @@
                               <w:autoSpaceDE w:val="0"/>
                               <w:autoSpaceDN w:val="0"/>
                               <w:adjustRightInd w:val="0"/>
-                              <w:spacing w:line="276" w:lineRule="auto"/>
-                              <w:jc w:val="left"/>
-                              <w:rPr>
-                                <w:rFonts w:eastAsia="Calibri" w:cs="CorporateSPro-Light"/>
-                                <w:sz w:val="13"/>
-                                <w:szCs w:val="13"/>
-                                <w:lang w:eastAsia="de-DE"/>
-                              </w:rPr>
-                            </w:pPr>
-                            <w:r>
-                              <w:rPr>
-                                <w:rFonts w:eastAsia="Calibri" w:cs="CorporateSPro-Light"/>
-                                <w:sz w:val="13"/>
-                                <w:szCs w:val="13"/>
-                                <w:lang w:eastAsia="de-DE"/>
-                              </w:rPr>
-                              <w:t xml:space="preserve"/>
-                            </w:r>
-                          </w:p>
-                          <w:p>
-                            <w:pPr>
-                              <w:autoSpaceDE w:val="0"/>
-                              <w:autoSpaceDN w:val="0"/>
-                              <w:adjustRightInd w:val="0"/>
+                              <w:spacing w:line="240" w:lineRule="auto"/>
                               <w:jc w:val="left"/>
                               <w:rPr>
                                 <w:rFonts w:eastAsia="Calibri" w:cs="CorporateSPro-Demi"/>
@@ -1385,8 +1553,50 @@
                                 <w:szCs w:val="13"/>
                                 <w:lang w:eastAsia="de-DE"/>
                               </w:rPr>
-                              <w:t xml:space="preserve">Lars Wacker</w:t>
+                              <w:t>Justizrat Prof. Dr. Dr. Thomas B. Schmidt M.A.</w:t>
                             </w:r>
+                          </w:p>
+                          <w:p>
+                            <w:pPr>
+                              <w:autoSpaceDE w:val="0"/>
+                              <w:autoSpaceDN w:val="0"/>
+                              <w:adjustRightInd w:val="0"/>
+                              <w:spacing w:line="240" w:lineRule="auto"/>
+                              <w:jc w:val="left"/>
+                              <w:rPr>
+                                <w:rFonts w:eastAsia="Calibri" w:cs="CorporateSPro-Light"/>
+                                <w:sz w:val="13"/>
+                                <w:szCs w:val="13"/>
+                                <w:lang w:eastAsia="de-DE"/>
+                              </w:rPr>
+                            </w:pPr>
+                            <w:r>
+                              <w:rPr>
+                                <w:rFonts w:eastAsia="Calibri" w:cs="CorporateSPro-Light"/>
+                                <w:sz w:val="13"/>
+                                <w:szCs w:val="13"/>
+                                <w:lang w:eastAsia="de-DE"/>
+                              </w:rPr>
+                              <w:t>Fachanwalt für Insolvenz- und Sanierungsrecht</w:t>
+                            </w:r>
+                          </w:p>
+                          <w:p>
+                            <w:pPr>
+                              <w:pBdr>
+                                <w:bottom w:val="single" w:sz="4" w:space="1" w:color="auto"/>
+                              </w:pBdr>
+                              <w:autoSpaceDE w:val="0"/>
+                              <w:autoSpaceDN w:val="0"/>
+                              <w:adjustRightInd w:val="0"/>
+                              <w:spacing w:line="276" w:lineRule="auto"/>
+                              <w:jc w:val="left"/>
+                              <w:rPr>
+                                <w:rFonts w:eastAsia="Calibri" w:cs="CorporateSPro-Light"/>
+                                <w:sz w:val="13"/>
+                                <w:szCs w:val="13"/>
+                                <w:lang w:eastAsia="de-DE"/>
+                              </w:rPr>
+                            </w:pPr>
                           </w:p>
                           <w:p>
                             <w:pPr>
@@ -1402,87 +1612,6 @@
                                 <w:lang w:eastAsia="de-DE"/>
                               </w:rPr>
                             </w:pPr>
-                            <w:r>
-                              <w:rPr>
-                                <w:rFonts w:eastAsia="Calibri" w:cs="CorporateSPro-Light"/>
-                                <w:sz w:val="13"/>
-                                <w:szCs w:val="13"/>
-                                <w:lang w:eastAsia="de-DE"/>
-                              </w:rPr>
-                              <w:t xml:space="preserve">Rechtsanwalt</w:t>
-                            </w:r>
-                          </w:p>
-                          <w:p>
-                            <w:pPr>
-                              <w:autoSpaceDE w:val="0"/>
-                              <w:autoSpaceDN w:val="0"/>
-                              <w:adjustRightInd w:val="0"/>
-                              <w:spacing w:line="276" w:lineRule="auto"/>
-                              <w:jc w:val="left"/>
-                              <w:rPr>
-                                <w:rFonts w:eastAsia="Calibri" w:cs="CorporateSPro-Light"/>
-                                <w:sz w:val="13"/>
-                                <w:szCs w:val="13"/>
-                                <w:lang w:eastAsia="de-DE"/>
-                              </w:rPr>
-                            </w:pPr>
-                            <w:r>
-                              <w:rPr>
-                                <w:rFonts w:eastAsia="Calibri" w:cs="CorporateSPro-Light"/>
-                                <w:sz w:val="13"/>
-                                <w:szCs w:val="13"/>
-                                <w:lang w:eastAsia="de-DE"/>
-                              </w:rPr>
-                              <w:t xml:space="preserve"/>
-                            </w:r>
-                          </w:p>
-                          <w:p>
-                            <w:pPr>
-                              <w:autoSpaceDE w:val="0"/>
-                              <w:autoSpaceDN w:val="0"/>
-                              <w:adjustRightInd w:val="0"/>
-                              <w:spacing w:line="276" w:lineRule="auto"/>
-                              <w:jc w:val="left"/>
-                              <w:rPr>
-                                <w:rFonts w:eastAsia="Calibri" w:cs="CorporateSPro-Light"/>
-                                <w:sz w:val="13"/>
-                                <w:szCs w:val="13"/>
-                                <w:lang w:eastAsia="de-DE"/>
-                              </w:rPr>
-                            </w:pPr>
-                            <w:r>
-                              <w:rPr>
-                                <w:rFonts w:eastAsia="Calibri" w:cs="CorporateSPro-Light"/>
-                                <w:sz w:val="13"/>
-                                <w:szCs w:val="13"/>
-                                <w:lang w:eastAsia="de-DE"/>
-                              </w:rPr>
-                              <w:t xml:space="preserve"/>
-                            </w:r>
-                          </w:p>
-                          <w:p>
-                            <w:pPr>
-                              <w:autoSpaceDE w:val="0"/>
-                              <w:autoSpaceDN w:val="0"/>
-                              <w:adjustRightInd w:val="0"/>
-                              <w:spacing w:line="276" w:lineRule="auto"/>
-                              <w:jc w:val="left"/>
-                              <w:rPr>
-                                <w:rFonts w:eastAsia="Calibri" w:cs="CorporateSPro-Light"/>
-                                <w:sz w:val="13"/>
-                                <w:szCs w:val="13"/>
-                                <w:lang w:eastAsia="de-DE"/>
-                              </w:rPr>
-                            </w:pPr>
-                            <w:r>
-                              <w:rPr>
-                                <w:rFonts w:eastAsia="Calibri" w:cs="CorporateSPro-Light"/>
-                                <w:sz w:val="13"/>
-                                <w:szCs w:val="13"/>
-                                <w:lang w:eastAsia="de-DE"/>
-                              </w:rPr>
-                              <w:t xml:space="preserve">OF COUNSEL</w:t>
-                            </w:r>
                           </w:p>
                           <w:p>
                             <w:pPr>
@@ -1491,8 +1620,30 @@
                               <w:adjustRightInd w:val="0"/>
                               <w:jc w:val="left"/>
                               <w:rPr>
+                                <w:rFonts w:eastAsia="Calibri" w:cs="CorporateSPro-Regular"/>
+                                <w:sz w:val="13"/>
+                                <w:szCs w:val="13"/>
+                                <w:lang w:eastAsia="de-DE"/>
+                              </w:rPr>
+                            </w:pPr>
+                            <w:r>
+                              <w:rPr>
+                                <w:rFonts w:eastAsia="Calibri" w:cs="CorporateSPro-Regular"/>
+                                <w:sz w:val="13"/>
+                                <w:szCs w:val="13"/>
+                                <w:lang w:eastAsia="de-DE"/>
+                              </w:rPr>
+                              <w:t>STANDORTE</w:t>
+                            </w:r>
+                          </w:p>
+                          <w:p>
+                            <w:pPr>
+                              <w:autoSpaceDE w:val="0"/>
+                              <w:autoSpaceDN w:val="0"/>
+                              <w:adjustRightInd w:val="0"/>
+                              <w:spacing w:line="240" w:lineRule="auto"/>
+                              <w:rPr>
                                 <w:rFonts w:eastAsia="Calibri" w:cs="CorporateSPro-Demi"/>
-                                <w:b/>
                                 <w:sz w:val="13"/>
                                 <w:szCs w:val="13"/>
                                 <w:lang w:eastAsia="de-DE"/>
@@ -1501,12 +1652,30 @@
                             <w:r>
                               <w:rPr>
                                 <w:rFonts w:eastAsia="Calibri" w:cs="CorporateSPro-Demi"/>
-                                <w:b/>
                                 <w:sz w:val="13"/>
                                 <w:szCs w:val="13"/>
                                 <w:lang w:eastAsia="de-DE"/>
                               </w:rPr>
-                              <w:t xml:space="preserve">Justizrat Prof. Dr. Dr. Thomas B. Schmidt M.A.</w:t>
+                              <w:t>Trier</w:t>
+                            </w:r>
+                            <w:r>
+                              <w:rPr>
+                                <w:rFonts w:eastAsia="Calibri" w:cs="CorporateSPro-Demi"/>
+                                <w:sz w:val="13"/>
+                                <w:szCs w:val="13"/>
+                                <w:lang w:eastAsia="de-DE"/>
+                              </w:rPr>
+                              <w:tab/>
+                            </w:r>
+                            <w:r>
+                              <w:rPr>
+                                <w:rFonts w:eastAsia="Calibri" w:cs="CorporateSPro-Demi"/>
+                                <w:sz w:val="13"/>
+                                <w:szCs w:val="13"/>
+                                <w:lang w:eastAsia="de-DE"/>
+                              </w:rPr>
+                              <w:tab/>
+                              <w:t>Bad Kreuznach</w:t>
                             </w:r>
                           </w:p>
                           <w:p>
@@ -1514,10 +1683,9 @@
                               <w:autoSpaceDE w:val="0"/>
                               <w:autoSpaceDN w:val="0"/>
                               <w:adjustRightInd w:val="0"/>
-                              <w:spacing w:line="276" w:lineRule="auto"/>
-                              <w:jc w:val="left"/>
+                              <w:spacing w:line="240" w:lineRule="auto"/>
                               <w:rPr>
-                                <w:rFonts w:eastAsia="Calibri" w:cs="CorporateSPro-Light"/>
+                                <w:rFonts w:eastAsia="Calibri" w:cs="CorporateSPro-Demi"/>
                                 <w:sz w:val="13"/>
                                 <w:szCs w:val="13"/>
                                 <w:lang w:eastAsia="de-DE"/>
@@ -1525,12 +1693,22 @@
                             </w:pPr>
                             <w:r>
                               <w:rPr>
-                                <w:rFonts w:eastAsia="Calibri" w:cs="CorporateSPro-Light"/>
+                                <w:rFonts w:eastAsia="Calibri" w:cs="CorporateSPro-Demi"/>
                                 <w:sz w:val="13"/>
                                 <w:szCs w:val="13"/>
                                 <w:lang w:eastAsia="de-DE"/>
                               </w:rPr>
-                              <w:t xml:space="preserve">Fachanwalt für Insolvenz- und Sanierungsrecht</w:t>
+                              <w:t>Frankfurt am Main</w:t>
+                            </w:r>
+                            <w:r>
+                              <w:rPr>
+                                <w:rFonts w:eastAsia="Calibri" w:cs="CorporateSPro-Demi"/>
+                                <w:sz w:val="13"/>
+                                <w:szCs w:val="13"/>
+                                <w:lang w:eastAsia="de-DE"/>
+                              </w:rPr>
+                              <w:tab/>
+                              <w:t>Zell/Mosel</w:t>
                             </w:r>
                           </w:p>
                           <w:p>
@@ -1538,10 +1716,9 @@
                               <w:autoSpaceDE w:val="0"/>
                               <w:autoSpaceDN w:val="0"/>
                               <w:adjustRightInd w:val="0"/>
-                              <w:spacing w:line="276" w:lineRule="auto"/>
-                              <w:jc w:val="left"/>
+                              <w:spacing w:line="240" w:lineRule="auto"/>
                               <w:rPr>
-                                <w:rFonts w:eastAsia="Calibri" w:cs="CorporateSPro-Light"/>
+                                <w:rFonts w:eastAsia="Calibri" w:cs="CorporateSPro-Demi"/>
                                 <w:sz w:val="13"/>
                                 <w:szCs w:val="13"/>
                                 <w:lang w:eastAsia="de-DE"/>
@@ -1549,12 +1726,22 @@
                             </w:pPr>
                             <w:r>
                               <w:rPr>
-                                <w:rFonts w:eastAsia="Calibri" w:cs="CorporateSPro-Light"/>
+                                <w:rFonts w:eastAsia="Calibri" w:cs="CorporateSPro-Demi"/>
                                 <w:sz w:val="13"/>
                                 <w:szCs w:val="13"/>
                                 <w:lang w:eastAsia="de-DE"/>
                               </w:rPr>
-                              <w:t xml:space="preserve"/>
+                              <w:t>Idar-Oberstein</w:t>
+                            </w:r>
+                            <w:r>
+                              <w:rPr>
+                                <w:rFonts w:eastAsia="Calibri" w:cs="CorporateSPro-Demi"/>
+                                <w:sz w:val="13"/>
+                                <w:szCs w:val="13"/>
+                                <w:lang w:eastAsia="de-DE"/>
+                              </w:rPr>
+                              <w:tab/>
+                              <w:t>Koblenz</w:t>
                             </w:r>
                           </w:p>
                           <w:p>
@@ -1562,10 +1749,9 @@
                               <w:autoSpaceDE w:val="0"/>
                               <w:autoSpaceDN w:val="0"/>
                               <w:adjustRightInd w:val="0"/>
-                              <w:spacing w:line="276" w:lineRule="auto"/>
-                              <w:jc w:val="left"/>
+                              <w:spacing w:line="240" w:lineRule="auto"/>
                               <w:rPr>
-                                <w:rFonts w:eastAsia="Calibri" w:cs="CorporateSPro-Light"/>
+                                <w:rFonts w:eastAsia="Calibri" w:cs="CorporateSPro-Demi"/>
                                 <w:sz w:val="13"/>
                                 <w:szCs w:val="13"/>
                                 <w:lang w:eastAsia="de-DE"/>
@@ -1573,12 +1759,31 @@
                             </w:pPr>
                             <w:r>
                               <w:rPr>
-                                <w:rFonts w:eastAsia="Calibri" w:cs="CorporateSPro-Light"/>
+                                <w:rFonts w:eastAsia="Calibri" w:cs="CorporateSPro-Demi"/>
                                 <w:sz w:val="13"/>
                                 <w:szCs w:val="13"/>
                                 <w:lang w:eastAsia="de-DE"/>
                               </w:rPr>
-                              <w:t xml:space="preserve"/>
+                              <w:t>Langgöns</w:t>
+                            </w:r>
+                            <w:r>
+                              <w:rPr>
+                                <w:rFonts w:eastAsia="Calibri" w:cs="CorporateSPro-Demi"/>
+                                <w:sz w:val="13"/>
+                                <w:szCs w:val="13"/>
+                                <w:lang w:eastAsia="de-DE"/>
+                              </w:rPr>
+                              <w:tab/>
+                            </w:r>
+                            <w:r>
+                              <w:rPr>
+                                <w:rFonts w:eastAsia="Calibri" w:cs="CorporateSPro-Demi"/>
+                                <w:sz w:val="13"/>
+                                <w:szCs w:val="13"/>
+                                <w:lang w:eastAsia="de-DE"/>
+                              </w:rPr>
+                              <w:tab/>
+                              <w:t>Limburg/Lahn</w:t>
                             </w:r>
                           </w:p>
                           <w:p>
@@ -1586,144 +1791,52 @@
                               <w:autoSpaceDE w:val="0"/>
                               <w:autoSpaceDN w:val="0"/>
                               <w:adjustRightInd w:val="0"/>
-                              <w:spacing w:line="276" w:lineRule="auto"/>
-                              <w:jc w:val="left"/>
+                              <w:spacing w:line="240" w:lineRule="auto"/>
                               <w:rPr>
-                                <w:rFonts w:eastAsia="Calibri" w:cs="CorporateSPro-Light"/>
-                                <w:sz w:val="13"/>
-                                <w:szCs w:val="13"/>
+                                <w:rFonts w:eastAsia="Calibri" w:cs="CorporateSPro-Demi"/>
+                                <w:sz w:val="9"/>
+                                <w:szCs w:val="9"/>
                                 <w:lang w:eastAsia="de-DE"/>
                               </w:rPr>
                             </w:pPr>
                             <w:r>
                               <w:rPr>
-                                <w:rFonts w:eastAsia="Calibri" w:cs="CorporateSPro-Light"/>
+                                <w:rFonts w:eastAsia="Calibri" w:cs="CorporateSPro-Demi"/>
                                 <w:sz w:val="13"/>
                                 <w:szCs w:val="13"/>
                                 <w:lang w:eastAsia="de-DE"/>
                               </w:rPr>
-                              <w:t xml:space="preserve">STANDORTE</w:t>
+                              <w:t>Mainz</w:t>
                             </w:r>
-                          </w:p>
-                          <w:p>
-                            <w:pPr>
-                              <w:autoSpaceDE w:val="0"/>
-                              <w:autoSpaceDN w:val="0"/>
-                              <w:adjustRightInd w:val="0"/>
-                              <w:spacing w:line="276" w:lineRule="auto"/>
-                              <w:jc w:val="left"/>
+                            <w:r>
                               <w:rPr>
-                                <w:rFonts w:eastAsia="Calibri" w:cs="CorporateSPro-Light"/>
+                                <w:rFonts w:eastAsia="Calibri" w:cs="CorporateSPro-Demi"/>
                                 <w:sz w:val="13"/>
                                 <w:szCs w:val="13"/>
                                 <w:lang w:eastAsia="de-DE"/>
                               </w:rPr>
-                            </w:pPr>
+                              <w:tab/>
+                            </w:r>
                             <w:r>
                               <w:rPr>
-                                <w:rFonts w:eastAsia="Calibri" w:cs="CorporateSPro-Light"/>
+                                <w:rFonts w:eastAsia="Calibri" w:cs="CorporateSPro-Demi"/>
                                 <w:sz w:val="13"/>
                                 <w:szCs w:val="13"/>
                                 <w:lang w:eastAsia="de-DE"/>
                               </w:rPr>
-                              <w:t xml:space="preserve">Trier		Zell/Mosel</w:t>
+                              <w:tab/>
+                              <w:t>Wiesbaden</w:t>
                             </w:r>
-                          </w:p>
-                          <w:p>
-                            <w:pPr>
-                              <w:autoSpaceDE w:val="0"/>
-                              <w:autoSpaceDN w:val="0"/>
-                              <w:adjustRightInd w:val="0"/>
-                              <w:spacing w:line="276" w:lineRule="auto"/>
-                              <w:jc w:val="left"/>
-                              <w:rPr>
-                                <w:rFonts w:eastAsia="Calibri" w:cs="CorporateSPro-Light"/>
-                                <w:sz w:val="13"/>
-                                <w:szCs w:val="13"/>
-                                <w:lang w:eastAsia="de-DE"/>
-                              </w:rPr>
-                            </w:pPr>
-                            <w:r>
-                              <w:rPr>
-                                <w:rFonts w:eastAsia="Calibri" w:cs="CorporateSPro-Light"/>
-                                <w:sz w:val="13"/>
-                                <w:szCs w:val="13"/>
-                                <w:lang w:eastAsia="de-DE"/>
-                              </w:rPr>
-                              <w:t xml:space="preserve">Wiesbaden		Koblenz</w:t>
-                            </w:r>
-                          </w:p>
-                          <w:p>
-                            <w:pPr>
-                              <w:autoSpaceDE w:val="0"/>
-                              <w:autoSpaceDN w:val="0"/>
-                              <w:adjustRightInd w:val="0"/>
-                              <w:spacing w:line="276" w:lineRule="auto"/>
-                              <w:jc w:val="left"/>
-                              <w:rPr>
-                                <w:rFonts w:eastAsia="Calibri" w:cs="CorporateSPro-Light"/>
-                                <w:sz w:val="13"/>
-                                <w:szCs w:val="13"/>
-                                <w:lang w:eastAsia="de-DE"/>
-                              </w:rPr>
-                            </w:pPr>
-                            <w:r>
-                              <w:rPr>
-                                <w:rFonts w:eastAsia="Calibri" w:cs="CorporateSPro-Light"/>
-                                <w:sz w:val="13"/>
-                                <w:szCs w:val="13"/>
-                                <w:lang w:eastAsia="de-DE"/>
-                              </w:rPr>
-                              <w:t xml:space="preserve">Bad Kreuznach		Frankfurt am Main</w:t>
-                            </w:r>
-                          </w:p>
-                          <w:p>
-                            <w:pPr>
-                              <w:autoSpaceDE w:val="0"/>
-                              <w:autoSpaceDN w:val="0"/>
-                              <w:adjustRightInd w:val="0"/>
-                              <w:spacing w:line="276" w:lineRule="auto"/>
-                              <w:jc w:val="left"/>
-                              <w:rPr>
-                                <w:rFonts w:eastAsia="Calibri" w:cs="CorporateSPro-Light"/>
-                                <w:sz w:val="13"/>
-                                <w:szCs w:val="13"/>
-                                <w:lang w:eastAsia="de-DE"/>
-                              </w:rPr>
-                            </w:pPr>
-                            <w:r>
-                              <w:rPr>
-                                <w:rFonts w:eastAsia="Calibri" w:cs="CorporateSPro-Light"/>
-                                <w:sz w:val="13"/>
-                                <w:szCs w:val="13"/>
-                                <w:lang w:eastAsia="de-DE"/>
-                              </w:rPr>
-                              <w:t xml:space="preserve">Idar-Oberstein		Langgöns</w:t>
-                            </w:r>
-                          </w:p>
-                          <w:p>
-                            <w:pPr>
-                              <w:autoSpaceDE w:val="0"/>
-                              <w:autoSpaceDN w:val="0"/>
-                              <w:adjustRightInd w:val="0"/>
-                              <w:spacing w:line="276" w:lineRule="auto"/>
-                              <w:jc w:val="left"/>
-                              <w:rPr>
-                                <w:rFonts w:eastAsia="Calibri" w:cs="CorporateSPro-Light"/>
-                                <w:sz w:val="13"/>
-                                <w:szCs w:val="13"/>
-                                <w:lang w:eastAsia="de-DE"/>
-                              </w:rPr>
-                            </w:pPr>
-                            <w:r>
-                              <w:rPr>
-                                <w:rFonts w:eastAsia="Calibri" w:cs="CorporateSPro-Light"/>
-                                <w:sz w:val="13"/>
-                                <w:szCs w:val="13"/>
-                                <w:lang w:eastAsia="de-DE"/>
-                              </w:rPr>
-                              <w:t xml:space="preserve">Limburg/Lahn		Mainz</w:t>
-                            </w:r>
+                            <w:bookmarkEnd w:id="0"/>
+                            <w:bookmarkEnd w:id="1"/>
+                            <w:bookmarkEnd w:id="2"/>
+                            <w:bookmarkEnd w:id="3"/>
+                            <w:bookmarkEnd w:id="4"/>
+                            <w:bookmarkEnd w:id="5"/>
+                            <w:bookmarkEnd w:id="6"/>
+                            <w:bookmarkEnd w:id="7"/>
+                            <w:bookmarkEnd w:id="8"/>
+                            <w:bookmarkEnd w:id="9"/>
                           </w:p>
                         </w:txbxContent>
                       </wps:txbx>
@@ -1776,7 +1889,7 @@
                           <w:szCs w:val="13"/>
                           <w:lang w:eastAsia="de-DE"/>
                         </w:rPr>
-                        <w:t xml:space="preserve">www.tbs-insolvenzverwalter.de</w:t>
+                        <w:t>www.tbs-insolvenzverwalter.de</w:t>
                       </w:r>
                     </w:p>
                     <w:p>
@@ -1800,11 +1913,14 @@
                           <w:szCs w:val="13"/>
                           <w:lang w:eastAsia="de-DE"/>
                         </w:rPr>
-                        <w:t xml:space="preserve">Partnerschaftsregister des</w:t>
+                        <w:t>Partnerschaftsregister des</w:t>
                       </w:r>
                     </w:p>
                     <w:p>
                       <w:pPr>
+                        <w:pBdr>
+                          <w:bottom w:val="single" w:sz="4" w:space="1" w:color="auto"/>
+                        </w:pBdr>
                         <w:autoSpaceDE w:val="0"/>
                         <w:autoSpaceDN w:val="0"/>
                         <w:adjustRightInd w:val="0"/>
@@ -1824,8 +1940,134 @@
                           <w:szCs w:val="13"/>
                           <w:lang w:eastAsia="de-DE"/>
                         </w:rPr>
-                        <w:t xml:space="preserve">Amtsgericht Koblenz – PR 20203</w:t>
+                        <w:t>Amtsgericht Koblenz – PR 20203</w:t>
                       </w:r>
+                    </w:p>
+                    <w:p>
+                      <w:pPr>
+                        <w:pBdr>
+                          <w:bottom w:val="single" w:sz="4" w:space="1" w:color="auto"/>
+                        </w:pBdr>
+                        <w:autoSpaceDE w:val="0"/>
+                        <w:autoSpaceDN w:val="0"/>
+                        <w:adjustRightInd w:val="0"/>
+                        <w:spacing w:line="276" w:lineRule="auto"/>
+                        <w:jc w:val="center"/>
+                        <w:rPr>
+                          <w:rFonts w:eastAsia="Calibri" w:cs="CorporateSPro-Light"/>
+                          <w:sz w:val="13"/>
+                          <w:szCs w:val="13"/>
+                          <w:lang w:eastAsia="de-DE"/>
+                        </w:rPr>
+                      </w:pPr>
+                    </w:p>
+                    <w:p>
+                      <w:pPr>
+                        <w:pBdr>
+                          <w:bottom w:val="single" w:sz="4" w:space="1" w:color="auto"/>
+                        </w:pBdr>
+                        <w:autoSpaceDE w:val="0"/>
+                        <w:autoSpaceDN w:val="0"/>
+                        <w:adjustRightInd w:val="0"/>
+                        <w:spacing w:line="276" w:lineRule="auto"/>
+                        <w:jc w:val="center"/>
+                        <w:rPr>
+                          <w:rFonts w:eastAsia="Calibri" w:cs="CorporateSPro-Light"/>
+                          <w:sz w:val="13"/>
+                          <w:szCs w:val="13"/>
+                          <w:lang w:eastAsia="de-DE"/>
+                        </w:rPr>
+                      </w:pPr>
+                    </w:p>
+                    <w:p>
+                      <w:pPr>
+                        <w:pBdr>
+                          <w:bottom w:val="single" w:sz="4" w:space="1" w:color="auto"/>
+                        </w:pBdr>
+                        <w:autoSpaceDE w:val="0"/>
+                        <w:autoSpaceDN w:val="0"/>
+                        <w:adjustRightInd w:val="0"/>
+                        <w:spacing w:line="276" w:lineRule="auto"/>
+                        <w:jc w:val="center"/>
+                        <w:rPr>
+                          <w:rFonts w:eastAsia="Calibri" w:cs="CorporateSPro-Light"/>
+                          <w:sz w:val="13"/>
+                          <w:szCs w:val="13"/>
+                          <w:lang w:eastAsia="de-DE"/>
+                        </w:rPr>
+                      </w:pPr>
+                    </w:p>
+                    <w:p>
+                      <w:pPr>
+                        <w:pBdr>
+                          <w:bottom w:val="single" w:sz="4" w:space="1" w:color="auto"/>
+                        </w:pBdr>
+                        <w:autoSpaceDE w:val="0"/>
+                        <w:autoSpaceDN w:val="0"/>
+                        <w:adjustRightInd w:val="0"/>
+                        <w:spacing w:line="276" w:lineRule="auto"/>
+                        <w:jc w:val="center"/>
+                        <w:rPr>
+                          <w:rFonts w:eastAsia="Calibri" w:cs="CorporateSPro-Light"/>
+                          <w:sz w:val="13"/>
+                          <w:szCs w:val="13"/>
+                          <w:lang w:eastAsia="de-DE"/>
+                        </w:rPr>
+                      </w:pPr>
+                    </w:p>
+                    <w:p>
+                      <w:pPr>
+                        <w:pBdr>
+                          <w:bottom w:val="single" w:sz="4" w:space="1" w:color="auto"/>
+                        </w:pBdr>
+                        <w:autoSpaceDE w:val="0"/>
+                        <w:autoSpaceDN w:val="0"/>
+                        <w:adjustRightInd w:val="0"/>
+                        <w:spacing w:line="276" w:lineRule="auto"/>
+                        <w:jc w:val="center"/>
+                        <w:rPr>
+                          <w:rFonts w:eastAsia="Calibri" w:cs="CorporateSPro-Light"/>
+                          <w:sz w:val="13"/>
+                          <w:szCs w:val="13"/>
+                          <w:lang w:eastAsia="de-DE"/>
+                        </w:rPr>
+                      </w:pPr>
+                    </w:p>
+                    <w:p>
+                      <w:pPr>
+                        <w:pBdr>
+                          <w:bottom w:val="single" w:sz="4" w:space="1" w:color="auto"/>
+                        </w:pBdr>
+                        <w:autoSpaceDE w:val="0"/>
+                        <w:autoSpaceDN w:val="0"/>
+                        <w:adjustRightInd w:val="0"/>
+                        <w:spacing w:line="276" w:lineRule="auto"/>
+                        <w:jc w:val="center"/>
+                        <w:rPr>
+                          <w:rFonts w:eastAsia="Calibri" w:cs="CorporateSPro-Light"/>
+                          <w:sz w:val="13"/>
+                          <w:szCs w:val="13"/>
+                          <w:lang w:eastAsia="de-DE"/>
+                        </w:rPr>
+                      </w:pPr>
+                    </w:p>
+                    <w:p>
+                      <w:pPr>
+                        <w:pBdr>
+                          <w:bottom w:val="single" w:sz="4" w:space="1" w:color="auto"/>
+                        </w:pBdr>
+                        <w:autoSpaceDE w:val="0"/>
+                        <w:autoSpaceDN w:val="0"/>
+                        <w:adjustRightInd w:val="0"/>
+                        <w:spacing w:line="276" w:lineRule="auto"/>
+                        <w:jc w:val="center"/>
+                        <w:rPr>
+                          <w:rFonts w:eastAsia="Calibri" w:cs="CorporateSPro-Light"/>
+                          <w:sz w:val="13"/>
+                          <w:szCs w:val="13"/>
+                          <w:lang w:eastAsia="de-DE"/>
+                        </w:rPr>
+                      </w:pPr>
                     </w:p>
                     <w:p>
                       <w:pPr>
@@ -1841,14 +2083,38 @@
                           <w:lang w:eastAsia="de-DE"/>
                         </w:rPr>
                       </w:pPr>
-                      <w:r>
+                    </w:p>
+                    <w:p>
+                      <w:pPr>
+                        <w:autoSpaceDE w:val="0"/>
+                        <w:autoSpaceDN w:val="0"/>
+                        <w:adjustRightInd w:val="0"/>
+                        <w:jc w:val="left"/>
                         <w:rPr>
-                          <w:rFonts w:eastAsia="Calibri" w:cs="CorporateSPro-Light"/>
+                          <w:rFonts w:eastAsia="Calibri" w:cs="CorporateSPro-Regular"/>
                           <w:sz w:val="13"/>
                           <w:szCs w:val="13"/>
                           <w:lang w:eastAsia="de-DE"/>
                         </w:rPr>
-                        <w:t xml:space="preserve"/>
+                      </w:pPr>
+                      <w:bookmarkStart w:id="10" w:name="_Hlk217368252"/>
+                      <w:bookmarkStart w:id="11" w:name="_Hlk217368253"/>
+                      <w:bookmarkStart w:id="12" w:name="_Hlk217368337"/>
+                      <w:bookmarkStart w:id="13" w:name="_Hlk217368338"/>
+                      <w:bookmarkStart w:id="14" w:name="_Hlk217368401"/>
+                      <w:bookmarkStart w:id="15" w:name="_Hlk217368402"/>
+                      <w:bookmarkStart w:id="16" w:name="_Hlk217368434"/>
+                      <w:bookmarkStart w:id="17" w:name="_Hlk217368435"/>
+                      <w:bookmarkStart w:id="18" w:name="_Hlk217368465"/>
+                      <w:bookmarkStart w:id="19" w:name="_Hlk217368466"/>
+                      <w:r>
+                        <w:rPr>
+                          <w:rFonts w:eastAsia="Calibri" w:cs="CorporateSPro-Regular"/>
+                          <w:sz w:val="13"/>
+                          <w:szCs w:val="13"/>
+                          <w:lang w:eastAsia="de-DE"/>
+                        </w:rPr>
+                        <w:t>PARTNER</w:t>
                       </w:r>
                     </w:p>
                     <w:p>
@@ -1856,78 +2122,7 @@
                         <w:autoSpaceDE w:val="0"/>
                         <w:autoSpaceDN w:val="0"/>
                         <w:adjustRightInd w:val="0"/>
-                        <w:spacing w:line="276" w:lineRule="auto"/>
-                        <w:jc w:val="left"/>
-                        <w:rPr>
-                          <w:rFonts w:eastAsia="Calibri" w:cs="CorporateSPro-Light"/>
-                          <w:sz w:val="13"/>
-                          <w:szCs w:val="13"/>
-                          <w:lang w:eastAsia="de-DE"/>
-                        </w:rPr>
-                      </w:pPr>
-                      <w:r>
-                        <w:rPr>
-                          <w:rFonts w:eastAsia="Calibri" w:cs="CorporateSPro-Light"/>
-                          <w:sz w:val="13"/>
-                          <w:szCs w:val="13"/>
-                          <w:lang w:eastAsia="de-DE"/>
-                        </w:rPr>
-                        <w:t xml:space="preserve"/>
-                      </w:r>
-                    </w:p>
-                    <w:p>
-                      <w:pPr>
-                        <w:autoSpaceDE w:val="0"/>
-                        <w:autoSpaceDN w:val="0"/>
-                        <w:adjustRightInd w:val="0"/>
-                        <w:spacing w:line="276" w:lineRule="auto"/>
-                        <w:jc w:val="left"/>
-                        <w:rPr>
-                          <w:rFonts w:eastAsia="Calibri" w:cs="CorporateSPro-Light"/>
-                          <w:sz w:val="13"/>
-                          <w:szCs w:val="13"/>
-                          <w:lang w:eastAsia="de-DE"/>
-                        </w:rPr>
-                      </w:pPr>
-                      <w:r>
-                        <w:rPr>
-                          <w:rFonts w:eastAsia="Calibri" w:cs="CorporateSPro-Light"/>
-                          <w:sz w:val="13"/>
-                          <w:szCs w:val="13"/>
-                          <w:lang w:eastAsia="de-DE"/>
-                        </w:rPr>
-                        <w:t xml:space="preserve"/>
-                      </w:r>
-                    </w:p>
-                    <w:p>
-                      <w:pPr>
-                        <w:autoSpaceDE w:val="0"/>
-                        <w:autoSpaceDN w:val="0"/>
-                        <w:adjustRightInd w:val="0"/>
-                        <w:spacing w:line="276" w:lineRule="auto"/>
-                        <w:jc w:val="left"/>
-                        <w:rPr>
-                          <w:rFonts w:eastAsia="Calibri" w:cs="CorporateSPro-Light"/>
-                          <w:sz w:val="13"/>
-                          <w:szCs w:val="13"/>
-                          <w:lang w:eastAsia="de-DE"/>
-                        </w:rPr>
-                      </w:pPr>
-                      <w:r>
-                        <w:rPr>
-                          <w:rFonts w:eastAsia="Calibri" w:cs="CorporateSPro-Light"/>
-                          <w:sz w:val="13"/>
-                          <w:szCs w:val="13"/>
-                          <w:lang w:eastAsia="de-DE"/>
-                        </w:rPr>
-                        <w:t xml:space="preserve">PARTNER</w:t>
-                      </w:r>
-                    </w:p>
-                    <w:p>
-                      <w:pPr>
-                        <w:autoSpaceDE w:val="0"/>
-                        <w:autoSpaceDN w:val="0"/>
-                        <w:adjustRightInd w:val="0"/>
+                        <w:spacing w:line="240" w:lineRule="auto"/>
                         <w:jc w:val="left"/>
                         <w:rPr>
                           <w:rFonts w:eastAsia="Calibri" w:cs="CorporateSPro-Demi"/>
@@ -1945,7 +2140,7 @@
                           <w:szCs w:val="13"/>
                           <w:lang w:eastAsia="de-DE"/>
                         </w:rPr>
-                        <w:t xml:space="preserve">Ingo Grünewald</w:t>
+                        <w:t>Ingo Grünewald</w:t>
                       </w:r>
                     </w:p>
                     <w:p>
@@ -1953,7 +2148,7 @@
                         <w:autoSpaceDE w:val="0"/>
                         <w:autoSpaceDN w:val="0"/>
                         <w:adjustRightInd w:val="0"/>
-                        <w:spacing w:line="276" w:lineRule="auto"/>
+                        <w:spacing w:line="240" w:lineRule="auto"/>
                         <w:jc w:val="left"/>
                         <w:rPr>
                           <w:rFonts w:eastAsia="Calibri" w:cs="CorporateSPro-Light"/>
@@ -1969,7 +2164,7 @@
                           <w:szCs w:val="13"/>
                           <w:lang w:eastAsia="de-DE"/>
                         </w:rPr>
-                        <w:t xml:space="preserve">Fachanwalt für Insolvenz- und Sanierungsrecht</w:t>
+                        <w:t>Fachanwalt für Insolvenz- und Sanierungsrecht</w:t>
                       </w:r>
                     </w:p>
                     <w:p>
@@ -1977,7 +2172,7 @@
                         <w:autoSpaceDE w:val="0"/>
                         <w:autoSpaceDN w:val="0"/>
                         <w:adjustRightInd w:val="0"/>
-                        <w:spacing w:line="276" w:lineRule="auto"/>
+                        <w:spacing w:line="240" w:lineRule="auto"/>
                         <w:jc w:val="left"/>
                         <w:rPr>
                           <w:rFonts w:eastAsia="Calibri" w:cs="CorporateSPro-Light"/>
@@ -1993,7 +2188,7 @@
                           <w:szCs w:val="13"/>
                           <w:lang w:eastAsia="de-DE"/>
                         </w:rPr>
-                        <w:t xml:space="preserve">Fachanwalt für Handels- und Gesellschaftsrecht</w:t>
+                        <w:t>Fachanwalt für Handels- und Gesellschaftsrecht</w:t>
                       </w:r>
                     </w:p>
                     <w:p>
@@ -2001,7 +2196,49 @@
                         <w:autoSpaceDE w:val="0"/>
                         <w:autoSpaceDN w:val="0"/>
                         <w:adjustRightInd w:val="0"/>
-                        <w:spacing w:line="276" w:lineRule="auto"/>
+                        <w:spacing w:line="240" w:lineRule="auto"/>
+                        <w:jc w:val="left"/>
+                        <w:rPr>
+                          <w:rFonts w:eastAsia="Calibri" w:cs="CorporateSPro-Demi"/>
+                          <w:b/>
+                          <w:sz w:val="13"/>
+                          <w:szCs w:val="13"/>
+                          <w:lang w:eastAsia="de-DE"/>
+                        </w:rPr>
+                      </w:pPr>
+                    </w:p>
+                    <w:p>
+                      <w:pPr>
+                        <w:autoSpaceDE w:val="0"/>
+                        <w:autoSpaceDN w:val="0"/>
+                        <w:adjustRightInd w:val="0"/>
+                        <w:spacing w:line="240" w:lineRule="auto"/>
+                        <w:jc w:val="left"/>
+                        <w:rPr>
+                          <w:rFonts w:eastAsia="Calibri" w:cs="CorporateSPro-Demi"/>
+                          <w:b/>
+                          <w:sz w:val="13"/>
+                          <w:szCs w:val="13"/>
+                          <w:lang w:val="en-GB" w:eastAsia="de-DE"/>
+                        </w:rPr>
+                      </w:pPr>
+                      <w:r>
+                        <w:rPr>
+                          <w:rFonts w:eastAsia="Calibri" w:cs="CorporateSPro-Demi"/>
+                          <w:b/>
+                          <w:sz w:val="13"/>
+                          <w:szCs w:val="13"/>
+                          <w:lang w:val="en-GB" w:eastAsia="de-DE"/>
+                        </w:rPr>
+                        <w:t>Dr. Alexander Thomas Lamberty LL.M.</w:t>
+                      </w:r>
+                    </w:p>
+                    <w:p>
+                      <w:pPr>
+                        <w:autoSpaceDE w:val="0"/>
+                        <w:autoSpaceDN w:val="0"/>
+                        <w:adjustRightInd w:val="0"/>
+                        <w:spacing w:line="240" w:lineRule="auto"/>
                         <w:jc w:val="left"/>
                         <w:rPr>
                           <w:rFonts w:eastAsia="Calibri" w:cs="CorporateSPro-Light"/>
@@ -2017,7 +2254,7 @@
                           <w:szCs w:val="13"/>
                           <w:lang w:eastAsia="de-DE"/>
                         </w:rPr>
-                        <w:t xml:space="preserve"/>
+                        <w:t>Fachanwalt für Insolvenz- und Sanierungsrecht</w:t>
                       </w:r>
                     </w:p>
                     <w:p>
@@ -2025,6 +2262,23 @@
                         <w:autoSpaceDE w:val="0"/>
                         <w:autoSpaceDN w:val="0"/>
                         <w:adjustRightInd w:val="0"/>
+                        <w:spacing w:line="240" w:lineRule="auto"/>
+                        <w:jc w:val="left"/>
+                        <w:rPr>
+                          <w:rFonts w:eastAsia="Calibri" w:cs="CorporateSPro-Demi"/>
+                          <w:b/>
+                          <w:sz w:val="13"/>
+                          <w:szCs w:val="13"/>
+                          <w:lang w:eastAsia="de-DE"/>
+                        </w:rPr>
+                      </w:pPr>
+                    </w:p>
+                    <w:p>
+                      <w:pPr>
+                        <w:autoSpaceDE w:val="0"/>
+                        <w:autoSpaceDN w:val="0"/>
+                        <w:adjustRightInd w:val="0"/>
+                        <w:spacing w:line="240" w:lineRule="auto"/>
                         <w:jc w:val="left"/>
                         <w:rPr>
                           <w:rFonts w:eastAsia="Calibri" w:cs="CorporateSPro-Demi"/>
@@ -2042,7 +2296,7 @@
                           <w:szCs w:val="13"/>
                           <w:lang w:eastAsia="de-DE"/>
                         </w:rPr>
-                        <w:t xml:space="preserve">Dr. Alexander Thomas Lamberty LL.M.</w:t>
+                        <w:t>Fatma Kreft</w:t>
                       </w:r>
                     </w:p>
                     <w:p>
@@ -2050,7 +2304,7 @@
                         <w:autoSpaceDE w:val="0"/>
                         <w:autoSpaceDN w:val="0"/>
                         <w:adjustRightInd w:val="0"/>
-                        <w:spacing w:line="276" w:lineRule="auto"/>
+                        <w:spacing w:line="240" w:lineRule="auto"/>
                         <w:jc w:val="left"/>
                         <w:rPr>
                           <w:rFonts w:eastAsia="Calibri" w:cs="CorporateSPro-Light"/>
@@ -2066,7 +2320,7 @@
                           <w:szCs w:val="13"/>
                           <w:lang w:eastAsia="de-DE"/>
                         </w:rPr>
-                        <w:t xml:space="preserve">Fachanwalt für Insolvenz- und Sanierungsrecht</w:t>
+                        <w:t>Fachanwältin für Insolvenz- und Sanierungsrecht</w:t>
                       </w:r>
                     </w:p>
                     <w:p>
@@ -2074,7 +2328,7 @@
                         <w:autoSpaceDE w:val="0"/>
                         <w:autoSpaceDN w:val="0"/>
                         <w:adjustRightInd w:val="0"/>
-                        <w:spacing w:line="276" w:lineRule="auto"/>
+                        <w:spacing w:line="240" w:lineRule="auto"/>
                         <w:jc w:val="left"/>
                         <w:rPr>
                           <w:rFonts w:eastAsia="Calibri" w:cs="CorporateSPro-Light"/>
@@ -2090,7 +2344,7 @@
                           <w:szCs w:val="13"/>
                           <w:lang w:eastAsia="de-DE"/>
                         </w:rPr>
-                        <w:t xml:space="preserve"/>
+                        <w:t>Fachanwältin für Steuerrecht</w:t>
                       </w:r>
                     </w:p>
                     <w:p>
@@ -2098,6 +2352,22 @@
                         <w:autoSpaceDE w:val="0"/>
                         <w:autoSpaceDN w:val="0"/>
                         <w:adjustRightInd w:val="0"/>
+                        <w:spacing w:line="240" w:lineRule="auto"/>
+                        <w:jc w:val="left"/>
+                        <w:rPr>
+                          <w:rFonts w:eastAsia="Calibri" w:cs="CorporateSPro-Light"/>
+                          <w:sz w:val="13"/>
+                          <w:szCs w:val="13"/>
+                          <w:lang w:eastAsia="de-DE"/>
+                        </w:rPr>
+                      </w:pPr>
+                    </w:p>
+                    <w:p>
+                      <w:pPr>
+                        <w:autoSpaceDE w:val="0"/>
+                        <w:autoSpaceDN w:val="0"/>
+                        <w:adjustRightInd w:val="0"/>
+                        <w:spacing w:line="240" w:lineRule="auto"/>
                         <w:jc w:val="left"/>
                         <w:rPr>
                           <w:rFonts w:eastAsia="Calibri" w:cs="CorporateSPro-Demi"/>
@@ -2115,7 +2385,7 @@
                           <w:szCs w:val="13"/>
                           <w:lang w:eastAsia="de-DE"/>
                         </w:rPr>
-                        <w:t xml:space="preserve">Fatma Kreft</w:t>
+                        <w:t>Dr. Arne Löser</w:t>
                       </w:r>
                     </w:p>
                     <w:p>
@@ -2123,7 +2393,7 @@
                         <w:autoSpaceDE w:val="0"/>
                         <w:autoSpaceDN w:val="0"/>
                         <w:adjustRightInd w:val="0"/>
-                        <w:spacing w:line="276" w:lineRule="auto"/>
+                        <w:spacing w:line="240" w:lineRule="auto"/>
                         <w:jc w:val="left"/>
                         <w:rPr>
                           <w:rFonts w:eastAsia="Calibri" w:cs="CorporateSPro-Light"/>
@@ -2139,7 +2409,7 @@
                           <w:szCs w:val="13"/>
                           <w:lang w:eastAsia="de-DE"/>
                         </w:rPr>
-                        <w:t xml:space="preserve">Fachanwältin für Insolvenz- und Sanierungsrecht</w:t>
+                        <w:t>Fachanwalt für Insolvenz- und Sanierungsrecht</w:t>
                       </w:r>
                     </w:p>
                     <w:p>
@@ -2147,7 +2417,7 @@
                         <w:autoSpaceDE w:val="0"/>
                         <w:autoSpaceDN w:val="0"/>
                         <w:adjustRightInd w:val="0"/>
-                        <w:spacing w:line="276" w:lineRule="auto"/>
+                        <w:spacing w:line="240" w:lineRule="auto"/>
                         <w:jc w:val="left"/>
                         <w:rPr>
                           <w:rFonts w:eastAsia="Calibri" w:cs="CorporateSPro-Light"/>
@@ -2163,7 +2433,7 @@
                           <w:szCs w:val="13"/>
                           <w:lang w:eastAsia="de-DE"/>
                         </w:rPr>
-                        <w:t xml:space="preserve">Fachanwältin für Steuerrecht</w:t>
+                        <w:t>Fachanwalt für Handels- und Gesellschaftsrecht</w:t>
                       </w:r>
                     </w:p>
                     <w:p>
@@ -2171,7 +2441,7 @@
                         <w:autoSpaceDE w:val="0"/>
                         <w:autoSpaceDN w:val="0"/>
                         <w:adjustRightInd w:val="0"/>
-                        <w:spacing w:line="276" w:lineRule="auto"/>
+                        <w:spacing w:line="240" w:lineRule="auto"/>
                         <w:jc w:val="left"/>
                         <w:rPr>
                           <w:rFonts w:eastAsia="Calibri" w:cs="CorporateSPro-Light"/>
@@ -2180,21 +2450,13 @@
                           <w:lang w:eastAsia="de-DE"/>
                         </w:rPr>
                       </w:pPr>
-                      <w:r>
-                        <w:rPr>
-                          <w:rFonts w:eastAsia="Calibri" w:cs="CorporateSPro-Light"/>
-                          <w:sz w:val="13"/>
-                          <w:szCs w:val="13"/>
-                          <w:lang w:eastAsia="de-DE"/>
-                        </w:rPr>
-                        <w:t xml:space="preserve"/>
-                      </w:r>
                     </w:p>
                     <w:p>
                       <w:pPr>
                         <w:autoSpaceDE w:val="0"/>
                         <w:autoSpaceDN w:val="0"/>
                         <w:adjustRightInd w:val="0"/>
+                        <w:spacing w:line="240" w:lineRule="auto"/>
                         <w:jc w:val="left"/>
                         <w:rPr>
                           <w:rFonts w:eastAsia="Calibri" w:cs="CorporateSPro-Demi"/>
@@ -2212,8 +2474,98 @@
                           <w:szCs w:val="13"/>
                           <w:lang w:eastAsia="de-DE"/>
                         </w:rPr>
-                        <w:t xml:space="preserve">Dr. Arne Löser</w:t>
+                        <w:t>Dr. Thomas Thöne</w:t>
                       </w:r>
+                    </w:p>
+                    <w:p>
+                      <w:pPr>
+                        <w:autoSpaceDE w:val="0"/>
+                        <w:autoSpaceDN w:val="0"/>
+                        <w:adjustRightInd w:val="0"/>
+                        <w:spacing w:line="240" w:lineRule="auto"/>
+                        <w:jc w:val="left"/>
+                        <w:rPr>
+                          <w:rFonts w:eastAsia="Calibri" w:cs="CorporateSPro-Light"/>
+                          <w:sz w:val="13"/>
+                          <w:szCs w:val="13"/>
+                          <w:lang w:eastAsia="de-DE"/>
+                        </w:rPr>
+                      </w:pPr>
+                      <w:r>
+                        <w:rPr>
+                          <w:rFonts w:eastAsia="Calibri" w:cs="CorporateSPro-Light"/>
+                          <w:sz w:val="13"/>
+                          <w:szCs w:val="13"/>
+                          <w:lang w:eastAsia="de-DE"/>
+                        </w:rPr>
+                        <w:t>Fachanwalt für Insolvenz- und Sanierungsrecht</w:t>
+                      </w:r>
+                    </w:p>
+                    <w:p>
+                      <w:pPr>
+                        <w:autoSpaceDE w:val="0"/>
+                        <w:autoSpaceDN w:val="0"/>
+                        <w:adjustRightInd w:val="0"/>
+                        <w:spacing w:line="240" w:lineRule="auto"/>
+                        <w:jc w:val="left"/>
+                        <w:rPr>
+                          <w:rFonts w:eastAsia="Calibri" w:cs="CorporateSPro-Light"/>
+                          <w:sz w:val="13"/>
+                          <w:szCs w:val="13"/>
+                          <w:lang w:eastAsia="de-DE"/>
+                        </w:rPr>
+                      </w:pPr>
+                      <w:r>
+                        <w:rPr>
+                          <w:rFonts w:eastAsia="Calibri" w:cs="CorporateSPro-Light"/>
+                          <w:sz w:val="13"/>
+                          <w:szCs w:val="13"/>
+                          <w:lang w:eastAsia="de-DE"/>
+                        </w:rPr>
+                        <w:t>Fachanwalt für Steuerrecht</w:t>
+                      </w:r>
+                    </w:p>
+                    <w:p>
+                      <w:pPr>
+                        <w:autoSpaceDE w:val="0"/>
+                        <w:autoSpaceDN w:val="0"/>
+                        <w:adjustRightInd w:val="0"/>
+                        <w:spacing w:line="240" w:lineRule="auto"/>
+                        <w:jc w:val="left"/>
+                        <w:rPr>
+                          <w:rFonts w:eastAsia="Calibri" w:cs="CorporateSPro-Light"/>
+                          <w:sz w:val="13"/>
+                          <w:szCs w:val="13"/>
+                          <w:lang w:eastAsia="de-DE"/>
+                        </w:rPr>
+                      </w:pPr>
+                      <w:r>
+                        <w:rPr>
+                          <w:rFonts w:eastAsia="Calibri" w:cs="CorporateSPro-Light"/>
+                          <w:sz w:val="13"/>
+                          <w:szCs w:val="13"/>
+                          <w:lang w:eastAsia="de-DE"/>
+                        </w:rPr>
+                        <w:t>Notar in Wiesbaden</w:t>
+                      </w:r>
+                    </w:p>
+                    <w:p>
+                      <w:pPr>
+                        <w:pBdr>
+                          <w:bottom w:val="single" w:sz="4" w:space="1" w:color="auto"/>
+                        </w:pBdr>
+                        <w:autoSpaceDE w:val="0"/>
+                        <w:autoSpaceDN w:val="0"/>
+                        <w:adjustRightInd w:val="0"/>
+                        <w:spacing w:line="276" w:lineRule="auto"/>
+                        <w:jc w:val="left"/>
+                        <w:rPr>
+                          <w:rFonts w:eastAsia="Calibri" w:cs="CorporateSPro-Light"/>
+                          <w:sz w:val="13"/>
+                          <w:szCs w:val="13"/>
+                          <w:lang w:eastAsia="de-DE"/>
+                        </w:rPr>
+                      </w:pPr>
                     </w:p>
                     <w:p>
                       <w:pPr>
@@ -2229,14 +2581,28 @@
                           <w:lang w:eastAsia="de-DE"/>
                         </w:rPr>
                       </w:pPr>
-                      <w:r>
+                    </w:p>
+                    <w:p>
+                      <w:pPr>
+                        <w:autoSpaceDE w:val="0"/>
+                        <w:autoSpaceDN w:val="0"/>
+                        <w:adjustRightInd w:val="0"/>
+                        <w:jc w:val="left"/>
                         <w:rPr>
-                          <w:rFonts w:eastAsia="Calibri" w:cs="CorporateSPro-Light"/>
+                          <w:rFonts w:eastAsia="Calibri" w:cs="CorporateSPro-Regular"/>
                           <w:sz w:val="13"/>
                           <w:szCs w:val="13"/>
                           <w:lang w:eastAsia="de-DE"/>
                         </w:rPr>
-                        <w:t xml:space="preserve">Fachanwalt für Insolvenz- und Sanierungsrecht</w:t>
+                      </w:pPr>
+                      <w:r>
+                        <w:rPr>
+                          <w:rFonts w:eastAsia="Calibri" w:cs="CorporateSPro-Regular"/>
+                          <w:sz w:val="13"/>
+                          <w:szCs w:val="13"/>
+                          <w:lang w:eastAsia="de-DE"/>
+                        </w:rPr>
+                        <w:t>ANGESTELLTE RECHTSANWÄLTE</w:t>
                       </w:r>
                     </w:p>
                     <w:p>
@@ -2244,54 +2610,7 @@
                         <w:autoSpaceDE w:val="0"/>
                         <w:autoSpaceDN w:val="0"/>
                         <w:adjustRightInd w:val="0"/>
-                        <w:spacing w:line="276" w:lineRule="auto"/>
-                        <w:jc w:val="left"/>
-                        <w:rPr>
-                          <w:rFonts w:eastAsia="Calibri" w:cs="CorporateSPro-Light"/>
-                          <w:sz w:val="13"/>
-                          <w:szCs w:val="13"/>
-                          <w:lang w:eastAsia="de-DE"/>
-                        </w:rPr>
-                      </w:pPr>
-                      <w:r>
-                        <w:rPr>
-                          <w:rFonts w:eastAsia="Calibri" w:cs="CorporateSPro-Light"/>
-                          <w:sz w:val="13"/>
-                          <w:szCs w:val="13"/>
-                          <w:lang w:eastAsia="de-DE"/>
-                        </w:rPr>
-                        <w:t xml:space="preserve">Fachanwalt für Handels- und Gesellschaftsrecht</w:t>
-                      </w:r>
-                    </w:p>
-                    <w:p>
-                      <w:pPr>
-                        <w:autoSpaceDE w:val="0"/>
-                        <w:autoSpaceDN w:val="0"/>
-                        <w:adjustRightInd w:val="0"/>
-                        <w:spacing w:line="276" w:lineRule="auto"/>
-                        <w:jc w:val="left"/>
-                        <w:rPr>
-                          <w:rFonts w:eastAsia="Calibri" w:cs="CorporateSPro-Light"/>
-                          <w:sz w:val="13"/>
-                          <w:szCs w:val="13"/>
-                          <w:lang w:eastAsia="de-DE"/>
-                        </w:rPr>
-                      </w:pPr>
-                      <w:r>
-                        <w:rPr>
-                          <w:rFonts w:eastAsia="Calibri" w:cs="CorporateSPro-Light"/>
-                          <w:sz w:val="13"/>
-                          <w:szCs w:val="13"/>
-                          <w:lang w:eastAsia="de-DE"/>
-                        </w:rPr>
-                        <w:t xml:space="preserve"/>
-                      </w:r>
-                    </w:p>
-                    <w:p>
-                      <w:pPr>
-                        <w:autoSpaceDE w:val="0"/>
-                        <w:autoSpaceDN w:val="0"/>
-                        <w:adjustRightInd w:val="0"/>
+                        <w:spacing w:line="240" w:lineRule="auto"/>
                         <w:jc w:val="left"/>
                         <w:rPr>
                           <w:rFonts w:eastAsia="Calibri" w:cs="CorporateSPro-Demi"/>
@@ -2309,7 +2628,7 @@
                           <w:szCs w:val="13"/>
                           <w:lang w:eastAsia="de-DE"/>
                         </w:rPr>
-                        <w:t xml:space="preserve">Thorsten Lex</w:t>
+                        <w:t>Eva Meyer</w:t>
                       </w:r>
                     </w:p>
                     <w:p>
@@ -2317,7 +2636,31 @@
                         <w:autoSpaceDE w:val="0"/>
                         <w:autoSpaceDN w:val="0"/>
                         <w:adjustRightInd w:val="0"/>
-                        <w:spacing w:line="276" w:lineRule="auto"/>
+                        <w:spacing w:line="240" w:lineRule="auto"/>
+                        <w:jc w:val="left"/>
+                        <w:rPr>
+                          <w:rFonts w:eastAsia="Calibri" w:cs="CorporateSPro-Demi"/>
+                          <w:sz w:val="13"/>
+                          <w:szCs w:val="13"/>
+                          <w:lang w:eastAsia="de-DE"/>
+                        </w:rPr>
+                      </w:pPr>
+                      <w:r>
+                        <w:rPr>
+                          <w:rFonts w:eastAsia="Calibri" w:cs="CorporateSPro-Demi"/>
+                          <w:sz w:val="13"/>
+                          <w:szCs w:val="13"/>
+                          <w:lang w:eastAsia="de-DE"/>
+                        </w:rPr>
+                        <w:t>Fachanwältin für Insolvenz- und Sanierungsrecht</w:t>
+                      </w:r>
+                    </w:p>
+                    <w:p>
+                      <w:pPr>
+                        <w:autoSpaceDE w:val="0"/>
+                        <w:autoSpaceDN w:val="0"/>
+                        <w:adjustRightInd w:val="0"/>
+                        <w:spacing w:line="240" w:lineRule="auto"/>
                         <w:jc w:val="left"/>
                         <w:rPr>
                           <w:rFonts w:eastAsia="Calibri" w:cs="CorporateSPro-Light"/>
@@ -2326,93 +2669,13 @@
                           <w:lang w:eastAsia="de-DE"/>
                         </w:rPr>
                       </w:pPr>
-                      <w:r>
-                        <w:rPr>
-                          <w:rFonts w:eastAsia="Calibri" w:cs="CorporateSPro-Light"/>
-                          <w:sz w:val="13"/>
-                          <w:szCs w:val="13"/>
-                          <w:lang w:eastAsia="de-DE"/>
-                        </w:rPr>
-                        <w:t xml:space="preserve">Fachanwalt für Business</w:t>
-                      </w:r>
                     </w:p>
                     <w:p>
                       <w:pPr>
                         <w:autoSpaceDE w:val="0"/>
                         <w:autoSpaceDN w:val="0"/>
                         <w:adjustRightInd w:val="0"/>
-                        <w:spacing w:line="276" w:lineRule="auto"/>
-                        <w:jc w:val="left"/>
-                        <w:rPr>
-                          <w:rFonts w:eastAsia="Calibri" w:cs="CorporateSPro-Light"/>
-                          <w:sz w:val="13"/>
-                          <w:szCs w:val="13"/>
-                          <w:lang w:eastAsia="de-DE"/>
-                        </w:rPr>
-                      </w:pPr>
-                      <w:r>
-                        <w:rPr>
-                          <w:rFonts w:eastAsia="Calibri" w:cs="CorporateSPro-Light"/>
-                          <w:sz w:val="13"/>
-                          <w:szCs w:val="13"/>
-                          <w:lang w:eastAsia="de-DE"/>
-                        </w:rPr>
-                        <w:t xml:space="preserve"/>
-                      </w:r>
-                    </w:p>
-                    <w:p>
-                      <w:pPr>
-                        <w:autoSpaceDE w:val="0"/>
-                        <w:autoSpaceDN w:val="0"/>
-                        <w:adjustRightInd w:val="0"/>
-                        <w:spacing w:line="276" w:lineRule="auto"/>
-                        <w:jc w:val="left"/>
-                        <w:rPr>
-                          <w:rFonts w:eastAsia="Calibri" w:cs="CorporateSPro-Light"/>
-                          <w:sz w:val="13"/>
-                          <w:szCs w:val="13"/>
-                          <w:lang w:eastAsia="de-DE"/>
-                        </w:rPr>
-                      </w:pPr>
-                      <w:r>
-                        <w:rPr>
-                          <w:rFonts w:eastAsia="Calibri" w:cs="CorporateSPro-Light"/>
-                          <w:sz w:val="13"/>
-                          <w:szCs w:val="13"/>
-                          <w:lang w:eastAsia="de-DE"/>
-                        </w:rPr>
-                        <w:t xml:space="preserve"/>
-                      </w:r>
-                    </w:p>
-                    <w:p>
-                      <w:pPr>
-                        <w:autoSpaceDE w:val="0"/>
-                        <w:autoSpaceDN w:val="0"/>
-                        <w:adjustRightInd w:val="0"/>
-                        <w:spacing w:line="276" w:lineRule="auto"/>
-                        <w:jc w:val="left"/>
-                        <w:rPr>
-                          <w:rFonts w:eastAsia="Calibri" w:cs="CorporateSPro-Light"/>
-                          <w:sz w:val="13"/>
-                          <w:szCs w:val="13"/>
-                          <w:lang w:eastAsia="de-DE"/>
-                        </w:rPr>
-                      </w:pPr>
-                      <w:r>
-                        <w:rPr>
-                          <w:rFonts w:eastAsia="Calibri" w:cs="CorporateSPro-Light"/>
-                          <w:sz w:val="13"/>
-                          <w:szCs w:val="13"/>
-                          <w:lang w:eastAsia="de-DE"/>
-                        </w:rPr>
-                        <w:t xml:space="preserve">ANGESTELLTE RECHTSANWÄLTE</w:t>
-                      </w:r>
-                    </w:p>
-                    <w:p>
-                      <w:pPr>
-                        <w:autoSpaceDE w:val="0"/>
-                        <w:autoSpaceDN w:val="0"/>
-                        <w:adjustRightInd w:val="0"/>
+                        <w:spacing w:line="240" w:lineRule="auto"/>
                         <w:jc w:val="left"/>
                         <w:rPr>
                           <w:rFonts w:eastAsia="Calibri" w:cs="CorporateSPro-Demi"/>
@@ -2430,7 +2693,7 @@
                           <w:szCs w:val="13"/>
                           <w:lang w:eastAsia="de-DE"/>
                         </w:rPr>
-                        <w:t xml:space="preserve">Eva Meyer</w:t>
+                        <w:t>Bettina Dax</w:t>
                       </w:r>
                     </w:p>
                     <w:p>
@@ -2438,7 +2701,7 @@
                         <w:autoSpaceDE w:val="0"/>
                         <w:autoSpaceDN w:val="0"/>
                         <w:adjustRightInd w:val="0"/>
-                        <w:spacing w:line="276" w:lineRule="auto"/>
+                        <w:spacing w:line="240" w:lineRule="auto"/>
                         <w:jc w:val="left"/>
                         <w:rPr>
                           <w:rFonts w:eastAsia="Calibri" w:cs="CorporateSPro-Light"/>
@@ -2454,7 +2717,7 @@
                           <w:szCs w:val="13"/>
                           <w:lang w:eastAsia="de-DE"/>
                         </w:rPr>
-                        <w:t xml:space="preserve">Fachanwältin für Insolvenz- und Sanierungsrecht</w:t>
+                        <w:t>Rechtsanwältin</w:t>
                       </w:r>
                     </w:p>
                     <w:p>
@@ -2462,30 +2725,23 @@
                         <w:autoSpaceDE w:val="0"/>
                         <w:autoSpaceDN w:val="0"/>
                         <w:adjustRightInd w:val="0"/>
-                        <w:spacing w:line="276" w:lineRule="auto"/>
+                        <w:spacing w:line="240" w:lineRule="auto"/>
                         <w:jc w:val="left"/>
                         <w:rPr>
-                          <w:rFonts w:eastAsia="Calibri" w:cs="CorporateSPro-Light"/>
+                          <w:rFonts w:eastAsia="Calibri" w:cs="CorporateSPro-Demi"/>
+                          <w:b/>
                           <w:sz w:val="13"/>
                           <w:szCs w:val="13"/>
                           <w:lang w:eastAsia="de-DE"/>
                         </w:rPr>
                       </w:pPr>
-                      <w:r>
-                        <w:rPr>
-                          <w:rFonts w:eastAsia="Calibri" w:cs="CorporateSPro-Light"/>
-                          <w:sz w:val="13"/>
-                          <w:szCs w:val="13"/>
-                          <w:lang w:eastAsia="de-DE"/>
-                        </w:rPr>
-                        <w:t xml:space="preserve"/>
-                      </w:r>
                     </w:p>
                     <w:p>
                       <w:pPr>
                         <w:autoSpaceDE w:val="0"/>
                         <w:autoSpaceDN w:val="0"/>
                         <w:adjustRightInd w:val="0"/>
+                        <w:spacing w:line="240" w:lineRule="auto"/>
                         <w:jc w:val="left"/>
                         <w:rPr>
                           <w:rFonts w:eastAsia="Calibri" w:cs="CorporateSPro-Demi"/>
@@ -2503,7 +2759,7 @@
                           <w:szCs w:val="13"/>
                           <w:lang w:eastAsia="de-DE"/>
                         </w:rPr>
-                        <w:t xml:space="preserve">Bettina Dax</w:t>
+                        <w:t>Cornelia Kriege</w:t>
                       </w:r>
                     </w:p>
                     <w:p>
@@ -2511,7 +2767,7 @@
                         <w:autoSpaceDE w:val="0"/>
                         <w:autoSpaceDN w:val="0"/>
                         <w:adjustRightInd w:val="0"/>
-                        <w:spacing w:line="276" w:lineRule="auto"/>
+                        <w:spacing w:line="240" w:lineRule="auto"/>
                         <w:jc w:val="left"/>
                         <w:rPr>
                           <w:rFonts w:eastAsia="Calibri" w:cs="CorporateSPro-Light"/>
@@ -2527,7 +2783,7 @@
                           <w:szCs w:val="13"/>
                           <w:lang w:eastAsia="de-DE"/>
                         </w:rPr>
-                        <w:t xml:space="preserve">Rechtsanwältin</w:t>
+                        <w:t>Rechtsanwältin</w:t>
                       </w:r>
                     </w:p>
                     <w:p>
@@ -2535,7 +2791,7 @@
                         <w:autoSpaceDE w:val="0"/>
                         <w:autoSpaceDN w:val="0"/>
                         <w:adjustRightInd w:val="0"/>
-                        <w:spacing w:line="276" w:lineRule="auto"/>
+                        <w:spacing w:line="240" w:lineRule="auto"/>
                         <w:jc w:val="left"/>
                         <w:rPr>
                           <w:rFonts w:eastAsia="Calibri" w:cs="CorporateSPro-Light"/>
@@ -2544,21 +2800,13 @@
                           <w:lang w:eastAsia="de-DE"/>
                         </w:rPr>
                       </w:pPr>
-                      <w:r>
-                        <w:rPr>
-                          <w:rFonts w:eastAsia="Calibri" w:cs="CorporateSPro-Light"/>
-                          <w:sz w:val="13"/>
-                          <w:szCs w:val="13"/>
-                          <w:lang w:eastAsia="de-DE"/>
-                        </w:rPr>
-                        <w:t xml:space="preserve"/>
-                      </w:r>
                     </w:p>
                     <w:p>
                       <w:pPr>
                         <w:autoSpaceDE w:val="0"/>
                         <w:autoSpaceDN w:val="0"/>
                         <w:adjustRightInd w:val="0"/>
+                        <w:spacing w:line="240" w:lineRule="auto"/>
                         <w:jc w:val="left"/>
                         <w:rPr>
                           <w:rFonts w:eastAsia="Calibri" w:cs="CorporateSPro-Demi"/>
@@ -2576,8 +2824,50 @@
                           <w:szCs w:val="13"/>
                           <w:lang w:eastAsia="de-DE"/>
                         </w:rPr>
-                        <w:t xml:space="preserve">Cornelia Kriege</w:t>
+                        <w:t>Lars Wacker</w:t>
                       </w:r>
+                    </w:p>
+                    <w:p>
+                      <w:pPr>
+                        <w:autoSpaceDE w:val="0"/>
+                        <w:autoSpaceDN w:val="0"/>
+                        <w:adjustRightInd w:val="0"/>
+                        <w:spacing w:line="240" w:lineRule="auto"/>
+                        <w:jc w:val="left"/>
+                        <w:rPr>
+                          <w:rFonts w:eastAsia="Calibri" w:cs="CorporateSPro-Light"/>
+                          <w:sz w:val="13"/>
+                          <w:szCs w:val="13"/>
+                          <w:lang w:eastAsia="de-DE"/>
+                        </w:rPr>
+                      </w:pPr>
+                      <w:r>
+                        <w:rPr>
+                          <w:rFonts w:eastAsia="Calibri" w:cs="CorporateSPro-Light"/>
+                          <w:sz w:val="13"/>
+                          <w:szCs w:val="13"/>
+                          <w:lang w:eastAsia="de-DE"/>
+                        </w:rPr>
+                        <w:t>Rechtsanwalt</w:t>
+                      </w:r>
+                    </w:p>
+                    <w:p>
+                      <w:pPr>
+                        <w:pBdr>
+                          <w:bottom w:val="single" w:sz="4" w:space="1" w:color="auto"/>
+                        </w:pBdr>
+                        <w:autoSpaceDE w:val="0"/>
+                        <w:autoSpaceDN w:val="0"/>
+                        <w:adjustRightInd w:val="0"/>
+                        <w:spacing w:line="276" w:lineRule="auto"/>
+                        <w:jc w:val="left"/>
+                        <w:rPr>
+                          <w:rFonts w:eastAsia="Calibri" w:cs="CorporateSPro-Light"/>
+                          <w:sz w:val="13"/>
+                          <w:szCs w:val="13"/>
+                          <w:lang w:eastAsia="de-DE"/>
+                        </w:rPr>
+                      </w:pPr>
                     </w:p>
                     <w:p>
                       <w:pPr>
@@ -2593,14 +2883,28 @@
                           <w:lang w:eastAsia="de-DE"/>
                         </w:rPr>
                       </w:pPr>
-                      <w:r>
+                    </w:p>
+                    <w:p>
+                      <w:pPr>
+                        <w:autoSpaceDE w:val="0"/>
+                        <w:autoSpaceDN w:val="0"/>
+                        <w:adjustRightInd w:val="0"/>
+                        <w:jc w:val="left"/>
                         <w:rPr>
-                          <w:rFonts w:eastAsia="Calibri" w:cs="CorporateSPro-Light"/>
+                          <w:rFonts w:eastAsia="Calibri" w:cs="CorporateSPro-Regular"/>
                           <w:sz w:val="13"/>
                           <w:szCs w:val="13"/>
                           <w:lang w:eastAsia="de-DE"/>
                         </w:rPr>
-                        <w:t xml:space="preserve">Rechtsanwältin</w:t>
+                      </w:pPr>
+                      <w:r>
+                        <w:rPr>
+                          <w:rFonts w:eastAsia="Calibri" w:cs="CorporateSPro-Regular"/>
+                          <w:sz w:val="13"/>
+                          <w:szCs w:val="13"/>
+                          <w:lang w:eastAsia="de-DE"/>
+                        </w:rPr>
+                        <w:t>OF COUNSEL</w:t>
                       </w:r>
                     </w:p>
                     <w:p>
@@ -2608,30 +2912,7 @@
                         <w:autoSpaceDE w:val="0"/>
                         <w:autoSpaceDN w:val="0"/>
                         <w:adjustRightInd w:val="0"/>
-                        <w:spacing w:line="276" w:lineRule="auto"/>
-                        <w:jc w:val="left"/>
-                        <w:rPr>
-                          <w:rFonts w:eastAsia="Calibri" w:cs="CorporateSPro-Light"/>
-                          <w:sz w:val="13"/>
-                          <w:szCs w:val="13"/>
-                          <w:lang w:eastAsia="de-DE"/>
-                        </w:rPr>
-                      </w:pPr>
-                      <w:r>
-                        <w:rPr>
-                          <w:rFonts w:eastAsia="Calibri" w:cs="CorporateSPro-Light"/>
-                          <w:sz w:val="13"/>
-                          <w:szCs w:val="13"/>
-                          <w:lang w:eastAsia="de-DE"/>
-                        </w:rPr>
-                        <w:t xml:space="preserve"/>
-                      </w:r>
-                    </w:p>
-                    <w:p>
-                      <w:pPr>
-                        <w:autoSpaceDE w:val="0"/>
-                        <w:autoSpaceDN w:val="0"/>
-                        <w:adjustRightInd w:val="0"/>
+                        <w:spacing w:line="240" w:lineRule="auto"/>
                         <w:jc w:val="left"/>
                         <w:rPr>
                           <w:rFonts w:eastAsia="Calibri" w:cs="CorporateSPro-Demi"/>
@@ -2649,8 +2930,50 @@
                           <w:szCs w:val="13"/>
                           <w:lang w:eastAsia="de-DE"/>
                         </w:rPr>
-                        <w:t xml:space="preserve">Lars Wacker</w:t>
+                        <w:t>Justizrat Prof. Dr. Dr. Thomas B. Schmidt M.A.</w:t>
                       </w:r>
+                    </w:p>
+                    <w:p>
+                      <w:pPr>
+                        <w:autoSpaceDE w:val="0"/>
+                        <w:autoSpaceDN w:val="0"/>
+                        <w:adjustRightInd w:val="0"/>
+                        <w:spacing w:line="240" w:lineRule="auto"/>
+                        <w:jc w:val="left"/>
+                        <w:rPr>
+                          <w:rFonts w:eastAsia="Calibri" w:cs="CorporateSPro-Light"/>
+                          <w:sz w:val="13"/>
+                          <w:szCs w:val="13"/>
+                          <w:lang w:eastAsia="de-DE"/>
+                        </w:rPr>
+                      </w:pPr>
+                      <w:r>
+                        <w:rPr>
+                          <w:rFonts w:eastAsia="Calibri" w:cs="CorporateSPro-Light"/>
+                          <w:sz w:val="13"/>
+                          <w:szCs w:val="13"/>
+                          <w:lang w:eastAsia="de-DE"/>
+                        </w:rPr>
+                        <w:t>Fachanwalt für Insolvenz- und Sanierungsrecht</w:t>
+                      </w:r>
+                    </w:p>
+                    <w:p>
+                      <w:pPr>
+                        <w:pBdr>
+                          <w:bottom w:val="single" w:sz="4" w:space="1" w:color="auto"/>
+                        </w:pBdr>
+                        <w:autoSpaceDE w:val="0"/>
+                        <w:autoSpaceDN w:val="0"/>
+                        <w:adjustRightInd w:val="0"/>
+                        <w:spacing w:line="276" w:lineRule="auto"/>
+                        <w:jc w:val="left"/>
+                        <w:rPr>
+                          <w:rFonts w:eastAsia="Calibri" w:cs="CorporateSPro-Light"/>
+                          <w:sz w:val="13"/>
+                          <w:szCs w:val="13"/>
+                          <w:lang w:eastAsia="de-DE"/>
+                        </w:rPr>
+                      </w:pPr>
                     </w:p>
                     <w:p>
                       <w:pPr>
@@ -2666,87 +2989,6 @@
                           <w:lang w:eastAsia="de-DE"/>
                         </w:rPr>
                       </w:pPr>
-                      <w:r>
-                        <w:rPr>
-                          <w:rFonts w:eastAsia="Calibri" w:cs="CorporateSPro-Light"/>
-                          <w:sz w:val="13"/>
-                          <w:szCs w:val="13"/>
-                          <w:lang w:eastAsia="de-DE"/>
-                        </w:rPr>
-                        <w:t xml:space="preserve">Rechtsanwalt</w:t>
-                      </w:r>
-                    </w:p>
-                    <w:p>
-                      <w:pPr>
-                        <w:autoSpaceDE w:val="0"/>
-                        <w:autoSpaceDN w:val="0"/>
-                        <w:adjustRightInd w:val="0"/>
-                        <w:spacing w:line="276" w:lineRule="auto"/>
-                        <w:jc w:val="left"/>
-                        <w:rPr>
-                          <w:rFonts w:eastAsia="Calibri" w:cs="CorporateSPro-Light"/>
-                          <w:sz w:val="13"/>
-                          <w:szCs w:val="13"/>
-                          <w:lang w:eastAsia="de-DE"/>
-                        </w:rPr>
-                      </w:pPr>
-                      <w:r>
-                        <w:rPr>
-                          <w:rFonts w:eastAsia="Calibri" w:cs="CorporateSPro-Light"/>
-                          <w:sz w:val="13"/>
-                          <w:szCs w:val="13"/>
-                          <w:lang w:eastAsia="de-DE"/>
-                        </w:rPr>
-                        <w:t xml:space="preserve"/>
-                      </w:r>
-                    </w:p>
-                    <w:p>
-                      <w:pPr>
-                        <w:autoSpaceDE w:val="0"/>
-                        <w:autoSpaceDN w:val="0"/>
-                        <w:adjustRightInd w:val="0"/>
-                        <w:spacing w:line="276" w:lineRule="auto"/>
-                        <w:jc w:val="left"/>
-                        <w:rPr>
-                          <w:rFonts w:eastAsia="Calibri" w:cs="CorporateSPro-Light"/>
-                          <w:sz w:val="13"/>
-                          <w:szCs w:val="13"/>
-                          <w:lang w:eastAsia="de-DE"/>
-                        </w:rPr>
-                      </w:pPr>
-                      <w:r>
-                        <w:rPr>
-                          <w:rFonts w:eastAsia="Calibri" w:cs="CorporateSPro-Light"/>
-                          <w:sz w:val="13"/>
-                          <w:szCs w:val="13"/>
-                          <w:lang w:eastAsia="de-DE"/>
-                        </w:rPr>
-                        <w:t xml:space="preserve"/>
-                      </w:r>
-                    </w:p>
-                    <w:p>
-                      <w:pPr>
-                        <w:autoSpaceDE w:val="0"/>
-                        <w:autoSpaceDN w:val="0"/>
-                        <w:adjustRightInd w:val="0"/>
-                        <w:spacing w:line="276" w:lineRule="auto"/>
-                        <w:jc w:val="left"/>
-                        <w:rPr>
-                          <w:rFonts w:eastAsia="Calibri" w:cs="CorporateSPro-Light"/>
-                          <w:sz w:val="13"/>
-                          <w:szCs w:val="13"/>
-                          <w:lang w:eastAsia="de-DE"/>
-                        </w:rPr>
-                      </w:pPr>
-                      <w:r>
-                        <w:rPr>
-                          <w:rFonts w:eastAsia="Calibri" w:cs="CorporateSPro-Light"/>
-                          <w:sz w:val="13"/>
-                          <w:szCs w:val="13"/>
-                          <w:lang w:eastAsia="de-DE"/>
-                        </w:rPr>
-                        <w:t xml:space="preserve">OF COUNSEL</w:t>
-                      </w:r>
                     </w:p>
                     <w:p>
                       <w:pPr>
@@ -2755,8 +2997,30 @@
                         <w:adjustRightInd w:val="0"/>
                         <w:jc w:val="left"/>
                         <w:rPr>
+                          <w:rFonts w:eastAsia="Calibri" w:cs="CorporateSPro-Regular"/>
+                          <w:sz w:val="13"/>
+                          <w:szCs w:val="13"/>
+                          <w:lang w:eastAsia="de-DE"/>
+                        </w:rPr>
+                      </w:pPr>
+                      <w:r>
+                        <w:rPr>
+                          <w:rFonts w:eastAsia="Calibri" w:cs="CorporateSPro-Regular"/>
+                          <w:sz w:val="13"/>
+                          <w:szCs w:val="13"/>
+                          <w:lang w:eastAsia="de-DE"/>
+                        </w:rPr>
+                        <w:t>STANDORTE</w:t>
+                      </w:r>
+                    </w:p>
+                    <w:p>
+                      <w:pPr>
+                        <w:autoSpaceDE w:val="0"/>
+                        <w:autoSpaceDN w:val="0"/>
+                        <w:adjustRightInd w:val="0"/>
+                        <w:spacing w:line="240" w:lineRule="auto"/>
+                        <w:rPr>
                           <w:rFonts w:eastAsia="Calibri" w:cs="CorporateSPro-Demi"/>
-                          <w:b/>
                           <w:sz w:val="13"/>
                           <w:szCs w:val="13"/>
                           <w:lang w:eastAsia="de-DE"/>
@@ -2765,12 +3029,30 @@
                       <w:r>
                         <w:rPr>
                           <w:rFonts w:eastAsia="Calibri" w:cs="CorporateSPro-Demi"/>
-                          <w:b/>
                           <w:sz w:val="13"/>
                           <w:szCs w:val="13"/>
                           <w:lang w:eastAsia="de-DE"/>
                         </w:rPr>
-                        <w:t xml:space="preserve">Justizrat Prof. Dr. Dr. Thomas B. Schmidt M.A.</w:t>
+                        <w:t>Trier</w:t>
+                      </w:r>
+                      <w:r>
+                        <w:rPr>
+                          <w:rFonts w:eastAsia="Calibri" w:cs="CorporateSPro-Demi"/>
+                          <w:sz w:val="13"/>
+                          <w:szCs w:val="13"/>
+                          <w:lang w:eastAsia="de-DE"/>
+                        </w:rPr>
+                        <w:tab/>
+                      </w:r>
+                      <w:r>
+                        <w:rPr>
+                          <w:rFonts w:eastAsia="Calibri" w:cs="CorporateSPro-Demi"/>
+                          <w:sz w:val="13"/>
+                          <w:szCs w:val="13"/>
+                          <w:lang w:eastAsia="de-DE"/>
+                        </w:rPr>
+                        <w:tab/>
+                        <w:t>Bad Kreuznach</w:t>
                       </w:r>
                     </w:p>
                     <w:p>
@@ -2778,10 +3060,9 @@
                         <w:autoSpaceDE w:val="0"/>
                         <w:autoSpaceDN w:val="0"/>
                         <w:adjustRightInd w:val="0"/>
-                        <w:spacing w:line="276" w:lineRule="auto"/>
-                        <w:jc w:val="left"/>
+                        <w:spacing w:line="240" w:lineRule="auto"/>
                         <w:rPr>
-                          <w:rFonts w:eastAsia="Calibri" w:cs="CorporateSPro-Light"/>
+                          <w:rFonts w:eastAsia="Calibri" w:cs="CorporateSPro-Demi"/>
                           <w:sz w:val="13"/>
                           <w:szCs w:val="13"/>
                           <w:lang w:eastAsia="de-DE"/>
@@ -2789,12 +3070,22 @@
                       </w:pPr>
                       <w:r>
                         <w:rPr>
-                          <w:rFonts w:eastAsia="Calibri" w:cs="CorporateSPro-Light"/>
+                          <w:rFonts w:eastAsia="Calibri" w:cs="CorporateSPro-Demi"/>
                           <w:sz w:val="13"/>
                           <w:szCs w:val="13"/>
                           <w:lang w:eastAsia="de-DE"/>
                         </w:rPr>
-                        <w:t xml:space="preserve">Fachanwalt für Insolvenz- und Sanierungsrecht</w:t>
+                        <w:t>Frankfurt am Main</w:t>
+                      </w:r>
+                      <w:r>
+                        <w:rPr>
+                          <w:rFonts w:eastAsia="Calibri" w:cs="CorporateSPro-Demi"/>
+                          <w:sz w:val="13"/>
+                          <w:szCs w:val="13"/>
+                          <w:lang w:eastAsia="de-DE"/>
+                        </w:rPr>
+                        <w:tab/>
+                        <w:t>Zell/Mosel</w:t>
                       </w:r>
                     </w:p>
                     <w:p>
@@ -2802,10 +3093,9 @@
                         <w:autoSpaceDE w:val="0"/>
                         <w:autoSpaceDN w:val="0"/>
                         <w:adjustRightInd w:val="0"/>
-                        <w:spacing w:line="276" w:lineRule="auto"/>
-                        <w:jc w:val="left"/>
+                        <w:spacing w:line="240" w:lineRule="auto"/>
                         <w:rPr>
-                          <w:rFonts w:eastAsia="Calibri" w:cs="CorporateSPro-Light"/>
+                          <w:rFonts w:eastAsia="Calibri" w:cs="CorporateSPro-Demi"/>
                           <w:sz w:val="13"/>
                           <w:szCs w:val="13"/>
                           <w:lang w:eastAsia="de-DE"/>
@@ -2813,12 +3103,22 @@
                       </w:pPr>
                       <w:r>
                         <w:rPr>
-                          <w:rFonts w:eastAsia="Calibri" w:cs="CorporateSPro-Light"/>
+                          <w:rFonts w:eastAsia="Calibri" w:cs="CorporateSPro-Demi"/>
                           <w:sz w:val="13"/>
                           <w:szCs w:val="13"/>
                           <w:lang w:eastAsia="de-DE"/>
                         </w:rPr>
-                        <w:t xml:space="preserve"/>
+                        <w:t>Idar-Oberstein</w:t>
+                      </w:r>
+                      <w:r>
+                        <w:rPr>
+                          <w:rFonts w:eastAsia="Calibri" w:cs="CorporateSPro-Demi"/>
+                          <w:sz w:val="13"/>
+                          <w:szCs w:val="13"/>
+                          <w:lang w:eastAsia="de-DE"/>
+                        </w:rPr>
+                        <w:tab/>
+                        <w:t>Koblenz</w:t>
                       </w:r>
                     </w:p>
                     <w:p>
@@ -2826,10 +3126,9 @@
                         <w:autoSpaceDE w:val="0"/>
                         <w:autoSpaceDN w:val="0"/>
                         <w:adjustRightInd w:val="0"/>
-                        <w:spacing w:line="276" w:lineRule="auto"/>
-                        <w:jc w:val="left"/>
+                        <w:spacing w:line="240" w:lineRule="auto"/>
                         <w:rPr>
-                          <w:rFonts w:eastAsia="Calibri" w:cs="CorporateSPro-Light"/>
+                          <w:rFonts w:eastAsia="Calibri" w:cs="CorporateSPro-Demi"/>
                           <w:sz w:val="13"/>
                           <w:szCs w:val="13"/>
                           <w:lang w:eastAsia="de-DE"/>
@@ -2837,12 +3136,31 @@
                       </w:pPr>
                       <w:r>
                         <w:rPr>
-                          <w:rFonts w:eastAsia="Calibri" w:cs="CorporateSPro-Light"/>
+                          <w:rFonts w:eastAsia="Calibri" w:cs="CorporateSPro-Demi"/>
                           <w:sz w:val="13"/>
                           <w:szCs w:val="13"/>
                           <w:lang w:eastAsia="de-DE"/>
                         </w:rPr>
-                        <w:t xml:space="preserve"/>
+                        <w:t>Langgöns</w:t>
+                      </w:r>
+                      <w:r>
+                        <w:rPr>
+                          <w:rFonts w:eastAsia="Calibri" w:cs="CorporateSPro-Demi"/>
+                          <w:sz w:val="13"/>
+                          <w:szCs w:val="13"/>
+                          <w:lang w:eastAsia="de-DE"/>
+                        </w:rPr>
+                        <w:tab/>
+                      </w:r>
+                      <w:r>
+                        <w:rPr>
+                          <w:rFonts w:eastAsia="Calibri" w:cs="CorporateSPro-Demi"/>
+                          <w:sz w:val="13"/>
+                          <w:szCs w:val="13"/>
+                          <w:lang w:eastAsia="de-DE"/>
+                        </w:rPr>
+                        <w:tab/>
+                        <w:t>Limburg/Lahn</w:t>
                       </w:r>
                     </w:p>
                     <w:p>
@@ -2850,144 +3168,52 @@
                         <w:autoSpaceDE w:val="0"/>
                         <w:autoSpaceDN w:val="0"/>
                         <w:adjustRightInd w:val="0"/>
-                        <w:spacing w:line="276" w:lineRule="auto"/>
-                        <w:jc w:val="left"/>
+                        <w:spacing w:line="240" w:lineRule="auto"/>
                         <w:rPr>
-                          <w:rFonts w:eastAsia="Calibri" w:cs="CorporateSPro-Light"/>
-                          <w:sz w:val="13"/>
-                          <w:szCs w:val="13"/>
+                          <w:rFonts w:eastAsia="Calibri" w:cs="CorporateSPro-Demi"/>
+                          <w:sz w:val="9"/>
+                          <w:szCs w:val="9"/>
                           <w:lang w:eastAsia="de-DE"/>
                         </w:rPr>
                       </w:pPr>
                       <w:r>
                         <w:rPr>
-                          <w:rFonts w:eastAsia="Calibri" w:cs="CorporateSPro-Light"/>
+                          <w:rFonts w:eastAsia="Calibri" w:cs="CorporateSPro-Demi"/>
                           <w:sz w:val="13"/>
                           <w:szCs w:val="13"/>
                           <w:lang w:eastAsia="de-DE"/>
                         </w:rPr>
-                        <w:t xml:space="preserve">STANDORTE</w:t>
+                        <w:t>Mainz</w:t>
                       </w:r>
-                    </w:p>
-                    <w:p>
-                      <w:pPr>
-                        <w:autoSpaceDE w:val="0"/>
-                        <w:autoSpaceDN w:val="0"/>
-                        <w:adjustRightInd w:val="0"/>
-                        <w:spacing w:line="276" w:lineRule="auto"/>
-                        <w:jc w:val="left"/>
+                      <w:r>
                         <w:rPr>
-                          <w:rFonts w:eastAsia="Calibri" w:cs="CorporateSPro-Light"/>
+                          <w:rFonts w:eastAsia="Calibri" w:cs="CorporateSPro-Demi"/>
                           <w:sz w:val="13"/>
                           <w:szCs w:val="13"/>
                           <w:lang w:eastAsia="de-DE"/>
                         </w:rPr>
-                      </w:pPr>
+                        <w:tab/>
+                      </w:r>
                       <w:r>
                         <w:rPr>
-                          <w:rFonts w:eastAsia="Calibri" w:cs="CorporateSPro-Light"/>
+                          <w:rFonts w:eastAsia="Calibri" w:cs="CorporateSPro-Demi"/>
                           <w:sz w:val="13"/>
                           <w:szCs w:val="13"/>
                           <w:lang w:eastAsia="de-DE"/>
                         </w:rPr>
-                        <w:t xml:space="preserve">Trier		Zell/Mosel</w:t>
+                        <w:tab/>
+                        <w:t>Wiesbaden</w:t>
                       </w:r>
-                    </w:p>
-                    <w:p>
-                      <w:pPr>
-                        <w:autoSpaceDE w:val="0"/>
-                        <w:autoSpaceDN w:val="0"/>
-                        <w:adjustRightInd w:val="0"/>
-                        <w:spacing w:line="276" w:lineRule="auto"/>
-                        <w:jc w:val="left"/>
-                        <w:rPr>
-                          <w:rFonts w:eastAsia="Calibri" w:cs="CorporateSPro-Light"/>
-                          <w:sz w:val="13"/>
-                          <w:szCs w:val="13"/>
-                          <w:lang w:eastAsia="de-DE"/>
-                        </w:rPr>
-                      </w:pPr>
-                      <w:r>
-                        <w:rPr>
-                          <w:rFonts w:eastAsia="Calibri" w:cs="CorporateSPro-Light"/>
-                          <w:sz w:val="13"/>
-                          <w:szCs w:val="13"/>
-                          <w:lang w:eastAsia="de-DE"/>
-                        </w:rPr>
-                        <w:t xml:space="preserve">Wiesbaden		Koblenz</w:t>
-                      </w:r>
-                    </w:p>
-                    <w:p>
-                      <w:pPr>
-                        <w:autoSpaceDE w:val="0"/>
-                        <w:autoSpaceDN w:val="0"/>
-                        <w:adjustRightInd w:val="0"/>
-                        <w:spacing w:line="276" w:lineRule="auto"/>
-                        <w:jc w:val="left"/>
-                        <w:rPr>
-                          <w:rFonts w:eastAsia="Calibri" w:cs="CorporateSPro-Light"/>
-                          <w:sz w:val="13"/>
-                          <w:szCs w:val="13"/>
-                          <w:lang w:eastAsia="de-DE"/>
-                        </w:rPr>
-                      </w:pPr>
-                      <w:r>
-                        <w:rPr>
-                          <w:rFonts w:eastAsia="Calibri" w:cs="CorporateSPro-Light"/>
-                          <w:sz w:val="13"/>
-                          <w:szCs w:val="13"/>
-                          <w:lang w:eastAsia="de-DE"/>
-                        </w:rPr>
-                        <w:t xml:space="preserve">Bad Kreuznach		Frankfurt am Main</w:t>
-                      </w:r>
-                    </w:p>
-                    <w:p>
-                      <w:pPr>
-                        <w:autoSpaceDE w:val="0"/>
-                        <w:autoSpaceDN w:val="0"/>
-                        <w:adjustRightInd w:val="0"/>
-                        <w:spacing w:line="276" w:lineRule="auto"/>
-                        <w:jc w:val="left"/>
-                        <w:rPr>
-                          <w:rFonts w:eastAsia="Calibri" w:cs="CorporateSPro-Light"/>
-                          <w:sz w:val="13"/>
-                          <w:szCs w:val="13"/>
-                          <w:lang w:eastAsia="de-DE"/>
-                        </w:rPr>
-                      </w:pPr>
-                      <w:r>
-                        <w:rPr>
-                          <w:rFonts w:eastAsia="Calibri" w:cs="CorporateSPro-Light"/>
-                          <w:sz w:val="13"/>
-                          <w:szCs w:val="13"/>
-                          <w:lang w:eastAsia="de-DE"/>
-                        </w:rPr>
-                        <w:t xml:space="preserve">Idar-Oberstein		Langgöns</w:t>
-                      </w:r>
-                    </w:p>
-                    <w:p>
-                      <w:pPr>
-                        <w:autoSpaceDE w:val="0"/>
-                        <w:autoSpaceDN w:val="0"/>
-                        <w:adjustRightInd w:val="0"/>
-                        <w:spacing w:line="276" w:lineRule="auto"/>
-                        <w:jc w:val="left"/>
-                        <w:rPr>
-                          <w:rFonts w:eastAsia="Calibri" w:cs="CorporateSPro-Light"/>
-                          <w:sz w:val="13"/>
-                          <w:szCs w:val="13"/>
-                          <w:lang w:eastAsia="de-DE"/>
-                        </w:rPr>
-                      </w:pPr>
-                      <w:r>
-                        <w:rPr>
-                          <w:rFonts w:eastAsia="Calibri" w:cs="CorporateSPro-Light"/>
-                          <w:sz w:val="13"/>
-                          <w:szCs w:val="13"/>
-                          <w:lang w:eastAsia="de-DE"/>
-                        </w:rPr>
-                        <w:t xml:space="preserve">Limburg/Lahn		Mainz</w:t>
-                      </w:r>
+                      <w:bookmarkEnd w:id="10"/>
+                      <w:bookmarkEnd w:id="11"/>
+                      <w:bookmarkEnd w:id="12"/>
+                      <w:bookmarkEnd w:id="13"/>
+                      <w:bookmarkEnd w:id="14"/>
+                      <w:bookmarkEnd w:id="15"/>
+                      <w:bookmarkEnd w:id="16"/>
+                      <w:bookmarkEnd w:id="17"/>
+                      <w:bookmarkEnd w:id="18"/>
+                      <w:bookmarkEnd w:id="19"/>
                     </w:p>
                   </w:txbxContent>
                 </v:textbox>

</xml_diff>